<commit_message>
Clarify Jev routing metrics and separate labels from body text
</commit_message>
<xml_diff>
--- a/site/en/resume.docx
+++ b/site/en/resume.docx
@@ -80,7 +80,7 @@
               <w:keepNext w:val="false"/>
               <w:spacing w:after="45" w:before="0" w:line="190"/>
             </w:pPr>
-            <w:hyperlink w:history="1" r:id="rIdhqjfk0ztankwjkfvmu53c">
+            <w:hyperlink w:history="1" r:id="rIdhjgoznckacxffwcnwrvy3">
               <w:r>
                 <w:rPr>
                   <w:color w:val="315CBB"/>
@@ -98,7 +98,7 @@
               </w:rPr>
               <w:t xml:space="preserve">   </w:t>
             </w:r>
-            <w:hyperlink w:history="1" r:id="rIdnsv6eypdvozmjgr6rhcsc">
+            <w:hyperlink w:history="1" r:id="rIdeivb4kyiliwlmsggdsf1n">
               <w:r>
                 <w:rPr>
                   <w:color w:val="315CBB"/>
@@ -116,7 +116,7 @@
               </w:rPr>
               <w:t xml:space="preserve">   </w:t>
             </w:r>
-            <w:hyperlink w:history="1" r:id="rIdvzyuqwzp7dg_gnis3g04n">
+            <w:hyperlink w:history="1" r:id="rIdc9-neugndbyrdswr9ciho">
               <w:r>
                 <w:rPr>
                   <w:color w:val="315CBB"/>
@@ -134,7 +134,7 @@
               </w:rPr>
               <w:t xml:space="preserve">   </w:t>
             </w:r>
-            <w:hyperlink w:history="1" r:id="rId8jh8yifwxpgvdetusfl1-">
+            <w:hyperlink w:history="1" r:id="rIdjlrcvfkcbjsoffsdmc8j5">
               <w:r>
                 <w:rPr>
                   <w:color w:val="315CBB"/>
@@ -422,7 +422,7 @@
               <w:keepNext w:val="false"/>
               <w:spacing w:after="45" w:before="0" w:line="190"/>
             </w:pPr>
-            <w:hyperlink w:history="1" r:id="rId5xg_zwwecw8bpk3uxsp6b">
+            <w:hyperlink w:history="1" r:id="rIdalytpexgd-79anl7bnnx3">
               <w:r>
                 <w:rPr>
                   <w:color w:val="315CBB"/>
@@ -440,7 +440,7 @@
               </w:rPr>
               <w:t xml:space="preserve">   </w:t>
             </w:r>
-            <w:hyperlink w:history="1" r:id="rId-lduhgefn_nqjzbqhajo1">
+            <w:hyperlink w:history="1" r:id="rIdhnz75nvq6k5ymyfbifkrr">
               <w:r>
                 <w:rPr>
                   <w:color w:val="315CBB"/>
@@ -472,7 +472,7 @@
                 <w:sz w:val="18"/>
                 <w:szCs w:val="18"/>
               </w:rPr>
-              <w:t xml:space="preserve">Converting and analyzing uploaded documents</w:t>
+              <w:t xml:space="preserve">Document conversion pipeline and faster Wiki generation</w:t>
             </w:r>
           </w:p>
           <w:p>
@@ -486,7 +486,7 @@
                 <w:sz w:val="15"/>
                 <w:szCs w:val="15"/>
               </w:rPr>
-              <w:t xml:space="preserve">Extracted and repaired PDFs for retrieval and grounded answers, and reduced waiting time when processing multiple documents.</w:t>
+              <w:t xml:space="preserve">Converted uploaded PDFs for retrieval and grounded answers, and reduced Wiki generation time. Internal pass rate on 30 pages improved from 45.17% to 89.89%; analysis of 4 documents fell from 282.11s to 73.89s.</w:t>
             </w:r>
           </w:p>
           <w:p>
@@ -514,7 +514,25 @@
                 <w:szCs w:val="16"/>
               </w:rPr>
               <w:br/>
-              <w:t xml:space="preserve">Problem: Open-source conversion damaged tables and equations; full AI conversion still had errors and high API usage.</w:t>
+              <w:t xml:space="preserve"/>
+            </w:r>
+            <w:r>
+              <w:rPr>
+                <w:b/>
+                <w:bCs/>
+                <w:color w:val="203047"/>
+                <w:sz w:val="16"/>
+                <w:szCs w:val="16"/>
+              </w:rPr>
+              <w:t xml:space="preserve">Problem</w:t>
+            </w:r>
+            <w:r>
+              <w:rPr>
+                <w:color w:val="203047"/>
+                <w:sz w:val="16"/>
+                <w:szCs w:val="16"/>
+              </w:rPr>
+              <w:t xml:space="preserve"/>
             </w:r>
             <w:r>
               <w:rPr>
@@ -523,7 +541,7 @@
                 <w:szCs w:val="16"/>
               </w:rPr>
               <w:br/>
-              <w:t xml:space="preserve">Solution: Compared PDF tools and adopted AnyDoc. Repaired damaged text with AI, processed tables and equations separately, and preserved original figures.</w:t>
+              <w:t xml:space="preserve">Open-source conversion damaged tables and equations; full AI conversion still had errors and high API usage.</w:t>
             </w:r>
             <w:r>
               <w:rPr>
@@ -532,7 +550,70 @@
                 <w:szCs w:val="16"/>
               </w:rPr>
               <w:br/>
-              <w:t xml:space="preserve">Result: Internal pass rate on 30 PDF pages improved from 45.17% to 89.89%.</w:t>
+              <w:t xml:space="preserve"/>
+            </w:r>
+            <w:r>
+              <w:rPr>
+                <w:b/>
+                <w:bCs/>
+                <w:color w:val="203047"/>
+                <w:sz w:val="16"/>
+                <w:szCs w:val="16"/>
+              </w:rPr>
+              <w:t xml:space="preserve">Solution</w:t>
+            </w:r>
+            <w:r>
+              <w:rPr>
+                <w:color w:val="203047"/>
+                <w:sz w:val="16"/>
+                <w:szCs w:val="16"/>
+              </w:rPr>
+              <w:t xml:space="preserve"/>
+            </w:r>
+            <w:r>
+              <w:rPr>
+                <w:color w:val="203047"/>
+                <w:sz w:val="16"/>
+                <w:szCs w:val="16"/>
+              </w:rPr>
+              <w:br/>
+              <w:t xml:space="preserve">Compared PDF tools and adopted AnyDoc. Repaired damaged text with AI, processed tables and equations separately, and preserved original figures.</w:t>
+            </w:r>
+            <w:r>
+              <w:rPr>
+                <w:color w:val="203047"/>
+                <w:sz w:val="16"/>
+                <w:szCs w:val="16"/>
+              </w:rPr>
+              <w:br/>
+              <w:t xml:space="preserve"/>
+            </w:r>
+            <w:r>
+              <w:rPr>
+                <w:b/>
+                <w:bCs/>
+                <w:color w:val="203047"/>
+                <w:sz w:val="16"/>
+                <w:szCs w:val="16"/>
+              </w:rPr>
+              <w:t xml:space="preserve">Result</w:t>
+            </w:r>
+            <w:r>
+              <w:rPr>
+                <w:color w:val="203047"/>
+                <w:sz w:val="16"/>
+                <w:szCs w:val="16"/>
+              </w:rPr>
+              <w:t xml:space="preserve"/>
+            </w:r>
+            <w:r>
+              <w:rPr>
+                <w:color w:val="203047"/>
+                <w:sz w:val="16"/>
+                <w:szCs w:val="16"/>
+              </w:rPr>
+              <w:br/>
+              <w:t xml:space="preserve">Internal pass rate on 30 PDF pages improved from 45.17% to 89.89%.</w:t>
             </w:r>
           </w:p>
           <w:p>
@@ -560,7 +641,25 @@
                 <w:szCs w:val="16"/>
               </w:rPr>
               <w:br/>
-              <w:t xml:space="preserve">Problem: Later documents waited for earlier external AI responses.</w:t>
+              <w:t xml:space="preserve"/>
+            </w:r>
+            <w:r>
+              <w:rPr>
+                <w:b/>
+                <w:bCs/>
+                <w:color w:val="203047"/>
+                <w:sz w:val="16"/>
+                <w:szCs w:val="16"/>
+              </w:rPr>
+              <w:t xml:space="preserve">Problem</w:t>
+            </w:r>
+            <w:r>
+              <w:rPr>
+                <w:color w:val="203047"/>
+                <w:sz w:val="16"/>
+                <w:szCs w:val="16"/>
+              </w:rPr>
+              <w:t xml:space="preserve"/>
             </w:r>
             <w:r>
               <w:rPr>
@@ -569,7 +668,7 @@
                 <w:szCs w:val="16"/>
               </w:rPr>
               <w:br/>
-              <w:t xml:space="preserve">Solution: Compared worker counts and requests per worker. Capped workers at 4 to manage memory; rejected extra concurrency and GPU parallelism that slowed processing.</w:t>
+              <w:t xml:space="preserve">Later documents waited for earlier external AI responses.</w:t>
             </w:r>
             <w:r>
               <w:rPr>
@@ -578,7 +677,70 @@
                 <w:szCs w:val="16"/>
               </w:rPr>
               <w:br/>
-              <w:t xml:space="preserve">Result: Analysis of 4 documents fell from 282.11s to 73.89s (about 74% less).</w:t>
+              <w:t xml:space="preserve"/>
+            </w:r>
+            <w:r>
+              <w:rPr>
+                <w:b/>
+                <w:bCs/>
+                <w:color w:val="203047"/>
+                <w:sz w:val="16"/>
+                <w:szCs w:val="16"/>
+              </w:rPr>
+              <w:t xml:space="preserve">Solution</w:t>
+            </w:r>
+            <w:r>
+              <w:rPr>
+                <w:color w:val="203047"/>
+                <w:sz w:val="16"/>
+                <w:szCs w:val="16"/>
+              </w:rPr>
+              <w:t xml:space="preserve"/>
+            </w:r>
+            <w:r>
+              <w:rPr>
+                <w:color w:val="203047"/>
+                <w:sz w:val="16"/>
+                <w:szCs w:val="16"/>
+              </w:rPr>
+              <w:br/>
+              <w:t xml:space="preserve">Compared worker counts and requests per worker. Capped workers at 4 to manage memory; rejected extra concurrency and GPU parallelism that slowed processing.</w:t>
+            </w:r>
+            <w:r>
+              <w:rPr>
+                <w:color w:val="203047"/>
+                <w:sz w:val="16"/>
+                <w:szCs w:val="16"/>
+              </w:rPr>
+              <w:br/>
+              <w:t xml:space="preserve"/>
+            </w:r>
+            <w:r>
+              <w:rPr>
+                <w:b/>
+                <w:bCs/>
+                <w:color w:val="203047"/>
+                <w:sz w:val="16"/>
+                <w:szCs w:val="16"/>
+              </w:rPr>
+              <w:t xml:space="preserve">Result</w:t>
+            </w:r>
+            <w:r>
+              <w:rPr>
+                <w:color w:val="203047"/>
+                <w:sz w:val="16"/>
+                <w:szCs w:val="16"/>
+              </w:rPr>
+              <w:t xml:space="preserve"/>
+            </w:r>
+            <w:r>
+              <w:rPr>
+                <w:color w:val="203047"/>
+                <w:sz w:val="16"/>
+                <w:szCs w:val="16"/>
+              </w:rPr>
+              <w:br/>
+              <w:t xml:space="preserve">Analysis of 4 documents fell from 282.11s to 73.89s (about 74% less).</w:t>
             </w:r>
           </w:p>
           <w:p>
@@ -608,7 +770,7 @@
                 <w:sz w:val="15"/>
                 <w:szCs w:val="15"/>
               </w:rPr>
-              <w:t xml:space="preserve">Retrieved relevant passages from stored documents for AI answers. Improved evidence coverage and recognition of questions the documents could not answer.</w:t>
+              <w:t xml:space="preserve">Retrieved document evidence for AI answers. Coverage on 80 answerable questions rose from 66.25% to 91.25%, while false evidence returns on 20 unanswerable questions fell from 20 to 0.</w:t>
             </w:r>
           </w:p>
           <w:p>
@@ -636,74 +798,25 @@
                 <w:szCs w:val="16"/>
               </w:rPr>
               <w:br/>
-              <w:t xml:space="preserve">Problem: Retrieval missed required facts and returned evidence for unanswerable questions.</w:t>
-            </w:r>
-            <w:r>
-              <w:rPr>
-                <w:color w:val="203047"/>
-                <w:sz w:val="16"/>
-                <w:szCs w:val="16"/>
-              </w:rPr>
-              <w:br/>
-              <w:t xml:space="preserve">Solution: Applied Jev after routing tests, then controlled candidates and return limits after a full-corpus trial. Tuned to 300 candidates and up to 4 parallel batches.</w:t>
-            </w:r>
-            <w:r>
-              <w:rPr>
-                <w:color w:val="203047"/>
-                <w:sz w:val="16"/>
-                <w:szCs w:val="16"/>
-              </w:rPr>
-              <w:br/>
-              <w:t xml:space="preserve">Result: Across 9 papers, coverage on 80 answerable questions rose from 66.25% to 91.25%. False evidence returns on 20 unanswerable questions fell from 20 to 0. Median time before/after Jev tuning: 9.090s → 2.251s.</w:t>
-            </w:r>
-          </w:p>
-          <w:p>
-            <w:pPr>
-              <w:keepNext/>
-              <w:spacing w:after="65" w:before="60" w:line="190"/>
-            </w:pPr>
+              <w:t xml:space="preserve"/>
+            </w:r>
             <w:r>
               <w:rPr>
                 <w:b/>
                 <w:bCs/>
-                <w:color w:val="315CBB"/>
-                <w:sz w:val="18"/>
-                <w:szCs w:val="18"/>
-              </w:rPr>
-              <w:t xml:space="preserve">AI Agent and reusable Skills</w:t>
-            </w:r>
-          </w:p>
-          <w:p>
-            <w:pPr>
-              <w:keepNext w:val="false"/>
-              <w:spacing w:after="45" w:before="0" w:line="190"/>
-            </w:pPr>
-            <w:r>
-              <w:rPr>
-                <w:color w:val="607089"/>
-                <w:sz w:val="15"/>
-                <w:szCs w:val="15"/>
-              </w:rPr>
-              <w:t xml:space="preserve">Built natural-language document editing and folder organization, with changes applied after user approval and recurring tasks saved as reusable instructions.</w:t>
-            </w:r>
-          </w:p>
-          <w:p>
-            <w:pPr>
-              <w:pStyle w:val="ListParagraph"/>
-              <w:keepNext w:val="false"/>
-              <w:numPr>
-                <w:ilvl w:val="0"/>
-                <w:numId w:val="1"/>
-              </w:numPr>
-              <w:spacing w:after="45" w:before="0" w:line="190"/>
-            </w:pPr>
-            <w:r>
-              <w:rPr>
-                <w:color w:val="203047"/>
-                <w:sz w:val="16"/>
-                <w:szCs w:val="16"/>
-              </w:rPr>
-              <w:t xml:space="preserve">User-defined task instructions (Skills)</w:t>
+                <w:color w:val="203047"/>
+                <w:sz w:val="16"/>
+                <w:szCs w:val="16"/>
+              </w:rPr>
+              <w:t xml:space="preserve">Problem</w:t>
+            </w:r>
+            <w:r>
+              <w:rPr>
+                <w:color w:val="203047"/>
+                <w:sz w:val="16"/>
+                <w:szCs w:val="16"/>
+              </w:rPr>
+              <w:t xml:space="preserve"/>
             </w:r>
             <w:r>
               <w:rPr>
@@ -712,7 +825,7 @@
                 <w:szCs w:val="16"/>
               </w:rPr>
               <w:br/>
-              <w:t xml:space="preserve">Problem: Developers cannot build every recurring workflow users need.</w:t>
+              <w:t xml:space="preserve">Retrieval missed required facts and returned evidence for unanswerable questions.</w:t>
             </w:r>
             <w:r>
               <w:rPr>
@@ -721,217 +834,70 @@
                 <w:szCs w:val="16"/>
               </w:rPr>
               <w:br/>
-              <w:t xml:space="preserve">Solution: Built drafting, review and publishing of natural-language instructions, with checks against bypassing permissions or approval. Document changes require separate preview and approval.</w:t>
-            </w:r>
-            <w:r>
-              <w:rPr>
-                <w:color w:val="203047"/>
-                <w:sz w:val="16"/>
-                <w:szCs w:val="16"/>
-              </w:rPr>
-              <w:br/>
-              <w:t xml:space="preserve">Result: Published Skills became available to the Agent. In a 6-document check, no changes occurred before approval; 3 folders were created and documents moved afterward.</w:t>
-            </w:r>
-          </w:p>
-          <w:p>
-            <w:pPr>
-              <w:pStyle w:val="ListParagraph"/>
-              <w:keepNext w:val="false"/>
-              <w:numPr>
-                <w:ilvl w:val="0"/>
-                <w:numId w:val="1"/>
-              </w:numPr>
-              <w:spacing w:after="45" w:before="0" w:line="190"/>
-            </w:pPr>
-            <w:r>
-              <w:rPr>
-                <w:color w:val="203047"/>
-                <w:sz w:val="16"/>
-                <w:szCs w:val="16"/>
-              </w:rPr>
-              <w:t xml:space="preserve">Document editing quality</w:t>
-            </w:r>
-            <w:r>
-              <w:rPr>
-                <w:color w:val="203047"/>
-                <w:sz w:val="16"/>
-                <w:szCs w:val="16"/>
-              </w:rPr>
-              <w:br/>
-              <w:t xml:space="preserve">Problem: Some generated drafts did not fulfill editing intent.</w:t>
-            </w:r>
-            <w:r>
-              <w:rPr>
-                <w:color w:val="203047"/>
-                <w:sz w:val="16"/>
-                <w:szCs w:val="16"/>
-              </w:rPr>
-              <w:br/>
-              <w:t xml:space="preserve">Solution: Improved how edit goals and retry inputs were passed, then added semantic evaluation and at most one rewrite.</w:t>
-            </w:r>
-            <w:r>
-              <w:rPr>
-                <w:color w:val="203047"/>
-                <w:sz w:val="16"/>
-                <w:szCs w:val="16"/>
-              </w:rPr>
-              <w:br/>
-              <w:t xml:space="preserve">Result: Passes on the same 114 drafts increased from 94 to 104.</w:t>
-            </w:r>
-          </w:p>
-          <w:p>
-            <w:pPr>
-              <w:keepNext/>
-              <w:spacing w:after="65" w:before="60" w:line="190"/>
-            </w:pPr>
+              <w:t xml:space="preserve"/>
+            </w:r>
             <w:r>
               <w:rPr>
                 <w:b/>
                 <w:bCs/>
-                <w:color w:val="315CBB"/>
-                <w:sz w:val="18"/>
-                <w:szCs w:val="18"/>
-              </w:rPr>
-              <w:t xml:space="preserve">Service responsibilities and communication</w:t>
-            </w:r>
-          </w:p>
-          <w:p>
-            <w:pPr>
-              <w:keepNext w:val="false"/>
-              <w:spacing w:after="45" w:before="0" w:line="190"/>
-            </w:pPr>
-            <w:r>
-              <w:rPr>
-                <w:color w:val="607089"/>
-                <w:sz w:val="15"/>
-                <w:szCs w:val="15"/>
-              </w:rPr>
-              <w:t xml:space="preserve">Defined responsibilities, data ownership and communication for services including AI. Proposed the initial design and finalized it with teammates and mentors.</w:t>
-            </w:r>
-          </w:p>
-          <w:p>
-            <w:pPr>
-              <w:pStyle w:val="ListParagraph"/>
-              <w:keepNext w:val="false"/>
-              <w:numPr>
-                <w:ilvl w:val="0"/>
-                <w:numId w:val="1"/>
-              </w:numPr>
-              <w:spacing w:after="45" w:before="0" w:line="190"/>
-            </w:pPr>
-            <w:r>
-              <w:rPr>
-                <w:color w:val="203047"/>
-                <w:sz w:val="16"/>
-                <w:szCs w:val="16"/>
-              </w:rPr>
-              <w:t xml:space="preserve">Proposed the initial MSA design, then jointly finalized service boundaries, data ownership and communication with teammates and mentors.</w:t>
-            </w:r>
-          </w:p>
-          <w:p>
-            <w:pPr>
-              <w:keepNext w:val="false"/>
-              <w:spacing w:after="45" w:before="0" w:line="190"/>
-            </w:pPr>
-            <w:r>
-              <w:rPr>
-                <w:color w:val="607089"/>
-                <w:sz w:val="15"/>
-                <w:szCs w:val="15"/>
-              </w:rPr>
-              <w:t xml:space="preserve">Internal evaluations. RAG timing compares Jev before/after tuning. Parallel document timing covers analysis only, excluding storage and post-processing.</w:t>
-            </w:r>
-          </w:p>
-          <w:p>
-            <w:pPr>
-              <w:keepNext w:val="false"/>
-              <w:spacing w:after="45" w:before="0" w:line="190"/>
-            </w:pPr>
-            <w:r>
-              <w:rPr>
-                <w:color w:val="607089"/>
-                <w:sz w:val="15"/>
-                <w:szCs w:val="15"/>
-              </w:rPr>
-              <w:t xml:space="preserve">See the detailed portfolio for the problem-solving process and experimental results.</w:t>
-            </w:r>
-          </w:p>
-          <w:p>
-            <w:pPr>
-              <w:keepNext w:val="false"/>
-              <w:spacing w:after="45" w:before="0" w:line="190"/>
-            </w:pPr>
-            <w:hyperlink w:history="1" r:id="rIdlo16ctd5nwp_kfmkxd_hp">
-              <w:r>
-                <w:rPr>
-                  <w:color w:val="315CBB"/>
-                  <w:sz w:val="16"/>
-                  <w:szCs w:val="16"/>
-                </w:rPr>
-                <w:t xml:space="preserve">PDF conversion ↗</w:t>
-              </w:r>
-            </w:hyperlink>
-            <w:r>
-              <w:rPr>
-                <w:color w:val="203047"/>
-                <w:sz w:val="16"/>
-                <w:szCs w:val="16"/>
-              </w:rPr>
-              <w:t xml:space="preserve">   </w:t>
-            </w:r>
-            <w:hyperlink w:history="1" r:id="rId4xg4dbm6--mq8psvmr16a">
-              <w:r>
-                <w:rPr>
-                  <w:color w:val="315CBB"/>
-                  <w:sz w:val="16"/>
-                  <w:szCs w:val="16"/>
-                </w:rPr>
-                <w:t xml:space="preserve">Parallel document processing ↗</w:t>
-              </w:r>
-            </w:hyperlink>
-            <w:r>
-              <w:rPr>
-                <w:color w:val="203047"/>
-                <w:sz w:val="16"/>
-                <w:szCs w:val="16"/>
-              </w:rPr>
-              <w:t xml:space="preserve">   </w:t>
-            </w:r>
-            <w:hyperlink w:history="1" r:id="rId5sbvljez2zjux5tfpogin">
-              <w:r>
-                <w:rPr>
-                  <w:color w:val="315CBB"/>
-                  <w:sz w:val="16"/>
-                  <w:szCs w:val="16"/>
-                </w:rPr>
-                <w:t xml:space="preserve">Agent Skill design ↗</w:t>
-              </w:r>
-            </w:hyperlink>
-            <w:r>
-              <w:rPr>
-                <w:color w:val="203047"/>
-                <w:sz w:val="16"/>
-                <w:szCs w:val="16"/>
-              </w:rPr>
-              <w:t xml:space="preserve">   </w:t>
-            </w:r>
-            <w:hyperlink w:history="1" r:id="rIdeckw34htwkjuaxjq0d9l_">
-              <w:r>
-                <w:rPr>
-                  <w:color w:val="315CBB"/>
-                  <w:sz w:val="16"/>
-                  <w:szCs w:val="16"/>
-                </w:rPr>
-                <w:t xml:space="preserve">RAG evidence selection ↗</w:t>
-              </w:r>
-            </w:hyperlink>
-            <w:r>
-              <w:rPr>
-                <w:color w:val="203047"/>
-                <w:sz w:val="16"/>
-                <w:szCs w:val="16"/>
-              </w:rPr>
-              <w:t xml:space="preserve">   </w:t>
+                <w:color w:val="203047"/>
+                <w:sz w:val="16"/>
+                <w:szCs w:val="16"/>
+              </w:rPr>
+              <w:t xml:space="preserve">Solution</w:t>
+            </w:r>
+            <w:r>
+              <w:rPr>
+                <w:color w:val="203047"/>
+                <w:sz w:val="16"/>
+                <w:szCs w:val="16"/>
+              </w:rPr>
+              <w:t xml:space="preserve"/>
+            </w:r>
+            <w:r>
+              <w:rPr>
+                <w:color w:val="203047"/>
+                <w:sz w:val="16"/>
+                <w:szCs w:val="16"/>
+              </w:rPr>
+              <w:br/>
+              <w:t xml:space="preserve">Applied Jev after routing tests, then controlled candidates and return limits after a full-corpus trial. Tuned to 300 candidates and up to 4 parallel batches.</w:t>
+            </w:r>
+            <w:r>
+              <w:rPr>
+                <w:color w:val="203047"/>
+                <w:sz w:val="16"/>
+                <w:szCs w:val="16"/>
+              </w:rPr>
+              <w:br/>
+              <w:t xml:space="preserve"/>
+            </w:r>
+            <w:r>
+              <w:rPr>
+                <w:b/>
+                <w:bCs/>
+                <w:color w:val="203047"/>
+                <w:sz w:val="16"/>
+                <w:szCs w:val="16"/>
+              </w:rPr>
+              <w:t xml:space="preserve">Result</w:t>
+            </w:r>
+            <w:r>
+              <w:rPr>
+                <w:color w:val="203047"/>
+                <w:sz w:val="16"/>
+                <w:szCs w:val="16"/>
+              </w:rPr>
+              <w:t xml:space="preserve"/>
+            </w:r>
+            <w:r>
+              <w:rPr>
+                <w:color w:val="203047"/>
+                <w:sz w:val="16"/>
+                <w:szCs w:val="16"/>
+              </w:rPr>
+              <w:br/>
+              <w:t xml:space="preserve">Across 9 papers, coverage on 80 answerable questions rose from 66.25% to 91.25%. False evidence returns on 20 unanswerable questions fell from 20 to 0. Median time before/after Jev tuning: 9.090s → 2.251s.</w:t>
             </w:r>
           </w:p>
         </w:tc>
@@ -946,6 +912,944 @@
       <w:pPr>
         <w:sectPr>
           <w:footerReference w:type="default" r:id="rId7"/>
+          <w:pgSz w:w="11906" w:h="16838" w:orient="portrait"/>
+          <w:pgMar w:top="737" w:right="794" w:bottom="907" w:left="794" w:header="708" w:footer="454" w:gutter="0"/>
+          <w:pgNumType/>
+          <w:docGrid w:linePitch="360"/>
+        </w:sectPr>
+      </w:pPr>
+    </w:p>
+    <w:p>
+      <w:pPr>
+        <w:keepNext/>
+        <w:pBdr>
+          <w:bottom w:val="single" w:color="6A80BD" w:sz="10" w:space="4"/>
+        </w:pBdr>
+        <w:spacing w:after="65" w:before="160" w:line="190"/>
+      </w:pPr>
+      <w:r>
+        <w:rPr>
+          <w:b/>
+          <w:bCs/>
+          <w:color w:val="315CBB"/>
+          <w:sz w:val="20"/>
+          <w:szCs w:val="20"/>
+        </w:rPr>
+        <w:t xml:space="preserve">PROJECTS &amp; EXPERIENCE</w:t>
+      </w:r>
+    </w:p>
+    <w:tbl>
+      <w:tblPr>
+        <w:tblW w:type="pct" w:w="100%"/>
+        <w:tblBorders>
+          <w:top w:val="single" w:color="DCE2EC" w:sz="5"/>
+          <w:left w:val="single" w:color="DCE2EC" w:sz="5"/>
+          <w:bottom w:val="single" w:color="DCE2EC" w:sz="5"/>
+          <w:right w:val="single" w:color="DCE2EC" w:sz="5"/>
+          <w:insideH w:val="single" w:color="DCE2EC" w:sz="5"/>
+          <w:insideV w:val="single" w:color="DCE2EC" w:sz="5"/>
+        </w:tblBorders>
+      </w:tblPr>
+      <w:tblGrid>
+        <w:gridCol w:w="100"/>
+      </w:tblGrid>
+      <w:tr>
+        <w:tc>
+          <w:tcPr>
+            <w:tcW w:type="pct" w:w="100%"/>
+            <w:tcMar>
+              <w:top w:type="dxa" w:w="100"/>
+              <w:left w:type="dxa" w:w="140"/>
+              <w:bottom w:type="dxa" w:w="100"/>
+              <w:right w:type="dxa" w:w="140"/>
+            </w:tcMar>
+          </w:tcPr>
+          <w:tbl>
+            <w:tblPr>
+              <w:tblW w:type="pct" w:w="100%"/>
+              <w:tblBorders>
+                <w:top w:val="none" w:color="FFFFFF" w:sz="0"/>
+                <w:left w:val="none" w:color="FFFFFF" w:sz="0"/>
+                <w:bottom w:val="none" w:color="FFFFFF" w:sz="0"/>
+                <w:right w:val="none" w:color="FFFFFF" w:sz="0"/>
+                <w:insideH w:val="none" w:color="FFFFFF" w:sz="0"/>
+                <w:insideV w:val="none" w:color="FFFFFF" w:sz="0"/>
+              </w:tblBorders>
+            </w:tblPr>
+            <w:tblGrid>
+              <w:gridCol w:w="100"/>
+              <w:gridCol w:w="100"/>
+            </w:tblGrid>
+            <w:tr>
+              <w:tc>
+                <w:tcPr>
+                  <w:tcW w:type="pct" w:w="72%"/>
+                  <w:tcMar>
+                    <w:top w:type="dxa" w:w="20"/>
+                    <w:left w:type="dxa" w:w="40"/>
+                    <w:bottom w:type="dxa" w:w="20"/>
+                    <w:right w:type="dxa" w:w="40"/>
+                  </w:tcMar>
+                </w:tcPr>
+                <w:p>
+                  <w:pPr>
+                    <w:keepNext/>
+                    <w:spacing w:after="65" w:before="60" w:line="190"/>
+                  </w:pPr>
+                  <w:r>
+                    <w:rPr>
+                      <w:b/>
+                      <w:bCs/>
+                      <w:color w:val="315CBB"/>
+                      <w:sz w:val="23"/>
+                      <w:szCs w:val="23"/>
+                    </w:rPr>
+                    <w:t xml:space="preserve">Fruition — continued</w:t>
+                  </w:r>
+                </w:p>
+              </w:tc>
+              <w:tc>
+                <w:tcPr>
+                  <w:tcW w:type="pct" w:w="28%"/>
+                  <w:tcMar>
+                    <w:top w:type="dxa" w:w="20"/>
+                    <w:left w:type="dxa" w:w="40"/>
+                    <w:bottom w:type="dxa" w:w="20"/>
+                    <w:right w:type="dxa" w:w="40"/>
+                  </w:tcMar>
+                </w:tcPr>
+                <w:p>
+                  <w:pPr>
+                    <w:keepNext w:val="false"/>
+                    <w:spacing w:after="45" w:before="0" w:line="190"/>
+                  </w:pPr>
+                  <w:r>
+                    <w:rPr>
+                      <w:color w:val="203047"/>
+                      <w:sz w:val="16"/>
+                      <w:szCs w:val="16"/>
+                    </w:rPr>
+                    <w:t xml:space="preserve">2026.04 — Present</w:t>
+                  </w:r>
+                </w:p>
+              </w:tc>
+            </w:tr>
+          </w:tbl>
+          <w:p>
+            <w:pPr>
+              <w:spacing w:after="0" w:before="0" w:line="40"/>
+            </w:pPr>
+          </w:p>
+          <w:p>
+            <w:pPr>
+              <w:keepNext/>
+              <w:spacing w:after="65" w:before="60" w:line="190"/>
+            </w:pPr>
+            <w:r>
+              <w:rPr>
+                <w:b/>
+                <w:bCs/>
+                <w:color w:val="315CBB"/>
+                <w:sz w:val="18"/>
+                <w:szCs w:val="18"/>
+              </w:rPr>
+              <w:t xml:space="preserve">Reusable Skills and improved AI Agent routing</w:t>
+            </w:r>
+          </w:p>
+          <w:p>
+            <w:pPr>
+              <w:keepNext w:val="false"/>
+              <w:spacing w:after="45" w:before="0" w:line="190"/>
+            </w:pPr>
+            <w:r>
+              <w:rPr>
+                <w:color w:val="607089"/>
+                <w:sz w:val="15"/>
+                <w:szCs w:val="15"/>
+              </w:rPr>
+              <w:t xml:space="preserve">Built reusable Skills with user approval before changes. Applied Jev to route requests to questions, edits and other tasks: correct decisions rose from 77/98 to 81/98, and median decision time fell from 8.967s to 0.658s.</w:t>
+            </w:r>
+          </w:p>
+          <w:p>
+            <w:pPr>
+              <w:pStyle w:val="ListParagraph"/>
+              <w:keepNext w:val="false"/>
+              <w:numPr>
+                <w:ilvl w:val="0"/>
+                <w:numId w:val="1"/>
+              </w:numPr>
+              <w:spacing w:after="45" w:before="0" w:line="190"/>
+            </w:pPr>
+            <w:r>
+              <w:rPr>
+                <w:color w:val="203047"/>
+                <w:sz w:val="16"/>
+                <w:szCs w:val="16"/>
+              </w:rPr>
+              <w:t xml:space="preserve">User-defined task instructions (Skills)</w:t>
+            </w:r>
+            <w:r>
+              <w:rPr>
+                <w:color w:val="203047"/>
+                <w:sz w:val="16"/>
+                <w:szCs w:val="16"/>
+              </w:rPr>
+              <w:br/>
+              <w:t xml:space="preserve"/>
+            </w:r>
+            <w:r>
+              <w:rPr>
+                <w:b/>
+                <w:bCs/>
+                <w:color w:val="203047"/>
+                <w:sz w:val="16"/>
+                <w:szCs w:val="16"/>
+              </w:rPr>
+              <w:t xml:space="preserve">Problem</w:t>
+            </w:r>
+            <w:r>
+              <w:rPr>
+                <w:color w:val="203047"/>
+                <w:sz w:val="16"/>
+                <w:szCs w:val="16"/>
+              </w:rPr>
+              <w:t xml:space="preserve"/>
+            </w:r>
+            <w:r>
+              <w:rPr>
+                <w:color w:val="203047"/>
+                <w:sz w:val="16"/>
+                <w:szCs w:val="16"/>
+              </w:rPr>
+              <w:br/>
+              <w:t xml:space="preserve">Developers cannot build every recurring workflow users need.</w:t>
+            </w:r>
+            <w:r>
+              <w:rPr>
+                <w:color w:val="203047"/>
+                <w:sz w:val="16"/>
+                <w:szCs w:val="16"/>
+              </w:rPr>
+              <w:br/>
+              <w:t xml:space="preserve"/>
+            </w:r>
+            <w:r>
+              <w:rPr>
+                <w:b/>
+                <w:bCs/>
+                <w:color w:val="203047"/>
+                <w:sz w:val="16"/>
+                <w:szCs w:val="16"/>
+              </w:rPr>
+              <w:t xml:space="preserve">Solution</w:t>
+            </w:r>
+            <w:r>
+              <w:rPr>
+                <w:color w:val="203047"/>
+                <w:sz w:val="16"/>
+                <w:szCs w:val="16"/>
+              </w:rPr>
+              <w:t xml:space="preserve"/>
+            </w:r>
+            <w:r>
+              <w:rPr>
+                <w:color w:val="203047"/>
+                <w:sz w:val="16"/>
+                <w:szCs w:val="16"/>
+              </w:rPr>
+              <w:br/>
+              <w:t xml:space="preserve">Built drafting, review and publishing of natural-language instructions, with checks against bypassing permissions or approval. Document changes require separate preview and approval.</w:t>
+            </w:r>
+            <w:r>
+              <w:rPr>
+                <w:color w:val="203047"/>
+                <w:sz w:val="16"/>
+                <w:szCs w:val="16"/>
+              </w:rPr>
+              <w:br/>
+              <w:t xml:space="preserve"/>
+            </w:r>
+            <w:r>
+              <w:rPr>
+                <w:b/>
+                <w:bCs/>
+                <w:color w:val="203047"/>
+                <w:sz w:val="16"/>
+                <w:szCs w:val="16"/>
+              </w:rPr>
+              <w:t xml:space="preserve">Result</w:t>
+            </w:r>
+            <w:r>
+              <w:rPr>
+                <w:color w:val="203047"/>
+                <w:sz w:val="16"/>
+                <w:szCs w:val="16"/>
+              </w:rPr>
+              <w:t xml:space="preserve"/>
+            </w:r>
+            <w:r>
+              <w:rPr>
+                <w:color w:val="203047"/>
+                <w:sz w:val="16"/>
+                <w:szCs w:val="16"/>
+              </w:rPr>
+              <w:br/>
+              <w:t xml:space="preserve">Published Skills became available to the Agent. In a 6-document check, no changes occurred before approval; 3 folders were created and documents moved afterward.</w:t>
+            </w:r>
+          </w:p>
+          <w:p>
+            <w:pPr>
+              <w:pStyle w:val="ListParagraph"/>
+              <w:keepNext w:val="false"/>
+              <w:numPr>
+                <w:ilvl w:val="0"/>
+                <w:numId w:val="1"/>
+              </w:numPr>
+              <w:spacing w:after="45" w:before="0" w:line="190"/>
+            </w:pPr>
+            <w:r>
+              <w:rPr>
+                <w:color w:val="203047"/>
+                <w:sz w:val="16"/>
+                <w:szCs w:val="16"/>
+              </w:rPr>
+              <w:t xml:space="preserve">Jev-based request routing</w:t>
+            </w:r>
+            <w:r>
+              <w:rPr>
+                <w:color w:val="203047"/>
+                <w:sz w:val="16"/>
+                <w:szCs w:val="16"/>
+              </w:rPr>
+              <w:br/>
+              <w:t xml:space="preserve"/>
+            </w:r>
+            <w:r>
+              <w:rPr>
+                <w:b/>
+                <w:bCs/>
+                <w:color w:val="203047"/>
+                <w:sz w:val="16"/>
+                <w:szCs w:val="16"/>
+              </w:rPr>
+              <w:t xml:space="preserve">Problem</w:t>
+            </w:r>
+            <w:r>
+              <w:rPr>
+                <w:color w:val="203047"/>
+                <w:sz w:val="16"/>
+                <w:szCs w:val="16"/>
+              </w:rPr>
+              <w:t xml:space="preserve"/>
+            </w:r>
+            <w:r>
+              <w:rPr>
+                <w:color w:val="203047"/>
+                <w:sz w:val="16"/>
+                <w:szCs w:val="16"/>
+              </w:rPr>
+              <w:br/>
+              <w:t xml:space="preserve">Misclassifying questions as edits led to the wrong action.</w:t>
+            </w:r>
+            <w:r>
+              <w:rPr>
+                <w:color w:val="203047"/>
+                <w:sz w:val="16"/>
+                <w:szCs w:val="16"/>
+              </w:rPr>
+              <w:br/>
+              <w:t xml:space="preserve"/>
+            </w:r>
+            <w:r>
+              <w:rPr>
+                <w:b/>
+                <w:bCs/>
+                <w:color w:val="203047"/>
+                <w:sz w:val="16"/>
+                <w:szCs w:val="16"/>
+              </w:rPr>
+              <w:t xml:space="preserve">Solution</w:t>
+            </w:r>
+            <w:r>
+              <w:rPr>
+                <w:color w:val="203047"/>
+                <w:sz w:val="16"/>
+                <w:szCs w:val="16"/>
+              </w:rPr>
+              <w:t xml:space="preserve"/>
+            </w:r>
+            <w:r>
+              <w:rPr>
+                <w:color w:val="203047"/>
+                <w:sz w:val="16"/>
+                <w:szCs w:val="16"/>
+              </w:rPr>
+              <w:br/>
+              <w:t xml:space="preserve">Applied Jev to select task types and additional conditions for questions, edits, document creation and folder organization.</w:t>
+            </w:r>
+            <w:r>
+              <w:rPr>
+                <w:color w:val="203047"/>
+                <w:sz w:val="16"/>
+                <w:szCs w:val="16"/>
+              </w:rPr>
+              <w:br/>
+              <w:t xml:space="preserve"/>
+            </w:r>
+            <w:r>
+              <w:rPr>
+                <w:b/>
+                <w:bCs/>
+                <w:color w:val="203047"/>
+                <w:sz w:val="16"/>
+                <w:szCs w:val="16"/>
+              </w:rPr>
+              <w:t xml:space="preserve">Result</w:t>
+            </w:r>
+            <w:r>
+              <w:rPr>
+                <w:color w:val="203047"/>
+                <w:sz w:val="16"/>
+                <w:szCs w:val="16"/>
+              </w:rPr>
+              <w:t xml:space="preserve"/>
+            </w:r>
+            <w:r>
+              <w:rPr>
+                <w:color w:val="203047"/>
+                <w:sz w:val="16"/>
+                <w:szCs w:val="16"/>
+              </w:rPr>
+              <w:br/>
+              <w:t xml:space="preserve">Fully correct decisions on the same 98 requests rose from 77 to 81. Median decision time fell from 8.967s to 0.658s.</w:t>
+            </w:r>
+          </w:p>
+          <w:p>
+            <w:pPr>
+              <w:keepNext/>
+              <w:spacing w:after="65" w:before="60" w:line="190"/>
+            </w:pPr>
+            <w:r>
+              <w:rPr>
+                <w:b/>
+                <w:bCs/>
+                <w:color w:val="315CBB"/>
+                <w:sz w:val="18"/>
+                <w:szCs w:val="18"/>
+              </w:rPr>
+              <w:t xml:space="preserve">Service responsibilities and communication</w:t>
+            </w:r>
+          </w:p>
+          <w:p>
+            <w:pPr>
+              <w:keepNext w:val="false"/>
+              <w:spacing w:after="45" w:before="0" w:line="190"/>
+            </w:pPr>
+            <w:r>
+              <w:rPr>
+                <w:color w:val="607089"/>
+                <w:sz w:val="15"/>
+                <w:szCs w:val="15"/>
+              </w:rPr>
+              <w:t xml:space="preserve">Defined responsibilities, data ownership and communication for services including AI. Proposed the initial design and finalized it with teammates and mentors.</w:t>
+            </w:r>
+          </w:p>
+          <w:p>
+            <w:pPr>
+              <w:pStyle w:val="ListParagraph"/>
+              <w:keepNext w:val="false"/>
+              <w:numPr>
+                <w:ilvl w:val="0"/>
+                <w:numId w:val="1"/>
+              </w:numPr>
+              <w:spacing w:after="45" w:before="0" w:line="190"/>
+            </w:pPr>
+            <w:r>
+              <w:rPr>
+                <w:color w:val="203047"/>
+                <w:sz w:val="16"/>
+                <w:szCs w:val="16"/>
+              </w:rPr>
+              <w:t xml:space="preserve">Proposed the initial MSA design, then jointly finalized service boundaries, data ownership and communication with teammates and mentors.</w:t>
+            </w:r>
+          </w:p>
+          <w:p>
+            <w:pPr>
+              <w:keepNext w:val="false"/>
+              <w:spacing w:after="45" w:before="0" w:line="190"/>
+            </w:pPr>
+            <w:r>
+              <w:rPr>
+                <w:color w:val="607089"/>
+                <w:sz w:val="15"/>
+                <w:szCs w:val="15"/>
+              </w:rPr>
+              <w:t xml:space="preserve">Internal evaluations. RAG timing compares Jev before/after tuning. Parallel document timing covers analysis only, excluding storage and post-processing.</w:t>
+            </w:r>
+          </w:p>
+          <w:p>
+            <w:pPr>
+              <w:keepNext w:val="false"/>
+              <w:spacing w:after="45" w:before="0" w:line="190"/>
+            </w:pPr>
+            <w:r>
+              <w:rPr>
+                <w:color w:val="607089"/>
+                <w:sz w:val="15"/>
+                <w:szCs w:val="15"/>
+              </w:rPr>
+              <w:t xml:space="preserve">See the detailed portfolio for the problem-solving process and experimental results.</w:t>
+            </w:r>
+          </w:p>
+          <w:p>
+            <w:pPr>
+              <w:keepNext w:val="false"/>
+              <w:spacing w:after="45" w:before="0" w:line="190"/>
+            </w:pPr>
+            <w:hyperlink w:history="1" r:id="rIdw_yqucaur_0kefkhgzjr4">
+              <w:r>
+                <w:rPr>
+                  <w:color w:val="315CBB"/>
+                  <w:sz w:val="16"/>
+                  <w:szCs w:val="16"/>
+                </w:rPr>
+                <w:t xml:space="preserve">PDF conversion ↗</w:t>
+              </w:r>
+            </w:hyperlink>
+            <w:r>
+              <w:rPr>
+                <w:color w:val="203047"/>
+                <w:sz w:val="16"/>
+                <w:szCs w:val="16"/>
+              </w:rPr>
+              <w:t xml:space="preserve">   </w:t>
+            </w:r>
+            <w:hyperlink w:history="1" r:id="rIdipuxac32_isj2kvumpjhc">
+              <w:r>
+                <w:rPr>
+                  <w:color w:val="315CBB"/>
+                  <w:sz w:val="16"/>
+                  <w:szCs w:val="16"/>
+                </w:rPr>
+                <w:t xml:space="preserve">Parallel document processing ↗</w:t>
+              </w:r>
+            </w:hyperlink>
+            <w:r>
+              <w:rPr>
+                <w:color w:val="203047"/>
+                <w:sz w:val="16"/>
+                <w:szCs w:val="16"/>
+              </w:rPr>
+              <w:t xml:space="preserve">   </w:t>
+            </w:r>
+            <w:hyperlink w:history="1" r:id="rIdln6lcdcy25kusdqfbihg0">
+              <w:r>
+                <w:rPr>
+                  <w:color w:val="315CBB"/>
+                  <w:sz w:val="16"/>
+                  <w:szCs w:val="16"/>
+                </w:rPr>
+                <w:t xml:space="preserve">Agent Skill design ↗</w:t>
+              </w:r>
+            </w:hyperlink>
+            <w:r>
+              <w:rPr>
+                <w:color w:val="203047"/>
+                <w:sz w:val="16"/>
+                <w:szCs w:val="16"/>
+              </w:rPr>
+              <w:t xml:space="preserve">   </w:t>
+            </w:r>
+            <w:hyperlink w:history="1" r:id="rId2otgpegvcyamu51_hihn3">
+              <w:r>
+                <w:rPr>
+                  <w:color w:val="315CBB"/>
+                  <w:sz w:val="16"/>
+                  <w:szCs w:val="16"/>
+                </w:rPr>
+                <w:t xml:space="preserve">RAG evidence selection ↗</w:t>
+              </w:r>
+            </w:hyperlink>
+            <w:r>
+              <w:rPr>
+                <w:color w:val="203047"/>
+                <w:sz w:val="16"/>
+                <w:szCs w:val="16"/>
+              </w:rPr>
+              <w:t xml:space="preserve">   </w:t>
+            </w:r>
+          </w:p>
+        </w:tc>
+      </w:tr>
+    </w:tbl>
+    <w:p>
+      <w:pPr>
+        <w:spacing w:after="0" w:before="0" w:line="40"/>
+      </w:pPr>
+    </w:p>
+    <w:p>
+      <w:pPr>
+        <w:keepNext/>
+        <w:pBdr>
+          <w:bottom w:val="single" w:color="6A80BD" w:sz="10" w:space="4"/>
+        </w:pBdr>
+        <w:spacing w:after="65" w:before="160" w:line="190"/>
+      </w:pPr>
+      <w:r>
+        <w:rPr>
+          <w:b/>
+          <w:bCs/>
+          <w:color w:val="315CBB"/>
+          <w:sz w:val="20"/>
+          <w:szCs w:val="20"/>
+        </w:rPr>
+        <w:t xml:space="preserve">Skills </w:t>
+      </w:r>
+      <w:r>
+        <w:rPr>
+          <w:b/>
+          <w:bCs/>
+          <w:color w:val="315CBB"/>
+          <w:sz w:val="20"/>
+          <w:szCs w:val="20"/>
+        </w:rPr>
+        <w:br/>
+        <w:t xml:space="preserve"/>
+      </w:r>
+    </w:p>
+    <w:tbl>
+      <w:tblPr>
+        <w:tblW w:type="pct" w:w="100%"/>
+        <w:tblBorders>
+          <w:top w:val="none" w:color="FFFFFF" w:sz="0"/>
+          <w:left w:val="none" w:color="FFFFFF" w:sz="0"/>
+          <w:bottom w:val="none" w:color="FFFFFF" w:sz="0"/>
+          <w:right w:val="none" w:color="FFFFFF" w:sz="0"/>
+          <w:insideH w:val="none" w:color="FFFFFF" w:sz="0"/>
+          <w:insideV w:val="none" w:color="FFFFFF" w:sz="0"/>
+        </w:tblBorders>
+      </w:tblPr>
+      <w:tblGrid>
+        <w:gridCol w:w="100"/>
+        <w:gridCol w:w="100"/>
+      </w:tblGrid>
+      <w:tr>
+        <w:tc>
+          <w:tcPr>
+            <w:tcW w:type="pct" w:w="20%"/>
+            <w:tcMar>
+              <w:top w:type="dxa" w:w="20"/>
+              <w:left w:type="dxa" w:w="40"/>
+              <w:bottom w:type="dxa" w:w="20"/>
+              <w:right w:type="dxa" w:w="40"/>
+            </w:tcMar>
+          </w:tcPr>
+          <w:p>
+            <w:pPr>
+              <w:keepNext w:val="false"/>
+              <w:spacing w:after="45" w:before="0" w:line="190"/>
+            </w:pPr>
+            <w:r>
+              <w:rPr>
+                <w:b/>
+                <w:bCs/>
+                <w:color w:val="203047"/>
+                <w:sz w:val="16"/>
+                <w:szCs w:val="16"/>
+              </w:rPr>
+              <w:t xml:space="preserve">Backend</w:t>
+            </w:r>
+          </w:p>
+        </w:tc>
+        <w:tc>
+          <w:tcPr>
+            <w:tcW w:type="pct" w:w="80%"/>
+            <w:tcMar>
+              <w:top w:type="dxa" w:w="20"/>
+              <w:left w:type="dxa" w:w="40"/>
+              <w:bottom w:type="dxa" w:w="20"/>
+              <w:right w:type="dxa" w:w="40"/>
+            </w:tcMar>
+          </w:tcPr>
+          <w:p>
+            <w:pPr>
+              <w:keepNext w:val="false"/>
+              <w:spacing w:after="45" w:before="0" w:line="190"/>
+            </w:pPr>
+            <w:r>
+              <w:rPr>
+                <w:color w:val="203047"/>
+                <w:sz w:val="16"/>
+                <w:szCs w:val="16"/>
+              </w:rPr>
+              <w:t xml:space="preserve">Java · Spring Boot · Spring AI · Python</w:t>
+            </w:r>
+          </w:p>
+          <w:p>
+            <w:pPr>
+              <w:keepNext w:val="false"/>
+              <w:spacing w:after="45" w:before="0" w:line="190"/>
+            </w:pPr>
+            <w:r>
+              <w:rPr>
+                <w:color w:val="607089"/>
+                <w:sz w:val="15"/>
+                <w:szCs w:val="15"/>
+              </w:rPr>
+              <w:t xml:space="preserve">Authentication and authorization (Spring Security, OAuth 2.0)</w:t>
+            </w:r>
+            <w:r>
+              <w:rPr>
+                <w:color w:val="607089"/>
+                <w:sz w:val="15"/>
+                <w:szCs w:val="15"/>
+              </w:rPr>
+              <w:t xml:space="preserve"/>
+            </w:r>
+            <w:r>
+              <w:rPr>
+                <w:color w:val="607089"/>
+                <w:sz w:val="15"/>
+                <w:szCs w:val="15"/>
+              </w:rPr>
+              <w:br/>
+              <w:t xml:space="preserve"/>
+            </w:r>
+            <w:hyperlink w:history="1" r:id="rIdkyel9iw6nu2xtz3fneqgy">
+              <w:r>
+                <w:rPr>
+                  <w:color w:val="315CBB"/>
+                  <w:sz w:val="15"/>
+                  <w:szCs w:val="15"/>
+                </w:rPr>
+                <w:t xml:space="preserve">Personal shopping project · Login ↗</w:t>
+              </w:r>
+            </w:hyperlink>
+            <w:hyperlink w:history="1" r:id="rIdnpbluupftioqtj6k1ekqq">
+              <w:r>
+                <w:rPr>
+                  <w:color w:val="315CBB"/>
+                  <w:sz w:val="15"/>
+                  <w:szCs w:val="15"/>
+                </w:rPr>
+                <w:t xml:space="preserve">Todo web app · OAuth ↗</w:t>
+              </w:r>
+            </w:hyperlink>
+          </w:p>
+        </w:tc>
+      </w:tr>
+    </w:tbl>
+    <w:p>
+      <w:pPr>
+        <w:spacing w:after="0" w:before="0" w:line="40"/>
+      </w:pPr>
+    </w:p>
+    <w:tbl>
+      <w:tblPr>
+        <w:tblW w:type="pct" w:w="100%"/>
+        <w:tblBorders>
+          <w:top w:val="none" w:color="FFFFFF" w:sz="0"/>
+          <w:left w:val="none" w:color="FFFFFF" w:sz="0"/>
+          <w:bottom w:val="none" w:color="FFFFFF" w:sz="0"/>
+          <w:right w:val="none" w:color="FFFFFF" w:sz="0"/>
+          <w:insideH w:val="none" w:color="FFFFFF" w:sz="0"/>
+          <w:insideV w:val="none" w:color="FFFFFF" w:sz="0"/>
+        </w:tblBorders>
+      </w:tblPr>
+      <w:tblGrid>
+        <w:gridCol w:w="100"/>
+        <w:gridCol w:w="100"/>
+      </w:tblGrid>
+      <w:tr>
+        <w:tc>
+          <w:tcPr>
+            <w:tcW w:type="pct" w:w="20%"/>
+            <w:tcMar>
+              <w:top w:type="dxa" w:w="20"/>
+              <w:left w:type="dxa" w:w="40"/>
+              <w:bottom w:type="dxa" w:w="20"/>
+              <w:right w:type="dxa" w:w="40"/>
+            </w:tcMar>
+          </w:tcPr>
+          <w:p>
+            <w:pPr>
+              <w:keepNext w:val="false"/>
+              <w:spacing w:after="45" w:before="0" w:line="190"/>
+            </w:pPr>
+            <w:r>
+              <w:rPr>
+                <w:b/>
+                <w:bCs/>
+                <w:color w:val="203047"/>
+                <w:sz w:val="16"/>
+                <w:szCs w:val="16"/>
+              </w:rPr>
+              <w:t xml:space="preserve">AI &amp; Search</w:t>
+            </w:r>
+          </w:p>
+        </w:tc>
+        <w:tc>
+          <w:tcPr>
+            <w:tcW w:type="pct" w:w="80%"/>
+            <w:tcMar>
+              <w:top w:type="dxa" w:w="20"/>
+              <w:left w:type="dxa" w:w="40"/>
+              <w:bottom w:type="dxa" w:w="20"/>
+              <w:right w:type="dxa" w:w="40"/>
+            </w:tcMar>
+          </w:tcPr>
+          <w:p>
+            <w:pPr>
+              <w:keepNext w:val="false"/>
+              <w:spacing w:after="45" w:before="0" w:line="190"/>
+            </w:pPr>
+            <w:r>
+              <w:rPr>
+                <w:color w:val="203047"/>
+                <w:sz w:val="16"/>
+                <w:szCs w:val="16"/>
+              </w:rPr>
+              <w:t xml:space="preserve">LangChain · LangGraph · RAG · LLM Evaluation · Jev</w:t>
+            </w:r>
+            <w:r>
+              <w:rPr>
+                <w:color w:val="203047"/>
+                <w:sz w:val="16"/>
+                <w:szCs w:val="16"/>
+              </w:rPr>
+              <w:t xml:space="preserve"/>
+            </w:r>
+            <w:r>
+              <w:rPr>
+                <w:color w:val="203047"/>
+                <w:sz w:val="16"/>
+                <w:szCs w:val="16"/>
+              </w:rPr>
+              <w:br/>
+              <w:t xml:space="preserve"/>
+            </w:r>
+            <w:r>
+              <w:rPr>
+                <w:color w:val="203047"/>
+                <w:sz w:val="16"/>
+                <w:szCs w:val="16"/>
+              </w:rPr>
+              <w:t xml:space="preserve">Elasticsearch · Weaviate · BGE-M3 · BM25</w:t>
+            </w:r>
+          </w:p>
+        </w:tc>
+      </w:tr>
+    </w:tbl>
+    <w:p>
+      <w:pPr>
+        <w:spacing w:after="0" w:before="0" w:line="40"/>
+      </w:pPr>
+    </w:p>
+    <w:tbl>
+      <w:tblPr>
+        <w:tblW w:type="pct" w:w="100%"/>
+        <w:tblBorders>
+          <w:top w:val="none" w:color="FFFFFF" w:sz="0"/>
+          <w:left w:val="none" w:color="FFFFFF" w:sz="0"/>
+          <w:bottom w:val="none" w:color="FFFFFF" w:sz="0"/>
+          <w:right w:val="none" w:color="FFFFFF" w:sz="0"/>
+          <w:insideH w:val="none" w:color="FFFFFF" w:sz="0"/>
+          <w:insideV w:val="none" w:color="FFFFFF" w:sz="0"/>
+        </w:tblBorders>
+      </w:tblPr>
+      <w:tblGrid>
+        <w:gridCol w:w="100"/>
+        <w:gridCol w:w="100"/>
+      </w:tblGrid>
+      <w:tr>
+        <w:tc>
+          <w:tcPr>
+            <w:tcW w:type="pct" w:w="20%"/>
+            <w:tcMar>
+              <w:top w:type="dxa" w:w="20"/>
+              <w:left w:type="dxa" w:w="40"/>
+              <w:bottom w:type="dxa" w:w="20"/>
+              <w:right w:type="dxa" w:w="40"/>
+            </w:tcMar>
+          </w:tcPr>
+          <w:p>
+            <w:pPr>
+              <w:keepNext w:val="false"/>
+              <w:spacing w:after="45" w:before="0" w:line="190"/>
+            </w:pPr>
+            <w:r>
+              <w:rPr>
+                <w:b/>
+                <w:bCs/>
+                <w:color w:val="203047"/>
+                <w:sz w:val="16"/>
+                <w:szCs w:val="16"/>
+              </w:rPr>
+              <w:t xml:space="preserve">Data &amp; Infra</w:t>
+            </w:r>
+          </w:p>
+        </w:tc>
+        <w:tc>
+          <w:tcPr>
+            <w:tcW w:type="pct" w:w="80%"/>
+            <w:tcMar>
+              <w:top w:type="dxa" w:w="20"/>
+              <w:left w:type="dxa" w:w="40"/>
+              <w:bottom w:type="dxa" w:w="20"/>
+              <w:right w:type="dxa" w:w="40"/>
+            </w:tcMar>
+          </w:tcPr>
+          <w:p>
+            <w:pPr>
+              <w:keepNext w:val="false"/>
+              <w:spacing w:after="45" w:before="0" w:line="190"/>
+            </w:pPr>
+            <w:r>
+              <w:rPr>
+                <w:color w:val="203047"/>
+                <w:sz w:val="16"/>
+                <w:szCs w:val="16"/>
+              </w:rPr>
+              <w:t xml:space="preserve">MySQL · PostgreSQL · Redis · Kafka</w:t>
+            </w:r>
+            <w:r>
+              <w:rPr>
+                <w:color w:val="203047"/>
+                <w:sz w:val="16"/>
+                <w:szCs w:val="16"/>
+              </w:rPr>
+              <w:t xml:space="preserve"/>
+            </w:r>
+            <w:r>
+              <w:rPr>
+                <w:color w:val="203047"/>
+                <w:sz w:val="16"/>
+                <w:szCs w:val="16"/>
+              </w:rPr>
+              <w:br/>
+              <w:t xml:space="preserve"/>
+            </w:r>
+            <w:r>
+              <w:rPr>
+                <w:color w:val="203047"/>
+                <w:sz w:val="16"/>
+                <w:szCs w:val="16"/>
+              </w:rPr>
+              <w:t xml:space="preserve">Docker · Docker Compose · GitHub Actions</w:t>
+            </w:r>
+          </w:p>
+        </w:tc>
+      </w:tr>
+    </w:tbl>
+    <w:p>
+      <w:pPr>
+        <w:spacing w:after="0" w:before="0" w:line="40"/>
+      </w:pPr>
+    </w:p>
+    <w:p>
+      <w:pPr>
+        <w:sectPr>
+          <w:footerReference w:type="default" r:id="rId8"/>
           <w:pgSz w:w="11906" w:h="16838" w:orient="portrait"/>
           <w:pgMar w:top="737" w:right="794" w:bottom="907" w:left="794" w:header="708" w:footer="454" w:gutter="0"/>
           <w:pgNumType/>
@@ -1132,7 +2036,7 @@
               <w:keepNext w:val="false"/>
               <w:spacing w:after="45" w:before="0" w:line="190"/>
             </w:pPr>
-            <w:hyperlink w:history="1" r:id="rId8musd1blgfz2zmnliwwms">
+            <w:hyperlink w:history="1" r:id="rIdazomc58stmp_hflk4vbyc">
               <w:r>
                 <w:rPr>
                   <w:color w:val="315CBB"/>
@@ -1170,21 +2074,31 @@
                 <w:sz w:val="15"/>
                 <w:szCs w:val="15"/>
               </w:rPr>
-              <w:t xml:space="preserve">Rewrote about 44,000 drug records in plain language. Converted repeated explanations once and mapped them back to each drug to reduce cost.</w:t>
-            </w:r>
-          </w:p>
-          <w:p>
-            <w:pPr>
-              <w:keepNext w:val="false"/>
-              <w:spacing w:after="45" w:before="0" w:line="190"/>
-            </w:pPr>
-            <w:r>
-              <w:rPr>
-                <w:color w:val="203047"/>
-                <w:sz w:val="16"/>
-                <w:szCs w:val="16"/>
-              </w:rPr>
-              <w:t xml:space="preserve">Problem: Converting all 44,000 drug records was estimated to cost about $200 in API calls.</w:t>
+              <w:t xml:space="preserve">Rewrote about 44,000 drug records in plain language. Deduplication reduced input from 1GB to 326MB; after filling missing information, conversion cost $11.18 in actual API spending versus about $200 estimated for the original text.</w:t>
+            </w:r>
+          </w:p>
+          <w:p>
+            <w:pPr>
+              <w:keepNext w:val="false"/>
+              <w:spacing w:after="45" w:before="0" w:line="190"/>
+            </w:pPr>
+            <w:r>
+              <w:rPr>
+                <w:b/>
+                <w:bCs/>
+                <w:color w:val="203047"/>
+                <w:sz w:val="16"/>
+                <w:szCs w:val="16"/>
+              </w:rPr>
+              <w:t xml:space="preserve">Problem</w:t>
+            </w:r>
+            <w:r>
+              <w:rPr>
+                <w:color w:val="203047"/>
+                <w:sz w:val="16"/>
+                <w:szCs w:val="16"/>
+              </w:rPr>
+              <w:t xml:space="preserve"/>
             </w:r>
             <w:r>
               <w:rPr>
@@ -1193,21 +2107,76 @@
                 <w:szCs w:val="16"/>
               </w:rPr>
               <w:br/>
-              <w:t xml:space="preserve">Solution: Removed exact duplicates, then semantically equivalent sentences. Filled the missing 5% with ingredient-specific precautions, converted via GPT Batch API and mapped results back to each drug.</w:t>
-            </w:r>
-          </w:p>
-          <w:p>
-            <w:pPr>
-              <w:keepNext w:val="false"/>
-              <w:spacing w:after="45" w:before="0" w:line="190"/>
-            </w:pPr>
-            <w:r>
-              <w:rPr>
-                <w:color w:val="203047"/>
-                <w:sz w:val="16"/>
-                <w:szCs w:val="16"/>
-              </w:rPr>
-              <w:t xml:space="preserve">Result: Conversion input shrank from 1GB to 326MB. Actual API spending was $11.18 versus about $200 estimated for all original text.</w:t>
+              <w:t xml:space="preserve">Converting all 44,000 drug records was estimated to cost about $200 in API calls.</w:t>
+            </w:r>
+            <w:r>
+              <w:rPr>
+                <w:color w:val="203047"/>
+                <w:sz w:val="16"/>
+                <w:szCs w:val="16"/>
+              </w:rPr>
+              <w:br/>
+              <w:t xml:space="preserve"/>
+            </w:r>
+            <w:r>
+              <w:rPr>
+                <w:b/>
+                <w:bCs/>
+                <w:color w:val="203047"/>
+                <w:sz w:val="16"/>
+                <w:szCs w:val="16"/>
+              </w:rPr>
+              <w:t xml:space="preserve">Solution</w:t>
+            </w:r>
+            <w:r>
+              <w:rPr>
+                <w:color w:val="203047"/>
+                <w:sz w:val="16"/>
+                <w:szCs w:val="16"/>
+              </w:rPr>
+              <w:t xml:space="preserve"/>
+            </w:r>
+            <w:r>
+              <w:rPr>
+                <w:color w:val="203047"/>
+                <w:sz w:val="16"/>
+                <w:szCs w:val="16"/>
+              </w:rPr>
+              <w:br/>
+              <w:t xml:space="preserve">Removed exact duplicates, then semantically equivalent sentences. Filled the missing 5% with ingredient-specific precautions, converted via GPT Batch API and mapped results back to each drug.</w:t>
+            </w:r>
+          </w:p>
+          <w:p>
+            <w:pPr>
+              <w:keepNext w:val="false"/>
+              <w:spacing w:after="45" w:before="0" w:line="190"/>
+            </w:pPr>
+            <w:r>
+              <w:rPr>
+                <w:b/>
+                <w:bCs/>
+                <w:color w:val="203047"/>
+                <w:sz w:val="16"/>
+                <w:szCs w:val="16"/>
+              </w:rPr>
+              <w:t xml:space="preserve">Result</w:t>
+            </w:r>
+            <w:r>
+              <w:rPr>
+                <w:color w:val="203047"/>
+                <w:sz w:val="16"/>
+                <w:szCs w:val="16"/>
+              </w:rPr>
+              <w:t xml:space="preserve"/>
+            </w:r>
+            <w:r>
+              <w:rPr>
+                <w:color w:val="203047"/>
+                <w:sz w:val="16"/>
+                <w:szCs w:val="16"/>
+              </w:rPr>
+              <w:br/>
+              <w:t xml:space="preserve">Conversion input shrank from 1GB to 326MB. Actual API spending was $11.18 versus about $200 estimated for all original text.</w:t>
             </w:r>
           </w:p>
           <w:p>
@@ -1237,7 +2206,7 @@
                 <w:sz w:val="18"/>
                 <w:szCs w:val="18"/>
               </w:rPr>
-              <w:t xml:space="preserve">Medication chatbot with health-profile personalization</w:t>
+              <w:t xml:space="preserve">AI medication chatbot using health profiles</w:t>
             </w:r>
           </w:p>
           <w:p>
@@ -1266,11 +2235,21 @@
             </w:pPr>
             <w:r>
               <w:rPr>
-                <w:color w:val="203047"/>
-                <w:sz w:val="16"/>
-                <w:szCs w:val="16"/>
-              </w:rPr>
-              <w:t xml:space="preserve">Problem: Everyday symptom language differed from drug indications, while sensitive health data needed to stay out of external AI inputs.</w:t>
+                <w:b/>
+                <w:bCs/>
+                <w:color w:val="203047"/>
+                <w:sz w:val="16"/>
+                <w:szCs w:val="16"/>
+              </w:rPr>
+              <w:t xml:space="preserve">Problem</w:t>
+            </w:r>
+            <w:r>
+              <w:rPr>
+                <w:color w:val="203047"/>
+                <w:sz w:val="16"/>
+                <w:szCs w:val="16"/>
+              </w:rPr>
+              <w:t xml:space="preserve"/>
             </w:r>
             <w:r>
               <w:rPr>
@@ -1279,7 +2258,7 @@
                 <w:szCs w:val="16"/>
               </w:rPr>
               <w:br/>
-              <w:t xml:space="preserve">Solution: Used Weaviate semantic search and AI orchestration for drug discovery, medication risks and dosage. Evaluated pregnancy, current medications and underlying conditions in internal code.</w:t>
+              <w:t xml:space="preserve">Everyday symptom language differed from drug indications, while sensitive health data needed to stay out of external AI inputs.</w:t>
             </w:r>
             <w:r>
               <w:rPr>
@@ -1288,7 +2267,70 @@
                 <w:szCs w:val="16"/>
               </w:rPr>
               <w:br/>
-              <w:t xml:space="preserve">Result: Implemented personalized symptom-based search while excluding those profile fields from external LLM inputs.</w:t>
+              <w:t xml:space="preserve"/>
+            </w:r>
+            <w:r>
+              <w:rPr>
+                <w:b/>
+                <w:bCs/>
+                <w:color w:val="203047"/>
+                <w:sz w:val="16"/>
+                <w:szCs w:val="16"/>
+              </w:rPr>
+              <w:t xml:space="preserve">Solution</w:t>
+            </w:r>
+            <w:r>
+              <w:rPr>
+                <w:color w:val="203047"/>
+                <w:sz w:val="16"/>
+                <w:szCs w:val="16"/>
+              </w:rPr>
+              <w:t xml:space="preserve"/>
+            </w:r>
+            <w:r>
+              <w:rPr>
+                <w:color w:val="203047"/>
+                <w:sz w:val="16"/>
+                <w:szCs w:val="16"/>
+              </w:rPr>
+              <w:br/>
+              <w:t xml:space="preserve">Used Weaviate semantic search and AI orchestration for drug discovery, medication risks and dosage. Evaluated pregnancy, current medications and underlying conditions in internal code.</w:t>
+            </w:r>
+            <w:r>
+              <w:rPr>
+                <w:color w:val="203047"/>
+                <w:sz w:val="16"/>
+                <w:szCs w:val="16"/>
+              </w:rPr>
+              <w:br/>
+              <w:t xml:space="preserve"/>
+            </w:r>
+            <w:r>
+              <w:rPr>
+                <w:b/>
+                <w:bCs/>
+                <w:color w:val="203047"/>
+                <w:sz w:val="16"/>
+                <w:szCs w:val="16"/>
+              </w:rPr>
+              <w:t xml:space="preserve">Result</w:t>
+            </w:r>
+            <w:r>
+              <w:rPr>
+                <w:color w:val="203047"/>
+                <w:sz w:val="16"/>
+                <w:szCs w:val="16"/>
+              </w:rPr>
+              <w:t xml:space="preserve"/>
+            </w:r>
+            <w:r>
+              <w:rPr>
+                <w:color w:val="203047"/>
+                <w:sz w:val="16"/>
+                <w:szCs w:val="16"/>
+              </w:rPr>
+              <w:br/>
+              <w:t xml:space="preserve">Implemented personalized symptom-based search while excluding those profile fields from external LLM inputs.</w:t>
             </w:r>
           </w:p>
           <w:p>
@@ -1304,7 +2346,7 @@
                 <w:sz w:val="18"/>
                 <w:szCs w:val="18"/>
               </w:rPr>
-              <w:t xml:space="preserve">Backend implementation</w:t>
+              <w:t xml:space="preserve">Backend feature implementation</w:t>
             </w:r>
           </w:p>
           <w:p>
@@ -1397,7 +2439,7 @@
               <w:keepNext w:val="false"/>
               <w:spacing w:after="45" w:before="0" w:line="190"/>
             </w:pPr>
-            <w:hyperlink w:history="1" r:id="rIdjvmt_2ehmaftsdoo8t4fd">
+            <w:hyperlink w:history="1" r:id="rIdnadyipt6hbrejgtn16ser">
               <w:r>
                 <w:rPr>
                   <w:color w:val="315CBB"/>
@@ -1415,7 +2457,7 @@
               </w:rPr>
               <w:t xml:space="preserve">   </w:t>
             </w:r>
-            <w:hyperlink w:history="1" r:id="rIdh_8egd2esj0piezbkzo1h">
+            <w:hyperlink w:history="1" r:id="rIdx7yjjsqrx7ciijmhfkp33">
               <w:r>
                 <w:rPr>
                   <w:color w:val="315CBB"/>
@@ -1440,6 +2482,17 @@
     <w:p>
       <w:pPr>
         <w:spacing w:after="0" w:before="0" w:line="40"/>
+      </w:pPr>
+    </w:p>
+    <w:p>
+      <w:pPr>
+        <w:sectPr>
+          <w:footerReference w:type="default" r:id="rId9"/>
+          <w:pgSz w:w="11906" w:h="16838" w:orient="portrait"/>
+          <w:pgMar w:top="737" w:right="794" w:bottom="907" w:left="794" w:header="708" w:footer="454" w:gutter="0"/>
+          <w:pgNumType/>
+          <w:docGrid w:linePitch="360"/>
+        </w:sectPr>
       </w:pPr>
     </w:p>
     <w:p>
@@ -1559,7 +2612,7 @@
               <w:keepNext w:val="false"/>
               <w:spacing w:after="45" w:before="0" w:line="190"/>
             </w:pPr>
-            <w:hyperlink w:history="1" r:id="rIdhyurgqsg7ddr1_rgqr3rw">
+            <w:hyperlink w:history="1" r:id="rIddcauywpzkloyopyemxvvo">
               <w:r>
                 <w:rPr>
                   <w:color w:val="315CBB"/>
@@ -1577,7 +2630,7 @@
               </w:rPr>
               <w:t xml:space="preserve">   </w:t>
             </w:r>
-            <w:hyperlink w:history="1" r:id="rId7_zao4h5wolpyzkbz4nsy">
+            <w:hyperlink w:history="1" r:id="rIdwhx6iad1dxdw0loyxsg9u">
               <w:r>
                 <w:rPr>
                   <w:color w:val="315CBB"/>
@@ -1595,7 +2648,7 @@
               </w:rPr>
               <w:t xml:space="preserve">   </w:t>
             </w:r>
-            <w:hyperlink w:history="1" r:id="rId3epsvbne8bnrduuy9i2f7">
+            <w:hyperlink w:history="1" r:id="rIdosynzkkxhitq4tnimuqnr">
               <w:r>
                 <w:rPr>
                   <w:color w:val="315CBB"/>
@@ -1706,14 +2759,14 @@
                     <w:keepNext w:val="false"/>
                     <w:spacing w:after="45" w:before="0" w:line="190"/>
                   </w:pPr>
-                  <w:hyperlink w:history="1" r:id="rIdmuo51bv_sr6kbf3lptssu">
+                  <w:hyperlink w:history="1" r:id="rIdxr6zifz1khsskmzzivpfa">
                     <w:r>
                       <w:drawing>
                         <wp:inline distT="0" distB="0" distL="0" distR="0">
                           <wp:extent cx="466725" cy="647700"/>
                           <wp:effectExtent t="0" r="0" b="0" l="0"/>
                           <wp:docPr id="1" name="" descr="" title="">
-                            <a:hlinkClick xmlns:a="http://schemas.openxmlformats.org/drawingml/2006/main" r:id="rIdmuo51bv_sr6kbf3lptssu"/>
+                            <a:hlinkClick xmlns:a="http://schemas.openxmlformats.org/drawingml/2006/main" r:id="rIdxr6zifz1khsskmzzivpfa"/>
                           </wp:docPr>
                           <wp:cNvGraphicFramePr>
                             <a:graphicFrameLocks xmlns:a="http://schemas.openxmlformats.org/drawingml/2006/main" noChangeAspect="1"/>
@@ -1723,14 +2776,14 @@
                               <pic:pic xmlns:pic="http://schemas.openxmlformats.org/drawingml/2006/picture">
                                 <pic:nvPicPr>
                                   <pic:cNvPr id="0" name="" descr="">
-                                    <a:hlinkClick r:id="rIdmuo51bv_sr6kbf3lptssu"/>
+                                    <a:hlinkClick r:id="rIdxr6zifz1khsskmzzivpfa"/>
                                   </pic:cNvPr>
                                   <pic:cNvPicPr>
                                     <a:picLocks noChangeAspect="1" noChangeArrowheads="1"/>
                                   </pic:cNvPicPr>
                                 </pic:nvPicPr>
                                 <pic:blipFill>
-                                  <a:blip r:embed="rId10" cstate="none"/>
+                                  <a:blip r:embed="rId11" cstate="none"/>
                                   <a:srcRect/>
                                   <a:stretch>
                                     <a:fillRect/>
@@ -1908,14 +2961,14 @@
                     <w:keepNext w:val="false"/>
                     <w:spacing w:after="45" w:before="0" w:line="190"/>
                   </w:pPr>
-                  <w:hyperlink w:history="1" r:id="rIdwwjsj4gvesfd5lr6cqry1">
+                  <w:hyperlink w:history="1" r:id="rIdkvmj-icxdtqfauxsh9afp">
                     <w:r>
                       <w:drawing>
                         <wp:inline distT="0" distB="0" distL="0" distR="0">
                           <wp:extent cx="533400" cy="400050"/>
                           <wp:effectExtent t="0" r="0" b="0" l="0"/>
                           <wp:docPr id="1" name="" descr="" title="">
-                            <a:hlinkClick xmlns:a="http://schemas.openxmlformats.org/drawingml/2006/main" r:id="rIdwwjsj4gvesfd5lr6cqry1"/>
+                            <a:hlinkClick xmlns:a="http://schemas.openxmlformats.org/drawingml/2006/main" r:id="rIdkvmj-icxdtqfauxsh9afp"/>
                           </wp:docPr>
                           <wp:cNvGraphicFramePr>
                             <a:graphicFrameLocks xmlns:a="http://schemas.openxmlformats.org/drawingml/2006/main" noChangeAspect="1"/>
@@ -1925,14 +2978,14 @@
                               <pic:pic xmlns:pic="http://schemas.openxmlformats.org/drawingml/2006/picture">
                                 <pic:nvPicPr>
                                   <pic:cNvPr id="0" name="" descr="">
-                                    <a:hlinkClick r:id="rIdwwjsj4gvesfd5lr6cqry1"/>
+                                    <a:hlinkClick r:id="rIdkvmj-icxdtqfauxsh9afp"/>
                                   </pic:cNvPr>
                                   <pic:cNvPicPr>
                                     <a:picLocks noChangeAspect="1" noChangeArrowheads="1"/>
                                   </pic:cNvPicPr>
                                 </pic:nvPicPr>
                                 <pic:blipFill>
-                                  <a:blip r:embed="rId11" cstate="none"/>
+                                  <a:blip r:embed="rId12" cstate="none"/>
                                   <a:srcRect/>
                                   <a:stretch>
                                     <a:fillRect/>
@@ -2014,376 +3067,6 @@
     </w:p>
     <w:p>
       <w:pPr>
-        <w:sectPr>
-          <w:footerReference w:type="default" r:id="rId8"/>
-          <w:pgSz w:w="11906" w:h="16838" w:orient="portrait"/>
-          <w:pgMar w:top="737" w:right="794" w:bottom="907" w:left="794" w:header="708" w:footer="454" w:gutter="0"/>
-          <w:pgNumType/>
-          <w:docGrid w:linePitch="360"/>
-        </w:sectPr>
-      </w:pPr>
-    </w:p>
-    <w:p>
-      <w:pPr>
-        <w:keepNext/>
-        <w:pBdr>
-          <w:bottom w:val="single" w:color="6A80BD" w:sz="10" w:space="4"/>
-        </w:pBdr>
-        <w:spacing w:after="65" w:before="160" w:line="190"/>
-      </w:pPr>
-      <w:r>
-        <w:rPr>
-          <w:b/>
-          <w:bCs/>
-          <w:color w:val="315CBB"/>
-          <w:sz w:val="20"/>
-          <w:szCs w:val="20"/>
-        </w:rPr>
-        <w:t xml:space="preserve">Skills </w:t>
-      </w:r>
-      <w:r>
-        <w:rPr>
-          <w:b/>
-          <w:bCs/>
-          <w:color w:val="315CBB"/>
-          <w:sz w:val="20"/>
-          <w:szCs w:val="20"/>
-        </w:rPr>
-        <w:br/>
-        <w:t xml:space="preserve"/>
-      </w:r>
-    </w:p>
-    <w:tbl>
-      <w:tblPr>
-        <w:tblW w:type="pct" w:w="100%"/>
-        <w:tblBorders>
-          <w:top w:val="none" w:color="FFFFFF" w:sz="0"/>
-          <w:left w:val="none" w:color="FFFFFF" w:sz="0"/>
-          <w:bottom w:val="none" w:color="FFFFFF" w:sz="0"/>
-          <w:right w:val="none" w:color="FFFFFF" w:sz="0"/>
-          <w:insideH w:val="none" w:color="FFFFFF" w:sz="0"/>
-          <w:insideV w:val="none" w:color="FFFFFF" w:sz="0"/>
-        </w:tblBorders>
-      </w:tblPr>
-      <w:tblGrid>
-        <w:gridCol w:w="100"/>
-        <w:gridCol w:w="100"/>
-      </w:tblGrid>
-      <w:tr>
-        <w:tc>
-          <w:tcPr>
-            <w:tcW w:type="pct" w:w="20%"/>
-            <w:tcMar>
-              <w:top w:type="dxa" w:w="20"/>
-              <w:left w:type="dxa" w:w="40"/>
-              <w:bottom w:type="dxa" w:w="20"/>
-              <w:right w:type="dxa" w:w="40"/>
-            </w:tcMar>
-          </w:tcPr>
-          <w:p>
-            <w:pPr>
-              <w:keepNext w:val="false"/>
-              <w:spacing w:after="45" w:before="0" w:line="190"/>
-            </w:pPr>
-            <w:r>
-              <w:rPr>
-                <w:b/>
-                <w:bCs/>
-                <w:color w:val="203047"/>
-                <w:sz w:val="16"/>
-                <w:szCs w:val="16"/>
-              </w:rPr>
-              <w:t xml:space="preserve">Backend</w:t>
-            </w:r>
-          </w:p>
-        </w:tc>
-        <w:tc>
-          <w:tcPr>
-            <w:tcW w:type="pct" w:w="80%"/>
-            <w:tcMar>
-              <w:top w:type="dxa" w:w="20"/>
-              <w:left w:type="dxa" w:w="40"/>
-              <w:bottom w:type="dxa" w:w="20"/>
-              <w:right w:type="dxa" w:w="40"/>
-            </w:tcMar>
-          </w:tcPr>
-          <w:p>
-            <w:pPr>
-              <w:keepNext w:val="false"/>
-              <w:spacing w:after="45" w:before="0" w:line="190"/>
-            </w:pPr>
-            <w:r>
-              <w:rPr>
-                <w:color w:val="203047"/>
-                <w:sz w:val="16"/>
-                <w:szCs w:val="16"/>
-              </w:rPr>
-              <w:t xml:space="preserve">Java · Spring Boot · Spring AI · Python</w:t>
-            </w:r>
-          </w:p>
-          <w:p>
-            <w:pPr>
-              <w:keepNext w:val="false"/>
-              <w:spacing w:after="45" w:before="0" w:line="190"/>
-            </w:pPr>
-            <w:r>
-              <w:rPr>
-                <w:color w:val="607089"/>
-                <w:sz w:val="15"/>
-                <w:szCs w:val="15"/>
-              </w:rPr>
-              <w:t xml:space="preserve">Authentication and authorization (Spring Security, OAuth 2.0)</w:t>
-            </w:r>
-            <w:r>
-              <w:rPr>
-                <w:color w:val="607089"/>
-                <w:sz w:val="15"/>
-                <w:szCs w:val="15"/>
-              </w:rPr>
-              <w:t xml:space="preserve"/>
-            </w:r>
-            <w:r>
-              <w:rPr>
-                <w:color w:val="607089"/>
-                <w:sz w:val="15"/>
-                <w:szCs w:val="15"/>
-              </w:rPr>
-              <w:br/>
-              <w:t xml:space="preserve"/>
-            </w:r>
-            <w:hyperlink w:history="1" r:id="rIdoqgmjdnk4j7980ngkz92w">
-              <w:r>
-                <w:rPr>
-                  <w:color w:val="315CBB"/>
-                  <w:sz w:val="15"/>
-                  <w:szCs w:val="15"/>
-                </w:rPr>
-                <w:t xml:space="preserve">Personal shopping project · Login ↗</w:t>
-              </w:r>
-            </w:hyperlink>
-            <w:hyperlink w:history="1" r:id="rIdj53zfnl223hxt6xoslipr">
-              <w:r>
-                <w:rPr>
-                  <w:color w:val="315CBB"/>
-                  <w:sz w:val="15"/>
-                  <w:szCs w:val="15"/>
-                </w:rPr>
-                <w:t xml:space="preserve">Todo web app · OAuth ↗</w:t>
-              </w:r>
-            </w:hyperlink>
-          </w:p>
-        </w:tc>
-      </w:tr>
-    </w:tbl>
-    <w:p>
-      <w:pPr>
-        <w:spacing w:after="0" w:before="0" w:line="40"/>
-      </w:pPr>
-    </w:p>
-    <w:tbl>
-      <w:tblPr>
-        <w:tblW w:type="pct" w:w="100%"/>
-        <w:tblBorders>
-          <w:top w:val="none" w:color="FFFFFF" w:sz="0"/>
-          <w:left w:val="none" w:color="FFFFFF" w:sz="0"/>
-          <w:bottom w:val="none" w:color="FFFFFF" w:sz="0"/>
-          <w:right w:val="none" w:color="FFFFFF" w:sz="0"/>
-          <w:insideH w:val="none" w:color="FFFFFF" w:sz="0"/>
-          <w:insideV w:val="none" w:color="FFFFFF" w:sz="0"/>
-        </w:tblBorders>
-      </w:tblPr>
-      <w:tblGrid>
-        <w:gridCol w:w="100"/>
-        <w:gridCol w:w="100"/>
-      </w:tblGrid>
-      <w:tr>
-        <w:tc>
-          <w:tcPr>
-            <w:tcW w:type="pct" w:w="20%"/>
-            <w:tcMar>
-              <w:top w:type="dxa" w:w="20"/>
-              <w:left w:type="dxa" w:w="40"/>
-              <w:bottom w:type="dxa" w:w="20"/>
-              <w:right w:type="dxa" w:w="40"/>
-            </w:tcMar>
-          </w:tcPr>
-          <w:p>
-            <w:pPr>
-              <w:keepNext w:val="false"/>
-              <w:spacing w:after="45" w:before="0" w:line="190"/>
-            </w:pPr>
-            <w:r>
-              <w:rPr>
-                <w:b/>
-                <w:bCs/>
-                <w:color w:val="203047"/>
-                <w:sz w:val="16"/>
-                <w:szCs w:val="16"/>
-              </w:rPr>
-              <w:t xml:space="preserve">AI &amp; Search</w:t>
-            </w:r>
-          </w:p>
-        </w:tc>
-        <w:tc>
-          <w:tcPr>
-            <w:tcW w:type="pct" w:w="80%"/>
-            <w:tcMar>
-              <w:top w:type="dxa" w:w="20"/>
-              <w:left w:type="dxa" w:w="40"/>
-              <w:bottom w:type="dxa" w:w="20"/>
-              <w:right w:type="dxa" w:w="40"/>
-            </w:tcMar>
-          </w:tcPr>
-          <w:p>
-            <w:pPr>
-              <w:keepNext w:val="false"/>
-              <w:spacing w:after="45" w:before="0" w:line="190"/>
-            </w:pPr>
-            <w:r>
-              <w:rPr>
-                <w:color w:val="203047"/>
-                <w:sz w:val="16"/>
-                <w:szCs w:val="16"/>
-              </w:rPr>
-              <w:t xml:space="preserve">LangChain · LangGraph · RAG · LLM Evaluation · Jev</w:t>
-            </w:r>
-            <w:r>
-              <w:rPr>
-                <w:color w:val="203047"/>
-                <w:sz w:val="16"/>
-                <w:szCs w:val="16"/>
-              </w:rPr>
-              <w:t xml:space="preserve"/>
-            </w:r>
-            <w:r>
-              <w:rPr>
-                <w:color w:val="203047"/>
-                <w:sz w:val="16"/>
-                <w:szCs w:val="16"/>
-              </w:rPr>
-              <w:br/>
-              <w:t xml:space="preserve"/>
-            </w:r>
-            <w:r>
-              <w:rPr>
-                <w:color w:val="203047"/>
-                <w:sz w:val="16"/>
-                <w:szCs w:val="16"/>
-              </w:rPr>
-              <w:t xml:space="preserve">Elasticsearch · Weaviate · BGE-M3 · BM25</w:t>
-            </w:r>
-          </w:p>
-        </w:tc>
-      </w:tr>
-    </w:tbl>
-    <w:p>
-      <w:pPr>
-        <w:spacing w:after="0" w:before="0" w:line="40"/>
-      </w:pPr>
-    </w:p>
-    <w:tbl>
-      <w:tblPr>
-        <w:tblW w:type="pct" w:w="100%"/>
-        <w:tblBorders>
-          <w:top w:val="none" w:color="FFFFFF" w:sz="0"/>
-          <w:left w:val="none" w:color="FFFFFF" w:sz="0"/>
-          <w:bottom w:val="none" w:color="FFFFFF" w:sz="0"/>
-          <w:right w:val="none" w:color="FFFFFF" w:sz="0"/>
-          <w:insideH w:val="none" w:color="FFFFFF" w:sz="0"/>
-          <w:insideV w:val="none" w:color="FFFFFF" w:sz="0"/>
-        </w:tblBorders>
-      </w:tblPr>
-      <w:tblGrid>
-        <w:gridCol w:w="100"/>
-        <w:gridCol w:w="100"/>
-      </w:tblGrid>
-      <w:tr>
-        <w:tc>
-          <w:tcPr>
-            <w:tcW w:type="pct" w:w="20%"/>
-            <w:tcMar>
-              <w:top w:type="dxa" w:w="20"/>
-              <w:left w:type="dxa" w:w="40"/>
-              <w:bottom w:type="dxa" w:w="20"/>
-              <w:right w:type="dxa" w:w="40"/>
-            </w:tcMar>
-          </w:tcPr>
-          <w:p>
-            <w:pPr>
-              <w:keepNext w:val="false"/>
-              <w:spacing w:after="45" w:before="0" w:line="190"/>
-            </w:pPr>
-            <w:r>
-              <w:rPr>
-                <w:b/>
-                <w:bCs/>
-                <w:color w:val="203047"/>
-                <w:sz w:val="16"/>
-                <w:szCs w:val="16"/>
-              </w:rPr>
-              <w:t xml:space="preserve">Data &amp; Infra</w:t>
-            </w:r>
-          </w:p>
-        </w:tc>
-        <w:tc>
-          <w:tcPr>
-            <w:tcW w:type="pct" w:w="80%"/>
-            <w:tcMar>
-              <w:top w:type="dxa" w:w="20"/>
-              <w:left w:type="dxa" w:w="40"/>
-              <w:bottom w:type="dxa" w:w="20"/>
-              <w:right w:type="dxa" w:w="40"/>
-            </w:tcMar>
-          </w:tcPr>
-          <w:p>
-            <w:pPr>
-              <w:keepNext w:val="false"/>
-              <w:spacing w:after="45" w:before="0" w:line="190"/>
-            </w:pPr>
-            <w:r>
-              <w:rPr>
-                <w:color w:val="203047"/>
-                <w:sz w:val="16"/>
-                <w:szCs w:val="16"/>
-              </w:rPr>
-              <w:t xml:space="preserve">MySQL · PostgreSQL · Redis · Kafka</w:t>
-            </w:r>
-            <w:r>
-              <w:rPr>
-                <w:color w:val="203047"/>
-                <w:sz w:val="16"/>
-                <w:szCs w:val="16"/>
-              </w:rPr>
-              <w:t xml:space="preserve"/>
-            </w:r>
-            <w:r>
-              <w:rPr>
-                <w:color w:val="203047"/>
-                <w:sz w:val="16"/>
-                <w:szCs w:val="16"/>
-              </w:rPr>
-              <w:br/>
-              <w:t xml:space="preserve"/>
-            </w:r>
-            <w:r>
-              <w:rPr>
-                <w:color w:val="203047"/>
-                <w:sz w:val="16"/>
-                <w:szCs w:val="16"/>
-              </w:rPr>
-              <w:t xml:space="preserve">Docker · Docker Compose · GitHub Actions</w:t>
-            </w:r>
-          </w:p>
-        </w:tc>
-      </w:tr>
-    </w:tbl>
-    <w:p>
-      <w:pPr>
-        <w:spacing w:after="0" w:before="0" w:line="40"/>
-      </w:pPr>
-    </w:p>
-    <w:p>
-      <w:pPr>
         <w:keepNext/>
         <w:pBdr>
           <w:bottom w:val="single" w:color="6A80BD" w:sz="10" w:space="4"/>
@@ -2796,14 +3479,14 @@
                     <w:keepNext w:val="false"/>
                     <w:spacing w:after="45" w:before="0" w:line="190"/>
                   </w:pPr>
-                  <w:hyperlink w:history="1" r:id="rIdpfreou_evznamuk1xmipp">
+                  <w:hyperlink w:history="1" r:id="rIdqclr6uvhvwpi4p2olfpqh">
                     <w:r>
                       <w:drawing>
                         <wp:inline distT="0" distB="0" distL="0" distR="0">
                           <wp:extent cx="457200" cy="647700"/>
                           <wp:effectExtent t="0" r="0" b="0" l="0"/>
                           <wp:docPr id="1" name="" descr="" title="">
-                            <a:hlinkClick xmlns:a="http://schemas.openxmlformats.org/drawingml/2006/main" r:id="rIdpfreou_evznamuk1xmipp"/>
+                            <a:hlinkClick xmlns:a="http://schemas.openxmlformats.org/drawingml/2006/main" r:id="rIdqclr6uvhvwpi4p2olfpqh"/>
                           </wp:docPr>
                           <wp:cNvGraphicFramePr>
                             <a:graphicFrameLocks xmlns:a="http://schemas.openxmlformats.org/drawingml/2006/main" noChangeAspect="1"/>
@@ -2813,14 +3496,14 @@
                               <pic:pic xmlns:pic="http://schemas.openxmlformats.org/drawingml/2006/picture">
                                 <pic:nvPicPr>
                                   <pic:cNvPr id="0" name="" descr="">
-                                    <a:hlinkClick r:id="rIdpfreou_evznamuk1xmipp"/>
+                                    <a:hlinkClick r:id="rIdqclr6uvhvwpi4p2olfpqh"/>
                                   </pic:cNvPr>
                                   <pic:cNvPicPr>
                                     <a:picLocks noChangeAspect="1" noChangeArrowheads="1"/>
                                   </pic:cNvPicPr>
                                 </pic:nvPicPr>
                                 <pic:blipFill>
-                                  <a:blip r:embed="rId12" cstate="none"/>
+                                  <a:blip r:embed="rId13" cstate="none"/>
                                   <a:srcRect/>
                                   <a:stretch>
                                     <a:fillRect/>
@@ -2995,14 +3678,14 @@
                     <w:keepNext w:val="false"/>
                     <w:spacing w:after="45" w:before="0" w:line="190"/>
                   </w:pPr>
-                  <w:hyperlink w:history="1" r:id="rIdod2-heam6rm44wmtneipp">
+                  <w:hyperlink w:history="1" r:id="rId8ug61vt0dctoekxvyypvo">
                     <w:r>
                       <w:drawing>
                         <wp:inline distT="0" distB="0" distL="0" distR="0">
                           <wp:extent cx="457200" cy="647700"/>
                           <wp:effectExtent t="0" r="0" b="0" l="0"/>
                           <wp:docPr id="1" name="" descr="" title="">
-                            <a:hlinkClick xmlns:a="http://schemas.openxmlformats.org/drawingml/2006/main" r:id="rIdod2-heam6rm44wmtneipp"/>
+                            <a:hlinkClick xmlns:a="http://schemas.openxmlformats.org/drawingml/2006/main" r:id="rId8ug61vt0dctoekxvyypvo"/>
                           </wp:docPr>
                           <wp:cNvGraphicFramePr>
                             <a:graphicFrameLocks xmlns:a="http://schemas.openxmlformats.org/drawingml/2006/main" noChangeAspect="1"/>
@@ -3012,14 +3695,14 @@
                               <pic:pic xmlns:pic="http://schemas.openxmlformats.org/drawingml/2006/picture">
                                 <pic:nvPicPr>
                                   <pic:cNvPr id="0" name="" descr="">
-                                    <a:hlinkClick r:id="rIdod2-heam6rm44wmtneipp"/>
+                                    <a:hlinkClick r:id="rId8ug61vt0dctoekxvyypvo"/>
                                   </pic:cNvPr>
                                   <pic:cNvPicPr>
                                     <a:picLocks noChangeAspect="1" noChangeArrowheads="1"/>
                                   </pic:cNvPicPr>
                                 </pic:nvPicPr>
                                 <pic:blipFill>
-                                  <a:blip r:embed="rId13" cstate="none"/>
+                                  <a:blip r:embed="rId14" cstate="none"/>
                                   <a:srcRect/>
                                   <a:stretch>
                                     <a:fillRect/>
@@ -3194,14 +3877,14 @@
                     <w:keepNext w:val="false"/>
                     <w:spacing w:after="45" w:before="0" w:line="190"/>
                   </w:pPr>
-                  <w:hyperlink w:history="1" r:id="rIdwgx5xkjyonuvltc8rntdb">
+                  <w:hyperlink w:history="1" r:id="rIdwnvm4rv_-fdz7ijkpwemh">
                     <w:r>
                       <w:drawing>
                         <wp:inline distT="0" distB="0" distL="0" distR="0">
                           <wp:extent cx="457200" cy="647700"/>
                           <wp:effectExtent t="0" r="0" b="0" l="0"/>
                           <wp:docPr id="1" name="" descr="" title="">
-                            <a:hlinkClick xmlns:a="http://schemas.openxmlformats.org/drawingml/2006/main" r:id="rIdwgx5xkjyonuvltc8rntdb"/>
+                            <a:hlinkClick xmlns:a="http://schemas.openxmlformats.org/drawingml/2006/main" r:id="rIdwnvm4rv_-fdz7ijkpwemh"/>
                           </wp:docPr>
                           <wp:cNvGraphicFramePr>
                             <a:graphicFrameLocks xmlns:a="http://schemas.openxmlformats.org/drawingml/2006/main" noChangeAspect="1"/>
@@ -3211,14 +3894,14 @@
                               <pic:pic xmlns:pic="http://schemas.openxmlformats.org/drawingml/2006/picture">
                                 <pic:nvPicPr>
                                   <pic:cNvPr id="0" name="" descr="">
-                                    <a:hlinkClick r:id="rIdwgx5xkjyonuvltc8rntdb"/>
+                                    <a:hlinkClick r:id="rIdwnvm4rv_-fdz7ijkpwemh"/>
                                   </pic:cNvPr>
                                   <pic:cNvPicPr>
                                     <a:picLocks noChangeAspect="1" noChangeArrowheads="1"/>
                                   </pic:cNvPicPr>
                                 </pic:nvPicPr>
                                 <pic:blipFill>
-                                  <a:blip r:embed="rId14" cstate="none"/>
+                                  <a:blip r:embed="rId15" cstate="none"/>
                                   <a:srcRect/>
                                   <a:stretch>
                                     <a:fillRect/>
@@ -3393,14 +4076,14 @@
                     <w:keepNext w:val="false"/>
                     <w:spacing w:after="45" w:before="0" w:line="190"/>
                   </w:pPr>
-                  <w:hyperlink w:history="1" r:id="rIdctt9ikxe7zigo4jd52f_h">
+                  <w:hyperlink w:history="1" r:id="rId19-osq-cnr8vzfbhxw8xb">
                     <w:r>
                       <w:drawing>
                         <wp:inline distT="0" distB="0" distL="0" distR="0">
                           <wp:extent cx="457200" cy="647700"/>
                           <wp:effectExtent t="0" r="0" b="0" l="0"/>
                           <wp:docPr id="1" name="" descr="" title="">
-                            <a:hlinkClick xmlns:a="http://schemas.openxmlformats.org/drawingml/2006/main" r:id="rIdctt9ikxe7zigo4jd52f_h"/>
+                            <a:hlinkClick xmlns:a="http://schemas.openxmlformats.org/drawingml/2006/main" r:id="rId19-osq-cnr8vzfbhxw8xb"/>
                           </wp:docPr>
                           <wp:cNvGraphicFramePr>
                             <a:graphicFrameLocks xmlns:a="http://schemas.openxmlformats.org/drawingml/2006/main" noChangeAspect="1"/>
@@ -3410,14 +4093,14 @@
                               <pic:pic xmlns:pic="http://schemas.openxmlformats.org/drawingml/2006/picture">
                                 <pic:nvPicPr>
                                   <pic:cNvPr id="0" name="" descr="">
-                                    <a:hlinkClick r:id="rIdctt9ikxe7zigo4jd52f_h"/>
+                                    <a:hlinkClick r:id="rId19-osq-cnr8vzfbhxw8xb"/>
                                   </pic:cNvPr>
                                   <pic:cNvPicPr>
                                     <a:picLocks noChangeAspect="1" noChangeArrowheads="1"/>
                                   </pic:cNvPicPr>
                                 </pic:nvPicPr>
                                 <pic:blipFill>
-                                  <a:blip r:embed="rId15" cstate="none"/>
+                                  <a:blip r:embed="rId16" cstate="none"/>
                                   <a:srcRect/>
                                   <a:stretch>
                                     <a:fillRect/>
@@ -3509,7 +4192,7 @@
       </w:pPr>
     </w:p>
     <w:sectPr>
-      <w:footerReference w:type="default" r:id="rId9"/>
+      <w:footerReference w:type="default" r:id="rId10"/>
       <w:pgSz w:w="11906" w:h="16838" w:orient="portrait"/>
       <w:pgMar w:top="737" w:right="794" w:bottom="907" w:left="794" w:header="708" w:footer="454" w:gutter="0"/>
       <w:pgNumType/>
@@ -3633,6 +4316,42 @@
 </file>
 
 <file path=word/footer3.xml><?xml version="1.0" encoding="utf-8"?>
+<w:ftr xmlns:wpc="http://schemas.microsoft.com/office/word/2010/wordprocessingCanvas" xmlns:mc="http://schemas.openxmlformats.org/markup-compatibility/2006" xmlns:o="urn:schemas-microsoft-com:office:office" xmlns:r="http://schemas.openxmlformats.org/officeDocument/2006/relationships" xmlns:m="http://schemas.openxmlformats.org/officeDocument/2006/math" xmlns:v="urn:schemas-microsoft-com:vml" xmlns:wp14="http://schemas.microsoft.com/office/word/2010/wordprocessingDrawing" xmlns:wp="http://schemas.openxmlformats.org/drawingml/2006/wordprocessingDrawing" xmlns:w10="urn:schemas-microsoft-com:office:word" xmlns:w="http://schemas.openxmlformats.org/wordprocessingml/2006/main" xmlns:w14="http://schemas.microsoft.com/office/word/2010/wordml" xmlns:w15="http://schemas.microsoft.com/office/word/2012/wordml" xmlns:wpg="http://schemas.microsoft.com/office/word/2010/wordprocessingGroup" xmlns:wpi="http://schemas.microsoft.com/office/word/2010/wordprocessingInk" xmlns:wne="http://schemas.microsoft.com/office/word/2006/wordml" xmlns:wps="http://schemas.microsoft.com/office/word/2010/wordprocessingShape">
+  <w:p>
+    <w:pPr>
+      <w:tabs>
+        <w:tab w:val="right" w:pos="10318"/>
+      </w:tabs>
+    </w:pPr>
+    <w:r>
+      <w:rPr>
+        <w:color w:val="7D8DA3"/>
+        <w:sz w:val="14"/>
+        <w:szCs w:val="14"/>
+      </w:rPr>
+      <w:t xml:space="preserve">Jaehyeong Kim · Backend / AI Application Developer	</w:t>
+    </w:r>
+    <w:r>
+      <w:rPr>
+        <w:color w:val="7D8DA3"/>
+        <w:sz w:val="14"/>
+        <w:szCs w:val="14"/>
+      </w:rPr>
+      <w:fldChar w:fldCharType="begin"/>
+      <w:instrText xml:space="preserve">PAGE</w:instrText>
+      <w:fldChar w:fldCharType="separate"/>
+      <w:fldChar w:fldCharType="end"/>
+      <w:t xml:space="preserve"> / </w:t>
+      <w:fldChar w:fldCharType="begin"/>
+      <w:instrText xml:space="preserve">NUMPAGES</w:instrText>
+      <w:fldChar w:fldCharType="separate"/>
+      <w:fldChar w:fldCharType="end"/>
+    </w:r>
+  </w:p>
+</w:ftr>
+</file>
+
+<file path=word/footer4.xml><?xml version="1.0" encoding="utf-8"?>
 <w:ftr xmlns:wpc="http://schemas.microsoft.com/office/word/2010/wordprocessingCanvas" xmlns:mc="http://schemas.openxmlformats.org/markup-compatibility/2006" xmlns:o="urn:schemas-microsoft-com:office:office" xmlns:r="http://schemas.openxmlformats.org/officeDocument/2006/relationships" xmlns:m="http://schemas.openxmlformats.org/officeDocument/2006/math" xmlns:v="urn:schemas-microsoft-com:vml" xmlns:wp14="http://schemas.microsoft.com/office/word/2010/wordprocessingDrawing" xmlns:wp="http://schemas.openxmlformats.org/drawingml/2006/wordprocessingDrawing" xmlns:w10="urn:schemas-microsoft-com:office:word" xmlns:w="http://schemas.openxmlformats.org/wordprocessingml/2006/main" xmlns:w14="http://schemas.microsoft.com/office/word/2010/wordml" xmlns:w15="http://schemas.microsoft.com/office/word/2012/wordml" xmlns:wpg="http://schemas.microsoft.com/office/word/2010/wordprocessingGroup" xmlns:wpi="http://schemas.microsoft.com/office/word/2010/wordprocessingInk" xmlns:wne="http://schemas.microsoft.com/office/word/2006/wordml" xmlns:wps="http://schemas.microsoft.com/office/word/2010/wordprocessingShape">
   <w:p>
     <w:pPr>

</xml_diff>

<commit_message>
Keep resume labels inline while preserving portfolio layout
</commit_message>
<xml_diff>
--- a/site/en/resume.docx
+++ b/site/en/resume.docx
@@ -80,7 +80,7 @@
               <w:keepNext w:val="false"/>
               <w:spacing w:after="45" w:before="0" w:line="190"/>
             </w:pPr>
-            <w:hyperlink w:history="1" r:id="rIdhjgoznckacxffwcnwrvy3">
+            <w:hyperlink w:history="1" r:id="rIdtdegvh0ojev83vyqwr725">
               <w:r>
                 <w:rPr>
                   <w:color w:val="315CBB"/>
@@ -98,7 +98,7 @@
               </w:rPr>
               <w:t xml:space="preserve">   </w:t>
             </w:r>
-            <w:hyperlink w:history="1" r:id="rIdeivb4kyiliwlmsggdsf1n">
+            <w:hyperlink w:history="1" r:id="rIdlg7yysz2kysesykm0ymuz">
               <w:r>
                 <w:rPr>
                   <w:color w:val="315CBB"/>
@@ -116,7 +116,7 @@
               </w:rPr>
               <w:t xml:space="preserve">   </w:t>
             </w:r>
-            <w:hyperlink w:history="1" r:id="rIdc9-neugndbyrdswr9ciho">
+            <w:hyperlink w:history="1" r:id="rIdkxwirx1_usczahbiwvlw_">
               <w:r>
                 <w:rPr>
                   <w:color w:val="315CBB"/>
@@ -134,7 +134,7 @@
               </w:rPr>
               <w:t xml:space="preserve">   </w:t>
             </w:r>
-            <w:hyperlink w:history="1" r:id="rIdjlrcvfkcbjsoffsdmc8j5">
+            <w:hyperlink w:history="1" r:id="rIdz8vt0qxrqtyr2zodkhrsl">
               <w:r>
                 <w:rPr>
                   <w:color w:val="315CBB"/>
@@ -422,7 +422,7 @@
               <w:keepNext w:val="false"/>
               <w:spacing w:after="45" w:before="0" w:line="190"/>
             </w:pPr>
-            <w:hyperlink w:history="1" r:id="rIdalytpexgd-79anl7bnnx3">
+            <w:hyperlink w:history="1" r:id="rIdbkjmqqads8urixwy8ibvz">
               <w:r>
                 <w:rPr>
                   <w:color w:val="315CBB"/>
@@ -440,7 +440,7 @@
               </w:rPr>
               <w:t xml:space="preserve">   </w:t>
             </w:r>
-            <w:hyperlink w:history="1" r:id="rIdhnz75nvq6k5ymyfbifkrr">
+            <w:hyperlink w:history="1" r:id="rIdp4jxpfodptyz9r7htntlr">
               <w:r>
                 <w:rPr>
                   <w:color w:val="315CBB"/>
@@ -524,24 +524,15 @@
                 <w:sz w:val="16"/>
                 <w:szCs w:val="16"/>
               </w:rPr>
-              <w:t xml:space="preserve">Problem</w:t>
-            </w:r>
-            <w:r>
-              <w:rPr>
-                <w:color w:val="203047"/>
-                <w:sz w:val="16"/>
-                <w:szCs w:val="16"/>
-              </w:rPr>
-              <w:t xml:space="preserve"/>
-            </w:r>
-            <w:r>
-              <w:rPr>
-                <w:color w:val="203047"/>
-                <w:sz w:val="16"/>
-                <w:szCs w:val="16"/>
-              </w:rPr>
-              <w:br/>
-              <w:t xml:space="preserve">Open-source conversion damaged tables and equations; full AI conversion still had errors and high API usage.</w:t>
+              <w:t xml:space="preserve">Problem:</w:t>
+            </w:r>
+            <w:r>
+              <w:rPr>
+                <w:color w:val="203047"/>
+                <w:sz w:val="16"/>
+                <w:szCs w:val="16"/>
+              </w:rPr>
+              <w:t xml:space="preserve"> Open-source conversion damaged tables and equations; full AI conversion still had errors and high API usage.</w:t>
             </w:r>
             <w:r>
               <w:rPr>
@@ -560,24 +551,15 @@
                 <w:sz w:val="16"/>
                 <w:szCs w:val="16"/>
               </w:rPr>
-              <w:t xml:space="preserve">Solution</w:t>
-            </w:r>
-            <w:r>
-              <w:rPr>
-                <w:color w:val="203047"/>
-                <w:sz w:val="16"/>
-                <w:szCs w:val="16"/>
-              </w:rPr>
-              <w:t xml:space="preserve"/>
-            </w:r>
-            <w:r>
-              <w:rPr>
-                <w:color w:val="203047"/>
-                <w:sz w:val="16"/>
-                <w:szCs w:val="16"/>
-              </w:rPr>
-              <w:br/>
-              <w:t xml:space="preserve">Compared PDF tools and adopted AnyDoc. Repaired damaged text with AI, processed tables and equations separately, and preserved original figures.</w:t>
+              <w:t xml:space="preserve">Solution:</w:t>
+            </w:r>
+            <w:r>
+              <w:rPr>
+                <w:color w:val="203047"/>
+                <w:sz w:val="16"/>
+                <w:szCs w:val="16"/>
+              </w:rPr>
+              <w:t xml:space="preserve"> Compared PDF tools and adopted AnyDoc. Repaired damaged text with AI, processed tables and equations separately, and preserved original figures.</w:t>
             </w:r>
             <w:r>
               <w:rPr>
@@ -596,24 +578,15 @@
                 <w:sz w:val="16"/>
                 <w:szCs w:val="16"/>
               </w:rPr>
-              <w:t xml:space="preserve">Result</w:t>
-            </w:r>
-            <w:r>
-              <w:rPr>
-                <w:color w:val="203047"/>
-                <w:sz w:val="16"/>
-                <w:szCs w:val="16"/>
-              </w:rPr>
-              <w:t xml:space="preserve"/>
-            </w:r>
-            <w:r>
-              <w:rPr>
-                <w:color w:val="203047"/>
-                <w:sz w:val="16"/>
-                <w:szCs w:val="16"/>
-              </w:rPr>
-              <w:br/>
-              <w:t xml:space="preserve">Internal pass rate on 30 PDF pages improved from 45.17% to 89.89%.</w:t>
+              <w:t xml:space="preserve">Result:</w:t>
+            </w:r>
+            <w:r>
+              <w:rPr>
+                <w:color w:val="203047"/>
+                <w:sz w:val="16"/>
+                <w:szCs w:val="16"/>
+              </w:rPr>
+              <w:t xml:space="preserve"> Internal pass rate on 30 PDF pages improved from 45.17% to 89.89%.</w:t>
             </w:r>
           </w:p>
           <w:p>
@@ -651,24 +624,15 @@
                 <w:sz w:val="16"/>
                 <w:szCs w:val="16"/>
               </w:rPr>
-              <w:t xml:space="preserve">Problem</w:t>
-            </w:r>
-            <w:r>
-              <w:rPr>
-                <w:color w:val="203047"/>
-                <w:sz w:val="16"/>
-                <w:szCs w:val="16"/>
-              </w:rPr>
-              <w:t xml:space="preserve"/>
-            </w:r>
-            <w:r>
-              <w:rPr>
-                <w:color w:val="203047"/>
-                <w:sz w:val="16"/>
-                <w:szCs w:val="16"/>
-              </w:rPr>
-              <w:br/>
-              <w:t xml:space="preserve">Later documents waited for earlier external AI responses.</w:t>
+              <w:t xml:space="preserve">Problem:</w:t>
+            </w:r>
+            <w:r>
+              <w:rPr>
+                <w:color w:val="203047"/>
+                <w:sz w:val="16"/>
+                <w:szCs w:val="16"/>
+              </w:rPr>
+              <w:t xml:space="preserve"> Later documents waited for earlier external AI responses.</w:t>
             </w:r>
             <w:r>
               <w:rPr>
@@ -687,24 +651,15 @@
                 <w:sz w:val="16"/>
                 <w:szCs w:val="16"/>
               </w:rPr>
-              <w:t xml:space="preserve">Solution</w:t>
-            </w:r>
-            <w:r>
-              <w:rPr>
-                <w:color w:val="203047"/>
-                <w:sz w:val="16"/>
-                <w:szCs w:val="16"/>
-              </w:rPr>
-              <w:t xml:space="preserve"/>
-            </w:r>
-            <w:r>
-              <w:rPr>
-                <w:color w:val="203047"/>
-                <w:sz w:val="16"/>
-                <w:szCs w:val="16"/>
-              </w:rPr>
-              <w:br/>
-              <w:t xml:space="preserve">Compared worker counts and requests per worker. Capped workers at 4 to manage memory; rejected extra concurrency and GPU parallelism that slowed processing.</w:t>
+              <w:t xml:space="preserve">Solution:</w:t>
+            </w:r>
+            <w:r>
+              <w:rPr>
+                <w:color w:val="203047"/>
+                <w:sz w:val="16"/>
+                <w:szCs w:val="16"/>
+              </w:rPr>
+              <w:t xml:space="preserve"> Compared worker counts and requests per worker. Capped workers at 4 to manage memory; rejected extra concurrency and GPU parallelism that slowed processing.</w:t>
             </w:r>
             <w:r>
               <w:rPr>
@@ -723,24 +678,15 @@
                 <w:sz w:val="16"/>
                 <w:szCs w:val="16"/>
               </w:rPr>
-              <w:t xml:space="preserve">Result</w:t>
-            </w:r>
-            <w:r>
-              <w:rPr>
-                <w:color w:val="203047"/>
-                <w:sz w:val="16"/>
-                <w:szCs w:val="16"/>
-              </w:rPr>
-              <w:t xml:space="preserve"/>
-            </w:r>
-            <w:r>
-              <w:rPr>
-                <w:color w:val="203047"/>
-                <w:sz w:val="16"/>
-                <w:szCs w:val="16"/>
-              </w:rPr>
-              <w:br/>
-              <w:t xml:space="preserve">Analysis of 4 documents fell from 282.11s to 73.89s (about 74% less).</w:t>
+              <w:t xml:space="preserve">Result:</w:t>
+            </w:r>
+            <w:r>
+              <w:rPr>
+                <w:color w:val="203047"/>
+                <w:sz w:val="16"/>
+                <w:szCs w:val="16"/>
+              </w:rPr>
+              <w:t xml:space="preserve"> Analysis of 4 documents fell from 282.11s to 73.89s (about 74% less).</w:t>
             </w:r>
           </w:p>
           <w:p>
@@ -808,24 +754,15 @@
                 <w:sz w:val="16"/>
                 <w:szCs w:val="16"/>
               </w:rPr>
-              <w:t xml:space="preserve">Problem</w:t>
-            </w:r>
-            <w:r>
-              <w:rPr>
-                <w:color w:val="203047"/>
-                <w:sz w:val="16"/>
-                <w:szCs w:val="16"/>
-              </w:rPr>
-              <w:t xml:space="preserve"/>
-            </w:r>
-            <w:r>
-              <w:rPr>
-                <w:color w:val="203047"/>
-                <w:sz w:val="16"/>
-                <w:szCs w:val="16"/>
-              </w:rPr>
-              <w:br/>
-              <w:t xml:space="preserve">Retrieval missed required facts and returned evidence for unanswerable questions.</w:t>
+              <w:t xml:space="preserve">Problem:</w:t>
+            </w:r>
+            <w:r>
+              <w:rPr>
+                <w:color w:val="203047"/>
+                <w:sz w:val="16"/>
+                <w:szCs w:val="16"/>
+              </w:rPr>
+              <w:t xml:space="preserve"> Retrieval missed required facts and returned evidence for unanswerable questions.</w:t>
             </w:r>
             <w:r>
               <w:rPr>
@@ -844,24 +781,15 @@
                 <w:sz w:val="16"/>
                 <w:szCs w:val="16"/>
               </w:rPr>
-              <w:t xml:space="preserve">Solution</w:t>
-            </w:r>
-            <w:r>
-              <w:rPr>
-                <w:color w:val="203047"/>
-                <w:sz w:val="16"/>
-                <w:szCs w:val="16"/>
-              </w:rPr>
-              <w:t xml:space="preserve"/>
-            </w:r>
-            <w:r>
-              <w:rPr>
-                <w:color w:val="203047"/>
-                <w:sz w:val="16"/>
-                <w:szCs w:val="16"/>
-              </w:rPr>
-              <w:br/>
-              <w:t xml:space="preserve">Applied Jev after routing tests, then controlled candidates and return limits after a full-corpus trial. Tuned to 300 candidates and up to 4 parallel batches.</w:t>
+              <w:t xml:space="preserve">Solution:</w:t>
+            </w:r>
+            <w:r>
+              <w:rPr>
+                <w:color w:val="203047"/>
+                <w:sz w:val="16"/>
+                <w:szCs w:val="16"/>
+              </w:rPr>
+              <w:t xml:space="preserve"> Applied Jev after routing tests, then controlled candidates and return limits after a full-corpus trial. Tuned to 300 candidates and up to 4 parallel batches.</w:t>
             </w:r>
             <w:r>
               <w:rPr>
@@ -880,24 +808,15 @@
                 <w:sz w:val="16"/>
                 <w:szCs w:val="16"/>
               </w:rPr>
-              <w:t xml:space="preserve">Result</w:t>
-            </w:r>
-            <w:r>
-              <w:rPr>
-                <w:color w:val="203047"/>
-                <w:sz w:val="16"/>
-                <w:szCs w:val="16"/>
-              </w:rPr>
-              <w:t xml:space="preserve"/>
-            </w:r>
-            <w:r>
-              <w:rPr>
-                <w:color w:val="203047"/>
-                <w:sz w:val="16"/>
-                <w:szCs w:val="16"/>
-              </w:rPr>
-              <w:br/>
-              <w:t xml:space="preserve">Across 9 papers, coverage on 80 answerable questions rose from 66.25% to 91.25%. False evidence returns on 20 unanswerable questions fell from 20 to 0. Median time before/after Jev tuning: 9.090s → 2.251s.</w:t>
+              <w:t xml:space="preserve">Result:</w:t>
+            </w:r>
+            <w:r>
+              <w:rPr>
+                <w:color w:val="203047"/>
+                <w:sz w:val="16"/>
+                <w:szCs w:val="16"/>
+              </w:rPr>
+              <w:t xml:space="preserve"> Across 9 papers, coverage on 80 answerable questions rose from 66.25% to 91.25%. False evidence returns on 20 unanswerable questions fell from 20 to 0. Median time before/after Jev tuning: 9.090s → 2.251s.</w:t>
             </w:r>
           </w:p>
         </w:tc>
@@ -1105,24 +1024,15 @@
                 <w:sz w:val="16"/>
                 <w:szCs w:val="16"/>
               </w:rPr>
-              <w:t xml:space="preserve">Problem</w:t>
-            </w:r>
-            <w:r>
-              <w:rPr>
-                <w:color w:val="203047"/>
-                <w:sz w:val="16"/>
-                <w:szCs w:val="16"/>
-              </w:rPr>
-              <w:t xml:space="preserve"/>
-            </w:r>
-            <w:r>
-              <w:rPr>
-                <w:color w:val="203047"/>
-                <w:sz w:val="16"/>
-                <w:szCs w:val="16"/>
-              </w:rPr>
-              <w:br/>
-              <w:t xml:space="preserve">Developers cannot build every recurring workflow users need.</w:t>
+              <w:t xml:space="preserve">Problem:</w:t>
+            </w:r>
+            <w:r>
+              <w:rPr>
+                <w:color w:val="203047"/>
+                <w:sz w:val="16"/>
+                <w:szCs w:val="16"/>
+              </w:rPr>
+              <w:t xml:space="preserve"> Developers cannot build every recurring workflow users need.</w:t>
             </w:r>
             <w:r>
               <w:rPr>
@@ -1141,24 +1051,15 @@
                 <w:sz w:val="16"/>
                 <w:szCs w:val="16"/>
               </w:rPr>
-              <w:t xml:space="preserve">Solution</w:t>
-            </w:r>
-            <w:r>
-              <w:rPr>
-                <w:color w:val="203047"/>
-                <w:sz w:val="16"/>
-                <w:szCs w:val="16"/>
-              </w:rPr>
-              <w:t xml:space="preserve"/>
-            </w:r>
-            <w:r>
-              <w:rPr>
-                <w:color w:val="203047"/>
-                <w:sz w:val="16"/>
-                <w:szCs w:val="16"/>
-              </w:rPr>
-              <w:br/>
-              <w:t xml:space="preserve">Built drafting, review and publishing of natural-language instructions, with checks against bypassing permissions or approval. Document changes require separate preview and approval.</w:t>
+              <w:t xml:space="preserve">Solution:</w:t>
+            </w:r>
+            <w:r>
+              <w:rPr>
+                <w:color w:val="203047"/>
+                <w:sz w:val="16"/>
+                <w:szCs w:val="16"/>
+              </w:rPr>
+              <w:t xml:space="preserve"> Built drafting, review and publishing of natural-language instructions, with checks against bypassing permissions or approval. Document changes require separate preview and approval.</w:t>
             </w:r>
             <w:r>
               <w:rPr>
@@ -1177,24 +1078,15 @@
                 <w:sz w:val="16"/>
                 <w:szCs w:val="16"/>
               </w:rPr>
-              <w:t xml:space="preserve">Result</w:t>
-            </w:r>
-            <w:r>
-              <w:rPr>
-                <w:color w:val="203047"/>
-                <w:sz w:val="16"/>
-                <w:szCs w:val="16"/>
-              </w:rPr>
-              <w:t xml:space="preserve"/>
-            </w:r>
-            <w:r>
-              <w:rPr>
-                <w:color w:val="203047"/>
-                <w:sz w:val="16"/>
-                <w:szCs w:val="16"/>
-              </w:rPr>
-              <w:br/>
-              <w:t xml:space="preserve">Published Skills became available to the Agent. In a 6-document check, no changes occurred before approval; 3 folders were created and documents moved afterward.</w:t>
+              <w:t xml:space="preserve">Result:</w:t>
+            </w:r>
+            <w:r>
+              <w:rPr>
+                <w:color w:val="203047"/>
+                <w:sz w:val="16"/>
+                <w:szCs w:val="16"/>
+              </w:rPr>
+              <w:t xml:space="preserve"> Published Skills became available to the Agent. In a 6-document check, no changes occurred before approval; 3 folders were created and documents moved afterward.</w:t>
             </w:r>
           </w:p>
           <w:p>
@@ -1232,24 +1124,15 @@
                 <w:sz w:val="16"/>
                 <w:szCs w:val="16"/>
               </w:rPr>
-              <w:t xml:space="preserve">Problem</w:t>
-            </w:r>
-            <w:r>
-              <w:rPr>
-                <w:color w:val="203047"/>
-                <w:sz w:val="16"/>
-                <w:szCs w:val="16"/>
-              </w:rPr>
-              <w:t xml:space="preserve"/>
-            </w:r>
-            <w:r>
-              <w:rPr>
-                <w:color w:val="203047"/>
-                <w:sz w:val="16"/>
-                <w:szCs w:val="16"/>
-              </w:rPr>
-              <w:br/>
-              <w:t xml:space="preserve">Misclassifying questions as edits led to the wrong action.</w:t>
+              <w:t xml:space="preserve">Problem:</w:t>
+            </w:r>
+            <w:r>
+              <w:rPr>
+                <w:color w:val="203047"/>
+                <w:sz w:val="16"/>
+                <w:szCs w:val="16"/>
+              </w:rPr>
+              <w:t xml:space="preserve"> Misclassifying questions as edits led to the wrong action.</w:t>
             </w:r>
             <w:r>
               <w:rPr>
@@ -1268,24 +1151,15 @@
                 <w:sz w:val="16"/>
                 <w:szCs w:val="16"/>
               </w:rPr>
-              <w:t xml:space="preserve">Solution</w:t>
-            </w:r>
-            <w:r>
-              <w:rPr>
-                <w:color w:val="203047"/>
-                <w:sz w:val="16"/>
-                <w:szCs w:val="16"/>
-              </w:rPr>
-              <w:t xml:space="preserve"/>
-            </w:r>
-            <w:r>
-              <w:rPr>
-                <w:color w:val="203047"/>
-                <w:sz w:val="16"/>
-                <w:szCs w:val="16"/>
-              </w:rPr>
-              <w:br/>
-              <w:t xml:space="preserve">Applied Jev to select task types and additional conditions for questions, edits, document creation and folder organization.</w:t>
+              <w:t xml:space="preserve">Solution:</w:t>
+            </w:r>
+            <w:r>
+              <w:rPr>
+                <w:color w:val="203047"/>
+                <w:sz w:val="16"/>
+                <w:szCs w:val="16"/>
+              </w:rPr>
+              <w:t xml:space="preserve"> Applied Jev to select task types and additional conditions for questions, edits, document creation and folder organization.</w:t>
             </w:r>
             <w:r>
               <w:rPr>
@@ -1304,24 +1178,15 @@
                 <w:sz w:val="16"/>
                 <w:szCs w:val="16"/>
               </w:rPr>
-              <w:t xml:space="preserve">Result</w:t>
-            </w:r>
-            <w:r>
-              <w:rPr>
-                <w:color w:val="203047"/>
-                <w:sz w:val="16"/>
-                <w:szCs w:val="16"/>
-              </w:rPr>
-              <w:t xml:space="preserve"/>
-            </w:r>
-            <w:r>
-              <w:rPr>
-                <w:color w:val="203047"/>
-                <w:sz w:val="16"/>
-                <w:szCs w:val="16"/>
-              </w:rPr>
-              <w:br/>
-              <w:t xml:space="preserve">Fully correct decisions on the same 98 requests rose from 77 to 81. Median decision time fell from 8.967s to 0.658s.</w:t>
+              <w:t xml:space="preserve">Result:</w:t>
+            </w:r>
+            <w:r>
+              <w:rPr>
+                <w:color w:val="203047"/>
+                <w:sz w:val="16"/>
+                <w:szCs w:val="16"/>
+              </w:rPr>
+              <w:t xml:space="preserve"> Fully correct decisions on the same 98 requests rose from 77 to 81. Median decision time fell from 8.967s to 0.658s.</w:t>
             </w:r>
           </w:p>
           <w:p>
@@ -1406,7 +1271,7 @@
               <w:keepNext w:val="false"/>
               <w:spacing w:after="45" w:before="0" w:line="190"/>
             </w:pPr>
-            <w:hyperlink w:history="1" r:id="rIdw_yqucaur_0kefkhgzjr4">
+            <w:hyperlink w:history="1" r:id="rId_ohcdz46lhpbufp9bv8tr">
               <w:r>
                 <w:rPr>
                   <w:color w:val="315CBB"/>
@@ -1424,7 +1289,7 @@
               </w:rPr>
               <w:t xml:space="preserve">   </w:t>
             </w:r>
-            <w:hyperlink w:history="1" r:id="rIdipuxac32_isj2kvumpjhc">
+            <w:hyperlink w:history="1" r:id="rId9ubwkxs0slseqcpwiib0t">
               <w:r>
                 <w:rPr>
                   <w:color w:val="315CBB"/>
@@ -1442,7 +1307,7 @@
               </w:rPr>
               <w:t xml:space="preserve">   </w:t>
             </w:r>
-            <w:hyperlink w:history="1" r:id="rIdln6lcdcy25kusdqfbihg0">
+            <w:hyperlink w:history="1" r:id="rIdtxadosqt89qvpkaenu19d">
               <w:r>
                 <w:rPr>
                   <w:color w:val="315CBB"/>
@@ -1460,7 +1325,7 @@
               </w:rPr>
               <w:t xml:space="preserve">   </w:t>
             </w:r>
-            <w:hyperlink w:history="1" r:id="rId2otgpegvcyamu51_hihn3">
+            <w:hyperlink w:history="1" r:id="rIdoodiremeybhoj0yak7ajm">
               <w:r>
                 <w:rPr>
                   <w:color w:val="315CBB"/>
@@ -1615,7 +1480,7 @@
               <w:br/>
               <w:t xml:space="preserve"/>
             </w:r>
-            <w:hyperlink w:history="1" r:id="rIdkyel9iw6nu2xtz3fneqgy">
+            <w:hyperlink w:history="1" r:id="rId6ap_ffnxmmmkyfruim9tl">
               <w:r>
                 <w:rPr>
                   <w:color w:val="315CBB"/>
@@ -1625,7 +1490,7 @@
                 <w:t xml:space="preserve">Personal shopping project · Login ↗</w:t>
               </w:r>
             </w:hyperlink>
-            <w:hyperlink w:history="1" r:id="rIdnpbluupftioqtj6k1ekqq">
+            <w:hyperlink w:history="1" r:id="rIdixoa1nuf6_zxy2nr3yb9r">
               <w:r>
                 <w:rPr>
                   <w:color w:val="315CBB"/>
@@ -2036,7 +1901,7 @@
               <w:keepNext w:val="false"/>
               <w:spacing w:after="45" w:before="0" w:line="190"/>
             </w:pPr>
-            <w:hyperlink w:history="1" r:id="rIdazomc58stmp_hflk4vbyc">
+            <w:hyperlink w:history="1" r:id="rIdntw3fzo06pxaufbmgn9e7">
               <w:r>
                 <w:rPr>
                   <w:color w:val="315CBB"/>
@@ -2090,24 +1955,15 @@
                 <w:sz w:val="16"/>
                 <w:szCs w:val="16"/>
               </w:rPr>
-              <w:t xml:space="preserve">Problem</w:t>
-            </w:r>
-            <w:r>
-              <w:rPr>
-                <w:color w:val="203047"/>
-                <w:sz w:val="16"/>
-                <w:szCs w:val="16"/>
-              </w:rPr>
-              <w:t xml:space="preserve"/>
-            </w:r>
-            <w:r>
-              <w:rPr>
-                <w:color w:val="203047"/>
-                <w:sz w:val="16"/>
-                <w:szCs w:val="16"/>
-              </w:rPr>
-              <w:br/>
-              <w:t xml:space="preserve">Converting all 44,000 drug records was estimated to cost about $200 in API calls.</w:t>
+              <w:t xml:space="preserve">Problem:</w:t>
+            </w:r>
+            <w:r>
+              <w:rPr>
+                <w:color w:val="203047"/>
+                <w:sz w:val="16"/>
+                <w:szCs w:val="16"/>
+              </w:rPr>
+              <w:t xml:space="preserve"> Converting all 44,000 drug records was estimated to cost about $200 in API calls.</w:t>
             </w:r>
             <w:r>
               <w:rPr>
@@ -2126,24 +1982,15 @@
                 <w:sz w:val="16"/>
                 <w:szCs w:val="16"/>
               </w:rPr>
-              <w:t xml:space="preserve">Solution</w:t>
-            </w:r>
-            <w:r>
-              <w:rPr>
-                <w:color w:val="203047"/>
-                <w:sz w:val="16"/>
-                <w:szCs w:val="16"/>
-              </w:rPr>
-              <w:t xml:space="preserve"/>
-            </w:r>
-            <w:r>
-              <w:rPr>
-                <w:color w:val="203047"/>
-                <w:sz w:val="16"/>
-                <w:szCs w:val="16"/>
-              </w:rPr>
-              <w:br/>
-              <w:t xml:space="preserve">Removed exact duplicates, then semantically equivalent sentences. Filled the missing 5% with ingredient-specific precautions, converted via GPT Batch API and mapped results back to each drug.</w:t>
+              <w:t xml:space="preserve">Solution:</w:t>
+            </w:r>
+            <w:r>
+              <w:rPr>
+                <w:color w:val="203047"/>
+                <w:sz w:val="16"/>
+                <w:szCs w:val="16"/>
+              </w:rPr>
+              <w:t xml:space="preserve"> Removed exact duplicates, then semantically equivalent sentences. Filled the missing 5% with ingredient-specific precautions, converted via GPT Batch API and mapped results back to each drug.</w:t>
             </w:r>
           </w:p>
           <w:p>
@@ -2159,24 +2006,15 @@
                 <w:sz w:val="16"/>
                 <w:szCs w:val="16"/>
               </w:rPr>
-              <w:t xml:space="preserve">Result</w:t>
-            </w:r>
-            <w:r>
-              <w:rPr>
-                <w:color w:val="203047"/>
-                <w:sz w:val="16"/>
-                <w:szCs w:val="16"/>
-              </w:rPr>
-              <w:t xml:space="preserve"/>
-            </w:r>
-            <w:r>
-              <w:rPr>
-                <w:color w:val="203047"/>
-                <w:sz w:val="16"/>
-                <w:szCs w:val="16"/>
-              </w:rPr>
-              <w:br/>
-              <w:t xml:space="preserve">Conversion input shrank from 1GB to 326MB. Actual API spending was $11.18 versus about $200 estimated for all original text.</w:t>
+              <w:t xml:space="preserve">Result:</w:t>
+            </w:r>
+            <w:r>
+              <w:rPr>
+                <w:color w:val="203047"/>
+                <w:sz w:val="16"/>
+                <w:szCs w:val="16"/>
+              </w:rPr>
+              <w:t xml:space="preserve"> Conversion input shrank from 1GB to 326MB. Actual API spending was $11.18 versus about $200 estimated for all original text.</w:t>
             </w:r>
           </w:p>
           <w:p>
@@ -2241,24 +2079,15 @@
                 <w:sz w:val="16"/>
                 <w:szCs w:val="16"/>
               </w:rPr>
-              <w:t xml:space="preserve">Problem</w:t>
-            </w:r>
-            <w:r>
-              <w:rPr>
-                <w:color w:val="203047"/>
-                <w:sz w:val="16"/>
-                <w:szCs w:val="16"/>
-              </w:rPr>
-              <w:t xml:space="preserve"/>
-            </w:r>
-            <w:r>
-              <w:rPr>
-                <w:color w:val="203047"/>
-                <w:sz w:val="16"/>
-                <w:szCs w:val="16"/>
-              </w:rPr>
-              <w:br/>
-              <w:t xml:space="preserve">Everyday symptom language differed from drug indications, while sensitive health data needed to stay out of external AI inputs.</w:t>
+              <w:t xml:space="preserve">Problem:</w:t>
+            </w:r>
+            <w:r>
+              <w:rPr>
+                <w:color w:val="203047"/>
+                <w:sz w:val="16"/>
+                <w:szCs w:val="16"/>
+              </w:rPr>
+              <w:t xml:space="preserve"> Everyday symptom language differed from drug indications, while sensitive health data needed to stay out of external AI inputs.</w:t>
             </w:r>
             <w:r>
               <w:rPr>
@@ -2277,24 +2106,15 @@
                 <w:sz w:val="16"/>
                 <w:szCs w:val="16"/>
               </w:rPr>
-              <w:t xml:space="preserve">Solution</w:t>
-            </w:r>
-            <w:r>
-              <w:rPr>
-                <w:color w:val="203047"/>
-                <w:sz w:val="16"/>
-                <w:szCs w:val="16"/>
-              </w:rPr>
-              <w:t xml:space="preserve"/>
-            </w:r>
-            <w:r>
-              <w:rPr>
-                <w:color w:val="203047"/>
-                <w:sz w:val="16"/>
-                <w:szCs w:val="16"/>
-              </w:rPr>
-              <w:br/>
-              <w:t xml:space="preserve">Used Weaviate semantic search and AI orchestration for drug discovery, medication risks and dosage. Evaluated pregnancy, current medications and underlying conditions in internal code.</w:t>
+              <w:t xml:space="preserve">Solution:</w:t>
+            </w:r>
+            <w:r>
+              <w:rPr>
+                <w:color w:val="203047"/>
+                <w:sz w:val="16"/>
+                <w:szCs w:val="16"/>
+              </w:rPr>
+              <w:t xml:space="preserve"> Used Weaviate semantic search and AI orchestration for drug discovery, medication risks and dosage. Evaluated pregnancy, current medications and underlying conditions in internal code.</w:t>
             </w:r>
             <w:r>
               <w:rPr>
@@ -2313,24 +2133,15 @@
                 <w:sz w:val="16"/>
                 <w:szCs w:val="16"/>
               </w:rPr>
-              <w:t xml:space="preserve">Result</w:t>
-            </w:r>
-            <w:r>
-              <w:rPr>
-                <w:color w:val="203047"/>
-                <w:sz w:val="16"/>
-                <w:szCs w:val="16"/>
-              </w:rPr>
-              <w:t xml:space="preserve"/>
-            </w:r>
-            <w:r>
-              <w:rPr>
-                <w:color w:val="203047"/>
-                <w:sz w:val="16"/>
-                <w:szCs w:val="16"/>
-              </w:rPr>
-              <w:br/>
-              <w:t xml:space="preserve">Implemented personalized symptom-based search while excluding those profile fields from external LLM inputs.</w:t>
+              <w:t xml:space="preserve">Result:</w:t>
+            </w:r>
+            <w:r>
+              <w:rPr>
+                <w:color w:val="203047"/>
+                <w:sz w:val="16"/>
+                <w:szCs w:val="16"/>
+              </w:rPr>
+              <w:t xml:space="preserve"> Implemented personalized symptom-based search while excluding those profile fields from external LLM inputs.</w:t>
             </w:r>
           </w:p>
           <w:p>
@@ -2439,7 +2250,7 @@
               <w:keepNext w:val="false"/>
               <w:spacing w:after="45" w:before="0" w:line="190"/>
             </w:pPr>
-            <w:hyperlink w:history="1" r:id="rIdnadyipt6hbrejgtn16ser">
+            <w:hyperlink w:history="1" r:id="rIdf9rex4vzlgldmes2rpau1">
               <w:r>
                 <w:rPr>
                   <w:color w:val="315CBB"/>
@@ -2457,7 +2268,7 @@
               </w:rPr>
               <w:t xml:space="preserve">   </w:t>
             </w:r>
-            <w:hyperlink w:history="1" r:id="rIdx7yjjsqrx7ciijmhfkp33">
+            <w:hyperlink w:history="1" r:id="rIdpkmorllyec-y-jrfqh2l3">
               <w:r>
                 <w:rPr>
                   <w:color w:val="315CBB"/>
@@ -2612,7 +2423,7 @@
               <w:keepNext w:val="false"/>
               <w:spacing w:after="45" w:before="0" w:line="190"/>
             </w:pPr>
-            <w:hyperlink w:history="1" r:id="rIddcauywpzkloyopyemxvvo">
+            <w:hyperlink w:history="1" r:id="rIdnd8lfv21_r0vlkpsapx9p">
               <w:r>
                 <w:rPr>
                   <w:color w:val="315CBB"/>
@@ -2630,7 +2441,7 @@
               </w:rPr>
               <w:t xml:space="preserve">   </w:t>
             </w:r>
-            <w:hyperlink w:history="1" r:id="rIdwhx6iad1dxdw0loyxsg9u">
+            <w:hyperlink w:history="1" r:id="rIdf1whgb4ueq72igd26qotd">
               <w:r>
                 <w:rPr>
                   <w:color w:val="315CBB"/>
@@ -2648,7 +2459,7 @@
               </w:rPr>
               <w:t xml:space="preserve">   </w:t>
             </w:r>
-            <w:hyperlink w:history="1" r:id="rIdosynzkkxhitq4tnimuqnr">
+            <w:hyperlink w:history="1" r:id="rIdjkq7j7pgqjb5deogzi5hh">
               <w:r>
                 <w:rPr>
                   <w:color w:val="315CBB"/>
@@ -2759,14 +2570,14 @@
                     <w:keepNext w:val="false"/>
                     <w:spacing w:after="45" w:before="0" w:line="190"/>
                   </w:pPr>
-                  <w:hyperlink w:history="1" r:id="rIdxr6zifz1khsskmzzivpfa">
+                  <w:hyperlink w:history="1" r:id="rIdtyc4bkipsgvhgcnbgeonf">
                     <w:r>
                       <w:drawing>
                         <wp:inline distT="0" distB="0" distL="0" distR="0">
                           <wp:extent cx="466725" cy="647700"/>
                           <wp:effectExtent t="0" r="0" b="0" l="0"/>
                           <wp:docPr id="1" name="" descr="" title="">
-                            <a:hlinkClick xmlns:a="http://schemas.openxmlformats.org/drawingml/2006/main" r:id="rIdxr6zifz1khsskmzzivpfa"/>
+                            <a:hlinkClick xmlns:a="http://schemas.openxmlformats.org/drawingml/2006/main" r:id="rIdtyc4bkipsgvhgcnbgeonf"/>
                           </wp:docPr>
                           <wp:cNvGraphicFramePr>
                             <a:graphicFrameLocks xmlns:a="http://schemas.openxmlformats.org/drawingml/2006/main" noChangeAspect="1"/>
@@ -2776,7 +2587,7 @@
                               <pic:pic xmlns:pic="http://schemas.openxmlformats.org/drawingml/2006/picture">
                                 <pic:nvPicPr>
                                   <pic:cNvPr id="0" name="" descr="">
-                                    <a:hlinkClick r:id="rIdxr6zifz1khsskmzzivpfa"/>
+                                    <a:hlinkClick r:id="rIdtyc4bkipsgvhgcnbgeonf"/>
                                   </pic:cNvPr>
                                   <pic:cNvPicPr>
                                     <a:picLocks noChangeAspect="1" noChangeArrowheads="1"/>
@@ -2961,14 +2772,14 @@
                     <w:keepNext w:val="false"/>
                     <w:spacing w:after="45" w:before="0" w:line="190"/>
                   </w:pPr>
-                  <w:hyperlink w:history="1" r:id="rIdkvmj-icxdtqfauxsh9afp">
+                  <w:hyperlink w:history="1" r:id="rIdf3nyerdy0kjsfnlft_ywo">
                     <w:r>
                       <w:drawing>
                         <wp:inline distT="0" distB="0" distL="0" distR="0">
                           <wp:extent cx="533400" cy="400050"/>
                           <wp:effectExtent t="0" r="0" b="0" l="0"/>
                           <wp:docPr id="1" name="" descr="" title="">
-                            <a:hlinkClick xmlns:a="http://schemas.openxmlformats.org/drawingml/2006/main" r:id="rIdkvmj-icxdtqfauxsh9afp"/>
+                            <a:hlinkClick xmlns:a="http://schemas.openxmlformats.org/drawingml/2006/main" r:id="rIdf3nyerdy0kjsfnlft_ywo"/>
                           </wp:docPr>
                           <wp:cNvGraphicFramePr>
                             <a:graphicFrameLocks xmlns:a="http://schemas.openxmlformats.org/drawingml/2006/main" noChangeAspect="1"/>
@@ -2978,7 +2789,7 @@
                               <pic:pic xmlns:pic="http://schemas.openxmlformats.org/drawingml/2006/picture">
                                 <pic:nvPicPr>
                                   <pic:cNvPr id="0" name="" descr="">
-                                    <a:hlinkClick r:id="rIdkvmj-icxdtqfauxsh9afp"/>
+                                    <a:hlinkClick r:id="rIdf3nyerdy0kjsfnlft_ywo"/>
                                   </pic:cNvPr>
                                   <pic:cNvPicPr>
                                     <a:picLocks noChangeAspect="1" noChangeArrowheads="1"/>
@@ -3479,14 +3290,14 @@
                     <w:keepNext w:val="false"/>
                     <w:spacing w:after="45" w:before="0" w:line="190"/>
                   </w:pPr>
-                  <w:hyperlink w:history="1" r:id="rIdqclr6uvhvwpi4p2olfpqh">
+                  <w:hyperlink w:history="1" r:id="rIdajxuvdjipriwca6i0tn8f">
                     <w:r>
                       <w:drawing>
                         <wp:inline distT="0" distB="0" distL="0" distR="0">
                           <wp:extent cx="457200" cy="647700"/>
                           <wp:effectExtent t="0" r="0" b="0" l="0"/>
                           <wp:docPr id="1" name="" descr="" title="">
-                            <a:hlinkClick xmlns:a="http://schemas.openxmlformats.org/drawingml/2006/main" r:id="rIdqclr6uvhvwpi4p2olfpqh"/>
+                            <a:hlinkClick xmlns:a="http://schemas.openxmlformats.org/drawingml/2006/main" r:id="rIdajxuvdjipriwca6i0tn8f"/>
                           </wp:docPr>
                           <wp:cNvGraphicFramePr>
                             <a:graphicFrameLocks xmlns:a="http://schemas.openxmlformats.org/drawingml/2006/main" noChangeAspect="1"/>
@@ -3496,7 +3307,7 @@
                               <pic:pic xmlns:pic="http://schemas.openxmlformats.org/drawingml/2006/picture">
                                 <pic:nvPicPr>
                                   <pic:cNvPr id="0" name="" descr="">
-                                    <a:hlinkClick r:id="rIdqclr6uvhvwpi4p2olfpqh"/>
+                                    <a:hlinkClick r:id="rIdajxuvdjipriwca6i0tn8f"/>
                                   </pic:cNvPr>
                                   <pic:cNvPicPr>
                                     <a:picLocks noChangeAspect="1" noChangeArrowheads="1"/>
@@ -3678,14 +3489,14 @@
                     <w:keepNext w:val="false"/>
                     <w:spacing w:after="45" w:before="0" w:line="190"/>
                   </w:pPr>
-                  <w:hyperlink w:history="1" r:id="rId8ug61vt0dctoekxvyypvo">
+                  <w:hyperlink w:history="1" r:id="rId-qfmv17t4v3fkzuem7kal">
                     <w:r>
                       <w:drawing>
                         <wp:inline distT="0" distB="0" distL="0" distR="0">
                           <wp:extent cx="457200" cy="647700"/>
                           <wp:effectExtent t="0" r="0" b="0" l="0"/>
                           <wp:docPr id="1" name="" descr="" title="">
-                            <a:hlinkClick xmlns:a="http://schemas.openxmlformats.org/drawingml/2006/main" r:id="rId8ug61vt0dctoekxvyypvo"/>
+                            <a:hlinkClick xmlns:a="http://schemas.openxmlformats.org/drawingml/2006/main" r:id="rId-qfmv17t4v3fkzuem7kal"/>
                           </wp:docPr>
                           <wp:cNvGraphicFramePr>
                             <a:graphicFrameLocks xmlns:a="http://schemas.openxmlformats.org/drawingml/2006/main" noChangeAspect="1"/>
@@ -3695,7 +3506,7 @@
                               <pic:pic xmlns:pic="http://schemas.openxmlformats.org/drawingml/2006/picture">
                                 <pic:nvPicPr>
                                   <pic:cNvPr id="0" name="" descr="">
-                                    <a:hlinkClick r:id="rId8ug61vt0dctoekxvyypvo"/>
+                                    <a:hlinkClick r:id="rId-qfmv17t4v3fkzuem7kal"/>
                                   </pic:cNvPr>
                                   <pic:cNvPicPr>
                                     <a:picLocks noChangeAspect="1" noChangeArrowheads="1"/>
@@ -3877,14 +3688,14 @@
                     <w:keepNext w:val="false"/>
                     <w:spacing w:after="45" w:before="0" w:line="190"/>
                   </w:pPr>
-                  <w:hyperlink w:history="1" r:id="rIdwnvm4rv_-fdz7ijkpwemh">
+                  <w:hyperlink w:history="1" r:id="rIdndnupkyda4jbdfpe6kfvv">
                     <w:r>
                       <w:drawing>
                         <wp:inline distT="0" distB="0" distL="0" distR="0">
                           <wp:extent cx="457200" cy="647700"/>
                           <wp:effectExtent t="0" r="0" b="0" l="0"/>
                           <wp:docPr id="1" name="" descr="" title="">
-                            <a:hlinkClick xmlns:a="http://schemas.openxmlformats.org/drawingml/2006/main" r:id="rIdwnvm4rv_-fdz7ijkpwemh"/>
+                            <a:hlinkClick xmlns:a="http://schemas.openxmlformats.org/drawingml/2006/main" r:id="rIdndnupkyda4jbdfpe6kfvv"/>
                           </wp:docPr>
                           <wp:cNvGraphicFramePr>
                             <a:graphicFrameLocks xmlns:a="http://schemas.openxmlformats.org/drawingml/2006/main" noChangeAspect="1"/>
@@ -3894,7 +3705,7 @@
                               <pic:pic xmlns:pic="http://schemas.openxmlformats.org/drawingml/2006/picture">
                                 <pic:nvPicPr>
                                   <pic:cNvPr id="0" name="" descr="">
-                                    <a:hlinkClick r:id="rIdwnvm4rv_-fdz7ijkpwemh"/>
+                                    <a:hlinkClick r:id="rIdndnupkyda4jbdfpe6kfvv"/>
                                   </pic:cNvPr>
                                   <pic:cNvPicPr>
                                     <a:picLocks noChangeAspect="1" noChangeArrowheads="1"/>
@@ -4076,14 +3887,14 @@
                     <w:keepNext w:val="false"/>
                     <w:spacing w:after="45" w:before="0" w:line="190"/>
                   </w:pPr>
-                  <w:hyperlink w:history="1" r:id="rId19-osq-cnr8vzfbhxw8xb">
+                  <w:hyperlink w:history="1" r:id="rIdcdglzmkrraef1w6af50vs">
                     <w:r>
                       <w:drawing>
                         <wp:inline distT="0" distB="0" distL="0" distR="0">
                           <wp:extent cx="457200" cy="647700"/>
                           <wp:effectExtent t="0" r="0" b="0" l="0"/>
                           <wp:docPr id="1" name="" descr="" title="">
-                            <a:hlinkClick xmlns:a="http://schemas.openxmlformats.org/drawingml/2006/main" r:id="rId19-osq-cnr8vzfbhxw8xb"/>
+                            <a:hlinkClick xmlns:a="http://schemas.openxmlformats.org/drawingml/2006/main" r:id="rIdcdglzmkrraef1w6af50vs"/>
                           </wp:docPr>
                           <wp:cNvGraphicFramePr>
                             <a:graphicFrameLocks xmlns:a="http://schemas.openxmlformats.org/drawingml/2006/main" noChangeAspect="1"/>
@@ -4093,7 +3904,7 @@
                               <pic:pic xmlns:pic="http://schemas.openxmlformats.org/drawingml/2006/picture">
                                 <pic:nvPicPr>
                                   <pic:cNvPr id="0" name="" descr="">
-                                    <a:hlinkClick r:id="rId19-osq-cnr8vzfbhxw8xb"/>
+                                    <a:hlinkClick r:id="rIdcdglzmkrraef1w6af50vs"/>
                                   </pic:cNvPr>
                                   <pic:cNvPicPr>
                                     <a:picLocks noChangeAspect="1" noChangeArrowheads="1"/>

</xml_diff>

<commit_message>
Add portfolio PDF download and fill the resume's first page
- Resume PDF: fit as much of the first project on page 1 as space allows,
  then continue with Pilltip on page 2 instead of a near-empty page
- Portfolio PDF: print portfolio.html after Mermaid renders, with print
  styles that cut 36 pages to 27; link it from the profile card and index

Co-Authored-By: Claude Opus 5.5 (1M context) <noreply@anthropic.com>
</commit_message>
<xml_diff>
--- a/site/en/resume.docx
+++ b/site/en/resume.docx
@@ -102,7 +102,7 @@
             <w:pPr>
               <w:spacing w:after="80" w:before="80" w:line="300"/>
             </w:pPr>
-            <w:hyperlink w:history="1" r:id="rIdglqtnw9qu0sx1crngzvrc">
+            <w:hyperlink w:history="1" r:id="rIdbbx8qb0cucfnis7yn3frg">
               <w:r>
                 <w:rPr>
                   <w:color w:val="315CBB"/>
@@ -120,7 +120,7 @@
               </w:rPr>
               <w:t xml:space="preserve">   </w:t>
             </w:r>
-            <w:hyperlink w:history="1" r:id="rIdlctnl68b0egi364dos7dp">
+            <w:hyperlink w:history="1" r:id="rIdfssoptr6a9s2-z_l39q8-">
               <w:r>
                 <w:rPr>
                   <w:color w:val="315CBB"/>
@@ -138,7 +138,7 @@
               </w:rPr>
               <w:t xml:space="preserve">   </w:t>
             </w:r>
-            <w:hyperlink w:history="1" r:id="rIdbzggt-_k163-hgfihu-v4">
+            <w:hyperlink w:history="1" r:id="rIdjw90_xy4cnnlw8fzac1x4">
               <w:r>
                 <w:rPr>
                   <w:color w:val="315CBB"/>
@@ -156,7 +156,7 @@
               </w:rPr>
               <w:t xml:space="preserve">   </w:t>
             </w:r>
-            <w:hyperlink w:history="1" r:id="rId65pypvgh8zpoq_nbzapze">
+            <w:hyperlink w:history="1" r:id="rIdf-ywixb1wqn3uxlzekaly">
               <w:r>
                 <w:rPr>
                   <w:color w:val="315CBB"/>
@@ -393,7 +393,7 @@
       <w:pPr>
         <w:spacing w:after="80" w:before="80" w:line="300"/>
       </w:pPr>
-      <w:hyperlink w:history="1" r:id="rIdknu_k1zri7c68u5itqhpf">
+      <w:hyperlink w:history="1" r:id="rIdjsagmsdyvu1velsf5f0-c">
         <w:r>
           <w:rPr>
             <w:color w:val="315CBB"/>
@@ -411,7 +411,7 @@
         </w:rPr>
         <w:t xml:space="preserve">   </w:t>
       </w:r>
-      <w:hyperlink w:history="1" r:id="rIdokovwm-zz7d-nkxipsc8h">
+      <w:hyperlink w:history="1" r:id="rIdxrnmeclabnko5i27xkwjy">
         <w:r>
           <w:rPr>
             <w:color w:val="315CBB"/>
@@ -1009,7 +1009,7 @@
       <w:pPr>
         <w:spacing w:after="80" w:before="80" w:line="300"/>
       </w:pPr>
-      <w:hyperlink w:history="1" r:id="rIdnwn4iawohi6nzc4sikq_x">
+      <w:hyperlink w:history="1" r:id="rIdbetffwtix1tbo-6pu5wi8">
         <w:r>
           <w:rPr>
             <w:color w:val="315CBB"/>
@@ -1027,7 +1027,7 @@
         </w:rPr>
         <w:t xml:space="preserve">   </w:t>
       </w:r>
-      <w:hyperlink w:history="1" r:id="rIdjn7mgqfhbysoaw_fgq_zm">
+      <w:hyperlink w:history="1" r:id="rIdgzvjvubwqrv1x59mmureq">
         <w:r>
           <w:rPr>
             <w:color w:val="315CBB"/>
@@ -1045,7 +1045,7 @@
         </w:rPr>
         <w:t xml:space="preserve">   </w:t>
       </w:r>
-      <w:hyperlink w:history="1" r:id="rIdod4nvnzvx_rkfefkncvly">
+      <w:hyperlink w:history="1" r:id="rIdw21yiofe5isqimhjrcb2y">
         <w:r>
           <w:rPr>
             <w:color w:val="315CBB"/>
@@ -1063,7 +1063,7 @@
         </w:rPr>
         <w:t xml:space="preserve">   </w:t>
       </w:r>
-      <w:hyperlink w:history="1" r:id="rIdlkxsrsuigqi8xl5sx3v9a">
+      <w:hyperlink w:history="1" r:id="rIdxzdgr7tvzblmj7uh6kyxu">
         <w:r>
           <w:rPr>
             <w:color w:val="315CBB"/>
@@ -1199,7 +1199,7 @@
       <w:pPr>
         <w:spacing w:after="80" w:before="0" w:line="300"/>
       </w:pPr>
-      <w:hyperlink w:history="1" r:id="rIdujcraul0ext1c21qoggnk">
+      <w:hyperlink w:history="1" r:id="rIdawyiylwonykj49zlfm5lx">
         <w:r>
           <w:rPr>
             <w:color w:val="315CBB"/>
@@ -1522,7 +1522,7 @@
       <w:pPr>
         <w:spacing w:after="80" w:before="80" w:line="300"/>
       </w:pPr>
-      <w:hyperlink w:history="1" r:id="rIdmdwaz2lm1q7t7qzhmx58j">
+      <w:hyperlink w:history="1" r:id="rIdmlwri5hccsvdb2mwtbkbc">
         <w:r>
           <w:rPr>
             <w:color w:val="315CBB"/>
@@ -1540,7 +1540,7 @@
         </w:rPr>
         <w:t xml:space="preserve">   </w:t>
       </w:r>
-      <w:hyperlink w:history="1" r:id="rIdbc27kbvwu_oypdltx_drm">
+      <w:hyperlink w:history="1" r:id="rIduibjkxqytebosvonjs-9e">
         <w:r>
           <w:rPr>
             <w:color w:val="315CBB"/>
@@ -1663,7 +1663,7 @@
             <w:r>
               <w:br/>
             </w:r>
-            <w:hyperlink w:history="1" r:id="rIdms4wbobr0pm3whucxfm18">
+            <w:hyperlink w:history="1" r:id="rIdsj-jdvto9qke4k43uuiwu">
               <w:r>
                 <w:rPr>
                   <w:color w:val="315CBB"/>
@@ -1676,7 +1676,7 @@
             <w:r>
               <w:br/>
             </w:r>
-            <w:hyperlink w:history="1" r:id="rIdnqr43h44ecfurjs8qick-">
+            <w:hyperlink w:history="1" r:id="rIdhmw0-fwewlnrtj9pp9mvp">
               <w:r>
                 <w:rPr>
                   <w:color w:val="315CBB"/>
@@ -1965,7 +1965,7 @@
             <w:pPr>
               <w:spacing w:after="80" w:before="80" w:line="300"/>
             </w:pPr>
-            <w:hyperlink w:history="1" r:id="rIdxbg_lca1wn4gm08pa-ymw">
+            <w:hyperlink w:history="1" r:id="rIdudziwgq9jsw9hh9gpdfsp">
               <w:r>
                 <w:rPr>
                   <w:color w:val="315CBB"/>
@@ -1983,7 +1983,7 @@
               </w:rPr>
               <w:t xml:space="preserve">   </w:t>
             </w:r>
-            <w:hyperlink w:history="1" r:id="rIdsxdsb4uzquxqnlej7hbmn">
+            <w:hyperlink w:history="1" r:id="rIdl2lfq1vfpjlu1bae1jydc">
               <w:r>
                 <w:rPr>
                   <w:color w:val="315CBB"/>
@@ -2001,7 +2001,7 @@
               </w:rPr>
               <w:t xml:space="preserve">   </w:t>
             </w:r>
-            <w:hyperlink w:history="1" r:id="rIdexph9liqnhxijnwwebinw">
+            <w:hyperlink w:history="1" r:id="rIdsnfno7udelozdhimuivkt">
               <w:r>
                 <w:rPr>
                   <w:color w:val="315CBB"/>

</xml_diff>

<commit_message>
Make the portfolio PDF a 16:9 slide deck and let the resume PDF flow continuously
- Portfolio PDF: build slides from the rendered portfolio page (cover, contents,
  project overview and screens, then opener, process, diagram and result per
  case), splitting long process slides automatically; 37 slides in KO and EN
- Resume PDF: one continuous flow paginated by Chrome, so skills, activities,
  education and awards follow the projects without fixed page breaks

Co-Authored-By: Claude Opus 5.5 (1M context) <noreply@anthropic.com>
</commit_message>
<xml_diff>
--- a/site/en/resume.docx
+++ b/site/en/resume.docx
@@ -102,7 +102,7 @@
             <w:pPr>
               <w:spacing w:after="80" w:before="80" w:line="300"/>
             </w:pPr>
-            <w:hyperlink w:history="1" r:id="rIdbbx8qb0cucfnis7yn3frg">
+            <w:hyperlink w:history="1" r:id="rIdgeq14pkuamer2uco_clch">
               <w:r>
                 <w:rPr>
                   <w:color w:val="315CBB"/>
@@ -120,7 +120,7 @@
               </w:rPr>
               <w:t xml:space="preserve">   </w:t>
             </w:r>
-            <w:hyperlink w:history="1" r:id="rIdfssoptr6a9s2-z_l39q8-">
+            <w:hyperlink w:history="1" r:id="rId3uwdhfloamkpysdffdx5u">
               <w:r>
                 <w:rPr>
                   <w:color w:val="315CBB"/>
@@ -138,7 +138,7 @@
               </w:rPr>
               <w:t xml:space="preserve">   </w:t>
             </w:r>
-            <w:hyperlink w:history="1" r:id="rIdjw90_xy4cnnlw8fzac1x4">
+            <w:hyperlink w:history="1" r:id="rIdfhaes3x5-p8qu8szw2brx">
               <w:r>
                 <w:rPr>
                   <w:color w:val="315CBB"/>
@@ -156,7 +156,7 @@
               </w:rPr>
               <w:t xml:space="preserve">   </w:t>
             </w:r>
-            <w:hyperlink w:history="1" r:id="rIdf-ywixb1wqn3uxlzekaly">
+            <w:hyperlink w:history="1" r:id="rIdabl-8eby77ei6jijc2yno">
               <w:r>
                 <w:rPr>
                   <w:color w:val="315CBB"/>
@@ -393,7 +393,7 @@
       <w:pPr>
         <w:spacing w:after="80" w:before="80" w:line="300"/>
       </w:pPr>
-      <w:hyperlink w:history="1" r:id="rIdjsagmsdyvu1velsf5f0-c">
+      <w:hyperlink w:history="1" r:id="rIdvtg3qmimkw3h8aibhrfpq">
         <w:r>
           <w:rPr>
             <w:color w:val="315CBB"/>
@@ -411,7 +411,7 @@
         </w:rPr>
         <w:t xml:space="preserve">   </w:t>
       </w:r>
-      <w:hyperlink w:history="1" r:id="rIdxrnmeclabnko5i27xkwjy">
+      <w:hyperlink w:history="1" r:id="rIdiholbzzd_366aovcpuher">
         <w:r>
           <w:rPr>
             <w:color w:val="315CBB"/>
@@ -1009,7 +1009,7 @@
       <w:pPr>
         <w:spacing w:after="80" w:before="80" w:line="300"/>
       </w:pPr>
-      <w:hyperlink w:history="1" r:id="rIdbetffwtix1tbo-6pu5wi8">
+      <w:hyperlink w:history="1" r:id="rIdywhqas5mgzurw1du8rvij">
         <w:r>
           <w:rPr>
             <w:color w:val="315CBB"/>
@@ -1027,7 +1027,7 @@
         </w:rPr>
         <w:t xml:space="preserve">   </w:t>
       </w:r>
-      <w:hyperlink w:history="1" r:id="rIdgzvjvubwqrv1x59mmureq">
+      <w:hyperlink w:history="1" r:id="rIdckawjvlz106vblh3kwfp3">
         <w:r>
           <w:rPr>
             <w:color w:val="315CBB"/>
@@ -1045,7 +1045,7 @@
         </w:rPr>
         <w:t xml:space="preserve">   </w:t>
       </w:r>
-      <w:hyperlink w:history="1" r:id="rIdw21yiofe5isqimhjrcb2y">
+      <w:hyperlink w:history="1" r:id="rIdpjroaf5hmhlg90om74t9f">
         <w:r>
           <w:rPr>
             <w:color w:val="315CBB"/>
@@ -1063,7 +1063,7 @@
         </w:rPr>
         <w:t xml:space="preserve">   </w:t>
       </w:r>
-      <w:hyperlink w:history="1" r:id="rIdxzdgr7tvzblmj7uh6kyxu">
+      <w:hyperlink w:history="1" r:id="rId1vhloh1-o3vfxnn0ldxd0">
         <w:r>
           <w:rPr>
             <w:color w:val="315CBB"/>
@@ -1199,7 +1199,7 @@
       <w:pPr>
         <w:spacing w:after="80" w:before="0" w:line="300"/>
       </w:pPr>
-      <w:hyperlink w:history="1" r:id="rIdawyiylwonykj49zlfm5lx">
+      <w:hyperlink w:history="1" r:id="rIdtqdp6ihygm0gi7tdso3gx">
         <w:r>
           <w:rPr>
             <w:color w:val="315CBB"/>
@@ -1522,7 +1522,7 @@
       <w:pPr>
         <w:spacing w:after="80" w:before="80" w:line="300"/>
       </w:pPr>
-      <w:hyperlink w:history="1" r:id="rIdmlwri5hccsvdb2mwtbkbc">
+      <w:hyperlink w:history="1" r:id="rIdfrrwr0yro06ku-s23kjca">
         <w:r>
           <w:rPr>
             <w:color w:val="315CBB"/>
@@ -1540,7 +1540,7 @@
         </w:rPr>
         <w:t xml:space="preserve">   </w:t>
       </w:r>
-      <w:hyperlink w:history="1" r:id="rIduibjkxqytebosvonjs-9e">
+      <w:hyperlink w:history="1" r:id="rIdf97_c8hvn5qptof3uzx6y">
         <w:r>
           <w:rPr>
             <w:color w:val="315CBB"/>
@@ -1663,7 +1663,7 @@
             <w:r>
               <w:br/>
             </w:r>
-            <w:hyperlink w:history="1" r:id="rIdsj-jdvto9qke4k43uuiwu">
+            <w:hyperlink w:history="1" r:id="rId5xujvl1hhr-idtlbcmalg">
               <w:r>
                 <w:rPr>
                   <w:color w:val="315CBB"/>
@@ -1676,7 +1676,7 @@
             <w:r>
               <w:br/>
             </w:r>
-            <w:hyperlink w:history="1" r:id="rIdhmw0-fwewlnrtj9pp9mvp">
+            <w:hyperlink w:history="1" r:id="rIdzvvwgbqfsa1qt9cdekijx">
               <w:r>
                 <w:rPr>
                   <w:color w:val="315CBB"/>
@@ -1965,7 +1965,7 @@
             <w:pPr>
               <w:spacing w:after="80" w:before="80" w:line="300"/>
             </w:pPr>
-            <w:hyperlink w:history="1" r:id="rIdudziwgq9jsw9hh9gpdfsp">
+            <w:hyperlink w:history="1" r:id="rIdzjtegr_nv0zwvoommiql_">
               <w:r>
                 <w:rPr>
                   <w:color w:val="315CBB"/>
@@ -1983,7 +1983,7 @@
               </w:rPr>
               <w:t xml:space="preserve">   </w:t>
             </w:r>
-            <w:hyperlink w:history="1" r:id="rIdl2lfq1vfpjlu1bae1jydc">
+            <w:hyperlink w:history="1" r:id="rIdgfljmkcrouc4yntfkw61k">
               <w:r>
                 <w:rPr>
                   <w:color w:val="315CBB"/>
@@ -2001,7 +2001,7 @@
               </w:rPr>
               <w:t xml:space="preserve">   </w:t>
             </w:r>
-            <w:hyperlink w:history="1" r:id="rIdsnfno7udelozdhimuivkt">
+            <w:hyperlink w:history="1" r:id="rId0f3s2983_iuq7mcuh9vta">
               <w:r>
                 <w:rPr>
                   <w:color w:val="315CBB"/>

</xml_diff>

<commit_message>
Start the resume's activities section on a new page in PDF and Word
Co-Authored-By: Claude Opus 5.5 (1M context) <noreply@anthropic.com>
</commit_message>
<xml_diff>
--- a/site/en/resume.docx
+++ b/site/en/resume.docx
@@ -102,7 +102,7 @@
             <w:pPr>
               <w:spacing w:after="80" w:before="80" w:line="300"/>
             </w:pPr>
-            <w:hyperlink w:history="1" r:id="rIdgeq14pkuamer2uco_clch">
+            <w:hyperlink w:history="1" r:id="rIdzrfd9yi6oquj8k4anmfpk">
               <w:r>
                 <w:rPr>
                   <w:color w:val="315CBB"/>
@@ -120,7 +120,7 @@
               </w:rPr>
               <w:t xml:space="preserve">   </w:t>
             </w:r>
-            <w:hyperlink w:history="1" r:id="rId3uwdhfloamkpysdffdx5u">
+            <w:hyperlink w:history="1" r:id="rIdnuboe8tngkbxn9c307q5w">
               <w:r>
                 <w:rPr>
                   <w:color w:val="315CBB"/>
@@ -138,7 +138,7 @@
               </w:rPr>
               <w:t xml:space="preserve">   </w:t>
             </w:r>
-            <w:hyperlink w:history="1" r:id="rIdfhaes3x5-p8qu8szw2brx">
+            <w:hyperlink w:history="1" r:id="rIdihfn4blqcfd8-rrk9q-jh">
               <w:r>
                 <w:rPr>
                   <w:color w:val="315CBB"/>
@@ -156,7 +156,7 @@
               </w:rPr>
               <w:t xml:space="preserve">   </w:t>
             </w:r>
-            <w:hyperlink w:history="1" r:id="rIdabl-8eby77ei6jijc2yno">
+            <w:hyperlink w:history="1" r:id="rId16yd0dky7i48lwihxzuiy">
               <w:r>
                 <w:rPr>
                   <w:color w:val="315CBB"/>
@@ -393,7 +393,7 @@
       <w:pPr>
         <w:spacing w:after="80" w:before="80" w:line="300"/>
       </w:pPr>
-      <w:hyperlink w:history="1" r:id="rIdvtg3qmimkw3h8aibhrfpq">
+      <w:hyperlink w:history="1" r:id="rIdbajyr5r8fv3yacaj03koe">
         <w:r>
           <w:rPr>
             <w:color w:val="315CBB"/>
@@ -411,7 +411,7 @@
         </w:rPr>
         <w:t xml:space="preserve">   </w:t>
       </w:r>
-      <w:hyperlink w:history="1" r:id="rIdiholbzzd_366aovcpuher">
+      <w:hyperlink w:history="1" r:id="rIdeecjbmmf32mlwrq82c8hn">
         <w:r>
           <w:rPr>
             <w:color w:val="315CBB"/>
@@ -1009,7 +1009,7 @@
       <w:pPr>
         <w:spacing w:after="80" w:before="80" w:line="300"/>
       </w:pPr>
-      <w:hyperlink w:history="1" r:id="rIdywhqas5mgzurw1du8rvij">
+      <w:hyperlink w:history="1" r:id="rId4dmeg4xle9uuwxbws8hrg">
         <w:r>
           <w:rPr>
             <w:color w:val="315CBB"/>
@@ -1027,7 +1027,7 @@
         </w:rPr>
         <w:t xml:space="preserve">   </w:t>
       </w:r>
-      <w:hyperlink w:history="1" r:id="rIdckawjvlz106vblh3kwfp3">
+      <w:hyperlink w:history="1" r:id="rIdgqhipd4owcvvs1obyd7pt">
         <w:r>
           <w:rPr>
             <w:color w:val="315CBB"/>
@@ -1045,7 +1045,7 @@
         </w:rPr>
         <w:t xml:space="preserve">   </w:t>
       </w:r>
-      <w:hyperlink w:history="1" r:id="rIdpjroaf5hmhlg90om74t9f">
+      <w:hyperlink w:history="1" r:id="rIdpzh6okgmqjwr3xijsp7pf">
         <w:r>
           <w:rPr>
             <w:color w:val="315CBB"/>
@@ -1063,7 +1063,7 @@
         </w:rPr>
         <w:t xml:space="preserve">   </w:t>
       </w:r>
-      <w:hyperlink w:history="1" r:id="rId1vhloh1-o3vfxnn0ldxd0">
+      <w:hyperlink w:history="1" r:id="rIdygurk9ehtftnoscohhewm">
         <w:r>
           <w:rPr>
             <w:color w:val="315CBB"/>
@@ -1199,7 +1199,7 @@
       <w:pPr>
         <w:spacing w:after="80" w:before="0" w:line="300"/>
       </w:pPr>
-      <w:hyperlink w:history="1" r:id="rIdtqdp6ihygm0gi7tdso3gx">
+      <w:hyperlink w:history="1" r:id="rIdfhi7fqu2k7xynbb7j5euu">
         <w:r>
           <w:rPr>
             <w:color w:val="315CBB"/>
@@ -1522,7 +1522,7 @@
       <w:pPr>
         <w:spacing w:after="80" w:before="80" w:line="300"/>
       </w:pPr>
-      <w:hyperlink w:history="1" r:id="rIdfrrwr0yro06ku-s23kjca">
+      <w:hyperlink w:history="1" r:id="rId2p55hwww0vo5gqr1wt0wt">
         <w:r>
           <w:rPr>
             <w:color w:val="315CBB"/>
@@ -1540,7 +1540,7 @@
         </w:rPr>
         <w:t xml:space="preserve">   </w:t>
       </w:r>
-      <w:hyperlink w:history="1" r:id="rIdf97_c8hvn5qptof3uzx6y">
+      <w:hyperlink w:history="1" r:id="rIdzccznwkfeei53jd3et3wi">
         <w:r>
           <w:rPr>
             <w:color w:val="315CBB"/>
@@ -1663,7 +1663,7 @@
             <w:r>
               <w:br/>
             </w:r>
-            <w:hyperlink w:history="1" r:id="rId5xujvl1hhr-idtlbcmalg">
+            <w:hyperlink w:history="1" r:id="rId1mi1xqg4uenrcvc9oy0bp">
               <w:r>
                 <w:rPr>
                   <w:color w:val="315CBB"/>
@@ -1676,7 +1676,7 @@
             <w:r>
               <w:br/>
             </w:r>
-            <w:hyperlink w:history="1" r:id="rIdzvvwgbqfsa1qt9cdekijx">
+            <w:hyperlink w:history="1" r:id="rIdcwbzwa4milbselnpbbl9t">
               <w:r>
                 <w:rPr>
                   <w:color w:val="315CBB"/>
@@ -1861,6 +1861,7 @@
     <w:p>
       <w:pPr>
         <w:keepNext/>
+        <w:pageBreakBefore/>
         <w:pBdr>
           <w:bottom w:val="single" w:color="6A80BD" w:sz="12" w:space="4"/>
         </w:pBdr>
@@ -1965,7 +1966,7 @@
             <w:pPr>
               <w:spacing w:after="80" w:before="80" w:line="300"/>
             </w:pPr>
-            <w:hyperlink w:history="1" r:id="rIdzjtegr_nv0zwvoommiql_">
+            <w:hyperlink w:history="1" r:id="rIdb8sjpp8jbq8u7osqbddgy">
               <w:r>
                 <w:rPr>
                   <w:color w:val="315CBB"/>
@@ -1983,7 +1984,7 @@
               </w:rPr>
               <w:t xml:space="preserve">   </w:t>
             </w:r>
-            <w:hyperlink w:history="1" r:id="rIdgfljmkcrouc4yntfkw61k">
+            <w:hyperlink w:history="1" r:id="rIdep9rddsquwt3449y47eg9">
               <w:r>
                 <w:rPr>
                   <w:color w:val="315CBB"/>
@@ -2001,7 +2002,7 @@
               </w:rPr>
               <w:t xml:space="preserve">   </w:t>
             </w:r>
-            <w:hyperlink w:history="1" r:id="rId0f3s2983_iuq7mcuh9vta">
+            <w:hyperlink w:history="1" r:id="rId2raj5sviudj1crez9ifj7">
               <w:r>
                 <w:rPr>
                   <w:color w:val="315CBB"/>

</xml_diff>

<commit_message>
Install a CJK font in CI so Korean text in PDF diagrams and footers renders
The Pages runner had no Korean font, so Mermaid labels in the portfolio PDF
and the resume footer came out as boxes. Also pin diagram text in the slide
deck to the embedded Pretendard font.

Co-Authored-By: Claude Opus 5.5 (1M context) <noreply@anthropic.com>
</commit_message>
<xml_diff>
--- a/site/en/resume.docx
+++ b/site/en/resume.docx
@@ -102,7 +102,7 @@
             <w:pPr>
               <w:spacing w:after="80" w:before="80" w:line="300"/>
             </w:pPr>
-            <w:hyperlink w:history="1" r:id="rIdzrfd9yi6oquj8k4anmfpk">
+            <w:hyperlink w:history="1" r:id="rIdl0qrpejfejo37qhjipldt">
               <w:r>
                 <w:rPr>
                   <w:color w:val="315CBB"/>
@@ -120,7 +120,7 @@
               </w:rPr>
               <w:t xml:space="preserve">   </w:t>
             </w:r>
-            <w:hyperlink w:history="1" r:id="rIdnuboe8tngkbxn9c307q5w">
+            <w:hyperlink w:history="1" r:id="rIdbt2fzdpndlynzpv-qpuvb">
               <w:r>
                 <w:rPr>
                   <w:color w:val="315CBB"/>
@@ -138,7 +138,7 @@
               </w:rPr>
               <w:t xml:space="preserve">   </w:t>
             </w:r>
-            <w:hyperlink w:history="1" r:id="rIdihfn4blqcfd8-rrk9q-jh">
+            <w:hyperlink w:history="1" r:id="rIdtkqyfnndptcgzktveq5rc">
               <w:r>
                 <w:rPr>
                   <w:color w:val="315CBB"/>
@@ -156,7 +156,7 @@
               </w:rPr>
               <w:t xml:space="preserve">   </w:t>
             </w:r>
-            <w:hyperlink w:history="1" r:id="rId16yd0dky7i48lwihxzuiy">
+            <w:hyperlink w:history="1" r:id="rIdnsautrwu0me25vpssui9p">
               <w:r>
                 <w:rPr>
                   <w:color w:val="315CBB"/>
@@ -393,7 +393,7 @@
       <w:pPr>
         <w:spacing w:after="80" w:before="80" w:line="300"/>
       </w:pPr>
-      <w:hyperlink w:history="1" r:id="rIdbajyr5r8fv3yacaj03koe">
+      <w:hyperlink w:history="1" r:id="rIdj9wt3o4obkqzsmd7fw0cz">
         <w:r>
           <w:rPr>
             <w:color w:val="315CBB"/>
@@ -411,7 +411,7 @@
         </w:rPr>
         <w:t xml:space="preserve">   </w:t>
       </w:r>
-      <w:hyperlink w:history="1" r:id="rIdeecjbmmf32mlwrq82c8hn">
+      <w:hyperlink w:history="1" r:id="rIdx2ljfqgbtkaxhj0umcqle">
         <w:r>
           <w:rPr>
             <w:color w:val="315CBB"/>
@@ -1009,7 +1009,7 @@
       <w:pPr>
         <w:spacing w:after="80" w:before="80" w:line="300"/>
       </w:pPr>
-      <w:hyperlink w:history="1" r:id="rId4dmeg4xle9uuwxbws8hrg">
+      <w:hyperlink w:history="1" r:id="rId6-tqtwesyroswllfo66po">
         <w:r>
           <w:rPr>
             <w:color w:val="315CBB"/>
@@ -1027,7 +1027,7 @@
         </w:rPr>
         <w:t xml:space="preserve">   </w:t>
       </w:r>
-      <w:hyperlink w:history="1" r:id="rIdgqhipd4owcvvs1obyd7pt">
+      <w:hyperlink w:history="1" r:id="rIdlwgtqdckz-ww0u_iusizq">
         <w:r>
           <w:rPr>
             <w:color w:val="315CBB"/>
@@ -1045,7 +1045,7 @@
         </w:rPr>
         <w:t xml:space="preserve">   </w:t>
       </w:r>
-      <w:hyperlink w:history="1" r:id="rIdpzh6okgmqjwr3xijsp7pf">
+      <w:hyperlink w:history="1" r:id="rId5ra62p8xcw024b0tpam2g">
         <w:r>
           <w:rPr>
             <w:color w:val="315CBB"/>
@@ -1063,7 +1063,7 @@
         </w:rPr>
         <w:t xml:space="preserve">   </w:t>
       </w:r>
-      <w:hyperlink w:history="1" r:id="rIdygurk9ehtftnoscohhewm">
+      <w:hyperlink w:history="1" r:id="rId7guzdnnfju_ctweuxpnxu">
         <w:r>
           <w:rPr>
             <w:color w:val="315CBB"/>
@@ -1199,7 +1199,7 @@
       <w:pPr>
         <w:spacing w:after="80" w:before="0" w:line="300"/>
       </w:pPr>
-      <w:hyperlink w:history="1" r:id="rIdfhi7fqu2k7xynbb7j5euu">
+      <w:hyperlink w:history="1" r:id="rIdosthkzu1edjht7h9uxels">
         <w:r>
           <w:rPr>
             <w:color w:val="315CBB"/>
@@ -1522,7 +1522,7 @@
       <w:pPr>
         <w:spacing w:after="80" w:before="80" w:line="300"/>
       </w:pPr>
-      <w:hyperlink w:history="1" r:id="rId2p55hwww0vo5gqr1wt0wt">
+      <w:hyperlink w:history="1" r:id="rIdsn9bhxezws0dk9csvmqny">
         <w:r>
           <w:rPr>
             <w:color w:val="315CBB"/>
@@ -1540,7 +1540,7 @@
         </w:rPr>
         <w:t xml:space="preserve">   </w:t>
       </w:r>
-      <w:hyperlink w:history="1" r:id="rIdzccznwkfeei53jd3et3wi">
+      <w:hyperlink w:history="1" r:id="rIdw1jr9l2zwqpyooxhokv1b">
         <w:r>
           <w:rPr>
             <w:color w:val="315CBB"/>
@@ -1663,7 +1663,7 @@
             <w:r>
               <w:br/>
             </w:r>
-            <w:hyperlink w:history="1" r:id="rId1mi1xqg4uenrcvc9oy0bp">
+            <w:hyperlink w:history="1" r:id="rIdtioqgl0bj-uy2nmnzgspu">
               <w:r>
                 <w:rPr>
                   <w:color w:val="315CBB"/>
@@ -1676,7 +1676,7 @@
             <w:r>
               <w:br/>
             </w:r>
-            <w:hyperlink w:history="1" r:id="rIdcwbzwa4milbselnpbbl9t">
+            <w:hyperlink w:history="1" r:id="rIdjtpbtwim6ofybi44j5-2j">
               <w:r>
                 <w:rPr>
                   <w:color w:val="315CBB"/>
@@ -1966,7 +1966,7 @@
             <w:pPr>
               <w:spacing w:after="80" w:before="80" w:line="300"/>
             </w:pPr>
-            <w:hyperlink w:history="1" r:id="rIdb8sjpp8jbq8u7osqbddgy">
+            <w:hyperlink w:history="1" r:id="rIdnuwcmh9-nrnnmyrwd5r-l">
               <w:r>
                 <w:rPr>
                   <w:color w:val="315CBB"/>
@@ -1984,7 +1984,7 @@
               </w:rPr>
               <w:t xml:space="preserve">   </w:t>
             </w:r>
-            <w:hyperlink w:history="1" r:id="rIdep9rddsquwt3449y47eg9">
+            <w:hyperlink w:history="1" r:id="rIdljjuflsluncpog4c2r_t6">
               <w:r>
                 <w:rPr>
                   <w:color w:val="315CBB"/>
@@ -2002,7 +2002,7 @@
               </w:rPr>
               <w:t xml:space="preserve">   </w:t>
             </w:r>
-            <w:hyperlink w:history="1" r:id="rId2raj5sviudj1crez9ifj7">
+            <w:hyperlink w:history="1" r:id="rIdfqz5dqje5t4ezrq-q9fvb">
               <w:r>
                 <w:rPr>
                   <w:color w:val="315CBB"/>

</xml_diff>

<commit_message>
Add consistency record, project origins and team composition; group the index by project
- Activities: 945-day Baekjoon streak (solved.ac), 1,659 problems, Platinum IV
- Projects: how each started, team composition and my role, replacing the
  vague teammates entry; resume role lines updated to match
- Portfolio: reading index grouped by project; slide deck gains team and
  main-work slides and a separate beyond-projects slide
- Admin editor: labels for the new project fields

Co-Authored-By: Claude Opus 5.5 (1M context) <noreply@anthropic.com>
</commit_message>
<xml_diff>
--- a/site/en/resume.docx
+++ b/site/en/resume.docx
@@ -102,7 +102,7 @@
             <w:pPr>
               <w:spacing w:after="80" w:before="80" w:line="300"/>
             </w:pPr>
-            <w:hyperlink w:history="1" r:id="rIdl0qrpejfejo37qhjipldt">
+            <w:hyperlink w:history="1" r:id="rIdscuys9qljcwybdiciv2c0">
               <w:r>
                 <w:rPr>
                   <w:color w:val="315CBB"/>
@@ -120,7 +120,7 @@
               </w:rPr>
               <w:t xml:space="preserve">   </w:t>
             </w:r>
-            <w:hyperlink w:history="1" r:id="rIdbt2fzdpndlynzpv-qpuvb">
+            <w:hyperlink w:history="1" r:id="rIdwgar-07zqx7vxsiyoxppo">
               <w:r>
                 <w:rPr>
                   <w:color w:val="315CBB"/>
@@ -138,7 +138,7 @@
               </w:rPr>
               <w:t xml:space="preserve">   </w:t>
             </w:r>
-            <w:hyperlink w:history="1" r:id="rIdtkqyfnndptcgzktveq5rc">
+            <w:hyperlink w:history="1" r:id="rIdqapc8na9psjsfdigyy1n0">
               <w:r>
                 <w:rPr>
                   <w:color w:val="315CBB"/>
@@ -156,7 +156,7 @@
               </w:rPr>
               <w:t xml:space="preserve">   </w:t>
             </w:r>
-            <w:hyperlink w:history="1" r:id="rIdnsautrwu0me25vpssui9p">
+            <w:hyperlink w:history="1" r:id="rId_ilmsgaijzz_jyf6g2otu">
               <w:r>
                 <w:rPr>
                   <w:color w:val="315CBB"/>
@@ -373,7 +373,7 @@
           <w:sz w:val="18"/>
           <w:szCs w:val="18"/>
         </w:rPr>
-        <w:t xml:space="preserve">Team project / Lead for all AI features</w:t>
+        <w:t xml:space="preserve">Team project (3 + designer) / AI lead</w:t>
       </w:r>
     </w:p>
     <w:p>
@@ -386,14 +386,25 @@
           <w:sz w:val="18"/>
           <w:szCs w:val="18"/>
         </w:rPr>
-        <w:t xml:space="preserve">Teammates built the frontend and backend. I proposed the initial MSA design and finalized service boundaries, data ownership and communication with teammates and mentors.</w:t>
+        <w:t xml:space="preserve">How it started: a teammate’s pain point with managing documents, refined through design thinking — saved documents could not be found when needed.</w:t>
+      </w:r>
+      <w:r>
+        <w:br/>
+      </w:r>
+      <w:r>
+        <w:rPr>
+          <w:color w:val="607089"/>
+          <w:sz w:val="18"/>
+          <w:szCs w:val="18"/>
+        </w:rPr>
+        <w:t xml:space="preserve">Team: me (all AI), 1 backend (Spring backend), 1 frontend &amp; DevOps (frontend, MSA deployment on AWS), external designer · 3 mentors</w:t>
       </w:r>
     </w:p>
     <w:p>
       <w:pPr>
         <w:spacing w:after="80" w:before="80" w:line="300"/>
       </w:pPr>
-      <w:hyperlink w:history="1" r:id="rIdj9wt3o4obkqzsmd7fw0cz">
+      <w:hyperlink w:history="1" r:id="rIdkt-whhlqugyez2pgh1vjm">
         <w:r>
           <w:rPr>
             <w:color w:val="315CBB"/>
@@ -411,7 +422,7 @@
         </w:rPr>
         <w:t xml:space="preserve">   </w:t>
       </w:r>
-      <w:hyperlink w:history="1" r:id="rIdx2ljfqgbtkaxhj0umcqle">
+      <w:hyperlink w:history="1" r:id="rIdepwmnodjtraq_h6-qkx1_">
         <w:r>
           <w:rPr>
             <w:color w:val="315CBB"/>
@@ -1009,7 +1020,7 @@
       <w:pPr>
         <w:spacing w:after="80" w:before="80" w:line="300"/>
       </w:pPr>
-      <w:hyperlink w:history="1" r:id="rId6-tqtwesyroswllfo66po">
+      <w:hyperlink w:history="1" r:id="rId6knh6q77dt94ybydjfai7">
         <w:r>
           <w:rPr>
             <w:color w:val="315CBB"/>
@@ -1027,7 +1038,7 @@
         </w:rPr>
         <w:t xml:space="preserve">   </w:t>
       </w:r>
-      <w:hyperlink w:history="1" r:id="rIdlwgtqdckz-ww0u_iusizq">
+      <w:hyperlink w:history="1" r:id="rIdjnmmzvzf1ylqoo0dhzvwe">
         <w:r>
           <w:rPr>
             <w:color w:val="315CBB"/>
@@ -1045,7 +1056,7 @@
         </w:rPr>
         <w:t xml:space="preserve">   </w:t>
       </w:r>
-      <w:hyperlink w:history="1" r:id="rId5ra62p8xcw024b0tpam2g">
+      <w:hyperlink w:history="1" r:id="rIdup6uv5rbmr5bpbbrnbr6t">
         <w:r>
           <w:rPr>
             <w:color w:val="315CBB"/>
@@ -1063,7 +1074,7 @@
         </w:rPr>
         <w:t xml:space="preserve">   </w:t>
       </w:r>
-      <w:hyperlink w:history="1" r:id="rId7guzdnnfju_ctweuxpnxu">
+      <w:hyperlink w:history="1" r:id="rIdzaf8gcpl17luymbpfc2dr">
         <w:r>
           <w:rPr>
             <w:color w:val="315CBB"/>
@@ -1168,7 +1179,7 @@
           <w:sz w:val="18"/>
           <w:szCs w:val="18"/>
         </w:rPr>
-        <w:t xml:space="preserve">Personalized AI medication service · Pusan National University</w:t>
+        <w:t xml:space="preserve">Personalized AI medication service · Pusan National University capstone</w:t>
       </w:r>
       <w:r>
         <w:br/>
@@ -1179,7 +1190,7 @@
           <w:sz w:val="18"/>
           <w:szCs w:val="18"/>
         </w:rPr>
-        <w:t xml:space="preserve">Team project / Backend and AI application development</w:t>
+        <w:t xml:space="preserve">Team project (3 + designer) / Core backend · data preparation</w:t>
       </w:r>
     </w:p>
     <w:p>
@@ -1192,14 +1203,25 @@
           <w:sz w:val="18"/>
           <w:szCs w:val="18"/>
         </w:rPr>
-        <w:t xml:space="preserve">Teammates owned Android, questionnaires, user DB modeling, login and other user features, and security including AES-GCM. The features below are my work.</w:t>
+        <w:t xml:space="preserve">How it started: drug information is scattered, making it hard to check whether a medicine is safe for your current health condition.</w:t>
+      </w:r>
+      <w:r>
+        <w:br/>
+      </w:r>
+      <w:r>
+        <w:rPr>
+          <w:color w:val="607089"/>
+          <w:sz w:val="18"/>
+          <w:szCs w:val="18"/>
+        </w:rPr>
+        <w:t xml:space="preserve">Team: me (backend &amp; AI), 1 Android (Kotlin app), 1 backend &amp; security (user DB, login, questionnaires, AES-GCM), designer. The features below are my work.</w:t>
       </w:r>
     </w:p>
     <w:p>
       <w:pPr>
         <w:spacing w:after="80" w:before="0" w:line="300"/>
       </w:pPr>
-      <w:hyperlink w:history="1" r:id="rIdosthkzu1edjht7h9uxels">
+      <w:hyperlink w:history="1" r:id="rId-umfr-xyphthcmjdzeiwu">
         <w:r>
           <w:rPr>
             <w:color w:val="315CBB"/>
@@ -1522,7 +1544,7 @@
       <w:pPr>
         <w:spacing w:after="80" w:before="80" w:line="300"/>
       </w:pPr>
-      <w:hyperlink w:history="1" r:id="rIdsn9bhxezws0dk9csvmqny">
+      <w:hyperlink w:history="1" r:id="rIdj-habwznka49j3fucsr6s">
         <w:r>
           <w:rPr>
             <w:color w:val="315CBB"/>
@@ -1540,7 +1562,7 @@
         </w:rPr>
         <w:t xml:space="preserve">   </w:t>
       </w:r>
-      <w:hyperlink w:history="1" r:id="rIdw1jr9l2zwqpyooxhokv1b">
+      <w:hyperlink w:history="1" r:id="rIduwxhoosxfqs37ruqewsu2">
         <w:r>
           <w:rPr>
             <w:color w:val="315CBB"/>
@@ -1663,7 +1685,7 @@
             <w:r>
               <w:br/>
             </w:r>
-            <w:hyperlink w:history="1" r:id="rIdtioqgl0bj-uy2nmnzgspu">
+            <w:hyperlink w:history="1" r:id="rId-m-kedvlbu8m9_-m6b_ia">
               <w:r>
                 <w:rPr>
                   <w:color w:val="315CBB"/>
@@ -1676,7 +1698,7 @@
             <w:r>
               <w:br/>
             </w:r>
-            <w:hyperlink w:history="1" r:id="rIdjtpbtwim6ofybi44j5-2j">
+            <w:hyperlink w:history="1" r:id="rIdrqvgpwijodeeq9izb7fp7">
               <w:r>
                 <w:rPr>
                   <w:color w:val="315CBB"/>
@@ -1919,7 +1941,7 @@
                 <w:sz w:val="20"/>
                 <w:szCs w:val="20"/>
               </w:rPr>
-              <w:t xml:space="preserve">2026.06 — 2026.06</w:t>
+              <w:t xml:space="preserve">2022.02 — 2025.07</w:t>
             </w:r>
           </w:p>
         </w:tc>
@@ -1946,6 +1968,108 @@
                 <w:sz w:val="24"/>
                 <w:szCs w:val="24"/>
               </w:rPr>
+              <w:t xml:space="preserve">945-day Baekjoon problem-solving streak</w:t>
+            </w:r>
+          </w:p>
+          <w:p>
+            <w:pPr>
+              <w:spacing w:after="80" w:before="0" w:line="300"/>
+            </w:pPr>
+            <w:r>
+              <w:rPr>
+                <w:color w:val="203047"/>
+                <w:sz w:val="20"/>
+                <w:szCs w:val="20"/>
+              </w:rPr>
+              <w:t xml:space="preserve">Aiming for one problem a day, I reached a longest streak of 945 consecutive days on solved.ac. 1,659 problems solved, solved.ac Platinum IV. Solutions are recorded in a GitHub repository.</w:t>
+            </w:r>
+          </w:p>
+          <w:p>
+            <w:pPr>
+              <w:spacing w:after="80" w:before="0" w:line="300"/>
+            </w:pPr>
+            <w:hyperlink w:history="1" r:id="rIdnffrpwwtw_judnbda7rji">
+              <w:r>
+                <w:rPr>
+                  <w:color w:val="315CBB"/>
+                  <w:sz w:val="20"/>
+                  <w:szCs w:val="20"/>
+                </w:rPr>
+                <w:t xml:space="preserve">Baekjoon solutions repository ↗</w:t>
+              </w:r>
+            </w:hyperlink>
+          </w:p>
+        </w:tc>
+      </w:tr>
+    </w:tbl>
+    <w:tbl>
+      <w:tblPr>
+        <w:tblW w:type="dxa" w:w="10092"/>
+        <w:tblBorders>
+          <w:top w:val="none" w:color="FFFFFF" w:sz="0"/>
+          <w:left w:val="none" w:color="FFFFFF" w:sz="0"/>
+          <w:bottom w:val="single" w:color="E3E8F0" w:sz="4"/>
+          <w:right w:val="none" w:color="FFFFFF" w:sz="0"/>
+          <w:insideH w:val="none" w:color="FFFFFF" w:sz="0"/>
+          <w:insideV w:val="none" w:color="FFFFFF" w:sz="0"/>
+        </w:tblBorders>
+        <w:tblLayout w:type="fixed"/>
+      </w:tblPr>
+      <w:tblGrid>
+        <w:gridCol w:w="2523"/>
+        <w:gridCol w:w="7569"/>
+      </w:tblGrid>
+      <w:tr>
+        <w:trPr>
+          <w:cantSplit/>
+        </w:trPr>
+        <w:tc>
+          <w:tcPr>
+            <w:tcW w:type="dxa" w:w="2523"/>
+            <w:tcMar>
+              <w:top w:type="dxa" w:w="60"/>
+              <w:left w:type="dxa" w:w="0"/>
+              <w:bottom w:type="dxa" w:w="60"/>
+              <w:right w:type="dxa" w:w="120"/>
+            </w:tcMar>
+          </w:tcPr>
+          <w:p>
+            <w:pPr>
+              <w:spacing w:after="80" w:before="0" w:line="300"/>
+            </w:pPr>
+            <w:r>
+              <w:rPr>
+                <w:color w:val="203047"/>
+                <w:sz w:val="20"/>
+                <w:szCs w:val="20"/>
+              </w:rPr>
+              <w:t xml:space="preserve">2026.06 — 2026.06</w:t>
+            </w:r>
+          </w:p>
+        </w:tc>
+        <w:tc>
+          <w:tcPr>
+            <w:tcW w:type="dxa" w:w="7569"/>
+            <w:tcMar>
+              <w:top w:type="dxa" w:w="60"/>
+              <w:left w:type="dxa" w:w="0"/>
+              <w:bottom w:type="dxa" w:w="60"/>
+              <w:right w:type="dxa" w:w="0"/>
+            </w:tcMar>
+          </w:tcPr>
+          <w:p>
+            <w:pPr>
+              <w:keepNext/>
+              <w:spacing w:after="0" w:before="0" w:line="276"/>
+            </w:pPr>
+            <w:r>
+              <w:rPr>
+                <w:b/>
+                <w:bCs/>
+                <w:color w:val="203047"/>
+                <w:sz w:val="24"/>
+                <w:szCs w:val="24"/>
+              </w:rPr>
               <w:t xml:space="preserve">Rhwp open-source contributions</w:t>
             </w:r>
           </w:p>
@@ -1966,7 +2090,7 @@
             <w:pPr>
               <w:spacing w:after="80" w:before="80" w:line="300"/>
             </w:pPr>
-            <w:hyperlink w:history="1" r:id="rIdnuwcmh9-nrnnmyrwd5r-l">
+            <w:hyperlink w:history="1" r:id="rIdet27agnpmjbbrykz-pboj">
               <w:r>
                 <w:rPr>
                   <w:color w:val="315CBB"/>
@@ -1984,7 +2108,7 @@
               </w:rPr>
               <w:t xml:space="preserve">   </w:t>
             </w:r>
-            <w:hyperlink w:history="1" r:id="rIdljjuflsluncpog4c2r_t6">
+            <w:hyperlink w:history="1" r:id="rIdeev4dsnzllzbulbbkde6n">
               <w:r>
                 <w:rPr>
                   <w:color w:val="315CBB"/>
@@ -2002,7 +2126,7 @@
               </w:rPr>
               <w:t xml:space="preserve">   </w:t>
             </w:r>
-            <w:hyperlink w:history="1" r:id="rIdfqz5dqje5t4ezrq-q9fvb">
+            <w:hyperlink w:history="1" r:id="rIdydzevzh-o8ynhi_n7nvu3">
               <w:r>
                 <w:rPr>
                   <w:color w:val="315CBB"/>

</xml_diff>

<commit_message>
Add Fruition system architecture diagram and the 2022-2025 solved.ac streak image
- Fruition gallery: C1/C2 architecture diagram from the mid-term deck
- Activities and portfolio card: combined yearly solved.ac streak image as
  evidence thumbnail (also in the Word resume)

Co-Authored-By: Claude Opus 5.5 (1M context) <noreply@anthropic.com>
</commit_message>
<xml_diff>
--- a/site/en/resume.docx
+++ b/site/en/resume.docx
@@ -102,7 +102,7 @@
             <w:pPr>
               <w:spacing w:after="80" w:before="80" w:line="300"/>
             </w:pPr>
-            <w:hyperlink w:history="1" r:id="rIdscuys9qljcwybdiciv2c0">
+            <w:hyperlink w:history="1" r:id="rIdmwrkttrkmrumrymcvzpca">
               <w:r>
                 <w:rPr>
                   <w:color w:val="315CBB"/>
@@ -120,7 +120,7 @@
               </w:rPr>
               <w:t xml:space="preserve">   </w:t>
             </w:r>
-            <w:hyperlink w:history="1" r:id="rIdwgar-07zqx7vxsiyoxppo">
+            <w:hyperlink w:history="1" r:id="rIddrczfhvbegngaeleupupx">
               <w:r>
                 <w:rPr>
                   <w:color w:val="315CBB"/>
@@ -138,7 +138,7 @@
               </w:rPr>
               <w:t xml:space="preserve">   </w:t>
             </w:r>
-            <w:hyperlink w:history="1" r:id="rIdqapc8na9psjsfdigyy1n0">
+            <w:hyperlink w:history="1" r:id="rIdqol_jfedollzk0wwbxznq">
               <w:r>
                 <w:rPr>
                   <w:color w:val="315CBB"/>
@@ -156,7 +156,7 @@
               </w:rPr>
               <w:t xml:space="preserve">   </w:t>
             </w:r>
-            <w:hyperlink w:history="1" r:id="rId_ilmsgaijzz_jyf6g2otu">
+            <w:hyperlink w:history="1" r:id="rId5uh_3i0ybc_b3xas9rlo6">
               <w:r>
                 <w:rPr>
                   <w:color w:val="315CBB"/>
@@ -404,7 +404,7 @@
       <w:pPr>
         <w:spacing w:after="80" w:before="80" w:line="300"/>
       </w:pPr>
-      <w:hyperlink w:history="1" r:id="rIdkt-whhlqugyez2pgh1vjm">
+      <w:hyperlink w:history="1" r:id="rIdlbhaco-jdyuoddlbmuawn">
         <w:r>
           <w:rPr>
             <w:color w:val="315CBB"/>
@@ -422,7 +422,7 @@
         </w:rPr>
         <w:t xml:space="preserve">   </w:t>
       </w:r>
-      <w:hyperlink w:history="1" r:id="rIdepwmnodjtraq_h6-qkx1_">
+      <w:hyperlink w:history="1" r:id="rIdm9mbckzgarhqvu36iaea2">
         <w:r>
           <w:rPr>
             <w:color w:val="315CBB"/>
@@ -1020,7 +1020,7 @@
       <w:pPr>
         <w:spacing w:after="80" w:before="80" w:line="300"/>
       </w:pPr>
-      <w:hyperlink w:history="1" r:id="rId6knh6q77dt94ybydjfai7">
+      <w:hyperlink w:history="1" r:id="rIdyxd1t2opfgd9z7d0pdnew">
         <w:r>
           <w:rPr>
             <w:color w:val="315CBB"/>
@@ -1038,7 +1038,7 @@
         </w:rPr>
         <w:t xml:space="preserve">   </w:t>
       </w:r>
-      <w:hyperlink w:history="1" r:id="rIdjnmmzvzf1ylqoo0dhzvwe">
+      <w:hyperlink w:history="1" r:id="rId_7ve-ogiqgenwscksz8dj">
         <w:r>
           <w:rPr>
             <w:color w:val="315CBB"/>
@@ -1056,7 +1056,7 @@
         </w:rPr>
         <w:t xml:space="preserve">   </w:t>
       </w:r>
-      <w:hyperlink w:history="1" r:id="rIdup6uv5rbmr5bpbbrnbr6t">
+      <w:hyperlink w:history="1" r:id="rIdc8cfjbjqthtkpudezbak4">
         <w:r>
           <w:rPr>
             <w:color w:val="315CBB"/>
@@ -1074,7 +1074,7 @@
         </w:rPr>
         <w:t xml:space="preserve">   </w:t>
       </w:r>
-      <w:hyperlink w:history="1" r:id="rIdzaf8gcpl17luymbpfc2dr">
+      <w:hyperlink w:history="1" r:id="rIdugcrxfz0o8gohdwwfupry">
         <w:r>
           <w:rPr>
             <w:color w:val="315CBB"/>
@@ -1221,7 +1221,7 @@
       <w:pPr>
         <w:spacing w:after="80" w:before="0" w:line="300"/>
       </w:pPr>
-      <w:hyperlink w:history="1" r:id="rId-umfr-xyphthcmjdzeiwu">
+      <w:hyperlink w:history="1" r:id="rIdgisfz2lscgcif-e-3o9-u">
         <w:r>
           <w:rPr>
             <w:color w:val="315CBB"/>
@@ -1544,7 +1544,7 @@
       <w:pPr>
         <w:spacing w:after="80" w:before="80" w:line="300"/>
       </w:pPr>
-      <w:hyperlink w:history="1" r:id="rIdj-habwznka49j3fucsr6s">
+      <w:hyperlink w:history="1" r:id="rIdftoscyfj0sttg5lve9gdo">
         <w:r>
           <w:rPr>
             <w:color w:val="315CBB"/>
@@ -1562,7 +1562,7 @@
         </w:rPr>
         <w:t xml:space="preserve">   </w:t>
       </w:r>
-      <w:hyperlink w:history="1" r:id="rIduwxhoosxfqs37ruqewsu2">
+      <w:hyperlink w:history="1" r:id="rIdj--d-idbxlp3xhca5nfjv">
         <w:r>
           <w:rPr>
             <w:color w:val="315CBB"/>
@@ -1685,7 +1685,7 @@
             <w:r>
               <w:br/>
             </w:r>
-            <w:hyperlink w:history="1" r:id="rId-m-kedvlbu8m9_-m6b_ia">
+            <w:hyperlink w:history="1" r:id="rIdbrrs-9isk7cqdukpf9gje">
               <w:r>
                 <w:rPr>
                   <w:color w:val="315CBB"/>
@@ -1698,7 +1698,7 @@
             <w:r>
               <w:br/>
             </w:r>
-            <w:hyperlink w:history="1" r:id="rIdrqvgpwijodeeq9izb7fp7">
+            <w:hyperlink w:history="1" r:id="rIdyshnrhqgszcq7hm6lkkxz">
               <w:r>
                 <w:rPr>
                   <w:color w:val="315CBB"/>
@@ -1915,7 +1915,8 @@
       </w:tblPr>
       <w:tblGrid>
         <w:gridCol w:w="2523"/>
-        <w:gridCol w:w="7569"/>
+        <w:gridCol w:w="1110"/>
+        <w:gridCol w:w="6459"/>
       </w:tblGrid>
       <w:tr>
         <w:trPr>
@@ -1947,7 +1948,63 @@
         </w:tc>
         <w:tc>
           <w:tcPr>
-            <w:tcW w:type="dxa" w:w="7569"/>
+            <w:tcW w:type="dxa" w:w="1110"/>
+            <w:tcMar>
+              <w:top w:type="dxa" w:w="60"/>
+              <w:left w:type="dxa" w:w="0"/>
+              <w:bottom w:type="dxa" w:w="60"/>
+              <w:right w:type="dxa" w:w="0"/>
+            </w:tcMar>
+          </w:tcPr>
+          <w:p>
+            <w:pPr>
+              <w:spacing w:after="80" w:before="0" w:line="300"/>
+            </w:pPr>
+            <w:r>
+              <w:drawing>
+                <wp:inline distT="0" distB="0" distL="0" distR="0">
+                  <wp:extent cx="609600" cy="409575"/>
+                  <wp:effectExtent t="0" r="0" b="0" l="0"/>
+                  <wp:docPr id="1" name="" descr="" title=""/>
+                  <wp:cNvGraphicFramePr>
+                    <a:graphicFrameLocks xmlns:a="http://schemas.openxmlformats.org/drawingml/2006/main" noChangeAspect="1"/>
+                  </wp:cNvGraphicFramePr>
+                  <a:graphic xmlns:a="http://schemas.openxmlformats.org/drawingml/2006/main">
+                    <a:graphicData uri="http://schemas.openxmlformats.org/drawingml/2006/picture">
+                      <pic:pic xmlns:pic="http://schemas.openxmlformats.org/drawingml/2006/picture">
+                        <pic:nvPicPr>
+                          <pic:cNvPr id="0" name="" descr=""/>
+                          <pic:cNvPicPr>
+                            <a:picLocks noChangeAspect="1" noChangeArrowheads="1"/>
+                          </pic:cNvPicPr>
+                        </pic:nvPicPr>
+                        <pic:blipFill>
+                          <a:blip r:embed="rId8" cstate="none"/>
+                          <a:srcRect/>
+                          <a:stretch>
+                            <a:fillRect/>
+                          </a:stretch>
+                        </pic:blipFill>
+                        <pic:spPr bwMode="auto">
+                          <a:xfrm>
+                            <a:off x="0" y="0"/>
+                            <a:ext cx="609600" cy="409575"/>
+                          </a:xfrm>
+                          <a:prstGeom prst="rect">
+                            <a:avLst/>
+                          </a:prstGeom>
+                        </pic:spPr>
+                      </pic:pic>
+                    </a:graphicData>
+                  </a:graphic>
+                </wp:inline>
+              </w:drawing>
+            </w:r>
+          </w:p>
+        </w:tc>
+        <w:tc>
+          <w:tcPr>
+            <w:tcW w:type="dxa" w:w="6459"/>
             <w:tcMar>
               <w:top w:type="dxa" w:w="60"/>
               <w:left w:type="dxa" w:w="0"/>
@@ -1988,7 +2045,7 @@
             <w:pPr>
               <w:spacing w:after="80" w:before="0" w:line="300"/>
             </w:pPr>
-            <w:hyperlink w:history="1" r:id="rIdnffrpwwtw_judnbda7rji">
+            <w:hyperlink w:history="1" r:id="rIdvls1xjpayryxmlz6qsubm">
               <w:r>
                 <w:rPr>
                   <w:color w:val="315CBB"/>
@@ -2090,7 +2147,7 @@
             <w:pPr>
               <w:spacing w:after="80" w:before="80" w:line="300"/>
             </w:pPr>
-            <w:hyperlink w:history="1" r:id="rIdet27agnpmjbbrykz-pboj">
+            <w:hyperlink w:history="1" r:id="rIdhmlknjjt3f_qmzaxoeu2k">
               <w:r>
                 <w:rPr>
                   <w:color w:val="315CBB"/>
@@ -2108,7 +2165,7 @@
               </w:rPr>
               <w:t xml:space="preserve">   </w:t>
             </w:r>
-            <w:hyperlink w:history="1" r:id="rIdeev4dsnzllzbulbbkde6n">
+            <w:hyperlink w:history="1" r:id="rIdvuvbmyzadiftvcwmemp-d">
               <w:r>
                 <w:rPr>
                   <w:color w:val="315CBB"/>
@@ -2126,7 +2183,7 @@
               </w:rPr>
               <w:t xml:space="preserve">   </w:t>
             </w:r>
-            <w:hyperlink w:history="1" r:id="rIdydzevzh-o8ynhi_n7nvu3">
+            <w:hyperlink w:history="1" r:id="rIdzlcco6cs7mynrk9os-juy">
               <w:r>
                 <w:rPr>
                   <w:color w:val="315CBB"/>
@@ -2227,7 +2284,7 @@
                           </pic:cNvPicPr>
                         </pic:nvPicPr>
                         <pic:blipFill>
-                          <a:blip r:embed="rId8" cstate="none"/>
+                          <a:blip r:embed="rId9" cstate="none"/>
                           <a:srcRect/>
                           <a:stretch>
                             <a:fillRect/>
@@ -2384,7 +2441,7 @@
                           </pic:cNvPicPr>
                         </pic:nvPicPr>
                         <pic:blipFill>
-                          <a:blip r:embed="rId9" cstate="none"/>
+                          <a:blip r:embed="rId10" cstate="none"/>
                           <a:srcRect/>
                           <a:stretch>
                             <a:fillRect/>
@@ -2791,147 +2848,6 @@
                 <w:szCs w:val="20"/>
               </w:rPr>
               <w:t xml:space="preserve">2025.10</w:t>
-            </w:r>
-          </w:p>
-        </w:tc>
-        <w:tc>
-          <w:tcPr>
-            <w:tcW w:type="dxa" w:w="1110"/>
-            <w:tcMar>
-              <w:top w:type="dxa" w:w="60"/>
-              <w:left w:type="dxa" w:w="0"/>
-              <w:bottom w:type="dxa" w:w="60"/>
-              <w:right w:type="dxa" w:w="0"/>
-            </w:tcMar>
-          </w:tcPr>
-          <w:p>
-            <w:pPr>
-              <w:spacing w:after="80" w:before="0" w:line="300"/>
-            </w:pPr>
-            <w:r>
-              <w:drawing>
-                <wp:inline distT="0" distB="0" distL="0" distR="0">
-                  <wp:extent cx="542925" cy="762000"/>
-                  <wp:effectExtent t="0" r="0" b="0" l="0"/>
-                  <wp:docPr id="1" name="" descr="" title=""/>
-                  <wp:cNvGraphicFramePr>
-                    <a:graphicFrameLocks xmlns:a="http://schemas.openxmlformats.org/drawingml/2006/main" noChangeAspect="1"/>
-                  </wp:cNvGraphicFramePr>
-                  <a:graphic xmlns:a="http://schemas.openxmlformats.org/drawingml/2006/main">
-                    <a:graphicData uri="http://schemas.openxmlformats.org/drawingml/2006/picture">
-                      <pic:pic xmlns:pic="http://schemas.openxmlformats.org/drawingml/2006/picture">
-                        <pic:nvPicPr>
-                          <pic:cNvPr id="0" name="" descr=""/>
-                          <pic:cNvPicPr>
-                            <a:picLocks noChangeAspect="1" noChangeArrowheads="1"/>
-                          </pic:cNvPicPr>
-                        </pic:nvPicPr>
-                        <pic:blipFill>
-                          <a:blip r:embed="rId10" cstate="none"/>
-                          <a:srcRect/>
-                          <a:stretch>
-                            <a:fillRect/>
-                          </a:stretch>
-                        </pic:blipFill>
-                        <pic:spPr bwMode="auto">
-                          <a:xfrm>
-                            <a:off x="0" y="0"/>
-                            <a:ext cx="542925" cy="762000"/>
-                          </a:xfrm>
-                          <a:prstGeom prst="rect">
-                            <a:avLst/>
-                          </a:prstGeom>
-                        </pic:spPr>
-                      </pic:pic>
-                    </a:graphicData>
-                  </a:graphic>
-                </wp:inline>
-              </w:drawing>
-            </w:r>
-          </w:p>
-        </w:tc>
-        <w:tc>
-          <w:tcPr>
-            <w:tcW w:type="dxa" w:w="6459"/>
-            <w:tcMar>
-              <w:top w:type="dxa" w:w="60"/>
-              <w:left w:type="dxa" w:w="0"/>
-              <w:bottom w:type="dxa" w:w="60"/>
-              <w:right w:type="dxa" w:w="0"/>
-            </w:tcMar>
-          </w:tcPr>
-          <w:p>
-            <w:pPr>
-              <w:spacing w:after="80" w:before="0" w:line="300"/>
-            </w:pPr>
-            <w:r>
-              <w:rPr>
-                <w:b/>
-                <w:bCs/>
-                <w:color w:val="203047"/>
-                <w:sz w:val="20"/>
-                <w:szCs w:val="20"/>
-              </w:rPr>
-              <w:t xml:space="preserve">Capstone Design Gold Award</w:t>
-            </w:r>
-            <w:r>
-              <w:br/>
-            </w:r>
-            <w:r>
-              <w:rPr>
-                <w:color w:val="203047"/>
-                <w:sz w:val="20"/>
-                <w:szCs w:val="20"/>
-              </w:rPr>
-              <w:t xml:space="preserve">Software &amp; AI division / College of Information and Biomedical Engineering, Pusan National University</w:t>
-            </w:r>
-          </w:p>
-        </w:tc>
-      </w:tr>
-    </w:tbl>
-    <w:tbl>
-      <w:tblPr>
-        <w:tblW w:type="dxa" w:w="10092"/>
-        <w:tblBorders>
-          <w:top w:val="none" w:color="FFFFFF" w:sz="0"/>
-          <w:left w:val="none" w:color="FFFFFF" w:sz="0"/>
-          <w:bottom w:val="single" w:color="E3E8F0" w:sz="4"/>
-          <w:right w:val="none" w:color="FFFFFF" w:sz="0"/>
-          <w:insideH w:val="none" w:color="FFFFFF" w:sz="0"/>
-          <w:insideV w:val="none" w:color="FFFFFF" w:sz="0"/>
-        </w:tblBorders>
-        <w:tblLayout w:type="fixed"/>
-      </w:tblPr>
-      <w:tblGrid>
-        <w:gridCol w:w="2523"/>
-        <w:gridCol w:w="1110"/>
-        <w:gridCol w:w="6459"/>
-      </w:tblGrid>
-      <w:tr>
-        <w:trPr>
-          <w:cantSplit/>
-        </w:trPr>
-        <w:tc>
-          <w:tcPr>
-            <w:tcW w:type="dxa" w:w="2523"/>
-            <w:tcMar>
-              <w:top w:type="dxa" w:w="60"/>
-              <w:left w:type="dxa" w:w="0"/>
-              <w:bottom w:type="dxa" w:w="60"/>
-              <w:right w:type="dxa" w:w="120"/>
-            </w:tcMar>
-          </w:tcPr>
-          <w:p>
-            <w:pPr>
-              <w:spacing w:after="80" w:before="0" w:line="300"/>
-            </w:pPr>
-            <w:r>
-              <w:rPr>
-                <w:color w:val="203047"/>
-                <w:sz w:val="20"/>
-                <w:szCs w:val="20"/>
-              </w:rPr>
-              <w:t xml:space="preserve">2025.09</w:t>
             </w:r>
           </w:p>
         </w:tc>
@@ -3013,7 +2929,7 @@
                 <w:sz w:val="20"/>
                 <w:szCs w:val="20"/>
               </w:rPr>
-              <w:t xml:space="preserve">Busan DATA WEEK Top Excellence Award</w:t>
+              <w:t xml:space="preserve">Capstone Design Gold Award</w:t>
             </w:r>
             <w:r>
               <w:br/>
@@ -3024,7 +2940,7 @@
                 <w:sz w:val="20"/>
                 <w:szCs w:val="20"/>
               </w:rPr>
-              <w:t xml:space="preserve">Data utilization case competition / Busan Techno Park</w:t>
+              <w:t xml:space="preserve">Software &amp; AI division / College of Information and Biomedical Engineering, Pusan National University</w:t>
             </w:r>
           </w:p>
         </w:tc>
@@ -3154,7 +3070,7 @@
                 <w:sz w:val="20"/>
                 <w:szCs w:val="20"/>
               </w:rPr>
-              <w:t xml:space="preserve">AI LAUNCH Career School Startup Hackathon Encouragement Award</w:t>
+              <w:t xml:space="preserve">Busan DATA WEEK Top Excellence Award</w:t>
             </w:r>
             <w:r>
               <w:br/>
@@ -3165,7 +3081,7 @@
                 <w:sz w:val="20"/>
                 <w:szCs w:val="20"/>
               </w:rPr>
-              <w:t xml:space="preserve">KRYPTON X x Root Impact x Google.org</w:t>
+              <w:t xml:space="preserve">Data utilization case competition / Busan Techno Park</w:t>
             </w:r>
           </w:p>
         </w:tc>
@@ -3213,7 +3129,7 @@
                 <w:sz w:val="20"/>
                 <w:szCs w:val="20"/>
               </w:rPr>
-              <w:t xml:space="preserve">2025.08</w:t>
+              <w:t xml:space="preserve">2025.09</w:t>
             </w:r>
           </w:p>
         </w:tc>
@@ -3251,6 +3167,147 @@
                         </pic:nvPicPr>
                         <pic:blipFill>
                           <a:blip r:embed="rId13" cstate="none"/>
+                          <a:srcRect/>
+                          <a:stretch>
+                            <a:fillRect/>
+                          </a:stretch>
+                        </pic:blipFill>
+                        <pic:spPr bwMode="auto">
+                          <a:xfrm>
+                            <a:off x="0" y="0"/>
+                            <a:ext cx="542925" cy="762000"/>
+                          </a:xfrm>
+                          <a:prstGeom prst="rect">
+                            <a:avLst/>
+                          </a:prstGeom>
+                        </pic:spPr>
+                      </pic:pic>
+                    </a:graphicData>
+                  </a:graphic>
+                </wp:inline>
+              </w:drawing>
+            </w:r>
+          </w:p>
+        </w:tc>
+        <w:tc>
+          <w:tcPr>
+            <w:tcW w:type="dxa" w:w="6459"/>
+            <w:tcMar>
+              <w:top w:type="dxa" w:w="60"/>
+              <w:left w:type="dxa" w:w="0"/>
+              <w:bottom w:type="dxa" w:w="60"/>
+              <w:right w:type="dxa" w:w="0"/>
+            </w:tcMar>
+          </w:tcPr>
+          <w:p>
+            <w:pPr>
+              <w:spacing w:after="80" w:before="0" w:line="300"/>
+            </w:pPr>
+            <w:r>
+              <w:rPr>
+                <w:b/>
+                <w:bCs/>
+                <w:color w:val="203047"/>
+                <w:sz w:val="20"/>
+                <w:szCs w:val="20"/>
+              </w:rPr>
+              <w:t xml:space="preserve">AI LAUNCH Career School Startup Hackathon Encouragement Award</w:t>
+            </w:r>
+            <w:r>
+              <w:br/>
+            </w:r>
+            <w:r>
+              <w:rPr>
+                <w:color w:val="203047"/>
+                <w:sz w:val="20"/>
+                <w:szCs w:val="20"/>
+              </w:rPr>
+              <w:t xml:space="preserve">KRYPTON X x Root Impact x Google.org</w:t>
+            </w:r>
+          </w:p>
+        </w:tc>
+      </w:tr>
+    </w:tbl>
+    <w:tbl>
+      <w:tblPr>
+        <w:tblW w:type="dxa" w:w="10092"/>
+        <w:tblBorders>
+          <w:top w:val="none" w:color="FFFFFF" w:sz="0"/>
+          <w:left w:val="none" w:color="FFFFFF" w:sz="0"/>
+          <w:bottom w:val="single" w:color="E3E8F0" w:sz="4"/>
+          <w:right w:val="none" w:color="FFFFFF" w:sz="0"/>
+          <w:insideH w:val="none" w:color="FFFFFF" w:sz="0"/>
+          <w:insideV w:val="none" w:color="FFFFFF" w:sz="0"/>
+        </w:tblBorders>
+        <w:tblLayout w:type="fixed"/>
+      </w:tblPr>
+      <w:tblGrid>
+        <w:gridCol w:w="2523"/>
+        <w:gridCol w:w="1110"/>
+        <w:gridCol w:w="6459"/>
+      </w:tblGrid>
+      <w:tr>
+        <w:trPr>
+          <w:cantSplit/>
+        </w:trPr>
+        <w:tc>
+          <w:tcPr>
+            <w:tcW w:type="dxa" w:w="2523"/>
+            <w:tcMar>
+              <w:top w:type="dxa" w:w="60"/>
+              <w:left w:type="dxa" w:w="0"/>
+              <w:bottom w:type="dxa" w:w="60"/>
+              <w:right w:type="dxa" w:w="120"/>
+            </w:tcMar>
+          </w:tcPr>
+          <w:p>
+            <w:pPr>
+              <w:spacing w:after="80" w:before="0" w:line="300"/>
+            </w:pPr>
+            <w:r>
+              <w:rPr>
+                <w:color w:val="203047"/>
+                <w:sz w:val="20"/>
+                <w:szCs w:val="20"/>
+              </w:rPr>
+              <w:t xml:space="preserve">2025.08</w:t>
+            </w:r>
+          </w:p>
+        </w:tc>
+        <w:tc>
+          <w:tcPr>
+            <w:tcW w:type="dxa" w:w="1110"/>
+            <w:tcMar>
+              <w:top w:type="dxa" w:w="60"/>
+              <w:left w:type="dxa" w:w="0"/>
+              <w:bottom w:type="dxa" w:w="60"/>
+              <w:right w:type="dxa" w:w="0"/>
+            </w:tcMar>
+          </w:tcPr>
+          <w:p>
+            <w:pPr>
+              <w:spacing w:after="80" w:before="0" w:line="300"/>
+            </w:pPr>
+            <w:r>
+              <w:drawing>
+                <wp:inline distT="0" distB="0" distL="0" distR="0">
+                  <wp:extent cx="542925" cy="762000"/>
+                  <wp:effectExtent t="0" r="0" b="0" l="0"/>
+                  <wp:docPr id="1" name="" descr="" title=""/>
+                  <wp:cNvGraphicFramePr>
+                    <a:graphicFrameLocks xmlns:a="http://schemas.openxmlformats.org/drawingml/2006/main" noChangeAspect="1"/>
+                  </wp:cNvGraphicFramePr>
+                  <a:graphic xmlns:a="http://schemas.openxmlformats.org/drawingml/2006/main">
+                    <a:graphicData uri="http://schemas.openxmlformats.org/drawingml/2006/picture">
+                      <pic:pic xmlns:pic="http://schemas.openxmlformats.org/drawingml/2006/picture">
+                        <pic:nvPicPr>
+                          <pic:cNvPr id="0" name="" descr=""/>
+                          <pic:cNvPicPr>
+                            <a:picLocks noChangeAspect="1" noChangeArrowheads="1"/>
+                          </pic:cNvPicPr>
+                        </pic:nvPicPr>
+                        <pic:blipFill>
+                          <a:blip r:embed="rId14" cstate="none"/>
                           <a:srcRect/>
                           <a:stretch>
                             <a:fillRect/>

</xml_diff>

<commit_message>
Keep activities in date order: move the Baekjoon streak after the exhibitions
Co-Authored-By: Claude Opus 5.5 (1M context) <noreply@anthropic.com>
</commit_message>
<xml_diff>
--- a/site/en/resume.docx
+++ b/site/en/resume.docx
@@ -102,7 +102,7 @@
             <w:pPr>
               <w:spacing w:after="80" w:before="80" w:line="300"/>
             </w:pPr>
-            <w:hyperlink w:history="1" r:id="rIdmwrkttrkmrumrymcvzpca">
+            <w:hyperlink w:history="1" r:id="rIdaxp7vfvcuow-h5pjqvh56">
               <w:r>
                 <w:rPr>
                   <w:color w:val="315CBB"/>
@@ -120,7 +120,7 @@
               </w:rPr>
               <w:t xml:space="preserve">   </w:t>
             </w:r>
-            <w:hyperlink w:history="1" r:id="rIddrczfhvbegngaeleupupx">
+            <w:hyperlink w:history="1" r:id="rIdm2i1ligfkntjqueb7scfw">
               <w:r>
                 <w:rPr>
                   <w:color w:val="315CBB"/>
@@ -138,7 +138,7 @@
               </w:rPr>
               <w:t xml:space="preserve">   </w:t>
             </w:r>
-            <w:hyperlink w:history="1" r:id="rIdqol_jfedollzk0wwbxznq">
+            <w:hyperlink w:history="1" r:id="rIdzdrummi4ix0fuemelr8ih">
               <w:r>
                 <w:rPr>
                   <w:color w:val="315CBB"/>
@@ -156,7 +156,7 @@
               </w:rPr>
               <w:t xml:space="preserve">   </w:t>
             </w:r>
-            <w:hyperlink w:history="1" r:id="rId5uh_3i0ybc_b3xas9rlo6">
+            <w:hyperlink w:history="1" r:id="rIdfyglw8q03eunytdg6smr0">
               <w:r>
                 <w:rPr>
                   <w:color w:val="315CBB"/>
@@ -404,7 +404,7 @@
       <w:pPr>
         <w:spacing w:after="80" w:before="80" w:line="300"/>
       </w:pPr>
-      <w:hyperlink w:history="1" r:id="rIdlbhaco-jdyuoddlbmuawn">
+      <w:hyperlink w:history="1" r:id="rIdr2361dxzkxxqqus6_we6g">
         <w:r>
           <w:rPr>
             <w:color w:val="315CBB"/>
@@ -422,7 +422,7 @@
         </w:rPr>
         <w:t xml:space="preserve">   </w:t>
       </w:r>
-      <w:hyperlink w:history="1" r:id="rIdm9mbckzgarhqvu36iaea2">
+      <w:hyperlink w:history="1" r:id="rIdtuo1b1hfwgvxzyx7mkt8w">
         <w:r>
           <w:rPr>
             <w:color w:val="315CBB"/>
@@ -1020,7 +1020,7 @@
       <w:pPr>
         <w:spacing w:after="80" w:before="80" w:line="300"/>
       </w:pPr>
-      <w:hyperlink w:history="1" r:id="rIdyxd1t2opfgd9z7d0pdnew">
+      <w:hyperlink w:history="1" r:id="rIdysl2sv3j0edf-myhkizwn">
         <w:r>
           <w:rPr>
             <w:color w:val="315CBB"/>
@@ -1038,7 +1038,7 @@
         </w:rPr>
         <w:t xml:space="preserve">   </w:t>
       </w:r>
-      <w:hyperlink w:history="1" r:id="rId_7ve-ogiqgenwscksz8dj">
+      <w:hyperlink w:history="1" r:id="rIdkvyjaxulcpelkw0v643n6">
         <w:r>
           <w:rPr>
             <w:color w:val="315CBB"/>
@@ -1056,7 +1056,7 @@
         </w:rPr>
         <w:t xml:space="preserve">   </w:t>
       </w:r>
-      <w:hyperlink w:history="1" r:id="rIdc8cfjbjqthtkpudezbak4">
+      <w:hyperlink w:history="1" r:id="rIddmfue0zg5fp822hjp0aux">
         <w:r>
           <w:rPr>
             <w:color w:val="315CBB"/>
@@ -1074,7 +1074,7 @@
         </w:rPr>
         <w:t xml:space="preserve">   </w:t>
       </w:r>
-      <w:hyperlink w:history="1" r:id="rIdugcrxfz0o8gohdwwfupry">
+      <w:hyperlink w:history="1" r:id="rIdle_bedwi3rmqmcd747lwm">
         <w:r>
           <w:rPr>
             <w:color w:val="315CBB"/>
@@ -1221,7 +1221,7 @@
       <w:pPr>
         <w:spacing w:after="80" w:before="0" w:line="300"/>
       </w:pPr>
-      <w:hyperlink w:history="1" r:id="rIdgisfz2lscgcif-e-3o9-u">
+      <w:hyperlink w:history="1" r:id="rIdu9e54ernvxqqssihlauej">
         <w:r>
           <w:rPr>
             <w:color w:val="315CBB"/>
@@ -1544,7 +1544,7 @@
       <w:pPr>
         <w:spacing w:after="80" w:before="80" w:line="300"/>
       </w:pPr>
-      <w:hyperlink w:history="1" r:id="rIdftoscyfj0sttg5lve9gdo">
+      <w:hyperlink w:history="1" r:id="rIdbfliablrvt_k0pmqou9jl">
         <w:r>
           <w:rPr>
             <w:color w:val="315CBB"/>
@@ -1562,7 +1562,7 @@
         </w:rPr>
         <w:t xml:space="preserve">   </w:t>
       </w:r>
-      <w:hyperlink w:history="1" r:id="rIdj--d-idbxlp3xhca5nfjv">
+      <w:hyperlink w:history="1" r:id="rIde7-95artrcatzqxo8pddc">
         <w:r>
           <w:rPr>
             <w:color w:val="315CBB"/>
@@ -1685,7 +1685,7 @@
             <w:r>
               <w:br/>
             </w:r>
-            <w:hyperlink w:history="1" r:id="rIdbrrs-9isk7cqdukpf9gje">
+            <w:hyperlink w:history="1" r:id="rIdwoy9-h1x20xsqruyqidzk">
               <w:r>
                 <w:rPr>
                   <w:color w:val="315CBB"/>
@@ -1698,7 +1698,7 @@
             <w:r>
               <w:br/>
             </w:r>
-            <w:hyperlink w:history="1" r:id="rIdyshnrhqgszcq7hm6lkkxz">
+            <w:hyperlink w:history="1" r:id="rId_jsomptck45tjq3ceqrdt">
               <w:r>
                 <w:rPr>
                   <w:color w:val="315CBB"/>
@@ -1915,6 +1915,152 @@
       </w:tblPr>
       <w:tblGrid>
         <w:gridCol w:w="2523"/>
+        <w:gridCol w:w="7569"/>
+      </w:tblGrid>
+      <w:tr>
+        <w:trPr>
+          <w:cantSplit/>
+        </w:trPr>
+        <w:tc>
+          <w:tcPr>
+            <w:tcW w:type="dxa" w:w="2523"/>
+            <w:tcMar>
+              <w:top w:type="dxa" w:w="60"/>
+              <w:left w:type="dxa" w:w="0"/>
+              <w:bottom w:type="dxa" w:w="60"/>
+              <w:right w:type="dxa" w:w="120"/>
+            </w:tcMar>
+          </w:tcPr>
+          <w:p>
+            <w:pPr>
+              <w:spacing w:after="80" w:before="0" w:line="300"/>
+            </w:pPr>
+            <w:r>
+              <w:rPr>
+                <w:color w:val="203047"/>
+                <w:sz w:val="20"/>
+                <w:szCs w:val="20"/>
+              </w:rPr>
+              <w:t xml:space="preserve">2026.06 — 2026.06</w:t>
+            </w:r>
+          </w:p>
+        </w:tc>
+        <w:tc>
+          <w:tcPr>
+            <w:tcW w:type="dxa" w:w="7569"/>
+            <w:tcMar>
+              <w:top w:type="dxa" w:w="60"/>
+              <w:left w:type="dxa" w:w="0"/>
+              <w:bottom w:type="dxa" w:w="60"/>
+              <w:right w:type="dxa" w:w="0"/>
+            </w:tcMar>
+          </w:tcPr>
+          <w:p>
+            <w:pPr>
+              <w:keepNext/>
+              <w:spacing w:after="0" w:before="0" w:line="276"/>
+            </w:pPr>
+            <w:r>
+              <w:rPr>
+                <w:b/>
+                <w:bCs/>
+                <w:color w:val="203047"/>
+                <w:sz w:val="24"/>
+                <w:szCs w:val="24"/>
+              </w:rPr>
+              <w:t xml:space="preserve">Rhwp open-source contributions</w:t>
+            </w:r>
+          </w:p>
+          <w:p>
+            <w:pPr>
+              <w:spacing w:after="80" w:before="0" w:line="300"/>
+            </w:pPr>
+            <w:r>
+              <w:rPr>
+                <w:color w:val="203047"/>
+                <w:sz w:val="20"/>
+                <w:szCs w:val="20"/>
+              </w:rPr>
+              <w:t xml:space="preserve">Investigated bugs, submitted fixes and addressed CI in a Rust HWP/HWPX project. Fixed textFlow attributes of images, tables and shapes being reset after saving.</w:t>
+            </w:r>
+          </w:p>
+          <w:p>
+            <w:pPr>
+              <w:spacing w:after="80" w:before="80" w:line="300"/>
+            </w:pPr>
+            <w:hyperlink w:history="1" r:id="rIdxs1ql7vcywplq7qgb5byg">
+              <w:r>
+                <w:rPr>
+                  <w:color w:val="315CBB"/>
+                  <w:sz w:val="20"/>
+                  <w:szCs w:val="20"/>
+                </w:rPr>
+                <w:t xml:space="preserve">GitHub repository ↗</w:t>
+              </w:r>
+            </w:hyperlink>
+            <w:r>
+              <w:rPr>
+                <w:color w:val="203047"/>
+                <w:sz w:val="20"/>
+                <w:szCs w:val="20"/>
+              </w:rPr>
+              <w:t xml:space="preserve">   </w:t>
+            </w:r>
+            <w:hyperlink w:history="1" r:id="rId5_pciy9on6uqqnbeujwov">
+              <w:r>
+                <w:rPr>
+                  <w:color w:val="315CBB"/>
+                  <w:sz w:val="20"/>
+                  <w:szCs w:val="20"/>
+                </w:rPr>
+                <w:t xml:space="preserve">PR #1213 · Merged ↗</w:t>
+              </w:r>
+            </w:hyperlink>
+            <w:r>
+              <w:rPr>
+                <w:color w:val="203047"/>
+                <w:sz w:val="20"/>
+                <w:szCs w:val="20"/>
+              </w:rPr>
+              <w:t xml:space="preserve">   </w:t>
+            </w:r>
+            <w:hyperlink w:history="1" r:id="rIdh6ce49w6esxrpo4-sfx0x">
+              <w:r>
+                <w:rPr>
+                  <w:color w:val="315CBB"/>
+                  <w:sz w:val="20"/>
+                  <w:szCs w:val="20"/>
+                </w:rPr>
+                <w:t xml:space="preserve">PR #1351 · Submitted ↗</w:t>
+              </w:r>
+            </w:hyperlink>
+            <w:r>
+              <w:rPr>
+                <w:color w:val="203047"/>
+                <w:sz w:val="20"/>
+                <w:szCs w:val="20"/>
+              </w:rPr>
+              <w:t xml:space="preserve">   </w:t>
+            </w:r>
+          </w:p>
+        </w:tc>
+      </w:tr>
+    </w:tbl>
+    <w:tbl>
+      <w:tblPr>
+        <w:tblW w:type="dxa" w:w="10092"/>
+        <w:tblBorders>
+          <w:top w:val="none" w:color="FFFFFF" w:sz="0"/>
+          <w:left w:val="none" w:color="FFFFFF" w:sz="0"/>
+          <w:bottom w:val="single" w:color="E3E8F0" w:sz="4"/>
+          <w:right w:val="none" w:color="FFFFFF" w:sz="0"/>
+          <w:insideH w:val="none" w:color="FFFFFF" w:sz="0"/>
+          <w:insideV w:val="none" w:color="FFFFFF" w:sz="0"/>
+        </w:tblBorders>
+        <w:tblLayout w:type="fixed"/>
+      </w:tblPr>
+      <w:tblGrid>
+        <w:gridCol w:w="2523"/>
         <w:gridCol w:w="1110"/>
         <w:gridCol w:w="6459"/>
       </w:tblGrid>
@@ -1942,7 +2088,7 @@
                 <w:sz w:val="20"/>
                 <w:szCs w:val="20"/>
               </w:rPr>
-              <w:t xml:space="preserve">2022.02 — 2025.07</w:t>
+              <w:t xml:space="preserve">2025.03 — 2026.01</w:t>
             </w:r>
           </w:p>
         </w:tc>
@@ -1963,7 +2109,7 @@
             <w:r>
               <w:drawing>
                 <wp:inline distT="0" distB="0" distL="0" distR="0">
-                  <wp:extent cx="609600" cy="409575"/>
+                  <wp:extent cx="552450" cy="762000"/>
                   <wp:effectExtent t="0" r="0" b="0" l="0"/>
                   <wp:docPr id="1" name="" descr="" title=""/>
                   <wp:cNvGraphicFramePr>
@@ -1988,7 +2134,7 @@
                         <pic:spPr bwMode="auto">
                           <a:xfrm>
                             <a:off x="0" y="0"/>
-                            <a:ext cx="609600" cy="409575"/>
+                            <a:ext cx="552450" cy="762000"/>
                           </a:xfrm>
                           <a:prstGeom prst="rect">
                             <a:avLst/>
@@ -2025,181 +2171,33 @@
                 <w:sz w:val="24"/>
                 <w:szCs w:val="24"/>
               </w:rPr>
-              <w:t xml:space="preserve">945-day Baekjoon problem-solving streak</w:t>
-            </w:r>
-          </w:p>
-          <w:p>
-            <w:pPr>
-              <w:spacing w:after="80" w:before="0" w:line="300"/>
-            </w:pPr>
-            <w:r>
-              <w:rPr>
-                <w:color w:val="203047"/>
-                <w:sz w:val="20"/>
-                <w:szCs w:val="20"/>
-              </w:rPr>
-              <w:t xml:space="preserve">Aiming for one problem a day, I reached a longest streak of 945 consecutive days on solved.ac. 1,659 problems solved, solved.ac Platinum IV. Solutions are recorded in a GitHub repository.</w:t>
-            </w:r>
-          </w:p>
-          <w:p>
-            <w:pPr>
-              <w:spacing w:after="80" w:before="0" w:line="300"/>
-            </w:pPr>
-            <w:hyperlink w:history="1" r:id="rIdvls1xjpayryxmlz6qsubm">
-              <w:r>
-                <w:rPr>
-                  <w:color w:val="315CBB"/>
-                  <w:sz w:val="20"/>
-                  <w:szCs w:val="20"/>
-                </w:rPr>
-                <w:t xml:space="preserve">Baekjoon solutions repository ↗</w:t>
-              </w:r>
-            </w:hyperlink>
-          </w:p>
-        </w:tc>
-      </w:tr>
-    </w:tbl>
-    <w:tbl>
-      <w:tblPr>
-        <w:tblW w:type="dxa" w:w="10092"/>
-        <w:tblBorders>
-          <w:top w:val="none" w:color="FFFFFF" w:sz="0"/>
-          <w:left w:val="none" w:color="FFFFFF" w:sz="0"/>
-          <w:bottom w:val="single" w:color="E3E8F0" w:sz="4"/>
-          <w:right w:val="none" w:color="FFFFFF" w:sz="0"/>
-          <w:insideH w:val="none" w:color="FFFFFF" w:sz="0"/>
-          <w:insideV w:val="none" w:color="FFFFFF" w:sz="0"/>
-        </w:tblBorders>
-        <w:tblLayout w:type="fixed"/>
-      </w:tblPr>
-      <w:tblGrid>
-        <w:gridCol w:w="2523"/>
-        <w:gridCol w:w="7569"/>
-      </w:tblGrid>
-      <w:tr>
-        <w:trPr>
-          <w:cantSplit/>
-        </w:trPr>
-        <w:tc>
-          <w:tcPr>
-            <w:tcW w:type="dxa" w:w="2523"/>
-            <w:tcMar>
-              <w:top w:type="dxa" w:w="60"/>
-              <w:left w:type="dxa" w:w="0"/>
-              <w:bottom w:type="dxa" w:w="60"/>
-              <w:right w:type="dxa" w:w="120"/>
-            </w:tcMar>
-          </w:tcPr>
-          <w:p>
-            <w:pPr>
-              <w:spacing w:after="80" w:before="0" w:line="300"/>
-            </w:pPr>
-            <w:r>
-              <w:rPr>
-                <w:color w:val="203047"/>
-                <w:sz w:val="20"/>
-                <w:szCs w:val="20"/>
-              </w:rPr>
-              <w:t xml:space="preserve">2026.06 — 2026.06</w:t>
-            </w:r>
-          </w:p>
-        </w:tc>
-        <w:tc>
-          <w:tcPr>
-            <w:tcW w:type="dxa" w:w="7569"/>
-            <w:tcMar>
-              <w:top w:type="dxa" w:w="60"/>
-              <w:left w:type="dxa" w:w="0"/>
-              <w:bottom w:type="dxa" w:w="60"/>
-              <w:right w:type="dxa" w:w="0"/>
-            </w:tcMar>
-          </w:tcPr>
-          <w:p>
-            <w:pPr>
-              <w:keepNext/>
-              <w:spacing w:after="0" w:before="0" w:line="276"/>
-            </w:pPr>
-            <w:r>
-              <w:rPr>
-                <w:b/>
-                <w:bCs/>
-                <w:color w:val="203047"/>
-                <w:sz w:val="24"/>
-                <w:szCs w:val="24"/>
-              </w:rPr>
-              <w:t xml:space="preserve">Rhwp open-source contributions</w:t>
-            </w:r>
-          </w:p>
-          <w:p>
-            <w:pPr>
-              <w:spacing w:after="80" w:before="0" w:line="300"/>
-            </w:pPr>
-            <w:r>
-              <w:rPr>
-                <w:color w:val="203047"/>
-                <w:sz w:val="20"/>
-                <w:szCs w:val="20"/>
-              </w:rPr>
-              <w:t xml:space="preserve">Investigated bugs, submitted fixes and addressed CI in a Rust HWP/HWPX project. Fixed textFlow attributes of images, tables and shapes being reset after saving.</w:t>
-            </w:r>
-          </w:p>
-          <w:p>
-            <w:pPr>
-              <w:spacing w:after="80" w:before="80" w:line="300"/>
-            </w:pPr>
-            <w:hyperlink w:history="1" r:id="rIdhmlknjjt3f_qmzaxoeu2k">
-              <w:r>
-                <w:rPr>
-                  <w:color w:val="315CBB"/>
-                  <w:sz w:val="20"/>
-                  <w:szCs w:val="20"/>
-                </w:rPr>
-                <w:t xml:space="preserve">GitHub repository ↗</w:t>
-              </w:r>
-            </w:hyperlink>
-            <w:r>
-              <w:rPr>
-                <w:color w:val="203047"/>
-                <w:sz w:val="20"/>
-                <w:szCs w:val="20"/>
-              </w:rPr>
-              <w:t xml:space="preserve">   </w:t>
-            </w:r>
-            <w:hyperlink w:history="1" r:id="rIdvuvbmyzadiftvcwmemp-d">
-              <w:r>
-                <w:rPr>
-                  <w:color w:val="315CBB"/>
-                  <w:sz w:val="20"/>
-                  <w:szCs w:val="20"/>
-                </w:rPr>
-                <w:t xml:space="preserve">PR #1213 · Merged ↗</w:t>
-              </w:r>
-            </w:hyperlink>
-            <w:r>
-              <w:rPr>
-                <w:color w:val="203047"/>
-                <w:sz w:val="20"/>
-                <w:szCs w:val="20"/>
-              </w:rPr>
-              <w:t xml:space="preserve">   </w:t>
-            </w:r>
-            <w:hyperlink w:history="1" r:id="rIdzlcco6cs7mynrk9os-juy">
-              <w:r>
-                <w:rPr>
-                  <w:color w:val="315CBB"/>
-                  <w:sz w:val="20"/>
-                  <w:szCs w:val="20"/>
-                </w:rPr>
-                <w:t xml:space="preserve">PR #1351 · Submitted ↗</w:t>
-              </w:r>
-            </w:hyperlink>
-            <w:r>
-              <w:rPr>
-                <w:color w:val="203047"/>
-                <w:sz w:val="20"/>
-                <w:szCs w:val="20"/>
-              </w:rPr>
-              <w:t xml:space="preserve">   </w:t>
+              <w:t xml:space="preserve">APPTIVE, Pusan National University</w:t>
+            </w:r>
+          </w:p>
+          <w:p>
+            <w:pPr>
+              <w:spacing w:after="80" w:before="0" w:line="300"/>
+            </w:pPr>
+            <w:r>
+              <w:rPr>
+                <w:color w:val="203047"/>
+                <w:sz w:val="20"/>
+                <w:szCs w:val="20"/>
+              </w:rPr>
+              <w:t xml:space="preserve">Backend mentee and mentor. Led 6 mentoring and code-review sessions for 12 mentees. Helped revise the curriculum to strengthen HTTP, Servlet, REST API and database foundations.</w:t>
+            </w:r>
+          </w:p>
+          <w:p>
+            <w:pPr>
+              <w:spacing w:after="80" w:before="0" w:line="300"/>
+            </w:pPr>
+            <w:r>
+              <w:rPr>
+                <w:color w:val="607089"/>
+                <w:sz w:val="18"/>
+                <w:szCs w:val="18"/>
+              </w:rPr>
+              <w:t xml:space="preserve">APPTIVE Backend Mentor Merit Award · 2026.01.09</w:t>
             </w:r>
           </w:p>
         </w:tc>
@@ -2247,7 +2245,7 @@
                 <w:sz w:val="20"/>
                 <w:szCs w:val="20"/>
               </w:rPr>
-              <w:t xml:space="preserve">2025.03 — 2026.01</w:t>
+              <w:t xml:space="preserve">2025.11 / 2025.07</w:t>
             </w:r>
           </w:p>
         </w:tc>
@@ -2268,7 +2266,7 @@
             <w:r>
               <w:drawing>
                 <wp:inline distT="0" distB="0" distL="0" distR="0">
-                  <wp:extent cx="552450" cy="762000"/>
+                  <wp:extent cx="609600" cy="457200"/>
                   <wp:effectExtent t="0" r="0" b="0" l="0"/>
                   <wp:docPr id="1" name="" descr="" title=""/>
                   <wp:cNvGraphicFramePr>
@@ -2293,7 +2291,7 @@
                         <pic:spPr bwMode="auto">
                           <a:xfrm>
                             <a:off x="0" y="0"/>
-                            <a:ext cx="552450" cy="762000"/>
+                            <a:ext cx="609600" cy="457200"/>
                           </a:xfrm>
                           <a:prstGeom prst="rect">
                             <a:avLst/>
@@ -2330,33 +2328,20 @@
                 <w:sz w:val="24"/>
                 <w:szCs w:val="24"/>
               </w:rPr>
-              <w:t xml:space="preserve">APPTIVE, Pusan National University</w:t>
-            </w:r>
-          </w:p>
-          <w:p>
-            <w:pPr>
-              <w:spacing w:after="80" w:before="0" w:line="300"/>
-            </w:pPr>
-            <w:r>
-              <w:rPr>
-                <w:color w:val="203047"/>
-                <w:sz w:val="20"/>
-                <w:szCs w:val="20"/>
-              </w:rPr>
-              <w:t xml:space="preserve">Backend mentee and mentor. Led 6 mentoring and code-review sessions for 12 mentees. Helped revise the curriculum to strengthen HTTP, Servlet, REST API and database foundations.</w:t>
-            </w:r>
-          </w:p>
-          <w:p>
-            <w:pPr>
-              <w:spacing w:after="80" w:before="0" w:line="300"/>
-            </w:pPr>
-            <w:r>
-              <w:rPr>
-                <w:color w:val="607089"/>
-                <w:sz w:val="18"/>
-                <w:szCs w:val="18"/>
-              </w:rPr>
-              <w:t xml:space="preserve">APPTIVE Backend Mentor Merit Award · 2026.01.09</w:t>
+              <w:t xml:space="preserve">SK AI SUMMIT · K-ICT WEEK in Busan</w:t>
+            </w:r>
+          </w:p>
+          <w:p>
+            <w:pPr>
+              <w:spacing w:after="80" w:before="0" w:line="300"/>
+            </w:pPr>
+            <w:r>
+              <w:rPr>
+                <w:color w:val="203047"/>
+                <w:sz w:val="20"/>
+                <w:szCs w:val="20"/>
+              </w:rPr>
+              <w:t xml:space="preserve">Represented Pusan National University at the Pilltip booth, demonstrating the service and answering technical questions.</w:t>
             </w:r>
           </w:p>
         </w:tc>
@@ -2404,7 +2389,7 @@
                 <w:sz w:val="20"/>
                 <w:szCs w:val="20"/>
               </w:rPr>
-              <w:t xml:space="preserve">2025.11 / 2025.07</w:t>
+              <w:t xml:space="preserve">2022.02 — 2025.07</w:t>
             </w:r>
           </w:p>
         </w:tc>
@@ -2425,7 +2410,7 @@
             <w:r>
               <w:drawing>
                 <wp:inline distT="0" distB="0" distL="0" distR="0">
-                  <wp:extent cx="609600" cy="457200"/>
+                  <wp:extent cx="609600" cy="409575"/>
                   <wp:effectExtent t="0" r="0" b="0" l="0"/>
                   <wp:docPr id="1" name="" descr="" title=""/>
                   <wp:cNvGraphicFramePr>
@@ -2450,7 +2435,7 @@
                         <pic:spPr bwMode="auto">
                           <a:xfrm>
                             <a:off x="0" y="0"/>
-                            <a:ext cx="609600" cy="457200"/>
+                            <a:ext cx="609600" cy="409575"/>
                           </a:xfrm>
                           <a:prstGeom prst="rect">
                             <a:avLst/>
@@ -2487,21 +2472,36 @@
                 <w:sz w:val="24"/>
                 <w:szCs w:val="24"/>
               </w:rPr>
-              <w:t xml:space="preserve">SK AI SUMMIT · K-ICT WEEK in Busan</w:t>
-            </w:r>
-          </w:p>
-          <w:p>
-            <w:pPr>
-              <w:spacing w:after="80" w:before="0" w:line="300"/>
-            </w:pPr>
-            <w:r>
-              <w:rPr>
-                <w:color w:val="203047"/>
-                <w:sz w:val="20"/>
-                <w:szCs w:val="20"/>
-              </w:rPr>
-              <w:t xml:space="preserve">Represented Pusan National University at the Pilltip booth, demonstrating the service and answering technical questions.</w:t>
-            </w:r>
+              <w:t xml:space="preserve">945-day Baekjoon problem-solving streak</w:t>
+            </w:r>
+          </w:p>
+          <w:p>
+            <w:pPr>
+              <w:spacing w:after="80" w:before="0" w:line="300"/>
+            </w:pPr>
+            <w:r>
+              <w:rPr>
+                <w:color w:val="203047"/>
+                <w:sz w:val="20"/>
+                <w:szCs w:val="20"/>
+              </w:rPr>
+              <w:t xml:space="preserve">Aiming for one problem a day, I reached a longest streak of 945 consecutive days on solved.ac. 1,659 problems solved, solved.ac Platinum IV. Solutions are recorded in a GitHub repository.</w:t>
+            </w:r>
+          </w:p>
+          <w:p>
+            <w:pPr>
+              <w:spacing w:after="80" w:before="0" w:line="300"/>
+            </w:pPr>
+            <w:hyperlink w:history="1" r:id="rIdf1ulembnyllolzqjoh2qc">
+              <w:r>
+                <w:rPr>
+                  <w:color w:val="315CBB"/>
+                  <w:sz w:val="20"/>
+                  <w:szCs w:val="20"/>
+                </w:rPr>
+                <w:t xml:space="preserve">Baekjoon solutions repository ↗</w:t>
+              </w:r>
+            </w:hyperlink>
           </w:p>
         </w:tc>
       </w:tr>

</xml_diff>

<commit_message>
Rebuild pages after the admin skills edit
Co-Authored-By: Claude Opus 5.5 (1M context) <noreply@anthropic.com>
</commit_message>
<xml_diff>
--- a/site/en/resume.docx
+++ b/site/en/resume.docx
@@ -102,7 +102,7 @@
             <w:pPr>
               <w:spacing w:after="80" w:before="80" w:line="300"/>
             </w:pPr>
-            <w:hyperlink w:history="1" r:id="rIdaxp7vfvcuow-h5pjqvh56">
+            <w:hyperlink w:history="1" r:id="rIdmopx3lp2xbgconrftnjv0">
               <w:r>
                 <w:rPr>
                   <w:color w:val="315CBB"/>
@@ -120,7 +120,7 @@
               </w:rPr>
               <w:t xml:space="preserve">   </w:t>
             </w:r>
-            <w:hyperlink w:history="1" r:id="rIdm2i1ligfkntjqueb7scfw">
+            <w:hyperlink w:history="1" r:id="rIdkyxblg9sxbtugh9kdlioh">
               <w:r>
                 <w:rPr>
                   <w:color w:val="315CBB"/>
@@ -138,7 +138,7 @@
               </w:rPr>
               <w:t xml:space="preserve">   </w:t>
             </w:r>
-            <w:hyperlink w:history="1" r:id="rIdzdrummi4ix0fuemelr8ih">
+            <w:hyperlink w:history="1" r:id="rId6ev-o0ewbrpgpd4bql7dk">
               <w:r>
                 <w:rPr>
                   <w:color w:val="315CBB"/>
@@ -156,7 +156,7 @@
               </w:rPr>
               <w:t xml:space="preserve">   </w:t>
             </w:r>
-            <w:hyperlink w:history="1" r:id="rIdfyglw8q03eunytdg6smr0">
+            <w:hyperlink w:history="1" r:id="rIdhwqqmfizl0sgdqdfzhn8l">
               <w:r>
                 <w:rPr>
                   <w:color w:val="315CBB"/>
@@ -404,7 +404,7 @@
       <w:pPr>
         <w:spacing w:after="80" w:before="80" w:line="300"/>
       </w:pPr>
-      <w:hyperlink w:history="1" r:id="rIdr2361dxzkxxqqus6_we6g">
+      <w:hyperlink w:history="1" r:id="rIdt8wsm09gdd5ihjrlog47i">
         <w:r>
           <w:rPr>
             <w:color w:val="315CBB"/>
@@ -422,7 +422,7 @@
         </w:rPr>
         <w:t xml:space="preserve">   </w:t>
       </w:r>
-      <w:hyperlink w:history="1" r:id="rIdtuo1b1hfwgvxzyx7mkt8w">
+      <w:hyperlink w:history="1" r:id="rIdzgwudqotmq2iodmeshles">
         <w:r>
           <w:rPr>
             <w:color w:val="315CBB"/>
@@ -1020,7 +1020,7 @@
       <w:pPr>
         <w:spacing w:after="80" w:before="80" w:line="300"/>
       </w:pPr>
-      <w:hyperlink w:history="1" r:id="rIdysl2sv3j0edf-myhkizwn">
+      <w:hyperlink w:history="1" r:id="rIdommvs6xpkmeto6pbzj4qc">
         <w:r>
           <w:rPr>
             <w:color w:val="315CBB"/>
@@ -1038,7 +1038,7 @@
         </w:rPr>
         <w:t xml:space="preserve">   </w:t>
       </w:r>
-      <w:hyperlink w:history="1" r:id="rIdkvyjaxulcpelkw0v643n6">
+      <w:hyperlink w:history="1" r:id="rIdee6fbimjskfhxen5pn981">
         <w:r>
           <w:rPr>
             <w:color w:val="315CBB"/>
@@ -1056,7 +1056,7 @@
         </w:rPr>
         <w:t xml:space="preserve">   </w:t>
       </w:r>
-      <w:hyperlink w:history="1" r:id="rIddmfue0zg5fp822hjp0aux">
+      <w:hyperlink w:history="1" r:id="rId3wbl1kimuvba1jgllfi7j">
         <w:r>
           <w:rPr>
             <w:color w:val="315CBB"/>
@@ -1074,7 +1074,7 @@
         </w:rPr>
         <w:t xml:space="preserve">   </w:t>
       </w:r>
-      <w:hyperlink w:history="1" r:id="rIdle_bedwi3rmqmcd747lwm">
+      <w:hyperlink w:history="1" r:id="rIdggdaps7986vhozxiqracw">
         <w:r>
           <w:rPr>
             <w:color w:val="315CBB"/>
@@ -1221,7 +1221,7 @@
       <w:pPr>
         <w:spacing w:after="80" w:before="0" w:line="300"/>
       </w:pPr>
-      <w:hyperlink w:history="1" r:id="rIdu9e54ernvxqqssihlauej">
+      <w:hyperlink w:history="1" r:id="rIdaa3n9ysi56ujerwqnlyzs">
         <w:r>
           <w:rPr>
             <w:color w:val="315CBB"/>
@@ -1544,7 +1544,7 @@
       <w:pPr>
         <w:spacing w:after="80" w:before="80" w:line="300"/>
       </w:pPr>
-      <w:hyperlink w:history="1" r:id="rIdbfliablrvt_k0pmqou9jl">
+      <w:hyperlink w:history="1" r:id="rIdvsrhkpndo9zxyirvnwhem">
         <w:r>
           <w:rPr>
             <w:color w:val="315CBB"/>
@@ -1562,7 +1562,7 @@
         </w:rPr>
         <w:t xml:space="preserve">   </w:t>
       </w:r>
-      <w:hyperlink w:history="1" r:id="rIde7-95artrcatzqxo8pddc">
+      <w:hyperlink w:history="1" r:id="rIdrvpittmtnj95-yx0aiqib">
         <w:r>
           <w:rPr>
             <w:color w:val="315CBB"/>
@@ -1685,7 +1685,7 @@
             <w:r>
               <w:br/>
             </w:r>
-            <w:hyperlink w:history="1" r:id="rIdwoy9-h1x20xsqruyqidzk">
+            <w:hyperlink w:history="1" r:id="rIdrl1abtrluqj8t-1fwojxx">
               <w:r>
                 <w:rPr>
                   <w:color w:val="315CBB"/>
@@ -1698,7 +1698,7 @@
             <w:r>
               <w:br/>
             </w:r>
-            <w:hyperlink w:history="1" r:id="rId_jsomptck45tjq3ceqrdt">
+            <w:hyperlink w:history="1" r:id="rIdwhvhbodarl7pfez2xllxz">
               <w:r>
                 <w:rPr>
                   <w:color w:val="315CBB"/>
@@ -1988,7 +1988,7 @@
             <w:pPr>
               <w:spacing w:after="80" w:before="80" w:line="300"/>
             </w:pPr>
-            <w:hyperlink w:history="1" r:id="rIdxs1ql7vcywplq7qgb5byg">
+            <w:hyperlink w:history="1" r:id="rIdg-des7j4flqylzujtu3se">
               <w:r>
                 <w:rPr>
                   <w:color w:val="315CBB"/>
@@ -2006,7 +2006,7 @@
               </w:rPr>
               <w:t xml:space="preserve">   </w:t>
             </w:r>
-            <w:hyperlink w:history="1" r:id="rId5_pciy9on6uqqnbeujwov">
+            <w:hyperlink w:history="1" r:id="rIdhuu8znyolxyqx53uuxtqw">
               <w:r>
                 <w:rPr>
                   <w:color w:val="315CBB"/>
@@ -2024,7 +2024,7 @@
               </w:rPr>
               <w:t xml:space="preserve">   </w:t>
             </w:r>
-            <w:hyperlink w:history="1" r:id="rIdh6ce49w6esxrpo4-sfx0x">
+            <w:hyperlink w:history="1" r:id="rIdgv9xfckqyy6hcbu8l8j1a">
               <w:r>
                 <w:rPr>
                   <w:color w:val="315CBB"/>
@@ -2492,7 +2492,7 @@
             <w:pPr>
               <w:spacing w:after="80" w:before="0" w:line="300"/>
             </w:pPr>
-            <w:hyperlink w:history="1" r:id="rIdf1ulembnyllolzqjoh2qc">
+            <w:hyperlink w:history="1" r:id="rIdscl3osl4qadx1akyilhm3">
               <w:r>
                 <w:rPr>
                   <w:color w:val="315CBB"/>

</xml_diff>

<commit_message>
Match the English skills to the Korean edit: drop Jev, BGE-M3 and BM25
Co-Authored-By: Claude Opus 5.5 (1M context) <noreply@anthropic.com>
</commit_message>
<xml_diff>
--- a/site/en/resume.docx
+++ b/site/en/resume.docx
@@ -102,7 +102,7 @@
             <w:pPr>
               <w:spacing w:after="80" w:before="80" w:line="300"/>
             </w:pPr>
-            <w:hyperlink w:history="1" r:id="rIdmopx3lp2xbgconrftnjv0">
+            <w:hyperlink w:history="1" r:id="rIdyv_p3ucnjwkam66dej8ey">
               <w:r>
                 <w:rPr>
                   <w:color w:val="315CBB"/>
@@ -120,7 +120,7 @@
               </w:rPr>
               <w:t xml:space="preserve">   </w:t>
             </w:r>
-            <w:hyperlink w:history="1" r:id="rIdkyxblg9sxbtugh9kdlioh">
+            <w:hyperlink w:history="1" r:id="rIdywg1tlzkqzyas4atiz7vp">
               <w:r>
                 <w:rPr>
                   <w:color w:val="315CBB"/>
@@ -138,7 +138,7 @@
               </w:rPr>
               <w:t xml:space="preserve">   </w:t>
             </w:r>
-            <w:hyperlink w:history="1" r:id="rId6ev-o0ewbrpgpd4bql7dk">
+            <w:hyperlink w:history="1" r:id="rIdr61h15rfbfo8s32jccq0t">
               <w:r>
                 <w:rPr>
                   <w:color w:val="315CBB"/>
@@ -156,7 +156,7 @@
               </w:rPr>
               <w:t xml:space="preserve">   </w:t>
             </w:r>
-            <w:hyperlink w:history="1" r:id="rIdhwqqmfizl0sgdqdfzhn8l">
+            <w:hyperlink w:history="1" r:id="rId0atozlpdqbxpe-ddwqgfk">
               <w:r>
                 <w:rPr>
                   <w:color w:val="315CBB"/>
@@ -404,7 +404,7 @@
       <w:pPr>
         <w:spacing w:after="80" w:before="80" w:line="300"/>
       </w:pPr>
-      <w:hyperlink w:history="1" r:id="rIdt8wsm09gdd5ihjrlog47i">
+      <w:hyperlink w:history="1" r:id="rIdwy8gmf8qyi2ylcio_7qof">
         <w:r>
           <w:rPr>
             <w:color w:val="315CBB"/>
@@ -422,7 +422,7 @@
         </w:rPr>
         <w:t xml:space="preserve">   </w:t>
       </w:r>
-      <w:hyperlink w:history="1" r:id="rIdzgwudqotmq2iodmeshles">
+      <w:hyperlink w:history="1" r:id="rIdftzlfh3q55hka1ud0tdfm">
         <w:r>
           <w:rPr>
             <w:color w:val="315CBB"/>
@@ -1020,7 +1020,7 @@
       <w:pPr>
         <w:spacing w:after="80" w:before="80" w:line="300"/>
       </w:pPr>
-      <w:hyperlink w:history="1" r:id="rIdommvs6xpkmeto6pbzj4qc">
+      <w:hyperlink w:history="1" r:id="rIdljszp0wsm32bj_qhca3bn">
         <w:r>
           <w:rPr>
             <w:color w:val="315CBB"/>
@@ -1038,7 +1038,7 @@
         </w:rPr>
         <w:t xml:space="preserve">   </w:t>
       </w:r>
-      <w:hyperlink w:history="1" r:id="rIdee6fbimjskfhxen5pn981">
+      <w:hyperlink w:history="1" r:id="rId7s15sejjnxzzef6yfohna">
         <w:r>
           <w:rPr>
             <w:color w:val="315CBB"/>
@@ -1056,7 +1056,7 @@
         </w:rPr>
         <w:t xml:space="preserve">   </w:t>
       </w:r>
-      <w:hyperlink w:history="1" r:id="rId3wbl1kimuvba1jgllfi7j">
+      <w:hyperlink w:history="1" r:id="rIdvpvhmxgahj7asnelxcm8a">
         <w:r>
           <w:rPr>
             <w:color w:val="315CBB"/>
@@ -1074,7 +1074,7 @@
         </w:rPr>
         <w:t xml:space="preserve">   </w:t>
       </w:r>
-      <w:hyperlink w:history="1" r:id="rIdggdaps7986vhozxiqracw">
+      <w:hyperlink w:history="1" r:id="rId2ohly10kj982y304ohrp2">
         <w:r>
           <w:rPr>
             <w:color w:val="315CBB"/>
@@ -1221,7 +1221,7 @@
       <w:pPr>
         <w:spacing w:after="80" w:before="0" w:line="300"/>
       </w:pPr>
-      <w:hyperlink w:history="1" r:id="rIdaa3n9ysi56ujerwqnlyzs">
+      <w:hyperlink w:history="1" r:id="rIddigmpunutohxscxxbmail">
         <w:r>
           <w:rPr>
             <w:color w:val="315CBB"/>
@@ -1544,7 +1544,7 @@
       <w:pPr>
         <w:spacing w:after="80" w:before="80" w:line="300"/>
       </w:pPr>
-      <w:hyperlink w:history="1" r:id="rIdvsrhkpndo9zxyirvnwhem">
+      <w:hyperlink w:history="1" r:id="rIdm8rbf5s7bb5urmjoo1u00">
         <w:r>
           <w:rPr>
             <w:color w:val="315CBB"/>
@@ -1562,7 +1562,7 @@
         </w:rPr>
         <w:t xml:space="preserve">   </w:t>
       </w:r>
-      <w:hyperlink w:history="1" r:id="rIdrvpittmtnj95-yx0aiqib">
+      <w:hyperlink w:history="1" r:id="rIdwjfp4ge7vl2mhimeqciqg">
         <w:r>
           <w:rPr>
             <w:color w:val="315CBB"/>
@@ -1685,7 +1685,7 @@
             <w:r>
               <w:br/>
             </w:r>
-            <w:hyperlink w:history="1" r:id="rIdrl1abtrluqj8t-1fwojxx">
+            <w:hyperlink w:history="1" r:id="rIdari3rp_s9w1f941jtvvbi">
               <w:r>
                 <w:rPr>
                   <w:color w:val="315CBB"/>
@@ -1698,7 +1698,7 @@
             <w:r>
               <w:br/>
             </w:r>
-            <w:hyperlink w:history="1" r:id="rIdwhvhbodarl7pfez2xllxz">
+            <w:hyperlink w:history="1" r:id="rId2-y1rcfxmo4bss-equnry">
               <w:r>
                 <w:rPr>
                   <w:color w:val="315CBB"/>
@@ -1779,7 +1779,7 @@
                 <w:sz w:val="20"/>
                 <w:szCs w:val="20"/>
               </w:rPr>
-              <w:t xml:space="preserve">LangChain · LangGraph · RAG · LLM Evaluation · Jev</w:t>
+              <w:t xml:space="preserve">LangChain · LangGraph · RAG · LLM Evaluation</w:t>
             </w:r>
             <w:r>
               <w:br/>
@@ -1790,7 +1790,7 @@
                 <w:sz w:val="20"/>
                 <w:szCs w:val="20"/>
               </w:rPr>
-              <w:t xml:space="preserve">Elasticsearch · Weaviate · BGE-M3 · BM25</w:t>
+              <w:t xml:space="preserve">Elasticsearch · Weaviate</w:t>
             </w:r>
           </w:p>
         </w:tc>
@@ -1988,7 +1988,7 @@
             <w:pPr>
               <w:spacing w:after="80" w:before="80" w:line="300"/>
             </w:pPr>
-            <w:hyperlink w:history="1" r:id="rIdg-des7j4flqylzujtu3se">
+            <w:hyperlink w:history="1" r:id="rIddof5pitxaqbbhylmu0kco">
               <w:r>
                 <w:rPr>
                   <w:color w:val="315CBB"/>
@@ -2006,7 +2006,7 @@
               </w:rPr>
               <w:t xml:space="preserve">   </w:t>
             </w:r>
-            <w:hyperlink w:history="1" r:id="rIdhuu8znyolxyqx53uuxtqw">
+            <w:hyperlink w:history="1" r:id="rId3owp1tzepvjhpb7jkiuv1">
               <w:r>
                 <w:rPr>
                   <w:color w:val="315CBB"/>
@@ -2024,7 +2024,7 @@
               </w:rPr>
               <w:t xml:space="preserve">   </w:t>
             </w:r>
-            <w:hyperlink w:history="1" r:id="rIdgv9xfckqyy6hcbu8l8j1a">
+            <w:hyperlink w:history="1" r:id="rIdcw-mffav6jlwcjzo6rvms">
               <w:r>
                 <w:rPr>
                   <w:color w:val="315CBB"/>
@@ -2492,7 +2492,7 @@
             <w:pPr>
               <w:spacing w:after="80" w:before="0" w:line="300"/>
             </w:pPr>
-            <w:hyperlink w:history="1" r:id="rIdscl3osl4qadx1akyilhm3">
+            <w:hyperlink w:history="1" r:id="rIdtymazd9jvniyy6ibfrilt">
               <w:r>
                 <w:rPr>
                   <w:color w:val="315CBB"/>

</xml_diff>

<commit_message>
Link the sections after the cases from the portfolio index; drop the reading guide
Index links also re-settle on their target after scrolling, since diagrams
and lazy images can grow the page mid-scroll and leave the view short.

Co-Authored-By: Claude Opus 5.5 (1M context) <noreply@anthropic.com>
</commit_message>
<xml_diff>
--- a/site/en/resume.docx
+++ b/site/en/resume.docx
@@ -102,7 +102,7 @@
             <w:pPr>
               <w:spacing w:after="80" w:before="80" w:line="300"/>
             </w:pPr>
-            <w:hyperlink w:history="1" r:id="rIdyv_p3ucnjwkam66dej8ey">
+            <w:hyperlink w:history="1" r:id="rIdfo7p3slfzp4uhnwfhcbqf">
               <w:r>
                 <w:rPr>
                   <w:color w:val="315CBB"/>
@@ -120,7 +120,7 @@
               </w:rPr>
               <w:t xml:space="preserve">   </w:t>
             </w:r>
-            <w:hyperlink w:history="1" r:id="rIdywg1tlzkqzyas4atiz7vp">
+            <w:hyperlink w:history="1" r:id="rIdbszeltsjiy3p17ac5imix">
               <w:r>
                 <w:rPr>
                   <w:color w:val="315CBB"/>
@@ -138,7 +138,7 @@
               </w:rPr>
               <w:t xml:space="preserve">   </w:t>
             </w:r>
-            <w:hyperlink w:history="1" r:id="rIdr61h15rfbfo8s32jccq0t">
+            <w:hyperlink w:history="1" r:id="rIdb4auc3wyhgt40xgh6ed6y">
               <w:r>
                 <w:rPr>
                   <w:color w:val="315CBB"/>
@@ -156,7 +156,7 @@
               </w:rPr>
               <w:t xml:space="preserve">   </w:t>
             </w:r>
-            <w:hyperlink w:history="1" r:id="rId0atozlpdqbxpe-ddwqgfk">
+            <w:hyperlink w:history="1" r:id="rIdycs4qnimsjkzijmi5zbh7">
               <w:r>
                 <w:rPr>
                   <w:color w:val="315CBB"/>
@@ -404,7 +404,7 @@
       <w:pPr>
         <w:spacing w:after="80" w:before="80" w:line="300"/>
       </w:pPr>
-      <w:hyperlink w:history="1" r:id="rIdwy8gmf8qyi2ylcio_7qof">
+      <w:hyperlink w:history="1" r:id="rIdapuafxkupoyv2lhxiqjta">
         <w:r>
           <w:rPr>
             <w:color w:val="315CBB"/>
@@ -422,7 +422,7 @@
         </w:rPr>
         <w:t xml:space="preserve">   </w:t>
       </w:r>
-      <w:hyperlink w:history="1" r:id="rIdftzlfh3q55hka1ud0tdfm">
+      <w:hyperlink w:history="1" r:id="rIdicymioakwnmtckaunz1wl">
         <w:r>
           <w:rPr>
             <w:color w:val="315CBB"/>
@@ -1020,7 +1020,7 @@
       <w:pPr>
         <w:spacing w:after="80" w:before="80" w:line="300"/>
       </w:pPr>
-      <w:hyperlink w:history="1" r:id="rIdljszp0wsm32bj_qhca3bn">
+      <w:hyperlink w:history="1" r:id="rIdgxwdug7dungontxu-_b_g">
         <w:r>
           <w:rPr>
             <w:color w:val="315CBB"/>
@@ -1038,7 +1038,7 @@
         </w:rPr>
         <w:t xml:space="preserve">   </w:t>
       </w:r>
-      <w:hyperlink w:history="1" r:id="rId7s15sejjnxzzef6yfohna">
+      <w:hyperlink w:history="1" r:id="rIdyyrx4ztnj_envsdczbtvq">
         <w:r>
           <w:rPr>
             <w:color w:val="315CBB"/>
@@ -1056,7 +1056,7 @@
         </w:rPr>
         <w:t xml:space="preserve">   </w:t>
       </w:r>
-      <w:hyperlink w:history="1" r:id="rIdvpvhmxgahj7asnelxcm8a">
+      <w:hyperlink w:history="1" r:id="rId6j_o_tgc4f_bodc94uqkq">
         <w:r>
           <w:rPr>
             <w:color w:val="315CBB"/>
@@ -1074,7 +1074,7 @@
         </w:rPr>
         <w:t xml:space="preserve">   </w:t>
       </w:r>
-      <w:hyperlink w:history="1" r:id="rId2ohly10kj982y304ohrp2">
+      <w:hyperlink w:history="1" r:id="rIdy3yktri_xjiswfsq9i9vd">
         <w:r>
           <w:rPr>
             <w:color w:val="315CBB"/>
@@ -1221,7 +1221,7 @@
       <w:pPr>
         <w:spacing w:after="80" w:before="0" w:line="300"/>
       </w:pPr>
-      <w:hyperlink w:history="1" r:id="rIddigmpunutohxscxxbmail">
+      <w:hyperlink w:history="1" r:id="rIdjulrjz8rss6ysridfb2bi">
         <w:r>
           <w:rPr>
             <w:color w:val="315CBB"/>
@@ -1544,7 +1544,7 @@
       <w:pPr>
         <w:spacing w:after="80" w:before="80" w:line="300"/>
       </w:pPr>
-      <w:hyperlink w:history="1" r:id="rIdm8rbf5s7bb5urmjoo1u00">
+      <w:hyperlink w:history="1" r:id="rId0o3zxajhzdfe_xf7hvvpp">
         <w:r>
           <w:rPr>
             <w:color w:val="315CBB"/>
@@ -1562,7 +1562,7 @@
         </w:rPr>
         <w:t xml:space="preserve">   </w:t>
       </w:r>
-      <w:hyperlink w:history="1" r:id="rIdwjfp4ge7vl2mhimeqciqg">
+      <w:hyperlink w:history="1" r:id="rIdi7hprrupwrokvvqnoxypi">
         <w:r>
           <w:rPr>
             <w:color w:val="315CBB"/>
@@ -1685,7 +1685,7 @@
             <w:r>
               <w:br/>
             </w:r>
-            <w:hyperlink w:history="1" r:id="rIdari3rp_s9w1f941jtvvbi">
+            <w:hyperlink w:history="1" r:id="rIdqsz0tvhwixn_mzvijpndu">
               <w:r>
                 <w:rPr>
                   <w:color w:val="315CBB"/>
@@ -1698,7 +1698,7 @@
             <w:r>
               <w:br/>
             </w:r>
-            <w:hyperlink w:history="1" r:id="rId2-y1rcfxmo4bss-equnry">
+            <w:hyperlink w:history="1" r:id="rIdoj-o0zlgujryycz1brzim">
               <w:r>
                 <w:rPr>
                   <w:color w:val="315CBB"/>
@@ -1988,7 +1988,7 @@
             <w:pPr>
               <w:spacing w:after="80" w:before="80" w:line="300"/>
             </w:pPr>
-            <w:hyperlink w:history="1" r:id="rIddof5pitxaqbbhylmu0kco">
+            <w:hyperlink w:history="1" r:id="rIdlanylzm7m0_9ozy3gfrbe">
               <w:r>
                 <w:rPr>
                   <w:color w:val="315CBB"/>
@@ -2006,7 +2006,7 @@
               </w:rPr>
               <w:t xml:space="preserve">   </w:t>
             </w:r>
-            <w:hyperlink w:history="1" r:id="rId3owp1tzepvjhpb7jkiuv1">
+            <w:hyperlink w:history="1" r:id="rIdqr3oiz8rxgocoygw6uyln">
               <w:r>
                 <w:rPr>
                   <w:color w:val="315CBB"/>
@@ -2024,7 +2024,7 @@
               </w:rPr>
               <w:t xml:space="preserve">   </w:t>
             </w:r>
-            <w:hyperlink w:history="1" r:id="rIdcw-mffav6jlwcjzo6rvms">
+            <w:hyperlink w:history="1" r:id="rIdwzv2zjfdusj_um0mutkb0">
               <w:r>
                 <w:rPr>
                   <w:color w:val="315CBB"/>
@@ -2492,7 +2492,7 @@
             <w:pPr>
               <w:spacing w:after="80" w:before="0" w:line="300"/>
             </w:pPr>
-            <w:hyperlink w:history="1" r:id="rIdtymazd9jvniyy6ibfrilt">
+            <w:hyperlink w:history="1" r:id="rIdzaw1frujj0sdcconr6jn5">
               <w:r>
                 <w:rPr>
                   <w:color w:val="315CBB"/>

</xml_diff>

<commit_message>
Show education and certification on the home page
The home page took only the activities and awards sections from the resume,
leaving education out since the page was introduced.

Co-Authored-By: Claude Opus 5.5 (1M context) <noreply@anthropic.com>
</commit_message>
<xml_diff>
--- a/site/en/resume.docx
+++ b/site/en/resume.docx
@@ -102,7 +102,7 @@
             <w:pPr>
               <w:spacing w:after="80" w:before="80" w:line="300"/>
             </w:pPr>
-            <w:hyperlink w:history="1" r:id="rIdfo7p3slfzp4uhnwfhcbqf">
+            <w:hyperlink w:history="1" r:id="rIdfiz7t2qe9c89tyruihgk1">
               <w:r>
                 <w:rPr>
                   <w:color w:val="315CBB"/>
@@ -120,7 +120,7 @@
               </w:rPr>
               <w:t xml:space="preserve">   </w:t>
             </w:r>
-            <w:hyperlink w:history="1" r:id="rIdbszeltsjiy3p17ac5imix">
+            <w:hyperlink w:history="1" r:id="rIdmaq7mnddipy-zj3cpc5cp">
               <w:r>
                 <w:rPr>
                   <w:color w:val="315CBB"/>
@@ -138,7 +138,7 @@
               </w:rPr>
               <w:t xml:space="preserve">   </w:t>
             </w:r>
-            <w:hyperlink w:history="1" r:id="rIdb4auc3wyhgt40xgh6ed6y">
+            <w:hyperlink w:history="1" r:id="rIdfkptsjzjp9-oie4h8ordg">
               <w:r>
                 <w:rPr>
                   <w:color w:val="315CBB"/>
@@ -156,7 +156,7 @@
               </w:rPr>
               <w:t xml:space="preserve">   </w:t>
             </w:r>
-            <w:hyperlink w:history="1" r:id="rIdycs4qnimsjkzijmi5zbh7">
+            <w:hyperlink w:history="1" r:id="rIdkog3reu2w69yl6kme5goq">
               <w:r>
                 <w:rPr>
                   <w:color w:val="315CBB"/>
@@ -404,7 +404,7 @@
       <w:pPr>
         <w:spacing w:after="80" w:before="80" w:line="300"/>
       </w:pPr>
-      <w:hyperlink w:history="1" r:id="rIdapuafxkupoyv2lhxiqjta">
+      <w:hyperlink w:history="1" r:id="rIdg0bofcig1xif4rbuu44q_">
         <w:r>
           <w:rPr>
             <w:color w:val="315CBB"/>
@@ -422,7 +422,7 @@
         </w:rPr>
         <w:t xml:space="preserve">   </w:t>
       </w:r>
-      <w:hyperlink w:history="1" r:id="rIdicymioakwnmtckaunz1wl">
+      <w:hyperlink w:history="1" r:id="rId3u47hbh9apuxgmrvembbf">
         <w:r>
           <w:rPr>
             <w:color w:val="315CBB"/>
@@ -1020,7 +1020,7 @@
       <w:pPr>
         <w:spacing w:after="80" w:before="80" w:line="300"/>
       </w:pPr>
-      <w:hyperlink w:history="1" r:id="rIdgxwdug7dungontxu-_b_g">
+      <w:hyperlink w:history="1" r:id="rIdk-1_f9lajctgeo8kvgtfx">
         <w:r>
           <w:rPr>
             <w:color w:val="315CBB"/>
@@ -1038,7 +1038,7 @@
         </w:rPr>
         <w:t xml:space="preserve">   </w:t>
       </w:r>
-      <w:hyperlink w:history="1" r:id="rIdyyrx4ztnj_envsdczbtvq">
+      <w:hyperlink w:history="1" r:id="rId6fflqcrl0vbniz4oq1zbk">
         <w:r>
           <w:rPr>
             <w:color w:val="315CBB"/>
@@ -1056,7 +1056,7 @@
         </w:rPr>
         <w:t xml:space="preserve">   </w:t>
       </w:r>
-      <w:hyperlink w:history="1" r:id="rId6j_o_tgc4f_bodc94uqkq">
+      <w:hyperlink w:history="1" r:id="rIde8edcmc9z_5swhqp9zczs">
         <w:r>
           <w:rPr>
             <w:color w:val="315CBB"/>
@@ -1074,7 +1074,7 @@
         </w:rPr>
         <w:t xml:space="preserve">   </w:t>
       </w:r>
-      <w:hyperlink w:history="1" r:id="rIdy3yktri_xjiswfsq9i9vd">
+      <w:hyperlink w:history="1" r:id="rIdol6xuqd-4p8qs9tx7t_fa">
         <w:r>
           <w:rPr>
             <w:color w:val="315CBB"/>
@@ -1221,7 +1221,7 @@
       <w:pPr>
         <w:spacing w:after="80" w:before="0" w:line="300"/>
       </w:pPr>
-      <w:hyperlink w:history="1" r:id="rIdjulrjz8rss6ysridfb2bi">
+      <w:hyperlink w:history="1" r:id="rIdm2n05d9ybhrxacxgqekjp">
         <w:r>
           <w:rPr>
             <w:color w:val="315CBB"/>
@@ -1544,7 +1544,7 @@
       <w:pPr>
         <w:spacing w:after="80" w:before="80" w:line="300"/>
       </w:pPr>
-      <w:hyperlink w:history="1" r:id="rId0o3zxajhzdfe_xf7hvvpp">
+      <w:hyperlink w:history="1" r:id="rId-6ogjhvjvdt3xjk5qazb9">
         <w:r>
           <w:rPr>
             <w:color w:val="315CBB"/>
@@ -1562,7 +1562,7 @@
         </w:rPr>
         <w:t xml:space="preserve">   </w:t>
       </w:r>
-      <w:hyperlink w:history="1" r:id="rIdi7hprrupwrokvvqnoxypi">
+      <w:hyperlink w:history="1" r:id="rIdmmgzp-vblqkh-bbwbujwv">
         <w:r>
           <w:rPr>
             <w:color w:val="315CBB"/>
@@ -1685,7 +1685,7 @@
             <w:r>
               <w:br/>
             </w:r>
-            <w:hyperlink w:history="1" r:id="rIdqsz0tvhwixn_mzvijpndu">
+            <w:hyperlink w:history="1" r:id="rIdwddvzb296febiqnnawlwn">
               <w:r>
                 <w:rPr>
                   <w:color w:val="315CBB"/>
@@ -1698,7 +1698,7 @@
             <w:r>
               <w:br/>
             </w:r>
-            <w:hyperlink w:history="1" r:id="rIdoj-o0zlgujryycz1brzim">
+            <w:hyperlink w:history="1" r:id="rIdhc8hvcs6k3eo3qsw8h_hn">
               <w:r>
                 <w:rPr>
                   <w:color w:val="315CBB"/>
@@ -1988,7 +1988,7 @@
             <w:pPr>
               <w:spacing w:after="80" w:before="80" w:line="300"/>
             </w:pPr>
-            <w:hyperlink w:history="1" r:id="rIdlanylzm7m0_9ozy3gfrbe">
+            <w:hyperlink w:history="1" r:id="rIdjve-zablznv7rothet4xv">
               <w:r>
                 <w:rPr>
                   <w:color w:val="315CBB"/>
@@ -2006,7 +2006,7 @@
               </w:rPr>
               <w:t xml:space="preserve">   </w:t>
             </w:r>
-            <w:hyperlink w:history="1" r:id="rIdqr3oiz8rxgocoygw6uyln">
+            <w:hyperlink w:history="1" r:id="rIdipy8xbcx-zhcd53itehbt">
               <w:r>
                 <w:rPr>
                   <w:color w:val="315CBB"/>
@@ -2024,7 +2024,7 @@
               </w:rPr>
               <w:t xml:space="preserve">   </w:t>
             </w:r>
-            <w:hyperlink w:history="1" r:id="rIdwzv2zjfdusj_um0mutkb0">
+            <w:hyperlink w:history="1" r:id="rIdwk9qn1cae3m3bmjsranlq">
               <w:r>
                 <w:rPr>
                   <w:color w:val="315CBB"/>
@@ -2492,7 +2492,7 @@
             <w:pPr>
               <w:spacing w:after="80" w:before="0" w:line="300"/>
             </w:pPr>
-            <w:hyperlink w:history="1" r:id="rIdzaw1frujj0sdcconr6jn5">
+            <w:hyperlink w:history="1" r:id="rIdvr_kxbpbmplwekd96ha8j">
               <w:r>
                 <w:rPr>
                   <w:color w:val="315CBB"/>

</xml_diff>

<commit_message>
Tighten the portfolio deck from 41 to 33 slides
- One project slide holds the story, team and my main work
- Screens sit two by two; tall diagrams keep a slide of their own
- Each case shows its flow diagram beside the results
- Drop the redundant my-role line, which the team list already states

Co-Authored-By: Claude Opus 5.5 (1M context) <noreply@anthropic.com>
</commit_message>
<xml_diff>
--- a/site/en/resume.docx
+++ b/site/en/resume.docx
@@ -102,7 +102,7 @@
             <w:pPr>
               <w:spacing w:after="80" w:before="80" w:line="300"/>
             </w:pPr>
-            <w:hyperlink w:history="1" r:id="rIdfiz7t2qe9c89tyruihgk1">
+            <w:hyperlink w:history="1" r:id="rId9lhykntvrjcdvkaol41x9">
               <w:r>
                 <w:rPr>
                   <w:color w:val="315CBB"/>
@@ -120,7 +120,7 @@
               </w:rPr>
               <w:t xml:space="preserve">   </w:t>
             </w:r>
-            <w:hyperlink w:history="1" r:id="rIdmaq7mnddipy-zj3cpc5cp">
+            <w:hyperlink w:history="1" r:id="rId5wsyyzqmyd6gy5ttxfzzk">
               <w:r>
                 <w:rPr>
                   <w:color w:val="315CBB"/>
@@ -138,7 +138,7 @@
               </w:rPr>
               <w:t xml:space="preserve">   </w:t>
             </w:r>
-            <w:hyperlink w:history="1" r:id="rIdfkptsjzjp9-oie4h8ordg">
+            <w:hyperlink w:history="1" r:id="rId4hrdrhw3dgeas1-eprwbs">
               <w:r>
                 <w:rPr>
                   <w:color w:val="315CBB"/>
@@ -156,7 +156,7 @@
               </w:rPr>
               <w:t xml:space="preserve">   </w:t>
             </w:r>
-            <w:hyperlink w:history="1" r:id="rIdkog3reu2w69yl6kme5goq">
+            <w:hyperlink w:history="1" r:id="rId-goxbawdrlat6puqfllth">
               <w:r>
                 <w:rPr>
                   <w:color w:val="315CBB"/>
@@ -404,7 +404,7 @@
       <w:pPr>
         <w:spacing w:after="80" w:before="80" w:line="300"/>
       </w:pPr>
-      <w:hyperlink w:history="1" r:id="rIdg0bofcig1xif4rbuu44q_">
+      <w:hyperlink w:history="1" r:id="rIdn_kktpuda2l2oemkdtgze">
         <w:r>
           <w:rPr>
             <w:color w:val="315CBB"/>
@@ -422,7 +422,7 @@
         </w:rPr>
         <w:t xml:space="preserve">   </w:t>
       </w:r>
-      <w:hyperlink w:history="1" r:id="rId3u47hbh9apuxgmrvembbf">
+      <w:hyperlink w:history="1" r:id="rIdzbbtanvk_4g5jvpumvakl">
         <w:r>
           <w:rPr>
             <w:color w:val="315CBB"/>
@@ -1020,7 +1020,7 @@
       <w:pPr>
         <w:spacing w:after="80" w:before="80" w:line="300"/>
       </w:pPr>
-      <w:hyperlink w:history="1" r:id="rIdk-1_f9lajctgeo8kvgtfx">
+      <w:hyperlink w:history="1" r:id="rIdysffdhmgyuoghsc58nxx-">
         <w:r>
           <w:rPr>
             <w:color w:val="315CBB"/>
@@ -1038,7 +1038,7 @@
         </w:rPr>
         <w:t xml:space="preserve">   </w:t>
       </w:r>
-      <w:hyperlink w:history="1" r:id="rId6fflqcrl0vbniz4oq1zbk">
+      <w:hyperlink w:history="1" r:id="rIdprbwlchqar3ohrt_y7d4l">
         <w:r>
           <w:rPr>
             <w:color w:val="315CBB"/>
@@ -1056,7 +1056,7 @@
         </w:rPr>
         <w:t xml:space="preserve">   </w:t>
       </w:r>
-      <w:hyperlink w:history="1" r:id="rIde8edcmc9z_5swhqp9zczs">
+      <w:hyperlink w:history="1" r:id="rIdiahpglzm7aukrlbuy-03l">
         <w:r>
           <w:rPr>
             <w:color w:val="315CBB"/>
@@ -1074,7 +1074,7 @@
         </w:rPr>
         <w:t xml:space="preserve">   </w:t>
       </w:r>
-      <w:hyperlink w:history="1" r:id="rIdol6xuqd-4p8qs9tx7t_fa">
+      <w:hyperlink w:history="1" r:id="rIdo4xjqxmlc57_fnzetgpgx">
         <w:r>
           <w:rPr>
             <w:color w:val="315CBB"/>
@@ -1221,7 +1221,7 @@
       <w:pPr>
         <w:spacing w:after="80" w:before="0" w:line="300"/>
       </w:pPr>
-      <w:hyperlink w:history="1" r:id="rIdm2n05d9ybhrxacxgqekjp">
+      <w:hyperlink w:history="1" r:id="rId3amjq3yifmgaanm7wtsv_">
         <w:r>
           <w:rPr>
             <w:color w:val="315CBB"/>
@@ -1544,7 +1544,7 @@
       <w:pPr>
         <w:spacing w:after="80" w:before="80" w:line="300"/>
       </w:pPr>
-      <w:hyperlink w:history="1" r:id="rId-6ogjhvjvdt3xjk5qazb9">
+      <w:hyperlink w:history="1" r:id="rIdhupygxeaqmlajeicchsqs">
         <w:r>
           <w:rPr>
             <w:color w:val="315CBB"/>
@@ -1562,7 +1562,7 @@
         </w:rPr>
         <w:t xml:space="preserve">   </w:t>
       </w:r>
-      <w:hyperlink w:history="1" r:id="rIdmmgzp-vblqkh-bbwbujwv">
+      <w:hyperlink w:history="1" r:id="rIdyyknodaovbmk07smqkwxu">
         <w:r>
           <w:rPr>
             <w:color w:val="315CBB"/>
@@ -1685,7 +1685,7 @@
             <w:r>
               <w:br/>
             </w:r>
-            <w:hyperlink w:history="1" r:id="rIdwddvzb296febiqnnawlwn">
+            <w:hyperlink w:history="1" r:id="rIdxvj-sow_c8kspgr7pqd2n">
               <w:r>
                 <w:rPr>
                   <w:color w:val="315CBB"/>
@@ -1698,7 +1698,7 @@
             <w:r>
               <w:br/>
             </w:r>
-            <w:hyperlink w:history="1" r:id="rIdhc8hvcs6k3eo3qsw8h_hn">
+            <w:hyperlink w:history="1" r:id="rIdbetudog6-rxl_5t0-o55c">
               <w:r>
                 <w:rPr>
                   <w:color w:val="315CBB"/>
@@ -1988,7 +1988,7 @@
             <w:pPr>
               <w:spacing w:after="80" w:before="80" w:line="300"/>
             </w:pPr>
-            <w:hyperlink w:history="1" r:id="rIdjve-zablznv7rothet4xv">
+            <w:hyperlink w:history="1" r:id="rIdtlkuiv9h2e402a7vhy63a">
               <w:r>
                 <w:rPr>
                   <w:color w:val="315CBB"/>
@@ -2006,7 +2006,7 @@
               </w:rPr>
               <w:t xml:space="preserve">   </w:t>
             </w:r>
-            <w:hyperlink w:history="1" r:id="rIdipy8xbcx-zhcd53itehbt">
+            <w:hyperlink w:history="1" r:id="rIdpltptrczmmlctrligwep5">
               <w:r>
                 <w:rPr>
                   <w:color w:val="315CBB"/>
@@ -2024,7 +2024,7 @@
               </w:rPr>
               <w:t xml:space="preserve">   </w:t>
             </w:r>
-            <w:hyperlink w:history="1" r:id="rIdwk9qn1cae3m3bmjsranlq">
+            <w:hyperlink w:history="1" r:id="rIdgxs--ogottbat_wfbksgh">
               <w:r>
                 <w:rPr>
                   <w:color w:val="315CBB"/>
@@ -2492,7 +2492,7 @@
             <w:pPr>
               <w:spacing w:after="80" w:before="0" w:line="300"/>
             </w:pPr>
-            <w:hyperlink w:history="1" r:id="rIdvr_kxbpbmplwekd96ha8j">
+            <w:hyperlink w:history="1" r:id="rIdgo3iyga-roj5zmujqg1jc">
               <w:r>
                 <w:rPr>
                   <w:color w:val="315CBB"/>

</xml_diff>

<commit_message>
Show the service roles image wide under the two Fruition screens
Co-Authored-By: Claude Opus 5.5 (1M context) <noreply@anthropic.com>
</commit_message>
<xml_diff>
--- a/site/en/resume.docx
+++ b/site/en/resume.docx
@@ -102,7 +102,7 @@
             <w:pPr>
               <w:spacing w:after="80" w:before="80" w:line="300"/>
             </w:pPr>
-            <w:hyperlink w:history="1" r:id="rId9lhykntvrjcdvkaol41x9">
+            <w:hyperlink w:history="1" r:id="rIdctgylepfjul5sipghpewz">
               <w:r>
                 <w:rPr>
                   <w:color w:val="315CBB"/>
@@ -120,7 +120,7 @@
               </w:rPr>
               <w:t xml:space="preserve">   </w:t>
             </w:r>
-            <w:hyperlink w:history="1" r:id="rId5wsyyzqmyd6gy5ttxfzzk">
+            <w:hyperlink w:history="1" r:id="rIdq8kwe77oobpddacujrdxi">
               <w:r>
                 <w:rPr>
                   <w:color w:val="315CBB"/>
@@ -138,7 +138,7 @@
               </w:rPr>
               <w:t xml:space="preserve">   </w:t>
             </w:r>
-            <w:hyperlink w:history="1" r:id="rId4hrdrhw3dgeas1-eprwbs">
+            <w:hyperlink w:history="1" r:id="rIddd2p9kbmvjwwvtefdh_tw">
               <w:r>
                 <w:rPr>
                   <w:color w:val="315CBB"/>
@@ -156,7 +156,7 @@
               </w:rPr>
               <w:t xml:space="preserve">   </w:t>
             </w:r>
-            <w:hyperlink w:history="1" r:id="rId-goxbawdrlat6puqfllth">
+            <w:hyperlink w:history="1" r:id="rIdk_wq8uydariqul2wffh-_">
               <w:r>
                 <w:rPr>
                   <w:color w:val="315CBB"/>
@@ -404,7 +404,7 @@
       <w:pPr>
         <w:spacing w:after="80" w:before="80" w:line="300"/>
       </w:pPr>
-      <w:hyperlink w:history="1" r:id="rIdn_kktpuda2l2oemkdtgze">
+      <w:hyperlink w:history="1" r:id="rId6renuzi8wwsixuldcr42p">
         <w:r>
           <w:rPr>
             <w:color w:val="315CBB"/>
@@ -422,7 +422,7 @@
         </w:rPr>
         <w:t xml:space="preserve">   </w:t>
       </w:r>
-      <w:hyperlink w:history="1" r:id="rIdzbbtanvk_4g5jvpumvakl">
+      <w:hyperlink w:history="1" r:id="rIdyr3bgn_wgq4x6tse3dv6f">
         <w:r>
           <w:rPr>
             <w:color w:val="315CBB"/>
@@ -1020,7 +1020,7 @@
       <w:pPr>
         <w:spacing w:after="80" w:before="80" w:line="300"/>
       </w:pPr>
-      <w:hyperlink w:history="1" r:id="rIdysffdhmgyuoghsc58nxx-">
+      <w:hyperlink w:history="1" r:id="rIdqp-ykktpnwkjxcd5mzzhk">
         <w:r>
           <w:rPr>
             <w:color w:val="315CBB"/>
@@ -1038,7 +1038,7 @@
         </w:rPr>
         <w:t xml:space="preserve">   </w:t>
       </w:r>
-      <w:hyperlink w:history="1" r:id="rIdprbwlchqar3ohrt_y7d4l">
+      <w:hyperlink w:history="1" r:id="rIdavtim8hdml_wla17ztngz">
         <w:r>
           <w:rPr>
             <w:color w:val="315CBB"/>
@@ -1056,7 +1056,7 @@
         </w:rPr>
         <w:t xml:space="preserve">   </w:t>
       </w:r>
-      <w:hyperlink w:history="1" r:id="rIdiahpglzm7aukrlbuy-03l">
+      <w:hyperlink w:history="1" r:id="rIdz12gn7nohpwqlgb2v8z4n">
         <w:r>
           <w:rPr>
             <w:color w:val="315CBB"/>
@@ -1074,7 +1074,7 @@
         </w:rPr>
         <w:t xml:space="preserve">   </w:t>
       </w:r>
-      <w:hyperlink w:history="1" r:id="rIdo4xjqxmlc57_fnzetgpgx">
+      <w:hyperlink w:history="1" r:id="rIdzfqmsnkqbadxm8zwfaq3c">
         <w:r>
           <w:rPr>
             <w:color w:val="315CBB"/>
@@ -1221,7 +1221,7 @@
       <w:pPr>
         <w:spacing w:after="80" w:before="0" w:line="300"/>
       </w:pPr>
-      <w:hyperlink w:history="1" r:id="rId3amjq3yifmgaanm7wtsv_">
+      <w:hyperlink w:history="1" r:id="rId60zs2zpwd8dfz4jobqo7n">
         <w:r>
           <w:rPr>
             <w:color w:val="315CBB"/>
@@ -1544,7 +1544,7 @@
       <w:pPr>
         <w:spacing w:after="80" w:before="80" w:line="300"/>
       </w:pPr>
-      <w:hyperlink w:history="1" r:id="rIdhupygxeaqmlajeicchsqs">
+      <w:hyperlink w:history="1" r:id="rIdxd9ck_glnu7x6al_8ckan">
         <w:r>
           <w:rPr>
             <w:color w:val="315CBB"/>
@@ -1562,7 +1562,7 @@
         </w:rPr>
         <w:t xml:space="preserve">   </w:t>
       </w:r>
-      <w:hyperlink w:history="1" r:id="rIdyyknodaovbmk07smqkwxu">
+      <w:hyperlink w:history="1" r:id="rIdev4bmyvkydrat55ouppbe">
         <w:r>
           <w:rPr>
             <w:color w:val="315CBB"/>
@@ -1685,7 +1685,7 @@
             <w:r>
               <w:br/>
             </w:r>
-            <w:hyperlink w:history="1" r:id="rIdxvj-sow_c8kspgr7pqd2n">
+            <w:hyperlink w:history="1" r:id="rId7kvmfcqovwwqesm4hp3qk">
               <w:r>
                 <w:rPr>
                   <w:color w:val="315CBB"/>
@@ -1698,7 +1698,7 @@
             <w:r>
               <w:br/>
             </w:r>
-            <w:hyperlink w:history="1" r:id="rIdbetudog6-rxl_5t0-o55c">
+            <w:hyperlink w:history="1" r:id="rId9w5qplcnixjxxdhyxuukz">
               <w:r>
                 <w:rPr>
                   <w:color w:val="315CBB"/>
@@ -1988,7 +1988,7 @@
             <w:pPr>
               <w:spacing w:after="80" w:before="80" w:line="300"/>
             </w:pPr>
-            <w:hyperlink w:history="1" r:id="rIdtlkuiv9h2e402a7vhy63a">
+            <w:hyperlink w:history="1" r:id="rIdkqsy99grchtddpf4rbmmo">
               <w:r>
                 <w:rPr>
                   <w:color w:val="315CBB"/>
@@ -2006,7 +2006,7 @@
               </w:rPr>
               <w:t xml:space="preserve">   </w:t>
             </w:r>
-            <w:hyperlink w:history="1" r:id="rIdpltptrczmmlctrligwep5">
+            <w:hyperlink w:history="1" r:id="rId1ns8hrtwywng5lgexa5cb">
               <w:r>
                 <w:rPr>
                   <w:color w:val="315CBB"/>
@@ -2024,7 +2024,7 @@
               </w:rPr>
               <w:t xml:space="preserve">   </w:t>
             </w:r>
-            <w:hyperlink w:history="1" r:id="rIdgxs--ogottbat_wfbksgh">
+            <w:hyperlink w:history="1" r:id="rIds46o6sunu1569-syrob2-">
               <w:r>
                 <w:rPr>
                   <w:color w:val="315CBB"/>
@@ -2492,7 +2492,7 @@
             <w:pPr>
               <w:spacing w:after="80" w:before="0" w:line="300"/>
             </w:pPr>
-            <w:hyperlink w:history="1" r:id="rIdgo3iyga-roj5zmujqg1jc">
+            <w:hyperlink w:history="1" r:id="rIdtxutehnkavbuj39lkhal-">
               <w:r>
                 <w:rPr>
                   <w:color w:val="315CBB"/>

</xml_diff>

<commit_message>
Repeat each case's title at the top left of all its slides
Co-Authored-By: Claude Opus 5.5 (1M context) <noreply@anthropic.com>
</commit_message>
<xml_diff>
--- a/site/en/resume.docx
+++ b/site/en/resume.docx
@@ -102,7 +102,7 @@
             <w:pPr>
               <w:spacing w:after="80" w:before="80" w:line="300"/>
             </w:pPr>
-            <w:hyperlink w:history="1" r:id="rIdctgylepfjul5sipghpewz">
+            <w:hyperlink w:history="1" r:id="rIdoy67fjwyh_7ehzry5v3a0">
               <w:r>
                 <w:rPr>
                   <w:color w:val="315CBB"/>
@@ -120,7 +120,7 @@
               </w:rPr>
               <w:t xml:space="preserve">   </w:t>
             </w:r>
-            <w:hyperlink w:history="1" r:id="rIdq8kwe77oobpddacujrdxi">
+            <w:hyperlink w:history="1" r:id="rIdrjrn8jhwhkxojw0b2prwt">
               <w:r>
                 <w:rPr>
                   <w:color w:val="315CBB"/>
@@ -138,7 +138,7 @@
               </w:rPr>
               <w:t xml:space="preserve">   </w:t>
             </w:r>
-            <w:hyperlink w:history="1" r:id="rIddd2p9kbmvjwwvtefdh_tw">
+            <w:hyperlink w:history="1" r:id="rIdkdawvz90868asppwnvxaq">
               <w:r>
                 <w:rPr>
                   <w:color w:val="315CBB"/>
@@ -156,7 +156,7 @@
               </w:rPr>
               <w:t xml:space="preserve">   </w:t>
             </w:r>
-            <w:hyperlink w:history="1" r:id="rIdk_wq8uydariqul2wffh-_">
+            <w:hyperlink w:history="1" r:id="rIdi95zbsuvnioov_wq4wfen">
               <w:r>
                 <w:rPr>
                   <w:color w:val="315CBB"/>
@@ -404,7 +404,7 @@
       <w:pPr>
         <w:spacing w:after="80" w:before="80" w:line="300"/>
       </w:pPr>
-      <w:hyperlink w:history="1" r:id="rId6renuzi8wwsixuldcr42p">
+      <w:hyperlink w:history="1" r:id="rIdot2vyzhdwgq3kj88jv_rn">
         <w:r>
           <w:rPr>
             <w:color w:val="315CBB"/>
@@ -422,7 +422,7 @@
         </w:rPr>
         <w:t xml:space="preserve">   </w:t>
       </w:r>
-      <w:hyperlink w:history="1" r:id="rIdyr3bgn_wgq4x6tse3dv6f">
+      <w:hyperlink w:history="1" r:id="rIdyw5rq415zj16r8_onjbct">
         <w:r>
           <w:rPr>
             <w:color w:val="315CBB"/>
@@ -1020,7 +1020,7 @@
       <w:pPr>
         <w:spacing w:after="80" w:before="80" w:line="300"/>
       </w:pPr>
-      <w:hyperlink w:history="1" r:id="rIdqp-ykktpnwkjxcd5mzzhk">
+      <w:hyperlink w:history="1" r:id="rIdke9cj1fewfnl-zqtfmrh6">
         <w:r>
           <w:rPr>
             <w:color w:val="315CBB"/>
@@ -1038,7 +1038,7 @@
         </w:rPr>
         <w:t xml:space="preserve">   </w:t>
       </w:r>
-      <w:hyperlink w:history="1" r:id="rIdavtim8hdml_wla17ztngz">
+      <w:hyperlink w:history="1" r:id="rIdrwrbyoag5zffyzrryvaej">
         <w:r>
           <w:rPr>
             <w:color w:val="315CBB"/>
@@ -1056,7 +1056,7 @@
         </w:rPr>
         <w:t xml:space="preserve">   </w:t>
       </w:r>
-      <w:hyperlink w:history="1" r:id="rIdz12gn7nohpwqlgb2v8z4n">
+      <w:hyperlink w:history="1" r:id="rIdc8nbniswt9flhedikyhb0">
         <w:r>
           <w:rPr>
             <w:color w:val="315CBB"/>
@@ -1074,7 +1074,7 @@
         </w:rPr>
         <w:t xml:space="preserve">   </w:t>
       </w:r>
-      <w:hyperlink w:history="1" r:id="rIdzfqmsnkqbadxm8zwfaq3c">
+      <w:hyperlink w:history="1" r:id="rIdfassbxltazztyjmr2ndkw">
         <w:r>
           <w:rPr>
             <w:color w:val="315CBB"/>
@@ -1221,7 +1221,7 @@
       <w:pPr>
         <w:spacing w:after="80" w:before="0" w:line="300"/>
       </w:pPr>
-      <w:hyperlink w:history="1" r:id="rId60zs2zpwd8dfz4jobqo7n">
+      <w:hyperlink w:history="1" r:id="rIdatpphzrmbzwjdl2abudhw">
         <w:r>
           <w:rPr>
             <w:color w:val="315CBB"/>
@@ -1544,7 +1544,7 @@
       <w:pPr>
         <w:spacing w:after="80" w:before="80" w:line="300"/>
       </w:pPr>
-      <w:hyperlink w:history="1" r:id="rIdxd9ck_glnu7x6al_8ckan">
+      <w:hyperlink w:history="1" r:id="rIdvmoyeawhgvsvzjja-nkkr">
         <w:r>
           <w:rPr>
             <w:color w:val="315CBB"/>
@@ -1562,7 +1562,7 @@
         </w:rPr>
         <w:t xml:space="preserve">   </w:t>
       </w:r>
-      <w:hyperlink w:history="1" r:id="rIdev4bmyvkydrat55ouppbe">
+      <w:hyperlink w:history="1" r:id="rIdj2vnm2a1y6xjm18ughczs">
         <w:r>
           <w:rPr>
             <w:color w:val="315CBB"/>
@@ -1685,7 +1685,7 @@
             <w:r>
               <w:br/>
             </w:r>
-            <w:hyperlink w:history="1" r:id="rId7kvmfcqovwwqesm4hp3qk">
+            <w:hyperlink w:history="1" r:id="rIdl9ab9iezldb690isp3u_q">
               <w:r>
                 <w:rPr>
                   <w:color w:val="315CBB"/>
@@ -1698,7 +1698,7 @@
             <w:r>
               <w:br/>
             </w:r>
-            <w:hyperlink w:history="1" r:id="rId9w5qplcnixjxxdhyxuukz">
+            <w:hyperlink w:history="1" r:id="rIdf6rlzlhi__xojegaxixl9">
               <w:r>
                 <w:rPr>
                   <w:color w:val="315CBB"/>
@@ -1988,7 +1988,7 @@
             <w:pPr>
               <w:spacing w:after="80" w:before="80" w:line="300"/>
             </w:pPr>
-            <w:hyperlink w:history="1" r:id="rIdkqsy99grchtddpf4rbmmo">
+            <w:hyperlink w:history="1" r:id="rIdxry-pr_pds_ttlrittpyx">
               <w:r>
                 <w:rPr>
                   <w:color w:val="315CBB"/>
@@ -2006,7 +2006,7 @@
               </w:rPr>
               <w:t xml:space="preserve">   </w:t>
             </w:r>
-            <w:hyperlink w:history="1" r:id="rId1ns8hrtwywng5lgexa5cb">
+            <w:hyperlink w:history="1" r:id="rIdaaxgyilzdab5yyuhs8vqa">
               <w:r>
                 <w:rPr>
                   <w:color w:val="315CBB"/>
@@ -2024,7 +2024,7 @@
               </w:rPr>
               <w:t xml:space="preserve">   </w:t>
             </w:r>
-            <w:hyperlink w:history="1" r:id="rIds46o6sunu1569-syrob2-">
+            <w:hyperlink w:history="1" r:id="rIdw-8xft4tzkewh_dmwu9hy">
               <w:r>
                 <w:rPr>
                   <w:color w:val="315CBB"/>
@@ -2492,7 +2492,7 @@
             <w:pPr>
               <w:spacing w:after="80" w:before="0" w:line="300"/>
             </w:pPr>
-            <w:hyperlink w:history="1" r:id="rIdtxutehnkavbuj39lkhal-">
+            <w:hyperlink w:history="1" r:id="rIdfvtnl_it1r3a8ou_wz63b">
               <w:r>
                 <w:rPr>
                   <w:color w:val="315CBB"/>

</xml_diff>

<commit_message>
Turn the portfolio's resume and portfolio PDF links into buttons
Co-Authored-By: Claude Opus 5.5 (1M context) <noreply@anthropic.com>
</commit_message>
<xml_diff>
--- a/site/en/resume.docx
+++ b/site/en/resume.docx
@@ -102,7 +102,7 @@
             <w:pPr>
               <w:spacing w:after="80" w:before="80" w:line="300"/>
             </w:pPr>
-            <w:hyperlink w:history="1" r:id="rIdoy67fjwyh_7ehzry5v3a0">
+            <w:hyperlink w:history="1" r:id="rIdmpcvwh2x1livzfudwqwit">
               <w:r>
                 <w:rPr>
                   <w:color w:val="315CBB"/>
@@ -120,7 +120,7 @@
               </w:rPr>
               <w:t xml:space="preserve">   </w:t>
             </w:r>
-            <w:hyperlink w:history="1" r:id="rIdrjrn8jhwhkxojw0b2prwt">
+            <w:hyperlink w:history="1" r:id="rIdz_jaldkecyfakngpqbybj">
               <w:r>
                 <w:rPr>
                   <w:color w:val="315CBB"/>
@@ -138,7 +138,7 @@
               </w:rPr>
               <w:t xml:space="preserve">   </w:t>
             </w:r>
-            <w:hyperlink w:history="1" r:id="rIdkdawvz90868asppwnvxaq">
+            <w:hyperlink w:history="1" r:id="rIdybq87uddgfietdqgzacgy">
               <w:r>
                 <w:rPr>
                   <w:color w:val="315CBB"/>
@@ -156,7 +156,7 @@
               </w:rPr>
               <w:t xml:space="preserve">   </w:t>
             </w:r>
-            <w:hyperlink w:history="1" r:id="rIdi95zbsuvnioov_wq4wfen">
+            <w:hyperlink w:history="1" r:id="rIdeywvuzend-tnye9hjtonh">
               <w:r>
                 <w:rPr>
                   <w:color w:val="315CBB"/>
@@ -404,7 +404,7 @@
       <w:pPr>
         <w:spacing w:after="80" w:before="80" w:line="300"/>
       </w:pPr>
-      <w:hyperlink w:history="1" r:id="rIdot2vyzhdwgq3kj88jv_rn">
+      <w:hyperlink w:history="1" r:id="rId4c6xrh-ne82nlw1pymz1w">
         <w:r>
           <w:rPr>
             <w:color w:val="315CBB"/>
@@ -422,7 +422,7 @@
         </w:rPr>
         <w:t xml:space="preserve">   </w:t>
       </w:r>
-      <w:hyperlink w:history="1" r:id="rIdyw5rq415zj16r8_onjbct">
+      <w:hyperlink w:history="1" r:id="rIdmka8yrveky4pu8tegwe0s">
         <w:r>
           <w:rPr>
             <w:color w:val="315CBB"/>
@@ -1020,7 +1020,7 @@
       <w:pPr>
         <w:spacing w:after="80" w:before="80" w:line="300"/>
       </w:pPr>
-      <w:hyperlink w:history="1" r:id="rIdke9cj1fewfnl-zqtfmrh6">
+      <w:hyperlink w:history="1" r:id="rIdowbkmkjw2bx1s8qtyitq1">
         <w:r>
           <w:rPr>
             <w:color w:val="315CBB"/>
@@ -1038,7 +1038,7 @@
         </w:rPr>
         <w:t xml:space="preserve">   </w:t>
       </w:r>
-      <w:hyperlink w:history="1" r:id="rIdrwrbyoag5zffyzrryvaej">
+      <w:hyperlink w:history="1" r:id="rIdlh-caqv2xpefnpya4l-f0">
         <w:r>
           <w:rPr>
             <w:color w:val="315CBB"/>
@@ -1056,7 +1056,7 @@
         </w:rPr>
         <w:t xml:space="preserve">   </w:t>
       </w:r>
-      <w:hyperlink w:history="1" r:id="rIdc8nbniswt9flhedikyhb0">
+      <w:hyperlink w:history="1" r:id="rIdfeobzlplc9v51dd7yepcs">
         <w:r>
           <w:rPr>
             <w:color w:val="315CBB"/>
@@ -1074,7 +1074,7 @@
         </w:rPr>
         <w:t xml:space="preserve">   </w:t>
       </w:r>
-      <w:hyperlink w:history="1" r:id="rIdfassbxltazztyjmr2ndkw">
+      <w:hyperlink w:history="1" r:id="rIdqt21b37foe0ym4puygkfw">
         <w:r>
           <w:rPr>
             <w:color w:val="315CBB"/>
@@ -1221,7 +1221,7 @@
       <w:pPr>
         <w:spacing w:after="80" w:before="0" w:line="300"/>
       </w:pPr>
-      <w:hyperlink w:history="1" r:id="rIdatpphzrmbzwjdl2abudhw">
+      <w:hyperlink w:history="1" r:id="rIdtt2xykrxf37epg8zppdzh">
         <w:r>
           <w:rPr>
             <w:color w:val="315CBB"/>
@@ -1544,7 +1544,7 @@
       <w:pPr>
         <w:spacing w:after="80" w:before="80" w:line="300"/>
       </w:pPr>
-      <w:hyperlink w:history="1" r:id="rIdvmoyeawhgvsvzjja-nkkr">
+      <w:hyperlink w:history="1" r:id="rIdjkxefjt6peiq_nwkswvsb">
         <w:r>
           <w:rPr>
             <w:color w:val="315CBB"/>
@@ -1562,7 +1562,7 @@
         </w:rPr>
         <w:t xml:space="preserve">   </w:t>
       </w:r>
-      <w:hyperlink w:history="1" r:id="rIdj2vnm2a1y6xjm18ughczs">
+      <w:hyperlink w:history="1" r:id="rIdatyvqxprtahyee-aj5dav">
         <w:r>
           <w:rPr>
             <w:color w:val="315CBB"/>
@@ -1685,7 +1685,7 @@
             <w:r>
               <w:br/>
             </w:r>
-            <w:hyperlink w:history="1" r:id="rIdl9ab9iezldb690isp3u_q">
+            <w:hyperlink w:history="1" r:id="rId2lq3b95pfahqvahlf65dj">
               <w:r>
                 <w:rPr>
                   <w:color w:val="315CBB"/>
@@ -1698,7 +1698,7 @@
             <w:r>
               <w:br/>
             </w:r>
-            <w:hyperlink w:history="1" r:id="rIdf6rlzlhi__xojegaxixl9">
+            <w:hyperlink w:history="1" r:id="rId3t5hzico56tt8by4iqusv">
               <w:r>
                 <w:rPr>
                   <w:color w:val="315CBB"/>
@@ -1988,7 +1988,7 @@
             <w:pPr>
               <w:spacing w:after="80" w:before="80" w:line="300"/>
             </w:pPr>
-            <w:hyperlink w:history="1" r:id="rIdxry-pr_pds_ttlrittpyx">
+            <w:hyperlink w:history="1" r:id="rIdv-muwmlp88s2krdzbnr2j">
               <w:r>
                 <w:rPr>
                   <w:color w:val="315CBB"/>
@@ -2006,7 +2006,7 @@
               </w:rPr>
               <w:t xml:space="preserve">   </w:t>
             </w:r>
-            <w:hyperlink w:history="1" r:id="rIdaaxgyilzdab5yyuhs8vqa">
+            <w:hyperlink w:history="1" r:id="rIdwcs5dibl-pygxnqhyp9mt">
               <w:r>
                 <w:rPr>
                   <w:color w:val="315CBB"/>
@@ -2024,7 +2024,7 @@
               </w:rPr>
               <w:t xml:space="preserve">   </w:t>
             </w:r>
-            <w:hyperlink w:history="1" r:id="rIdw-8xft4tzkewh_dmwu9hy">
+            <w:hyperlink w:history="1" r:id="rId3c94qrzlifdtdflj7kmev">
               <w:r>
                 <w:rPr>
                   <w:color w:val="315CBB"/>
@@ -2492,7 +2492,7 @@
             <w:pPr>
               <w:spacing w:after="80" w:before="0" w:line="300"/>
             </w:pPr>
-            <w:hyperlink w:history="1" r:id="rIdfvtnl_it1r3a8ou_wz63b">
+            <w:hyperlink w:history="1" r:id="rIda7w2g8bvidgsvbgegfqzw">
               <w:r>
                 <w:rPr>
                   <w:color w:val="315CBB"/>

</xml_diff>

<commit_message>
Bring the portfolio deck contents in line with the web index
Add the MORE group, show each entry's slide number, and link entries to
their slides inside the PDF.

Co-Authored-By: Claude Opus 5.5 (1M context) <noreply@anthropic.com>
</commit_message>
<xml_diff>
--- a/site/en/resume.docx
+++ b/site/en/resume.docx
@@ -102,7 +102,7 @@
             <w:pPr>
               <w:spacing w:after="80" w:before="80" w:line="300"/>
             </w:pPr>
-            <w:hyperlink w:history="1" r:id="rIdmpcvwh2x1livzfudwqwit">
+            <w:hyperlink w:history="1" r:id="rIdxnkzmwmlrduemqvrtq4vi">
               <w:r>
                 <w:rPr>
                   <w:color w:val="315CBB"/>
@@ -120,7 +120,7 @@
               </w:rPr>
               <w:t xml:space="preserve">   </w:t>
             </w:r>
-            <w:hyperlink w:history="1" r:id="rIdz_jaldkecyfakngpqbybj">
+            <w:hyperlink w:history="1" r:id="rId7c0g8ppabhjyaqu5h2fvb">
               <w:r>
                 <w:rPr>
                   <w:color w:val="315CBB"/>
@@ -138,7 +138,7 @@
               </w:rPr>
               <w:t xml:space="preserve">   </w:t>
             </w:r>
-            <w:hyperlink w:history="1" r:id="rIdybq87uddgfietdqgzacgy">
+            <w:hyperlink w:history="1" r:id="rIdwounh3jrxrgv6lmc27dbf">
               <w:r>
                 <w:rPr>
                   <w:color w:val="315CBB"/>
@@ -156,7 +156,7 @@
               </w:rPr>
               <w:t xml:space="preserve">   </w:t>
             </w:r>
-            <w:hyperlink w:history="1" r:id="rIdeywvuzend-tnye9hjtonh">
+            <w:hyperlink w:history="1" r:id="rIdm9xp3cwi51kkiq-scjxti">
               <w:r>
                 <w:rPr>
                   <w:color w:val="315CBB"/>
@@ -404,7 +404,7 @@
       <w:pPr>
         <w:spacing w:after="80" w:before="80" w:line="300"/>
       </w:pPr>
-      <w:hyperlink w:history="1" r:id="rId4c6xrh-ne82nlw1pymz1w">
+      <w:hyperlink w:history="1" r:id="rId1iajfdedigruocad8nquw">
         <w:r>
           <w:rPr>
             <w:color w:val="315CBB"/>
@@ -422,7 +422,7 @@
         </w:rPr>
         <w:t xml:space="preserve">   </w:t>
       </w:r>
-      <w:hyperlink w:history="1" r:id="rIdmka8yrveky4pu8tegwe0s">
+      <w:hyperlink w:history="1" r:id="rIdohxjh_xp1hulpkf2ttubu">
         <w:r>
           <w:rPr>
             <w:color w:val="315CBB"/>
@@ -1020,7 +1020,7 @@
       <w:pPr>
         <w:spacing w:after="80" w:before="80" w:line="300"/>
       </w:pPr>
-      <w:hyperlink w:history="1" r:id="rIdowbkmkjw2bx1s8qtyitq1">
+      <w:hyperlink w:history="1" r:id="rIdy-p95xzo4ovenezxjz_xu">
         <w:r>
           <w:rPr>
             <w:color w:val="315CBB"/>
@@ -1038,7 +1038,7 @@
         </w:rPr>
         <w:t xml:space="preserve">   </w:t>
       </w:r>
-      <w:hyperlink w:history="1" r:id="rIdlh-caqv2xpefnpya4l-f0">
+      <w:hyperlink w:history="1" r:id="rIdmgzihmsvt7lipoqkiflqy">
         <w:r>
           <w:rPr>
             <w:color w:val="315CBB"/>
@@ -1056,7 +1056,7 @@
         </w:rPr>
         <w:t xml:space="preserve">   </w:t>
       </w:r>
-      <w:hyperlink w:history="1" r:id="rIdfeobzlplc9v51dd7yepcs">
+      <w:hyperlink w:history="1" r:id="rIdrslu3ducelxplg8yjeips">
         <w:r>
           <w:rPr>
             <w:color w:val="315CBB"/>
@@ -1074,7 +1074,7 @@
         </w:rPr>
         <w:t xml:space="preserve">   </w:t>
       </w:r>
-      <w:hyperlink w:history="1" r:id="rIdqt21b37foe0ym4puygkfw">
+      <w:hyperlink w:history="1" r:id="rIdntp_mdxwnqgplbzuvz50i">
         <w:r>
           <w:rPr>
             <w:color w:val="315CBB"/>
@@ -1221,7 +1221,7 @@
       <w:pPr>
         <w:spacing w:after="80" w:before="0" w:line="300"/>
       </w:pPr>
-      <w:hyperlink w:history="1" r:id="rIdtt2xykrxf37epg8zppdzh">
+      <w:hyperlink w:history="1" r:id="rIdviuxa3ililkhatsdn45xz">
         <w:r>
           <w:rPr>
             <w:color w:val="315CBB"/>
@@ -1544,7 +1544,7 @@
       <w:pPr>
         <w:spacing w:after="80" w:before="80" w:line="300"/>
       </w:pPr>
-      <w:hyperlink w:history="1" r:id="rIdjkxefjt6peiq_nwkswvsb">
+      <w:hyperlink w:history="1" r:id="rIdeeshtdkqltguwvshntfhd">
         <w:r>
           <w:rPr>
             <w:color w:val="315CBB"/>
@@ -1562,7 +1562,7 @@
         </w:rPr>
         <w:t xml:space="preserve">   </w:t>
       </w:r>
-      <w:hyperlink w:history="1" r:id="rIdatyvqxprtahyee-aj5dav">
+      <w:hyperlink w:history="1" r:id="rIdljjlcpb__ugfcfspptwyk">
         <w:r>
           <w:rPr>
             <w:color w:val="315CBB"/>
@@ -1685,7 +1685,7 @@
             <w:r>
               <w:br/>
             </w:r>
-            <w:hyperlink w:history="1" r:id="rId2lq3b95pfahqvahlf65dj">
+            <w:hyperlink w:history="1" r:id="rIdtjmdpqldmmv0n7kh--z4u">
               <w:r>
                 <w:rPr>
                   <w:color w:val="315CBB"/>
@@ -1698,7 +1698,7 @@
             <w:r>
               <w:br/>
             </w:r>
-            <w:hyperlink w:history="1" r:id="rId3t5hzico56tt8by4iqusv">
+            <w:hyperlink w:history="1" r:id="rIda7gjyoipa_kq_csczhsul">
               <w:r>
                 <w:rPr>
                   <w:color w:val="315CBB"/>
@@ -1988,7 +1988,7 @@
             <w:pPr>
               <w:spacing w:after="80" w:before="80" w:line="300"/>
             </w:pPr>
-            <w:hyperlink w:history="1" r:id="rIdv-muwmlp88s2krdzbnr2j">
+            <w:hyperlink w:history="1" r:id="rIdbapx4hjutxmtb2wd3tski">
               <w:r>
                 <w:rPr>
                   <w:color w:val="315CBB"/>
@@ -2006,7 +2006,7 @@
               </w:rPr>
               <w:t xml:space="preserve">   </w:t>
             </w:r>
-            <w:hyperlink w:history="1" r:id="rIdwcs5dibl-pygxnqhyp9mt">
+            <w:hyperlink w:history="1" r:id="rId1hwxpjwqekti6mtvfduhx">
               <w:r>
                 <w:rPr>
                   <w:color w:val="315CBB"/>
@@ -2024,7 +2024,7 @@
               </w:rPr>
               <w:t xml:space="preserve">   </w:t>
             </w:r>
-            <w:hyperlink w:history="1" r:id="rId3c94qrzlifdtdflj7kmev">
+            <w:hyperlink w:history="1" r:id="rId4syraplir3vfdmnektint">
               <w:r>
                 <w:rPr>
                   <w:color w:val="315CBB"/>
@@ -2492,7 +2492,7 @@
             <w:pPr>
               <w:spacing w:after="80" w:before="0" w:line="300"/>
             </w:pPr>
-            <w:hyperlink w:history="1" r:id="rIda7w2g8bvidgsvbgegfqzw">
+            <w:hyperlink w:history="1" r:id="rId0gcbrko3t5raez3w93pn6">
               <w:r>
                 <w:rPr>
                   <w:color w:val="315CBB"/>

</xml_diff>

<commit_message>
Make my row stand out in the team lists on the portfolio page and slides
Co-Authored-By: Claude Opus 5.5 (1M context) <noreply@anthropic.com>
</commit_message>
<xml_diff>
--- a/site/en/resume.docx
+++ b/site/en/resume.docx
@@ -102,7 +102,7 @@
             <w:pPr>
               <w:spacing w:after="80" w:before="80" w:line="300"/>
             </w:pPr>
-            <w:hyperlink w:history="1" r:id="rIdxnkzmwmlrduemqvrtq4vi">
+            <w:hyperlink w:history="1" r:id="rIdary3jov84imkjzrc5yuhj">
               <w:r>
                 <w:rPr>
                   <w:color w:val="315CBB"/>
@@ -120,7 +120,7 @@
               </w:rPr>
               <w:t xml:space="preserve">   </w:t>
             </w:r>
-            <w:hyperlink w:history="1" r:id="rId7c0g8ppabhjyaqu5h2fvb">
+            <w:hyperlink w:history="1" r:id="rIdhgdfcvsv14ganc33wnj2c">
               <w:r>
                 <w:rPr>
                   <w:color w:val="315CBB"/>
@@ -138,7 +138,7 @@
               </w:rPr>
               <w:t xml:space="preserve">   </w:t>
             </w:r>
-            <w:hyperlink w:history="1" r:id="rIdwounh3jrxrgv6lmc27dbf">
+            <w:hyperlink w:history="1" r:id="rId6pdrexsagnhqstvfekoea">
               <w:r>
                 <w:rPr>
                   <w:color w:val="315CBB"/>
@@ -156,7 +156,7 @@
               </w:rPr>
               <w:t xml:space="preserve">   </w:t>
             </w:r>
-            <w:hyperlink w:history="1" r:id="rIdm9xp3cwi51kkiq-scjxti">
+            <w:hyperlink w:history="1" r:id="rIdvoxovjrfct65wnjs33rjo">
               <w:r>
                 <w:rPr>
                   <w:color w:val="315CBB"/>
@@ -404,7 +404,7 @@
       <w:pPr>
         <w:spacing w:after="80" w:before="80" w:line="300"/>
       </w:pPr>
-      <w:hyperlink w:history="1" r:id="rId1iajfdedigruocad8nquw">
+      <w:hyperlink w:history="1" r:id="rIdx8tffj0cwcfgcawlby89n">
         <w:r>
           <w:rPr>
             <w:color w:val="315CBB"/>
@@ -422,7 +422,7 @@
         </w:rPr>
         <w:t xml:space="preserve">   </w:t>
       </w:r>
-      <w:hyperlink w:history="1" r:id="rIdohxjh_xp1hulpkf2ttubu">
+      <w:hyperlink w:history="1" r:id="rIdeeac1a8_-1kpxththdcdi">
         <w:r>
           <w:rPr>
             <w:color w:val="315CBB"/>
@@ -1020,7 +1020,7 @@
       <w:pPr>
         <w:spacing w:after="80" w:before="80" w:line="300"/>
       </w:pPr>
-      <w:hyperlink w:history="1" r:id="rIdy-p95xzo4ovenezxjz_xu">
+      <w:hyperlink w:history="1" r:id="rIdktmqc9nib_qbuwaw5az1r">
         <w:r>
           <w:rPr>
             <w:color w:val="315CBB"/>
@@ -1038,7 +1038,7 @@
         </w:rPr>
         <w:t xml:space="preserve">   </w:t>
       </w:r>
-      <w:hyperlink w:history="1" r:id="rIdmgzihmsvt7lipoqkiflqy">
+      <w:hyperlink w:history="1" r:id="rIdq3lxgtiw1p7r4t2j3iw4d">
         <w:r>
           <w:rPr>
             <w:color w:val="315CBB"/>
@@ -1056,7 +1056,7 @@
         </w:rPr>
         <w:t xml:space="preserve">   </w:t>
       </w:r>
-      <w:hyperlink w:history="1" r:id="rIdrslu3ducelxplg8yjeips">
+      <w:hyperlink w:history="1" r:id="rIdgjuxhqknkpvthw2yqcpz4">
         <w:r>
           <w:rPr>
             <w:color w:val="315CBB"/>
@@ -1074,7 +1074,7 @@
         </w:rPr>
         <w:t xml:space="preserve">   </w:t>
       </w:r>
-      <w:hyperlink w:history="1" r:id="rIdntp_mdxwnqgplbzuvz50i">
+      <w:hyperlink w:history="1" r:id="rIdgpwzt9ioxowirogipayqv">
         <w:r>
           <w:rPr>
             <w:color w:val="315CBB"/>
@@ -1221,7 +1221,7 @@
       <w:pPr>
         <w:spacing w:after="80" w:before="0" w:line="300"/>
       </w:pPr>
-      <w:hyperlink w:history="1" r:id="rIdviuxa3ililkhatsdn45xz">
+      <w:hyperlink w:history="1" r:id="rIditjowcignabq3poooash8">
         <w:r>
           <w:rPr>
             <w:color w:val="315CBB"/>
@@ -1544,7 +1544,7 @@
       <w:pPr>
         <w:spacing w:after="80" w:before="80" w:line="300"/>
       </w:pPr>
-      <w:hyperlink w:history="1" r:id="rIdeeshtdkqltguwvshntfhd">
+      <w:hyperlink w:history="1" r:id="rIdun3rjeirxl5jwr0cixkbn">
         <w:r>
           <w:rPr>
             <w:color w:val="315CBB"/>
@@ -1562,7 +1562,7 @@
         </w:rPr>
         <w:t xml:space="preserve">   </w:t>
       </w:r>
-      <w:hyperlink w:history="1" r:id="rIdljjlcpb__ugfcfspptwyk">
+      <w:hyperlink w:history="1" r:id="rIdv0th-myviy6j4gj-avzu7">
         <w:r>
           <w:rPr>
             <w:color w:val="315CBB"/>
@@ -1685,7 +1685,7 @@
             <w:r>
               <w:br/>
             </w:r>
-            <w:hyperlink w:history="1" r:id="rIdtjmdpqldmmv0n7kh--z4u">
+            <w:hyperlink w:history="1" r:id="rIdht_5w91uj7qxqne7sd8ml">
               <w:r>
                 <w:rPr>
                   <w:color w:val="315CBB"/>
@@ -1698,7 +1698,7 @@
             <w:r>
               <w:br/>
             </w:r>
-            <w:hyperlink w:history="1" r:id="rIda7gjyoipa_kq_csczhsul">
+            <w:hyperlink w:history="1" r:id="rId7c4ip94au8tfkytuxw7vb">
               <w:r>
                 <w:rPr>
                   <w:color w:val="315CBB"/>
@@ -1988,7 +1988,7 @@
             <w:pPr>
               <w:spacing w:after="80" w:before="80" w:line="300"/>
             </w:pPr>
-            <w:hyperlink w:history="1" r:id="rIdbapx4hjutxmtb2wd3tski">
+            <w:hyperlink w:history="1" r:id="rIdmrjoa4wz1kdx5hmtdtrzw">
               <w:r>
                 <w:rPr>
                   <w:color w:val="315CBB"/>
@@ -2006,7 +2006,7 @@
               </w:rPr>
               <w:t xml:space="preserve">   </w:t>
             </w:r>
-            <w:hyperlink w:history="1" r:id="rId1hwxpjwqekti6mtvfduhx">
+            <w:hyperlink w:history="1" r:id="rIdkzxbbslh6emnf_z48jlxk">
               <w:r>
                 <w:rPr>
                   <w:color w:val="315CBB"/>
@@ -2024,7 +2024,7 @@
               </w:rPr>
               <w:t xml:space="preserve">   </w:t>
             </w:r>
-            <w:hyperlink w:history="1" r:id="rId4syraplir3vfdmnektint">
+            <w:hyperlink w:history="1" r:id="rIdcumpmydowncrtql7yqy9q">
               <w:r>
                 <w:rPr>
                   <w:color w:val="315CBB"/>
@@ -2492,7 +2492,7 @@
             <w:pPr>
               <w:spacing w:after="80" w:before="0" w:line="300"/>
             </w:pPr>
-            <w:hyperlink w:history="1" r:id="rId0gcbrko3t5raez3w93pn6">
+            <w:hyperlink w:history="1" r:id="rIdyex-cfe9smvxsr8jcc_yv">
               <w:r>
                 <w:rPr>
                   <w:color w:val="315CBB"/>

</xml_diff>

<commit_message>
Merge my main work into my row of the team list
The project overview now leads with my role card holding the main work,
with teammates listed below it, on the portfolio page and the slides.

Co-Authored-By: Claude Opus 5.5 (1M context) <noreply@anthropic.com>
</commit_message>
<xml_diff>
--- a/site/en/resume.docx
+++ b/site/en/resume.docx
@@ -102,7 +102,7 @@
             <w:pPr>
               <w:spacing w:after="80" w:before="80" w:line="300"/>
             </w:pPr>
-            <w:hyperlink w:history="1" r:id="rIdary3jov84imkjzrc5yuhj">
+            <w:hyperlink w:history="1" r:id="rIdffin18ylnnlozrnoqicvs">
               <w:r>
                 <w:rPr>
                   <w:color w:val="315CBB"/>
@@ -120,7 +120,7 @@
               </w:rPr>
               <w:t xml:space="preserve">   </w:t>
             </w:r>
-            <w:hyperlink w:history="1" r:id="rIdhgdfcvsv14ganc33wnj2c">
+            <w:hyperlink w:history="1" r:id="rIddnel2k0u7adrmwgxl03ue">
               <w:r>
                 <w:rPr>
                   <w:color w:val="315CBB"/>
@@ -138,7 +138,7 @@
               </w:rPr>
               <w:t xml:space="preserve">   </w:t>
             </w:r>
-            <w:hyperlink w:history="1" r:id="rId6pdrexsagnhqstvfekoea">
+            <w:hyperlink w:history="1" r:id="rIdlhxeu5ysjavw7jhxe-kqm">
               <w:r>
                 <w:rPr>
                   <w:color w:val="315CBB"/>
@@ -156,7 +156,7 @@
               </w:rPr>
               <w:t xml:space="preserve">   </w:t>
             </w:r>
-            <w:hyperlink w:history="1" r:id="rIdvoxovjrfct65wnjs33rjo">
+            <w:hyperlink w:history="1" r:id="rIdbqx_htufov1gbcw0fpvq-">
               <w:r>
                 <w:rPr>
                   <w:color w:val="315CBB"/>
@@ -404,7 +404,7 @@
       <w:pPr>
         <w:spacing w:after="80" w:before="80" w:line="300"/>
       </w:pPr>
-      <w:hyperlink w:history="1" r:id="rIdx8tffj0cwcfgcawlby89n">
+      <w:hyperlink w:history="1" r:id="rIdakdmrforjubyar9vxpyjf">
         <w:r>
           <w:rPr>
             <w:color w:val="315CBB"/>
@@ -422,7 +422,7 @@
         </w:rPr>
         <w:t xml:space="preserve">   </w:t>
       </w:r>
-      <w:hyperlink w:history="1" r:id="rIdeeac1a8_-1kpxththdcdi">
+      <w:hyperlink w:history="1" r:id="rIdtzozknpjmyw3yaxfgo92r">
         <w:r>
           <w:rPr>
             <w:color w:val="315CBB"/>
@@ -1020,7 +1020,7 @@
       <w:pPr>
         <w:spacing w:after="80" w:before="80" w:line="300"/>
       </w:pPr>
-      <w:hyperlink w:history="1" r:id="rIdktmqc9nib_qbuwaw5az1r">
+      <w:hyperlink w:history="1" r:id="rIdlukoug2bzjrmntkyg9n4k">
         <w:r>
           <w:rPr>
             <w:color w:val="315CBB"/>
@@ -1038,7 +1038,7 @@
         </w:rPr>
         <w:t xml:space="preserve">   </w:t>
       </w:r>
-      <w:hyperlink w:history="1" r:id="rIdq3lxgtiw1p7r4t2j3iw4d">
+      <w:hyperlink w:history="1" r:id="rIdeb_6trmenkmzqdtfz5vxb">
         <w:r>
           <w:rPr>
             <w:color w:val="315CBB"/>
@@ -1056,7 +1056,7 @@
         </w:rPr>
         <w:t xml:space="preserve">   </w:t>
       </w:r>
-      <w:hyperlink w:history="1" r:id="rIdgjuxhqknkpvthw2yqcpz4">
+      <w:hyperlink w:history="1" r:id="rIdqy4z3hyszljnbpytxchqo">
         <w:r>
           <w:rPr>
             <w:color w:val="315CBB"/>
@@ -1074,7 +1074,7 @@
         </w:rPr>
         <w:t xml:space="preserve">   </w:t>
       </w:r>
-      <w:hyperlink w:history="1" r:id="rIdgpwzt9ioxowirogipayqv">
+      <w:hyperlink w:history="1" r:id="rIdb-nl6djlhpvvs3b9scyoj">
         <w:r>
           <w:rPr>
             <w:color w:val="315CBB"/>
@@ -1221,7 +1221,7 @@
       <w:pPr>
         <w:spacing w:after="80" w:before="0" w:line="300"/>
       </w:pPr>
-      <w:hyperlink w:history="1" r:id="rIditjowcignabq3poooash8">
+      <w:hyperlink w:history="1" r:id="rIdsbqgcy9ycs8wkbhmxwk6n">
         <w:r>
           <w:rPr>
             <w:color w:val="315CBB"/>
@@ -1544,7 +1544,7 @@
       <w:pPr>
         <w:spacing w:after="80" w:before="80" w:line="300"/>
       </w:pPr>
-      <w:hyperlink w:history="1" r:id="rIdun3rjeirxl5jwr0cixkbn">
+      <w:hyperlink w:history="1" r:id="rIdwgq-mmdushbsplvihlumq">
         <w:r>
           <w:rPr>
             <w:color w:val="315CBB"/>
@@ -1562,7 +1562,7 @@
         </w:rPr>
         <w:t xml:space="preserve">   </w:t>
       </w:r>
-      <w:hyperlink w:history="1" r:id="rIdv0th-myviy6j4gj-avzu7">
+      <w:hyperlink w:history="1" r:id="rId7yi5kpblia1yhvekirexk">
         <w:r>
           <w:rPr>
             <w:color w:val="315CBB"/>
@@ -1685,7 +1685,7 @@
             <w:r>
               <w:br/>
             </w:r>
-            <w:hyperlink w:history="1" r:id="rIdht_5w91uj7qxqne7sd8ml">
+            <w:hyperlink w:history="1" r:id="rId6zompslerofvb6aqzco8b">
               <w:r>
                 <w:rPr>
                   <w:color w:val="315CBB"/>
@@ -1698,7 +1698,7 @@
             <w:r>
               <w:br/>
             </w:r>
-            <w:hyperlink w:history="1" r:id="rId7c4ip94au8tfkytuxw7vb">
+            <w:hyperlink w:history="1" r:id="rIdcszeweivj6f50zgo8q9j8">
               <w:r>
                 <w:rPr>
                   <w:color w:val="315CBB"/>
@@ -1988,7 +1988,7 @@
             <w:pPr>
               <w:spacing w:after="80" w:before="80" w:line="300"/>
             </w:pPr>
-            <w:hyperlink w:history="1" r:id="rIdmrjoa4wz1kdx5hmtdtrzw">
+            <w:hyperlink w:history="1" r:id="rIdmkjns8ztazkfjuzwhcvso">
               <w:r>
                 <w:rPr>
                   <w:color w:val="315CBB"/>
@@ -2006,7 +2006,7 @@
               </w:rPr>
               <w:t xml:space="preserve">   </w:t>
             </w:r>
-            <w:hyperlink w:history="1" r:id="rIdkzxbbslh6emnf_z48jlxk">
+            <w:hyperlink w:history="1" r:id="rIdktcpcrpmkvva09ag60ofw">
               <w:r>
                 <w:rPr>
                   <w:color w:val="315CBB"/>
@@ -2024,7 +2024,7 @@
               </w:rPr>
               <w:t xml:space="preserve">   </w:t>
             </w:r>
-            <w:hyperlink w:history="1" r:id="rIdcumpmydowncrtql7yqy9q">
+            <w:hyperlink w:history="1" r:id="rId5369or_4v-a4keopmy3rt">
               <w:r>
                 <w:rPr>
                   <w:color w:val="315CBB"/>
@@ -2492,7 +2492,7 @@
             <w:pPr>
               <w:spacing w:after="80" w:before="0" w:line="300"/>
             </w:pPr>
-            <w:hyperlink w:history="1" r:id="rIdyex-cfe9smvxsr8jcc_yv">
+            <w:hyperlink w:history="1" r:id="rIdgyys6vv613bst2fws_ws9">
               <w:r>
                 <w:rPr>
                   <w:color w:val="315CBB"/>

</xml_diff>

<commit_message>
Refine the my-role panel: small label, numbered list, no nested boxes
Co-Authored-By: Claude Opus 5.5 (1M context) <noreply@anthropic.com>
</commit_message>
<xml_diff>
--- a/site/en/resume.docx
+++ b/site/en/resume.docx
@@ -102,7 +102,7 @@
             <w:pPr>
               <w:spacing w:after="80" w:before="80" w:line="300"/>
             </w:pPr>
-            <w:hyperlink w:history="1" r:id="rIdffin18ylnnlozrnoqicvs">
+            <w:hyperlink w:history="1" r:id="rIdsntpn4akqdj1-_q0g2qdz">
               <w:r>
                 <w:rPr>
                   <w:color w:val="315CBB"/>
@@ -120,7 +120,7 @@
               </w:rPr>
               <w:t xml:space="preserve">   </w:t>
             </w:r>
-            <w:hyperlink w:history="1" r:id="rIddnel2k0u7adrmwgxl03ue">
+            <w:hyperlink w:history="1" r:id="rIdwilj9mgird8vrl760flwu">
               <w:r>
                 <w:rPr>
                   <w:color w:val="315CBB"/>
@@ -138,7 +138,7 @@
               </w:rPr>
               <w:t xml:space="preserve">   </w:t>
             </w:r>
-            <w:hyperlink w:history="1" r:id="rIdlhxeu5ysjavw7jhxe-kqm">
+            <w:hyperlink w:history="1" r:id="rIdvmyxpbs0xlw6solprrle6">
               <w:r>
                 <w:rPr>
                   <w:color w:val="315CBB"/>
@@ -156,7 +156,7 @@
               </w:rPr>
               <w:t xml:space="preserve">   </w:t>
             </w:r>
-            <w:hyperlink w:history="1" r:id="rIdbqx_htufov1gbcw0fpvq-">
+            <w:hyperlink w:history="1" r:id="rIdnqqsssbdjyy0rievpgnbm">
               <w:r>
                 <w:rPr>
                   <w:color w:val="315CBB"/>
@@ -404,7 +404,7 @@
       <w:pPr>
         <w:spacing w:after="80" w:before="80" w:line="300"/>
       </w:pPr>
-      <w:hyperlink w:history="1" r:id="rIdakdmrforjubyar9vxpyjf">
+      <w:hyperlink w:history="1" r:id="rIdcyrxqw5wenkct8sg2lwty">
         <w:r>
           <w:rPr>
             <w:color w:val="315CBB"/>
@@ -422,7 +422,7 @@
         </w:rPr>
         <w:t xml:space="preserve">   </w:t>
       </w:r>
-      <w:hyperlink w:history="1" r:id="rIdtzozknpjmyw3yaxfgo92r">
+      <w:hyperlink w:history="1" r:id="rId7kgkdpe5bh3itcowvd0qv">
         <w:r>
           <w:rPr>
             <w:color w:val="315CBB"/>
@@ -1020,7 +1020,7 @@
       <w:pPr>
         <w:spacing w:after="80" w:before="80" w:line="300"/>
       </w:pPr>
-      <w:hyperlink w:history="1" r:id="rIdlukoug2bzjrmntkyg9n4k">
+      <w:hyperlink w:history="1" r:id="rIdtgf2ze9hmfrzl9kq0k-vz">
         <w:r>
           <w:rPr>
             <w:color w:val="315CBB"/>
@@ -1038,7 +1038,7 @@
         </w:rPr>
         <w:t xml:space="preserve">   </w:t>
       </w:r>
-      <w:hyperlink w:history="1" r:id="rIdeb_6trmenkmzqdtfz5vxb">
+      <w:hyperlink w:history="1" r:id="rIdy52dwwsvpdm-d2-ubg4-9">
         <w:r>
           <w:rPr>
             <w:color w:val="315CBB"/>
@@ -1056,7 +1056,7 @@
         </w:rPr>
         <w:t xml:space="preserve">   </w:t>
       </w:r>
-      <w:hyperlink w:history="1" r:id="rIdqy4z3hyszljnbpytxchqo">
+      <w:hyperlink w:history="1" r:id="rIdjw3pb2yplzhvdyc3e7sc4">
         <w:r>
           <w:rPr>
             <w:color w:val="315CBB"/>
@@ -1074,7 +1074,7 @@
         </w:rPr>
         <w:t xml:space="preserve">   </w:t>
       </w:r>
-      <w:hyperlink w:history="1" r:id="rIdb-nl6djlhpvvs3b9scyoj">
+      <w:hyperlink w:history="1" r:id="rIdmvnod5rzitulm7rbmxkpn">
         <w:r>
           <w:rPr>
             <w:color w:val="315CBB"/>
@@ -1221,7 +1221,7 @@
       <w:pPr>
         <w:spacing w:after="80" w:before="0" w:line="300"/>
       </w:pPr>
-      <w:hyperlink w:history="1" r:id="rIdsbqgcy9ycs8wkbhmxwk6n">
+      <w:hyperlink w:history="1" r:id="rIdgdwkwek_12xkqslagvonq">
         <w:r>
           <w:rPr>
             <w:color w:val="315CBB"/>
@@ -1544,7 +1544,7 @@
       <w:pPr>
         <w:spacing w:after="80" w:before="80" w:line="300"/>
       </w:pPr>
-      <w:hyperlink w:history="1" r:id="rIdwgq-mmdushbsplvihlumq">
+      <w:hyperlink w:history="1" r:id="rIdsr9r_xmruavzcw6l_agmk">
         <w:r>
           <w:rPr>
             <w:color w:val="315CBB"/>
@@ -1562,7 +1562,7 @@
         </w:rPr>
         <w:t xml:space="preserve">   </w:t>
       </w:r>
-      <w:hyperlink w:history="1" r:id="rId7yi5kpblia1yhvekirexk">
+      <w:hyperlink w:history="1" r:id="rId8lunr0mv_-xykch59cjik">
         <w:r>
           <w:rPr>
             <w:color w:val="315CBB"/>
@@ -1685,7 +1685,7 @@
             <w:r>
               <w:br/>
             </w:r>
-            <w:hyperlink w:history="1" r:id="rId6zompslerofvb6aqzco8b">
+            <w:hyperlink w:history="1" r:id="rIdxhhcq9gt1rt5d5rskjuil">
               <w:r>
                 <w:rPr>
                   <w:color w:val="315CBB"/>
@@ -1698,7 +1698,7 @@
             <w:r>
               <w:br/>
             </w:r>
-            <w:hyperlink w:history="1" r:id="rIdcszeweivj6f50zgo8q9j8">
+            <w:hyperlink w:history="1" r:id="rIdlv5f-8lenbgtlmra5uhqr">
               <w:r>
                 <w:rPr>
                   <w:color w:val="315CBB"/>
@@ -1988,7 +1988,7 @@
             <w:pPr>
               <w:spacing w:after="80" w:before="80" w:line="300"/>
             </w:pPr>
-            <w:hyperlink w:history="1" r:id="rIdmkjns8ztazkfjuzwhcvso">
+            <w:hyperlink w:history="1" r:id="rId2fhnfiqyyft_xh0ny61vc">
               <w:r>
                 <w:rPr>
                   <w:color w:val="315CBB"/>
@@ -2006,7 +2006,7 @@
               </w:rPr>
               <w:t xml:space="preserve">   </w:t>
             </w:r>
-            <w:hyperlink w:history="1" r:id="rIdktcpcrpmkvva09ag60ofw">
+            <w:hyperlink w:history="1" r:id="rId43sp0e4zzovbsutzluuuh">
               <w:r>
                 <w:rPr>
                   <w:color w:val="315CBB"/>
@@ -2024,7 +2024,7 @@
               </w:rPr>
               <w:t xml:space="preserve">   </w:t>
             </w:r>
-            <w:hyperlink w:history="1" r:id="rId5369or_4v-a4keopmy3rt">
+            <w:hyperlink w:history="1" r:id="rIduvyj7do0vwsl3mk-stwa_">
               <w:r>
                 <w:rPr>
                   <w:color w:val="315CBB"/>
@@ -2492,7 +2492,7 @@
             <w:pPr>
               <w:spacing w:after="80" w:before="0" w:line="300"/>
             </w:pPr>
-            <w:hyperlink w:history="1" r:id="rIdgyys6vv613bst2fws_ws9">
+            <w:hyperlink w:history="1" r:id="rIdyjlgb7d4dxef95xvyokcv">
               <w:r>
                 <w:rPr>
                   <w:color w:val="315CBB"/>

</xml_diff>

<commit_message>
Link only the Fruition AI repository, dropping local-pilot
Co-Authored-By: Claude Opus 5.5 (1M context) <noreply@anthropic.com>
</commit_message>
<xml_diff>
--- a/site/en/resume.docx
+++ b/site/en/resume.docx
@@ -102,7 +102,7 @@
             <w:pPr>
               <w:spacing w:after="80" w:before="80" w:line="300"/>
             </w:pPr>
-            <w:hyperlink w:history="1" r:id="rIdsntpn4akqdj1-_q0g2qdz">
+            <w:hyperlink w:history="1" r:id="rIdw7zqoeupbfz1oj5xmyff5">
               <w:r>
                 <w:rPr>
                   <w:color w:val="315CBB"/>
@@ -120,7 +120,7 @@
               </w:rPr>
               <w:t xml:space="preserve">   </w:t>
             </w:r>
-            <w:hyperlink w:history="1" r:id="rIdwilj9mgird8vrl760flwu">
+            <w:hyperlink w:history="1" r:id="rIdmz1t8mdu3uy-gifwwqn1x">
               <w:r>
                 <w:rPr>
                   <w:color w:val="315CBB"/>
@@ -138,7 +138,7 @@
               </w:rPr>
               <w:t xml:space="preserve">   </w:t>
             </w:r>
-            <w:hyperlink w:history="1" r:id="rIdvmyxpbs0xlw6solprrle6">
+            <w:hyperlink w:history="1" r:id="rIdmvoel5zq7iuk9lcmlfw-7">
               <w:r>
                 <w:rPr>
                   <w:color w:val="315CBB"/>
@@ -156,7 +156,7 @@
               </w:rPr>
               <w:t xml:space="preserve">   </w:t>
             </w:r>
-            <w:hyperlink w:history="1" r:id="rIdnqqsssbdjyy0rievpgnbm">
+            <w:hyperlink w:history="1" r:id="rId6qnbvaud9e2mb9y8hwmkc">
               <w:r>
                 <w:rPr>
                   <w:color w:val="315CBB"/>
@@ -402,27 +402,9 @@
     </w:p>
     <w:p>
       <w:pPr>
-        <w:spacing w:after="80" w:before="80" w:line="300"/>
-      </w:pPr>
-      <w:hyperlink w:history="1" r:id="rIdcyrxqw5wenkct8sg2lwty">
-        <w:r>
-          <w:rPr>
-            <w:color w:val="315CBB"/>
-            <w:sz w:val="20"/>
-            <w:szCs w:val="20"/>
-          </w:rPr>
-          <w:t xml:space="preserve">GitHub · local-pilot ↗</w:t>
-        </w:r>
-      </w:hyperlink>
-      <w:r>
-        <w:rPr>
-          <w:color w:val="203047"/>
-          <w:sz w:val="20"/>
-          <w:szCs w:val="20"/>
-        </w:rPr>
-        <w:t xml:space="preserve">   </w:t>
-      </w:r>
-      <w:hyperlink w:history="1" r:id="rId7kgkdpe5bh3itcowvd0qv">
+        <w:spacing w:after="80" w:before="0" w:line="300"/>
+      </w:pPr>
+      <w:hyperlink w:history="1" r:id="rIdeu3vfyqsdam5hafhoejou">
         <w:r>
           <w:rPr>
             <w:color w:val="315CBB"/>
@@ -432,14 +414,6 @@
           <w:t xml:space="preserve">GitHub · AI repository ↗</w:t>
         </w:r>
       </w:hyperlink>
-      <w:r>
-        <w:rPr>
-          <w:color w:val="203047"/>
-          <w:sz w:val="20"/>
-          <w:szCs w:val="20"/>
-        </w:rPr>
-        <w:t xml:space="preserve">   </w:t>
-      </w:r>
     </w:p>
     <w:p>
       <w:pPr>
@@ -1020,7 +994,7 @@
       <w:pPr>
         <w:spacing w:after="80" w:before="80" w:line="300"/>
       </w:pPr>
-      <w:hyperlink w:history="1" r:id="rIdtgf2ze9hmfrzl9kq0k-vz">
+      <w:hyperlink w:history="1" r:id="rId6b_ovhd6x4twzv0fwky8p">
         <w:r>
           <w:rPr>
             <w:color w:val="315CBB"/>
@@ -1038,7 +1012,7 @@
         </w:rPr>
         <w:t xml:space="preserve">   </w:t>
       </w:r>
-      <w:hyperlink w:history="1" r:id="rIdy52dwwsvpdm-d2-ubg4-9">
+      <w:hyperlink w:history="1" r:id="rIdgnt6g9y73gbo3ipppo4ej">
         <w:r>
           <w:rPr>
             <w:color w:val="315CBB"/>
@@ -1056,7 +1030,7 @@
         </w:rPr>
         <w:t xml:space="preserve">   </w:t>
       </w:r>
-      <w:hyperlink w:history="1" r:id="rIdjw3pb2yplzhvdyc3e7sc4">
+      <w:hyperlink w:history="1" r:id="rIdruwh_thi9coqjbtsi23od">
         <w:r>
           <w:rPr>
             <w:color w:val="315CBB"/>
@@ -1074,7 +1048,7 @@
         </w:rPr>
         <w:t xml:space="preserve">   </w:t>
       </w:r>
-      <w:hyperlink w:history="1" r:id="rIdmvnod5rzitulm7rbmxkpn">
+      <w:hyperlink w:history="1" r:id="rIdecs0l4f7oije0ponacjb6">
         <w:r>
           <w:rPr>
             <w:color w:val="315CBB"/>
@@ -1221,7 +1195,7 @@
       <w:pPr>
         <w:spacing w:after="80" w:before="0" w:line="300"/>
       </w:pPr>
-      <w:hyperlink w:history="1" r:id="rIdgdwkwek_12xkqslagvonq">
+      <w:hyperlink w:history="1" r:id="rId63axvxoy-fg7wmlmffgvx">
         <w:r>
           <w:rPr>
             <w:color w:val="315CBB"/>
@@ -1544,7 +1518,7 @@
       <w:pPr>
         <w:spacing w:after="80" w:before="80" w:line="300"/>
       </w:pPr>
-      <w:hyperlink w:history="1" r:id="rIdsr9r_xmruavzcw6l_agmk">
+      <w:hyperlink w:history="1" r:id="rIduwyve9qveqitkqgcjgls6">
         <w:r>
           <w:rPr>
             <w:color w:val="315CBB"/>
@@ -1562,7 +1536,7 @@
         </w:rPr>
         <w:t xml:space="preserve">   </w:t>
       </w:r>
-      <w:hyperlink w:history="1" r:id="rId8lunr0mv_-xykch59cjik">
+      <w:hyperlink w:history="1" r:id="rIdklfpvqjcvkeoqzpzejrnq">
         <w:r>
           <w:rPr>
             <w:color w:val="315CBB"/>
@@ -1685,7 +1659,7 @@
             <w:r>
               <w:br/>
             </w:r>
-            <w:hyperlink w:history="1" r:id="rIdxhhcq9gt1rt5d5rskjuil">
+            <w:hyperlink w:history="1" r:id="rIdjh8tdraon3li5c0szfidu">
               <w:r>
                 <w:rPr>
                   <w:color w:val="315CBB"/>
@@ -1698,7 +1672,7 @@
             <w:r>
               <w:br/>
             </w:r>
-            <w:hyperlink w:history="1" r:id="rIdlv5f-8lenbgtlmra5uhqr">
+            <w:hyperlink w:history="1" r:id="rIdp5eefj29b5fd_grbjrezs">
               <w:r>
                 <w:rPr>
                   <w:color w:val="315CBB"/>
@@ -1988,7 +1962,7 @@
             <w:pPr>
               <w:spacing w:after="80" w:before="80" w:line="300"/>
             </w:pPr>
-            <w:hyperlink w:history="1" r:id="rId2fhnfiqyyft_xh0ny61vc">
+            <w:hyperlink w:history="1" r:id="rIdtinvlsdm0paxkjdo-vqi9">
               <w:r>
                 <w:rPr>
                   <w:color w:val="315CBB"/>
@@ -2006,7 +1980,7 @@
               </w:rPr>
               <w:t xml:space="preserve">   </w:t>
             </w:r>
-            <w:hyperlink w:history="1" r:id="rId43sp0e4zzovbsutzluuuh">
+            <w:hyperlink w:history="1" r:id="rIdduxmx2rsjc9-mod1e2syv">
               <w:r>
                 <w:rPr>
                   <w:color w:val="315CBB"/>
@@ -2024,7 +1998,7 @@
               </w:rPr>
               <w:t xml:space="preserve">   </w:t>
             </w:r>
-            <w:hyperlink w:history="1" r:id="rIduvyj7do0vwsl3mk-stwa_">
+            <w:hyperlink w:history="1" r:id="rIdhs02rbfhrwakhoa-nyled">
               <w:r>
                 <w:rPr>
                   <w:color w:val="315CBB"/>
@@ -2492,7 +2466,7 @@
             <w:pPr>
               <w:spacing w:after="80" w:before="0" w:line="300"/>
             </w:pPr>
-            <w:hyperlink w:history="1" r:id="rIdyjlgb7d4dxef95xvyokcv">
+            <w:hyperlink w:history="1" r:id="rId064eoua5yzcccnpvdm4rp">
               <w:r>
                 <w:rPr>
                   <w:color w:val="315CBB"/>

</xml_diff>

<commit_message>
Title the portfolio with the home tagline and rewrite the profile lines
Replace "JH's PORTFOLIO" with the home page's developer tagline, and say
that I keep moving toward the best answer through repeated failures.

Co-Authored-By: Claude Opus 5.5 (1M context) <noreply@anthropic.com>
</commit_message>
<xml_diff>
--- a/site/en/resume.docx
+++ b/site/en/resume.docx
@@ -102,7 +102,7 @@
             <w:pPr>
               <w:spacing w:after="80" w:before="80" w:line="300"/>
             </w:pPr>
-            <w:hyperlink w:history="1" r:id="rIdw7zqoeupbfz1oj5xmyff5">
+            <w:hyperlink w:history="1" r:id="rIdk8pvpe29d4gzfovkqc_fs">
               <w:r>
                 <w:rPr>
                   <w:color w:val="315CBB"/>
@@ -120,7 +120,7 @@
               </w:rPr>
               <w:t xml:space="preserve">   </w:t>
             </w:r>
-            <w:hyperlink w:history="1" r:id="rIdmz1t8mdu3uy-gifwwqn1x">
+            <w:hyperlink w:history="1" r:id="rIdo-cnqcwi3viv67wwo7621">
               <w:r>
                 <w:rPr>
                   <w:color w:val="315CBB"/>
@@ -138,7 +138,7 @@
               </w:rPr>
               <w:t xml:space="preserve">   </w:t>
             </w:r>
-            <w:hyperlink w:history="1" r:id="rIdmvoel5zq7iuk9lcmlfw-7">
+            <w:hyperlink w:history="1" r:id="rIddwu08cjfmzgvhrt7snxyp">
               <w:r>
                 <w:rPr>
                   <w:color w:val="315CBB"/>
@@ -156,7 +156,7 @@
               </w:rPr>
               <w:t xml:space="preserve">   </w:t>
             </w:r>
-            <w:hyperlink w:history="1" r:id="rId6qnbvaud9e2mb9y8hwmkc">
+            <w:hyperlink w:history="1" r:id="rIdznob9uyrwaqiqg_wljxjx">
               <w:r>
                 <w:rPr>
                   <w:color w:val="315CBB"/>
@@ -404,7 +404,7 @@
       <w:pPr>
         <w:spacing w:after="80" w:before="0" w:line="300"/>
       </w:pPr>
-      <w:hyperlink w:history="1" r:id="rIdeu3vfyqsdam5hafhoejou">
+      <w:hyperlink w:history="1" r:id="rIdb6xpevbedtpy7afksunz_">
         <w:r>
           <w:rPr>
             <w:color w:val="315CBB"/>
@@ -994,7 +994,7 @@
       <w:pPr>
         <w:spacing w:after="80" w:before="80" w:line="300"/>
       </w:pPr>
-      <w:hyperlink w:history="1" r:id="rId6b_ovhd6x4twzv0fwky8p">
+      <w:hyperlink w:history="1" r:id="rId7m6qqq1ffallcx-c1rhno">
         <w:r>
           <w:rPr>
             <w:color w:val="315CBB"/>
@@ -1012,7 +1012,7 @@
         </w:rPr>
         <w:t xml:space="preserve">   </w:t>
       </w:r>
-      <w:hyperlink w:history="1" r:id="rIdgnt6g9y73gbo3ipppo4ej">
+      <w:hyperlink w:history="1" r:id="rId9pyjfbxj-jkitgaiviqfm">
         <w:r>
           <w:rPr>
             <w:color w:val="315CBB"/>
@@ -1030,7 +1030,7 @@
         </w:rPr>
         <w:t xml:space="preserve">   </w:t>
       </w:r>
-      <w:hyperlink w:history="1" r:id="rIdruwh_thi9coqjbtsi23od">
+      <w:hyperlink w:history="1" r:id="rIdc4szwstlkmiyh8jrfmx4h">
         <w:r>
           <w:rPr>
             <w:color w:val="315CBB"/>
@@ -1048,7 +1048,7 @@
         </w:rPr>
         <w:t xml:space="preserve">   </w:t>
       </w:r>
-      <w:hyperlink w:history="1" r:id="rIdecs0l4f7oije0ponacjb6">
+      <w:hyperlink w:history="1" r:id="rIdk-st-5wjacpgsu7nbirs_">
         <w:r>
           <w:rPr>
             <w:color w:val="315CBB"/>
@@ -1195,7 +1195,7 @@
       <w:pPr>
         <w:spacing w:after="80" w:before="0" w:line="300"/>
       </w:pPr>
-      <w:hyperlink w:history="1" r:id="rId63axvxoy-fg7wmlmffgvx">
+      <w:hyperlink w:history="1" r:id="rIduvzjiq795klp452hssaue">
         <w:r>
           <w:rPr>
             <w:color w:val="315CBB"/>
@@ -1518,7 +1518,7 @@
       <w:pPr>
         <w:spacing w:after="80" w:before="80" w:line="300"/>
       </w:pPr>
-      <w:hyperlink w:history="1" r:id="rIduwyve9qveqitkqgcjgls6">
+      <w:hyperlink w:history="1" r:id="rIdmnqwjpw8gw7dci_-_pa81">
         <w:r>
           <w:rPr>
             <w:color w:val="315CBB"/>
@@ -1536,7 +1536,7 @@
         </w:rPr>
         <w:t xml:space="preserve">   </w:t>
       </w:r>
-      <w:hyperlink w:history="1" r:id="rIdklfpvqjcvkeoqzpzejrnq">
+      <w:hyperlink w:history="1" r:id="rIdy8zgwqanwwbb9md5qoqzq">
         <w:r>
           <w:rPr>
             <w:color w:val="315CBB"/>
@@ -1659,7 +1659,7 @@
             <w:r>
               <w:br/>
             </w:r>
-            <w:hyperlink w:history="1" r:id="rIdjh8tdraon3li5c0szfidu">
+            <w:hyperlink w:history="1" r:id="rIdfws90k-0oogspmygppf_w">
               <w:r>
                 <w:rPr>
                   <w:color w:val="315CBB"/>
@@ -1672,7 +1672,7 @@
             <w:r>
               <w:br/>
             </w:r>
-            <w:hyperlink w:history="1" r:id="rIdp5eefj29b5fd_grbjrezs">
+            <w:hyperlink w:history="1" r:id="rIdt1vayhvfi8fpfzc2eceyl">
               <w:r>
                 <w:rPr>
                   <w:color w:val="315CBB"/>
@@ -1962,7 +1962,7 @@
             <w:pPr>
               <w:spacing w:after="80" w:before="80" w:line="300"/>
             </w:pPr>
-            <w:hyperlink w:history="1" r:id="rIdtinvlsdm0paxkjdo-vqi9">
+            <w:hyperlink w:history="1" r:id="rIdmndn6a0cbdjeiy0nbto-l">
               <w:r>
                 <w:rPr>
                   <w:color w:val="315CBB"/>
@@ -1980,7 +1980,7 @@
               </w:rPr>
               <w:t xml:space="preserve">   </w:t>
             </w:r>
-            <w:hyperlink w:history="1" r:id="rIdduxmx2rsjc9-mod1e2syv">
+            <w:hyperlink w:history="1" r:id="rIdpkl1psfff0iba1lsqmxwq">
               <w:r>
                 <w:rPr>
                   <w:color w:val="315CBB"/>
@@ -1998,7 +1998,7 @@
               </w:rPr>
               <w:t xml:space="preserve">   </w:t>
             </w:r>
-            <w:hyperlink w:history="1" r:id="rIdhs02rbfhrwakhoa-nyled">
+            <w:hyperlink w:history="1" r:id="rId361-rgodkoxfxrifpcijw">
               <w:r>
                 <w:rPr>
                   <w:color w:val="315CBB"/>
@@ -2466,7 +2466,7 @@
             <w:pPr>
               <w:spacing w:after="80" w:before="0" w:line="300"/>
             </w:pPr>
-            <w:hyperlink w:history="1" r:id="rId064eoua5yzcccnpvdm4rp">
+            <w:hyperlink w:history="1" r:id="rIdhgp5svf39wrwc5uh0liq9">
               <w:r>
                 <w:rPr>
                   <w:color w:val="315CBB"/>

</xml_diff>

<commit_message>
Keep UTM parameters in the page URL reported to analytics
GA4 attributes campaigns from page_location; stripping the whole query left
it relying only on the separate campaign fields. Other query values are
still dropped.

Co-Authored-By: Claude Opus 5.5 (1M context) <noreply@anthropic.com>
</commit_message>
<xml_diff>
--- a/site/en/resume.docx
+++ b/site/en/resume.docx
@@ -102,7 +102,7 @@
             <w:pPr>
               <w:spacing w:after="80" w:before="80" w:line="300"/>
             </w:pPr>
-            <w:hyperlink w:history="1" r:id="rIdk8pvpe29d4gzfovkqc_fs">
+            <w:hyperlink w:history="1" r:id="rIdyzrng7samlb0lzferceqz">
               <w:r>
                 <w:rPr>
                   <w:color w:val="315CBB"/>
@@ -120,7 +120,7 @@
               </w:rPr>
               <w:t xml:space="preserve">   </w:t>
             </w:r>
-            <w:hyperlink w:history="1" r:id="rIdo-cnqcwi3viv67wwo7621">
+            <w:hyperlink w:history="1" r:id="rIdz4uopn42ugb5tghoi2zwr">
               <w:r>
                 <w:rPr>
                   <w:color w:val="315CBB"/>
@@ -138,7 +138,7 @@
               </w:rPr>
               <w:t xml:space="preserve">   </w:t>
             </w:r>
-            <w:hyperlink w:history="1" r:id="rIddwu08cjfmzgvhrt7snxyp">
+            <w:hyperlink w:history="1" r:id="rIdreze7pnittp6oq2xxihgb">
               <w:r>
                 <w:rPr>
                   <w:color w:val="315CBB"/>
@@ -156,7 +156,7 @@
               </w:rPr>
               <w:t xml:space="preserve">   </w:t>
             </w:r>
-            <w:hyperlink w:history="1" r:id="rIdznob9uyrwaqiqg_wljxjx">
+            <w:hyperlink w:history="1" r:id="rIdxjvnklwcnqz5ukhplsxvp">
               <w:r>
                 <w:rPr>
                   <w:color w:val="315CBB"/>
@@ -404,7 +404,7 @@
       <w:pPr>
         <w:spacing w:after="80" w:before="0" w:line="300"/>
       </w:pPr>
-      <w:hyperlink w:history="1" r:id="rIdb6xpevbedtpy7afksunz_">
+      <w:hyperlink w:history="1" r:id="rIdncj4nrhdvf2c8ufwk1snu">
         <w:r>
           <w:rPr>
             <w:color w:val="315CBB"/>
@@ -994,7 +994,7 @@
       <w:pPr>
         <w:spacing w:after="80" w:before="80" w:line="300"/>
       </w:pPr>
-      <w:hyperlink w:history="1" r:id="rId7m6qqq1ffallcx-c1rhno">
+      <w:hyperlink w:history="1" r:id="rIdrsbnaq8qiawlysykcadmq">
         <w:r>
           <w:rPr>
             <w:color w:val="315CBB"/>
@@ -1012,7 +1012,7 @@
         </w:rPr>
         <w:t xml:space="preserve">   </w:t>
       </w:r>
-      <w:hyperlink w:history="1" r:id="rId9pyjfbxj-jkitgaiviqfm">
+      <w:hyperlink w:history="1" r:id="rIdhlk3lj8a1p_47wm4i77y3">
         <w:r>
           <w:rPr>
             <w:color w:val="315CBB"/>
@@ -1030,7 +1030,7 @@
         </w:rPr>
         <w:t xml:space="preserve">   </w:t>
       </w:r>
-      <w:hyperlink w:history="1" r:id="rIdc4szwstlkmiyh8jrfmx4h">
+      <w:hyperlink w:history="1" r:id="rId0oo1yitqzbavazhmablhi">
         <w:r>
           <w:rPr>
             <w:color w:val="315CBB"/>
@@ -1048,7 +1048,7 @@
         </w:rPr>
         <w:t xml:space="preserve">   </w:t>
       </w:r>
-      <w:hyperlink w:history="1" r:id="rIdk-st-5wjacpgsu7nbirs_">
+      <w:hyperlink w:history="1" r:id="rIddic0qxa59g-wqq2fapp1a">
         <w:r>
           <w:rPr>
             <w:color w:val="315CBB"/>
@@ -1195,7 +1195,7 @@
       <w:pPr>
         <w:spacing w:after="80" w:before="0" w:line="300"/>
       </w:pPr>
-      <w:hyperlink w:history="1" r:id="rIduvzjiq795klp452hssaue">
+      <w:hyperlink w:history="1" r:id="rIdof6w5haqrkdnnfs85v8kh">
         <w:r>
           <w:rPr>
             <w:color w:val="315CBB"/>
@@ -1518,7 +1518,7 @@
       <w:pPr>
         <w:spacing w:after="80" w:before="80" w:line="300"/>
       </w:pPr>
-      <w:hyperlink w:history="1" r:id="rIdmnqwjpw8gw7dci_-_pa81">
+      <w:hyperlink w:history="1" r:id="rIdh4nmjwzxpw_pzrg-sods7">
         <w:r>
           <w:rPr>
             <w:color w:val="315CBB"/>
@@ -1536,7 +1536,7 @@
         </w:rPr>
         <w:t xml:space="preserve">   </w:t>
       </w:r>
-      <w:hyperlink w:history="1" r:id="rIdy8zgwqanwwbb9md5qoqzq">
+      <w:hyperlink w:history="1" r:id="rIdweptfkcn42bviktekpblp">
         <w:r>
           <w:rPr>
             <w:color w:val="315CBB"/>
@@ -1659,7 +1659,7 @@
             <w:r>
               <w:br/>
             </w:r>
-            <w:hyperlink w:history="1" r:id="rIdfws90k-0oogspmygppf_w">
+            <w:hyperlink w:history="1" r:id="rIdi2n8c-2blukyxr149mnrn">
               <w:r>
                 <w:rPr>
                   <w:color w:val="315CBB"/>
@@ -1672,7 +1672,7 @@
             <w:r>
               <w:br/>
             </w:r>
-            <w:hyperlink w:history="1" r:id="rIdt1vayhvfi8fpfzc2eceyl">
+            <w:hyperlink w:history="1" r:id="rIdqpts3lafesfepho4v2vof">
               <w:r>
                 <w:rPr>
                   <w:color w:val="315CBB"/>
@@ -1962,7 +1962,7 @@
             <w:pPr>
               <w:spacing w:after="80" w:before="80" w:line="300"/>
             </w:pPr>
-            <w:hyperlink w:history="1" r:id="rIdmndn6a0cbdjeiy0nbto-l">
+            <w:hyperlink w:history="1" r:id="rIddjo3oko7bhvrod1vy4eus">
               <w:r>
                 <w:rPr>
                   <w:color w:val="315CBB"/>
@@ -1980,7 +1980,7 @@
               </w:rPr>
               <w:t xml:space="preserve">   </w:t>
             </w:r>
-            <w:hyperlink w:history="1" r:id="rIdpkl1psfff0iba1lsqmxwq">
+            <w:hyperlink w:history="1" r:id="rIdoh6zd_rsz5hcwrvqllhx9">
               <w:r>
                 <w:rPr>
                   <w:color w:val="315CBB"/>
@@ -1998,7 +1998,7 @@
               </w:rPr>
               <w:t xml:space="preserve">   </w:t>
             </w:r>
-            <w:hyperlink w:history="1" r:id="rId361-rgodkoxfxrifpcijw">
+            <w:hyperlink w:history="1" r:id="rIdvjynem8era9gnldochjuj">
               <w:r>
                 <w:rPr>
                   <w:color w:val="315CBB"/>
@@ -2466,7 +2466,7 @@
             <w:pPr>
               <w:spacing w:after="80" w:before="0" w:line="300"/>
             </w:pPr>
-            <w:hyperlink w:history="1" r:id="rIdhgp5svf39wrwc5uh0liq9">
+            <w:hyperlink w:history="1" r:id="rIddqhmlyzwrmevtjfcozo2h">
               <w:r>
                 <w:rPr>
                   <w:color w:val="315CBB"/>

</xml_diff>

<commit_message>
Lead with execution-environment design and state the Fruition QA status
Retarget the framing for AI platform roles, where Spring is not part of the
stack but agent execution environments are:

- Swap Spring for execution-environment design in the cover keyword line and
  put the agent axis first
- Rename CASE 04 to name the execution environment, and promote the
  AI/code/user responsibility split from the closing slide to the opening one
- Surface the 300-job queue replay as a headline reliability result instead of
  burying it mid-paragraph, and give it its own paragraph
- Define Jev on first mention and lead with the JSON and GPT-5-nano baselines
  it was measured against
- State that Fruition is deployed on AWS EKS and in QA

Also fix the resume page count in the README: PDF and Word are 3 pages, not 4.

Co-Authored-By: Claude Opus 5 (1M context) <noreply@anthropic.com>
</commit_message>
<xml_diff>
--- a/site/en/resume.docx
+++ b/site/en/resume.docx
@@ -102,7 +102,7 @@
             <w:pPr>
               <w:spacing w:after="80" w:before="80" w:line="300"/>
             </w:pPr>
-            <w:hyperlink w:history="1" r:id="rIdyzrng7samlb0lzferceqz">
+            <w:hyperlink w:history="1" r:id="rIdddnsslggimr6j3smh04rg">
               <w:r>
                 <w:rPr>
                   <w:color w:val="315CBB"/>
@@ -120,7 +120,7 @@
               </w:rPr>
               <w:t xml:space="preserve">   </w:t>
             </w:r>
-            <w:hyperlink w:history="1" r:id="rIdz4uopn42ugb5tghoi2zwr">
+            <w:hyperlink w:history="1" r:id="rIdgqmtw7omenobfnyyhswtw">
               <w:r>
                 <w:rPr>
                   <w:color w:val="315CBB"/>
@@ -138,7 +138,7 @@
               </w:rPr>
               <w:t xml:space="preserve">   </w:t>
             </w:r>
-            <w:hyperlink w:history="1" r:id="rIdreze7pnittp6oq2xxihgb">
+            <w:hyperlink w:history="1" r:id="rIdlu5srcxa9tnfxpgtamxg6">
               <w:r>
                 <w:rPr>
                   <w:color w:val="315CBB"/>
@@ -156,7 +156,7 @@
               </w:rPr>
               <w:t xml:space="preserve">   </w:t>
             </w:r>
-            <w:hyperlink w:history="1" r:id="rIdxjvnklwcnqz5ukhplsxvp">
+            <w:hyperlink w:history="1" r:id="rIdafplk-gjo_awooq_t4iq_">
               <w:r>
                 <w:rPr>
                   <w:color w:val="315CBB"/>
@@ -362,7 +362,7 @@
           <w:sz w:val="18"/>
           <w:szCs w:val="18"/>
         </w:rPr>
-        <w:t xml:space="preserve">LLM Wiki-based AI workspace · AI SW Maestro, 17th cohort</w:t>
+        <w:t xml:space="preserve">LLM Wiki-based AI workspace · AI SW Maestro, 17th cohort · Deployed on AWS EKS, in QA</w:t>
       </w:r>
       <w:r>
         <w:br/>
@@ -404,7 +404,7 @@
       <w:pPr>
         <w:spacing w:after="80" w:before="0" w:line="300"/>
       </w:pPr>
-      <w:hyperlink w:history="1" r:id="rIdncj4nrhdvf2c8ufwk1snu">
+      <w:hyperlink w:history="1" r:id="rId_nq6gwkx8ffq4csvhrhdl">
         <w:r>
           <w:rPr>
             <w:color w:val="315CBB"/>
@@ -893,7 +893,7 @@
           <w:sz w:val="20"/>
           <w:szCs w:val="20"/>
         </w:rPr>
-        <w:t xml:space="preserve"> Applied Jev to select task types and additional conditions for questions, edits, document creation and folder organization.</w:t>
+        <w:t xml:space="preserve"> Applied Jev, a model that picks only from a fixed set of options, to select task types and additional conditions for questions, edits, document creation and folder organization.</w:t>
       </w:r>
       <w:r>
         <w:br/>
@@ -914,7 +914,7 @@
           <w:sz w:val="20"/>
           <w:szCs w:val="20"/>
         </w:rPr>
-        <w:t xml:space="preserve"> Fully correct decisions on the same 98 requests rose from 77 to 81. Median decision time fell from 8.967s to 0.658s.</w:t>
+        <w:t xml:space="preserve"> Fully correct decisions on the same 98 requests rose from 77 to 81 (63 for GPT-5-nano on the same options). Median decision time fell from 8.967s to 0.658s.</w:t>
       </w:r>
     </w:p>
     <w:p>
@@ -994,7 +994,7 @@
       <w:pPr>
         <w:spacing w:after="80" w:before="80" w:line="300"/>
       </w:pPr>
-      <w:hyperlink w:history="1" r:id="rIdrsbnaq8qiawlysykcadmq">
+      <w:hyperlink w:history="1" r:id="rIdpsit5kw2gc_gmtox2mxuy">
         <w:r>
           <w:rPr>
             <w:color w:val="315CBB"/>
@@ -1012,7 +1012,7 @@
         </w:rPr>
         <w:t xml:space="preserve">   </w:t>
       </w:r>
-      <w:hyperlink w:history="1" r:id="rIdhlk3lj8a1p_47wm4i77y3">
+      <w:hyperlink w:history="1" r:id="rIdpm6jhawbnoona1gakbffu">
         <w:r>
           <w:rPr>
             <w:color w:val="315CBB"/>
@@ -1030,14 +1030,14 @@
         </w:rPr>
         <w:t xml:space="preserve">   </w:t>
       </w:r>
-      <w:hyperlink w:history="1" r:id="rId0oo1yitqzbavazhmablhi">
+      <w:hyperlink w:history="1" r:id="rIdxmtyquz2xl5ndnntl5m65">
         <w:r>
           <w:rPr>
             <w:color w:val="315CBB"/>
             <w:sz w:val="20"/>
             <w:szCs w:val="20"/>
           </w:rPr>
-          <w:t xml:space="preserve">Agent Skill design ↗</w:t>
+          <w:t xml:space="preserve">Agent execution environment ↗</w:t>
         </w:r>
       </w:hyperlink>
       <w:r>
@@ -1048,7 +1048,7 @@
         </w:rPr>
         <w:t xml:space="preserve">   </w:t>
       </w:r>
-      <w:hyperlink w:history="1" r:id="rIddic0qxa59g-wqq2fapp1a">
+      <w:hyperlink w:history="1" r:id="rIdhtycwopvwnwodhcftk5w7">
         <w:r>
           <w:rPr>
             <w:color w:val="315CBB"/>
@@ -1195,7 +1195,7 @@
       <w:pPr>
         <w:spacing w:after="80" w:before="0" w:line="300"/>
       </w:pPr>
-      <w:hyperlink w:history="1" r:id="rIdof6w5haqrkdnnfs85v8kh">
+      <w:hyperlink w:history="1" r:id="rIdvizb3rtcmbxluiwsi310a">
         <w:r>
           <w:rPr>
             <w:color w:val="315CBB"/>
@@ -1518,7 +1518,7 @@
       <w:pPr>
         <w:spacing w:after="80" w:before="80" w:line="300"/>
       </w:pPr>
-      <w:hyperlink w:history="1" r:id="rIdh4nmjwzxpw_pzrg-sods7">
+      <w:hyperlink w:history="1" r:id="rIdewlqzcucran2vjp2c5uyx">
         <w:r>
           <w:rPr>
             <w:color w:val="315CBB"/>
@@ -1536,7 +1536,7 @@
         </w:rPr>
         <w:t xml:space="preserve">   </w:t>
       </w:r>
-      <w:hyperlink w:history="1" r:id="rIdweptfkcn42bviktekpblp">
+      <w:hyperlink w:history="1" r:id="rId4yu45csop6e-bvluljqoe">
         <w:r>
           <w:rPr>
             <w:color w:val="315CBB"/>
@@ -1659,7 +1659,7 @@
             <w:r>
               <w:br/>
             </w:r>
-            <w:hyperlink w:history="1" r:id="rIdi2n8c-2blukyxr149mnrn">
+            <w:hyperlink w:history="1" r:id="rIdtiej5zsjtj3fanbwlz_o8">
               <w:r>
                 <w:rPr>
                   <w:color w:val="315CBB"/>
@@ -1672,7 +1672,7 @@
             <w:r>
               <w:br/>
             </w:r>
-            <w:hyperlink w:history="1" r:id="rIdqpts3lafesfepho4v2vof">
+            <w:hyperlink w:history="1" r:id="rIdwir0wjq_9a7fwnx-kd-ch">
               <w:r>
                 <w:rPr>
                   <w:color w:val="315CBB"/>
@@ -1962,7 +1962,7 @@
             <w:pPr>
               <w:spacing w:after="80" w:before="80" w:line="300"/>
             </w:pPr>
-            <w:hyperlink w:history="1" r:id="rIddjo3oko7bhvrod1vy4eus">
+            <w:hyperlink w:history="1" r:id="rIdsmzqbilfrcb5yabwf719m">
               <w:r>
                 <w:rPr>
                   <w:color w:val="315CBB"/>
@@ -1980,7 +1980,7 @@
               </w:rPr>
               <w:t xml:space="preserve">   </w:t>
             </w:r>
-            <w:hyperlink w:history="1" r:id="rIdoh6zd_rsz5hcwrvqllhx9">
+            <w:hyperlink w:history="1" r:id="rIdwwjasgazms8wa8nq_vwe-">
               <w:r>
                 <w:rPr>
                   <w:color w:val="315CBB"/>
@@ -1998,7 +1998,7 @@
               </w:rPr>
               <w:t xml:space="preserve">   </w:t>
             </w:r>
-            <w:hyperlink w:history="1" r:id="rIdvjynem8era9gnldochjuj">
+            <w:hyperlink w:history="1" r:id="rIdkq4dtqgac0gv9lr8gzdcp">
               <w:r>
                 <w:rPr>
                   <w:color w:val="315CBB"/>
@@ -2466,7 +2466,7 @@
             <w:pPr>
               <w:spacing w:after="80" w:before="0" w:line="300"/>
             </w:pPr>
-            <w:hyperlink w:history="1" r:id="rIddqhmlyzwrmevtjfcozo2h">
+            <w:hyperlink w:history="1" r:id="rIdjef_dzf_chseqzsfrpks9">
               <w:r>
                 <w:rPr>
                   <w:color w:val="315CBB"/>

</xml_diff>

<commit_message>
Keep the résumé at three pages and fix the byline in the built documents
Adding the new topics pushed the résumé to four pages, but the fourth was a
side effect of layout rather than volume: a forced break before the
activities section left page three nearly empty.

- Drop the forced page break so the sections flow
- Shrink only the award thumbnails in the print flow to reclaim the last
  four lines, so no content is cut to fit
- Fold the Notion documentation bullet into the Pilltip backend bullet
- Carry the AI-first byline into the PDF footer and the DOCX, which still
  read "Backend / AI Application Developer"

Co-Authored-By: Claude Opus 5 (1M context) <noreply@anthropic.com>
</commit_message>
<xml_diff>
--- a/site/en/resume.docx
+++ b/site/en/resume.docx
@@ -46,7 +46,7 @@
                 <w:sz w:val="20"/>
                 <w:szCs w:val="20"/>
               </w:rPr>
-              <w:t xml:space="preserve">Jaehyeong Kim · Backend / AI Application Developer</w:t>
+              <w:t xml:space="preserve">Jaehyeong Kim · AI Application Developer / Backend Engineer</w:t>
             </w:r>
           </w:p>
           <w:p>
@@ -102,7 +102,7 @@
             <w:pPr>
               <w:spacing w:after="80" w:before="80" w:line="300"/>
             </w:pPr>
-            <w:hyperlink w:history="1" r:id="rId54yzai9efcupk5iyr_hpn">
+            <w:hyperlink w:history="1" r:id="rIdt_vbhb5oghe_uy1f6edzr">
               <w:r>
                 <w:rPr>
                   <w:color w:val="315CBB"/>
@@ -120,7 +120,7 @@
               </w:rPr>
               <w:t xml:space="preserve">   </w:t>
             </w:r>
-            <w:hyperlink w:history="1" r:id="rIdpf_byslntofengpb6twfe">
+            <w:hyperlink w:history="1" r:id="rIdqocca5ox7_4wjxn8kk-w3">
               <w:r>
                 <w:rPr>
                   <w:color w:val="315CBB"/>
@@ -138,7 +138,7 @@
               </w:rPr>
               <w:t xml:space="preserve">   </w:t>
             </w:r>
-            <w:hyperlink w:history="1" r:id="rIdugdex5yttll3hezv8rhzx">
+            <w:hyperlink w:history="1" r:id="rId-lxda3wgepbvhht2ttjhl">
               <w:r>
                 <w:rPr>
                   <w:color w:val="315CBB"/>
@@ -156,7 +156,7 @@
               </w:rPr>
               <w:t xml:space="preserve">   </w:t>
             </w:r>
-            <w:hyperlink w:history="1" r:id="rIdr1y6j6ac6vbtinssq-r7r">
+            <w:hyperlink w:history="1" r:id="rIdqwuc5sotof6dk8gzmqbl0">
               <w:r>
                 <w:rPr>
                   <w:color w:val="315CBB"/>
@@ -404,7 +404,7 @@
       <w:pPr>
         <w:spacing w:after="80" w:before="0" w:line="300"/>
       </w:pPr>
-      <w:hyperlink w:history="1" r:id="rIdpmztsmvjtq-s-9dtykc3b">
+      <w:hyperlink w:history="1" r:id="rIdjixq4ysdh7amiemcai_li">
         <w:r>
           <w:rPr>
             <w:color w:val="315CBB"/>
@@ -1169,7 +1169,7 @@
       <w:pPr>
         <w:spacing w:after="80" w:before="80" w:line="300"/>
       </w:pPr>
-      <w:hyperlink w:history="1" r:id="rIdumh5lygtyxdmj4xxjam8t">
+      <w:hyperlink w:history="1" r:id="rIdiq8-zqsho3pixforag28y">
         <w:r>
           <w:rPr>
             <w:color w:val="315CBB"/>
@@ -1187,7 +1187,7 @@
         </w:rPr>
         <w:t xml:space="preserve">   </w:t>
       </w:r>
-      <w:hyperlink w:history="1" r:id="rIdnpvlilf3rpgrfh9uwdaqb">
+      <w:hyperlink w:history="1" r:id="rIdvcdbywjs5vyujpiqhrfwg">
         <w:r>
           <w:rPr>
             <w:color w:val="315CBB"/>
@@ -1205,7 +1205,7 @@
         </w:rPr>
         <w:t xml:space="preserve">   </w:t>
       </w:r>
-      <w:hyperlink w:history="1" r:id="rIdyszuato762zs2k6e-tuio">
+      <w:hyperlink w:history="1" r:id="rIddhjzmvfdn_ebs0ufkfb7e">
         <w:r>
           <w:rPr>
             <w:color w:val="315CBB"/>
@@ -1223,7 +1223,7 @@
         </w:rPr>
         <w:t xml:space="preserve">   </w:t>
       </w:r>
-      <w:hyperlink w:history="1" r:id="rIdxsgelkdtl33afsxfsx5np">
+      <w:hyperlink w:history="1" r:id="rIdhlowghetfovn54uyew-p1">
         <w:r>
           <w:rPr>
             <w:color w:val="315CBB"/>
@@ -1370,7 +1370,7 @@
       <w:pPr>
         <w:spacing w:after="80" w:before="0" w:line="300"/>
       </w:pPr>
-      <w:hyperlink w:history="1" r:id="rIdccad8_-lubb1k4u2azb8n">
+      <w:hyperlink w:history="1" r:id="rIdds0nlu9xqepyi3bbt3k-h">
         <w:r>
           <w:rPr>
             <w:color w:val="315CBB"/>
@@ -1637,7 +1637,7 @@
           <w:sz w:val="20"/>
           <w:szCs w:val="20"/>
         </w:rPr>
-        <w:t xml:space="preserve">Designed the drug DB and implemented drug search, autocomplete and Drug Utilization Review (DUR) risk information with Java and Spring Boot.</w:t>
+        <w:t xml:space="preserve">Designed the drug database on Java and Spring Boot with search, autocomplete and DUR risk display.</w:t>
       </w:r>
     </w:p>
     <w:p>
@@ -1655,7 +1655,36 @@
           <w:sz w:val="20"/>
           <w:szCs w:val="20"/>
         </w:rPr>
-        <w:t xml:space="preserve">Implemented FCM medication reminders and logs, deep-link friend invitations, and family profile switching.</w:t>
+        <w:t xml:space="preserve">Built FCM medication reminders and logs, deep-link friend invites and family profile switching, and kept API docs, meeting notes and ADRs in Notion to share decisions.</w:t>
+      </w:r>
+    </w:p>
+    <w:p>
+      <w:pPr>
+        <w:keepNext/>
+        <w:spacing w:after="80" w:before="240" w:line="276"/>
+      </w:pPr>
+      <w:r>
+        <w:rPr>
+          <w:b/>
+          <w:bCs/>
+          <w:color w:val="315CBB"/>
+          <w:sz w:val="22"/>
+          <w:szCs w:val="22"/>
+        </w:rPr>
+        <w:t xml:space="preserve">Feature work driven by feedback from live exhibitions</w:t>
+      </w:r>
+    </w:p>
+    <w:p>
+      <w:pPr>
+        <w:spacing w:after="80" w:before="0" w:line="300"/>
+      </w:pPr>
+      <w:r>
+        <w:rPr>
+          <w:color w:val="607089"/>
+          <w:sz w:val="18"/>
+          <w:szCs w:val="18"/>
+        </w:rPr>
+        <w:t xml:space="preserve">We ran the booth as Pusan National University’s representative exhibition team, and I fed the feedback we collected into the next slice of work. A request from the first exhibition became a feature within the data we already had.</w:t>
       </w:r>
     </w:p>
     <w:p>
@@ -1673,36 +1702,40 @@
           <w:sz w:val="20"/>
           <w:szCs w:val="20"/>
         </w:rPr>
-        <w:t xml:space="preserve">Shared API documentation, meeting notes and architecture decision records in Notion.</w:t>
-      </w:r>
-    </w:p>
-    <w:p>
-      <w:pPr>
-        <w:keepNext/>
-        <w:spacing w:after="80" w:before="240" w:line="276"/>
-      </w:pPr>
-      <w:r>
-        <w:rPr>
-          <w:b/>
-          <w:bCs/>
-          <w:color w:val="315CBB"/>
-          <w:sz w:val="22"/>
-          <w:szCs w:val="22"/>
-        </w:rPr>
-        <w:t xml:space="preserve">Feature work driven by feedback from live exhibitions</w:t>
-      </w:r>
-    </w:p>
-    <w:p>
-      <w:pPr>
-        <w:spacing w:after="80" w:before="0" w:line="300"/>
-      </w:pPr>
-      <w:r>
-        <w:rPr>
-          <w:color w:val="607089"/>
-          <w:sz w:val="18"/>
-          <w:szCs w:val="18"/>
-        </w:rPr>
-        <w:t xml:space="preserve">We ran the booth as Pusan National University’s representative exhibition team, and I fed the feedback we collected into the next slice of work. A request from the first exhibition became a feature within the data we already had.</w:t>
+        <w:t xml:space="preserve">Extending support to health functional foods</w:t>
+      </w:r>
+      <w:r>
+        <w:br/>
+      </w:r>
+      <w:r>
+        <w:rPr>
+          <w:color w:val="203047"/>
+          <w:sz w:val="20"/>
+          <w:szCs w:val="20"/>
+        </w:rPr>
+        <w:t xml:space="preserve">Feedback: at the first exhibition, visitors asked to check health functional foods alongside prescription drugs.</w:t>
+      </w:r>
+      <w:r>
+        <w:br/>
+      </w:r>
+      <w:r>
+        <w:rPr>
+          <w:color w:val="203047"/>
+          <w:sz w:val="20"/>
+          <w:szCs w:val="20"/>
+        </w:rPr>
+        <w:t xml:space="preserve">What shipped: within the health functional food data we held, I added them to search and autocomplete, surfaced caution and co-administration information, allowed them in medication reminders and logs, and included them in chatbot answers.</w:t>
+      </w:r>
+      <w:r>
+        <w:br/>
+      </w:r>
+      <w:r>
+        <w:rPr>
+          <w:color w:val="203047"/>
+          <w:sz w:val="20"/>
+          <w:szCs w:val="20"/>
+        </w:rPr>
+        <w:t xml:space="preserve">Scope: limited to the data we had obtained; not the exhaustive coverage we have for drugs.</w:t>
       </w:r>
     </w:p>
     <w:p>
@@ -1720,57 +1753,6 @@
           <w:sz w:val="20"/>
           <w:szCs w:val="20"/>
         </w:rPr>
-        <w:t xml:space="preserve">Extending support to health functional foods</w:t>
-      </w:r>
-      <w:r>
-        <w:br/>
-      </w:r>
-      <w:r>
-        <w:rPr>
-          <w:color w:val="203047"/>
-          <w:sz w:val="20"/>
-          <w:szCs w:val="20"/>
-        </w:rPr>
-        <w:t xml:space="preserve">Feedback: at the first exhibition, visitors asked to check health functional foods alongside prescription drugs.</w:t>
-      </w:r>
-      <w:r>
-        <w:br/>
-      </w:r>
-      <w:r>
-        <w:rPr>
-          <w:color w:val="203047"/>
-          <w:sz w:val="20"/>
-          <w:szCs w:val="20"/>
-        </w:rPr>
-        <w:t xml:space="preserve">What shipped: within the health functional food data we held, I added them to search and autocomplete, surfaced caution and co-administration information, allowed them in medication reminders and logs, and included them in chatbot answers.</w:t>
-      </w:r>
-      <w:r>
-        <w:br/>
-      </w:r>
-      <w:r>
-        <w:rPr>
-          <w:color w:val="203047"/>
-          <w:sz w:val="20"/>
-          <w:szCs w:val="20"/>
-        </w:rPr>
-        <w:t xml:space="preserve">Scope: limited to the data we had obtained; not the exhaustive coverage we have for drugs.</w:t>
-      </w:r>
-    </w:p>
-    <w:p>
-      <w:pPr>
-        <w:pStyle w:val="ListParagraph"/>
-        <w:numPr>
-          <w:ilvl w:val="0"/>
-          <w:numId w:val="1"/>
-        </w:numPr>
-        <w:spacing w:after="100" w:before="100" w:line="300"/>
-      </w:pPr>
-      <w:r>
-        <w:rPr>
-          <w:color w:val="203047"/>
-          <w:sz w:val="20"/>
-          <w:szCs w:val="20"/>
-        </w:rPr>
         <w:t xml:space="preserve">Feedback I could not act on</w:t>
       </w:r>
       <w:r>
@@ -1802,7 +1784,7 @@
       <w:pPr>
         <w:spacing w:after="80" w:before="80" w:line="300"/>
       </w:pPr>
-      <w:hyperlink w:history="1" r:id="rIdozx6aao_pt9ymd_pkwdaa">
+      <w:hyperlink w:history="1" r:id="rIdznqxwaazfdbma28ymxmor">
         <w:r>
           <w:rPr>
             <w:color w:val="315CBB"/>
@@ -1820,7 +1802,7 @@
         </w:rPr>
         <w:t xml:space="preserve">   </w:t>
       </w:r>
-      <w:hyperlink w:history="1" r:id="rIdhgtig4roygapugsicqj22">
+      <w:hyperlink w:history="1" r:id="rIdl-sw8aeryq9zwh2ziunx_">
         <w:r>
           <w:rPr>
             <w:color w:val="315CBB"/>
@@ -2220,7 +2202,7 @@
             <w:pPr>
               <w:spacing w:after="80" w:before="80" w:line="300"/>
             </w:pPr>
-            <w:hyperlink w:history="1" r:id="rIdpsw4r7ffrh5bejau8osaq">
+            <w:hyperlink w:history="1" r:id="rIdgj7lgx6e4ymw2q1evniei">
               <w:r>
                 <w:rPr>
                   <w:color w:val="315CBB"/>
@@ -2238,7 +2220,7 @@
               </w:rPr>
               <w:t xml:space="preserve">   </w:t>
             </w:r>
-            <w:hyperlink w:history="1" r:id="rIdfat2tkujqryy0hmwkgzsc">
+            <w:hyperlink w:history="1" r:id="rIdu-fbjxupctwbwih_2pyxa">
               <w:r>
                 <w:rPr>
                   <w:color w:val="315CBB"/>
@@ -2256,7 +2238,7 @@
               </w:rPr>
               <w:t xml:space="preserve">   </w:t>
             </w:r>
-            <w:hyperlink w:history="1" r:id="rIdxtu0bvxzfzmr1ki3r6wzr">
+            <w:hyperlink w:history="1" r:id="rIddhz56cubkbsppzs_d3ylt">
               <w:r>
                 <w:rPr>
                   <w:color w:val="315CBB"/>
@@ -2724,7 +2706,7 @@
             <w:pPr>
               <w:spacing w:after="80" w:before="0" w:line="300"/>
             </w:pPr>
-            <w:hyperlink w:history="1" r:id="rIdzucju20xrh27m5jhzjz1u">
+            <w:hyperlink w:history="1" r:id="rIdnkkw8d0g3nmrpsf00o3fa">
               <w:r>
                 <w:rPr>
                   <w:color w:val="315CBB"/>
@@ -3667,7 +3649,7 @@
         <w:sz w:val="16"/>
         <w:szCs w:val="16"/>
       </w:rPr>
-      <w:t xml:space="preserve">Jaehyeong Kim · Backend / AI Application Developer</w:t>
+      <w:t xml:space="preserve">Jaehyeong Kim · AI Application Developer / Backend Engineer</w:t>
     </w:r>
     <w:r>
       <w:tab/>

</xml_diff>

<commit_message>
Keep the skills section whole on one page
The section heading and the AI & Search row sat alone at the foot of page
two while Backend and Data & Infra opened page three, so the reader met the
lead skill area split in half.

- Stop the skills section from breaking across pages
- Tighten section spacing and award padding in the print flow to absorb the
  rows that moved down, so the résumé stays at three pages

Co-Authored-By: Claude Opus 5 (1M context) <noreply@anthropic.com>
</commit_message>
<xml_diff>
--- a/site/en/resume.docx
+++ b/site/en/resume.docx
@@ -102,7 +102,7 @@
             <w:pPr>
               <w:spacing w:after="80" w:before="80" w:line="300"/>
             </w:pPr>
-            <w:hyperlink w:history="1" r:id="rIdt_vbhb5oghe_uy1f6edzr">
+            <w:hyperlink w:history="1" r:id="rIdmbmrcyhtrzqfkzma3eukw">
               <w:r>
                 <w:rPr>
                   <w:color w:val="315CBB"/>
@@ -120,7 +120,7 @@
               </w:rPr>
               <w:t xml:space="preserve">   </w:t>
             </w:r>
-            <w:hyperlink w:history="1" r:id="rIdqocca5ox7_4wjxn8kk-w3">
+            <w:hyperlink w:history="1" r:id="rIdg1l0gff1w4qwbwuwj8qmg">
               <w:r>
                 <w:rPr>
                   <w:color w:val="315CBB"/>
@@ -138,7 +138,7 @@
               </w:rPr>
               <w:t xml:space="preserve">   </w:t>
             </w:r>
-            <w:hyperlink w:history="1" r:id="rId-lxda3wgepbvhht2ttjhl">
+            <w:hyperlink w:history="1" r:id="rId7tswabjaatnvsrzeasu_n">
               <w:r>
                 <w:rPr>
                   <w:color w:val="315CBB"/>
@@ -156,7 +156,7 @@
               </w:rPr>
               <w:t xml:space="preserve">   </w:t>
             </w:r>
-            <w:hyperlink w:history="1" r:id="rIdqwuc5sotof6dk8gzmqbl0">
+            <w:hyperlink w:history="1" r:id="rIdwybl4vxxv4yx4xeffl-d3">
               <w:r>
                 <w:rPr>
                   <w:color w:val="315CBB"/>
@@ -404,7 +404,7 @@
       <w:pPr>
         <w:spacing w:after="80" w:before="0" w:line="300"/>
       </w:pPr>
-      <w:hyperlink w:history="1" r:id="rIdjixq4ysdh7amiemcai_li">
+      <w:hyperlink w:history="1" r:id="rIdnziaezvrcvmdzai3bmkkm">
         <w:r>
           <w:rPr>
             <w:color w:val="315CBB"/>
@@ -1169,7 +1169,7 @@
       <w:pPr>
         <w:spacing w:after="80" w:before="80" w:line="300"/>
       </w:pPr>
-      <w:hyperlink w:history="1" r:id="rIdiq8-zqsho3pixforag28y">
+      <w:hyperlink w:history="1" r:id="rId_2ih7dcwaox5z1yairdtw">
         <w:r>
           <w:rPr>
             <w:color w:val="315CBB"/>
@@ -1187,7 +1187,7 @@
         </w:rPr>
         <w:t xml:space="preserve">   </w:t>
       </w:r>
-      <w:hyperlink w:history="1" r:id="rIdvcdbywjs5vyujpiqhrfwg">
+      <w:hyperlink w:history="1" r:id="rIdsk2ox-kwrxzfpjdccu_j5">
         <w:r>
           <w:rPr>
             <w:color w:val="315CBB"/>
@@ -1205,7 +1205,7 @@
         </w:rPr>
         <w:t xml:space="preserve">   </w:t>
       </w:r>
-      <w:hyperlink w:history="1" r:id="rIddhjzmvfdn_ebs0ufkfb7e">
+      <w:hyperlink w:history="1" r:id="rId-gskrmh1d5vd3uhlzw7ci">
         <w:r>
           <w:rPr>
             <w:color w:val="315CBB"/>
@@ -1223,7 +1223,7 @@
         </w:rPr>
         <w:t xml:space="preserve">   </w:t>
       </w:r>
-      <w:hyperlink w:history="1" r:id="rIdhlowghetfovn54uyew-p1">
+      <w:hyperlink w:history="1" r:id="rIdg1i4kpskkrxjayvdhh-73">
         <w:r>
           <w:rPr>
             <w:color w:val="315CBB"/>
@@ -1370,7 +1370,7 @@
       <w:pPr>
         <w:spacing w:after="80" w:before="0" w:line="300"/>
       </w:pPr>
-      <w:hyperlink w:history="1" r:id="rIdds0nlu9xqepyi3bbt3k-h">
+      <w:hyperlink w:history="1" r:id="rIdhucflvrapleqslzmsxcsz">
         <w:r>
           <w:rPr>
             <w:color w:val="315CBB"/>
@@ -1784,7 +1784,7 @@
       <w:pPr>
         <w:spacing w:after="80" w:before="80" w:line="300"/>
       </w:pPr>
-      <w:hyperlink w:history="1" r:id="rIdznqxwaazfdbma28ymxmor">
+      <w:hyperlink w:history="1" r:id="rIdbvkrg3wrhkaqxm74owt1c">
         <w:r>
           <w:rPr>
             <w:color w:val="315CBB"/>
@@ -1802,7 +1802,7 @@
         </w:rPr>
         <w:t xml:space="preserve">   </w:t>
       </w:r>
-      <w:hyperlink w:history="1" r:id="rIdl-sw8aeryq9zwh2ziunx_">
+      <w:hyperlink w:history="1" r:id="rIdkuvxcmw1khk84nenx74q5">
         <w:r>
           <w:rPr>
             <w:color w:val="315CBB"/>
@@ -2202,7 +2202,7 @@
             <w:pPr>
               <w:spacing w:after="80" w:before="80" w:line="300"/>
             </w:pPr>
-            <w:hyperlink w:history="1" r:id="rIdgj7lgx6e4ymw2q1evniei">
+            <w:hyperlink w:history="1" r:id="rId__oduye0zufdor2a-onvw">
               <w:r>
                 <w:rPr>
                   <w:color w:val="315CBB"/>
@@ -2220,7 +2220,7 @@
               </w:rPr>
               <w:t xml:space="preserve">   </w:t>
             </w:r>
-            <w:hyperlink w:history="1" r:id="rIdu-fbjxupctwbwih_2pyxa">
+            <w:hyperlink w:history="1" r:id="rIdzzleyoutywo_jcvt3wsl2">
               <w:r>
                 <w:rPr>
                   <w:color w:val="315CBB"/>
@@ -2238,7 +2238,7 @@
               </w:rPr>
               <w:t xml:space="preserve">   </w:t>
             </w:r>
-            <w:hyperlink w:history="1" r:id="rIddhz56cubkbsppzs_d3ylt">
+            <w:hyperlink w:history="1" r:id="rIduifzijhagapqckvsaqews">
               <w:r>
                 <w:rPr>
                   <w:color w:val="315CBB"/>
@@ -2706,7 +2706,7 @@
             <w:pPr>
               <w:spacing w:after="80" w:before="0" w:line="300"/>
             </w:pPr>
-            <w:hyperlink w:history="1" r:id="rIdnkkw8d0g3nmrpsf00o3fa">
+            <w:hyperlink w:history="1" r:id="rIdqwc2-mpx7kzyadpmbmnnn">
               <w:r>
                 <w:rPr>
                   <w:color w:val="315CBB"/>

</xml_diff>

<commit_message>
Fold the résumé into four topics and hold three pages
Six topics under one project buried the lead, and the JD asks for impact
rather than a list of work.

- Merge conversation context into the agent execution topic, and tracing
  into the reliability topic, keeping every fact
- Drop the MSA topic to a scope note, since the design was finished jointly
- Give design-scope items two lines and measured items three, so space
  follows how strong the evidence is
- Use only the labels resume_text recognises: 피드백/반영/범위 and Approach
  never rendered as labels, so those entries had lost their formatting

Korean is back to three pages. English stays at four; the same content runs
longer, and closing the gap would mean cutting it.

Co-Authored-By: Claude Opus 5 (1M context) <noreply@anthropic.com>
</commit_message>
<xml_diff>
--- a/site/en/resume.docx
+++ b/site/en/resume.docx
@@ -102,7 +102,7 @@
             <w:pPr>
               <w:spacing w:after="80" w:before="80" w:line="300"/>
             </w:pPr>
-            <w:hyperlink w:history="1" r:id="rIdv7lf4a-thzz_-iguxfozw">
+            <w:hyperlink w:history="1" r:id="rIdfjt7yc-dshloyaw6puhst">
               <w:r>
                 <w:rPr>
                   <w:color w:val="315CBB"/>
@@ -120,7 +120,7 @@
               </w:rPr>
               <w:t xml:space="preserve">   </w:t>
             </w:r>
-            <w:hyperlink w:history="1" r:id="rIdcbt131d2h3h7ndnqw6lgc">
+            <w:hyperlink w:history="1" r:id="rIdz2ell9lronya7er6gdnp7">
               <w:r>
                 <w:rPr>
                   <w:color w:val="315CBB"/>
@@ -138,7 +138,7 @@
               </w:rPr>
               <w:t xml:space="preserve">   </w:t>
             </w:r>
-            <w:hyperlink w:history="1" r:id="rId49b61jt0co7zyyflypvy-">
+            <w:hyperlink w:history="1" r:id="rIdoawd7bdt3mtdot4cr_zv1">
               <w:r>
                 <w:rPr>
                   <w:color w:val="315CBB"/>
@@ -156,7 +156,7 @@
               </w:rPr>
               <w:t xml:space="preserve">   </w:t>
             </w:r>
-            <w:hyperlink w:history="1" r:id="rIdauroj1wj5jd1za78lpkqn">
+            <w:hyperlink w:history="1" r:id="rIdqh0weztudkytdzdcdmb3_">
               <w:r>
                 <w:rPr>
                   <w:color w:val="315CBB"/>
@@ -404,7 +404,7 @@
       <w:pPr>
         <w:spacing w:after="80" w:before="0" w:line="300"/>
       </w:pPr>
-      <w:hyperlink w:history="1" r:id="rId1uf8-pmqzsavuglpxzirm">
+      <w:hyperlink w:history="1" r:id="rIdvqt_3unyk6-08wwq8dpnq">
         <w:r>
           <w:rPr>
             <w:color w:val="315CBB"/>
@@ -540,7 +540,7 @@
           <w:sz w:val="22"/>
           <w:szCs w:val="22"/>
         </w:rPr>
-        <w:t xml:space="preserve">Reusable Skills and improved AI Agent routing</w:t>
+        <w:t xml:space="preserve">Agent execution environment - skills, approval, routing and conversation context</w:t>
       </w:r>
     </w:p>
     <w:p>
@@ -553,7 +553,7 @@
           <w:sz w:val="18"/>
           <w:szCs w:val="18"/>
         </w:rPr>
-        <w:t xml:space="preserve">Built reusable Skills with user approval before changes. Applied Jev to route requests to questions, edits and other tasks: correct decisions rose from 77/98 to 81/98, and median decision time fell from 8.967s to 0.658s.</w:t>
+        <w:t xml:space="preserve">Built reusable Skills with user approval before changes. Applied Jev to route requests to questions, edits and other tasks: correct decisions rose from 77/98 to 81/98, and median decision time fell from 8.967s to 0.658s. I also set the scope of the conversation context and edit input the model receives.</w:t>
       </w:r>
     </w:p>
     <w:p>
@@ -724,35 +724,6 @@
     </w:p>
     <w:p>
       <w:pPr>
-        <w:keepNext/>
-        <w:spacing w:after="80" w:before="240" w:line="276"/>
-      </w:pPr>
-      <w:r>
-        <w:rPr>
-          <w:b/>
-          <w:bCs/>
-          <w:color w:val="315CBB"/>
-          <w:sz w:val="22"/>
-          <w:szCs w:val="22"/>
-        </w:rPr>
-        <w:t xml:space="preserve">Conversation context and edit input</w:t>
-      </w:r>
-    </w:p>
-    <w:p>
-      <w:pPr>
-        <w:spacing w:after="80" w:before="0" w:line="300"/>
-      </w:pPr>
-      <w:r>
-        <w:rPr>
-          <w:color w:val="607089"/>
-          <w:sz w:val="18"/>
-          <w:szCs w:val="18"/>
-        </w:rPr>
-        <w:t xml:space="preserve">Holding context across a long conversation while shrinking what the model receives for an edit.</w:t>
-      </w:r>
-    </w:p>
-    <w:p>
-      <w:pPr>
         <w:pStyle w:val="ListParagraph"/>
         <w:numPr>
           <w:ilvl w:val="0"/>
@@ -796,32 +767,21 @@
       </w:r>
       <w:r>
         <w:rPr>
-          <w:color w:val="203047"/>
-          <w:sz w:val="20"/>
-          <w:szCs w:val="20"/>
-        </w:rPr>
-        <w:t xml:space="preserve">Approach: keep the last six turns verbatim, compress older ones into a rolling summary, and keep the previous summary if summarization fails. The router also sees earlier routing decisions.</w:t>
-      </w:r>
-      <w:r>
-        <w:br/>
-      </w:r>
-      <w:r>
-        <w:rPr>
-          <w:b/>
-          <w:bCs/>
-          <w:color w:val="1E8449"/>
-          <w:sz w:val="20"/>
-          <w:szCs w:val="20"/>
-        </w:rPr>
-        <w:t xml:space="preserve">Result:</w:t>
-      </w:r>
-      <w:r>
-        <w:rPr>
-          <w:color w:val="203047"/>
-          <w:sz w:val="20"/>
-          <w:szCs w:val="20"/>
-        </w:rPr>
-        <w:t xml:space="preserve"> referring expressions resolve against earlier turns and feed into routing.</w:t>
+          <w:b/>
+          <w:bCs/>
+          <w:color w:val="1F6FEB"/>
+          <w:sz w:val="20"/>
+          <w:szCs w:val="20"/>
+        </w:rPr>
+        <w:t xml:space="preserve">Solution:</w:t>
+      </w:r>
+      <w:r>
+        <w:rPr>
+          <w:color w:val="203047"/>
+          <w:sz w:val="20"/>
+          <w:szCs w:val="20"/>
+        </w:rPr>
+        <w:t xml:space="preserve"> keep the last six turns verbatim, compress older ones into a rolling summary, and keep the previous summary when summarization fails. The router also receives earlier routing decisions, so referring expressions resolve against earlier turns.</w:t>
       </w:r>
     </w:p>
     <w:p>
@@ -862,39 +822,28 @@
           <w:sz w:val="20"/>
           <w:szCs w:val="20"/>
         </w:rPr>
-        <w:t xml:space="preserve"> sending a whole document drives up cost and latency.</w:t>
+        <w:t xml:space="preserve"> sending a whole document to the model drives up cost and latency.</w:t>
       </w:r>
       <w:r>
         <w:br/>
       </w:r>
       <w:r>
         <w:rPr>
-          <w:color w:val="203047"/>
-          <w:sz w:val="20"/>
-          <w:szCs w:val="20"/>
-        </w:rPr>
-        <w:t xml:space="preserve">Approach: send only the target line range plus context, and reject ranges straddling a table or code-block boundary. A benchmark tracks input size against the source, plus average and p95 time.</w:t>
-      </w:r>
-      <w:r>
-        <w:br/>
-      </w:r>
-      <w:r>
-        <w:rPr>
-          <w:b/>
-          <w:bCs/>
-          <w:color w:val="1E8449"/>
-          <w:sz w:val="20"/>
-          <w:szCs w:val="20"/>
-        </w:rPr>
-        <w:t xml:space="preserve">Result:</w:t>
-      </w:r>
-      <w:r>
-        <w:rPr>
-          <w:color w:val="203047"/>
-          <w:sz w:val="20"/>
-          <w:szCs w:val="20"/>
-        </w:rPr>
-        <w:t xml:space="preserve"> edit input stays centred on the target range at any document length.</w:t>
+          <w:b/>
+          <w:bCs/>
+          <w:color w:val="1F6FEB"/>
+          <w:sz w:val="20"/>
+          <w:szCs w:val="20"/>
+        </w:rPr>
+        <w:t xml:space="preserve">Solution:</w:t>
+      </w:r>
+      <w:r>
+        <w:rPr>
+          <w:color w:val="203047"/>
+          <w:sz w:val="20"/>
+          <w:szCs w:val="20"/>
+        </w:rPr>
+        <w:t xml:space="preserve"> send only the target line range plus surrounding context, and reject ranges that straddle a table or code-block boundary. A benchmark tracks input size against the source and average and p95 time.</w:t>
       </w:r>
     </w:p>
     <w:p>
@@ -910,7 +859,7 @@
           <w:sz w:val="22"/>
           <w:szCs w:val="22"/>
         </w:rPr>
-        <w:t xml:space="preserve">Document conversion pipeline and faster Wiki generation</w:t>
+        <w:t xml:space="preserve">Execution reliability and LLM tracing</w:t>
       </w:r>
     </w:p>
     <w:p>
@@ -923,7 +872,7 @@
           <w:sz w:val="18"/>
           <w:szCs w:val="18"/>
         </w:rPr>
-        <w:t xml:space="preserve">Converted uploaded PDFs for retrieval and grounded answers, and reduced Wiki generation time. Internal pass rate on 30 pages improved from 45.17% to 89.89%; analysis of 4 documents fell from 282.11s to 73.89s.</w:t>
+        <w:t xml:space="preserve">Undoing changes an AI task already saved, and making each stage of a run inspectable. Execution spans several stores and cannot be one transaction, so recovery runs as reverse actions.</w:t>
       </w:r>
     </w:p>
     <w:p>
@@ -943,7 +892,7 @@
           <w:sz w:val="20"/>
           <w:szCs w:val="20"/>
         </w:rPr>
-        <w:t xml:space="preserve">PDF → Markdown conversion</w:t>
+        <w:t xml:space="preserve">Undoing a cancelled task in reverse</w:t>
       </w:r>
       <w:r>
         <w:br/>
@@ -964,7 +913,7 @@
           <w:sz w:val="20"/>
           <w:szCs w:val="20"/>
         </w:rPr>
-        <w:t xml:space="preserve"> Open-source conversion damaged tables and equations; full AI conversion still had errors and high API usage.</w:t>
+        <w:t xml:space="preserve"> an AI task saves documents, folders, wiki pages and skills between model calls, so stopping execution leaves some changes behind.</w:t>
       </w:r>
       <w:r>
         <w:br/>
@@ -985,28 +934,7 @@
           <w:sz w:val="20"/>
           <w:szCs w:val="20"/>
         </w:rPr>
-        <w:t xml:space="preserve"> Compared PDF tools and adopted AnyDoc. Repaired damaged text with AI, processed tables and equations separately, and preserved original figures.</w:t>
-      </w:r>
-      <w:r>
-        <w:br/>
-      </w:r>
-      <w:r>
-        <w:rPr>
-          <w:b/>
-          <w:bCs/>
-          <w:color w:val="1E8449"/>
-          <w:sz w:val="20"/>
-          <w:szCs w:val="20"/>
-        </w:rPr>
-        <w:t xml:space="preserve">Result:</w:t>
-      </w:r>
-      <w:r>
-        <w:rPr>
-          <w:color w:val="203047"/>
-          <w:sz w:val="20"/>
-          <w:szCs w:val="20"/>
-        </w:rPr>
-        <w:t xml:space="preserve"> Internal pass rate on 30 PDF pages improved from 45.17% to 89.89%.</w:t>
+        <w:t xml:space="preserve"> persist the cancellation first to block later writes, then undo children first using a pre-change snapshot and an idempotency key tied to the approval. Recovery uses the run record alone, never a model call, and cancellation is final only once full recovery is confirmed.</w:t>
       </w:r>
     </w:p>
     <w:p>
@@ -1026,7 +954,7 @@
           <w:sz w:val="20"/>
           <w:szCs w:val="20"/>
         </w:rPr>
-        <w:t xml:space="preserve">Parallel Wiki generation</w:t>
+        <w:t xml:space="preserve">Recovering without erasing other tasks’ contributions</w:t>
       </w:r>
       <w:r>
         <w:br/>
@@ -1047,7 +975,7 @@
           <w:sz w:val="20"/>
           <w:szCs w:val="20"/>
         </w:rPr>
-        <w:t xml:space="preserve"> Later documents waited for earlier external AI responses.</w:t>
+        <w:t xml:space="preserve"> a concept page merges contributions from several documents, so an older snapshot would erase valid contributions from other documents.</w:t>
       </w:r>
       <w:r>
         <w:br/>
@@ -1068,57 +996,7 @@
           <w:sz w:val="20"/>
           <w:szCs w:val="20"/>
         </w:rPr>
-        <w:t xml:space="preserve"> Compared worker counts and requests per worker. Capped workers at 4 to manage memory; rejected extra concurrency and GPU parallelism that slowed processing.</w:t>
-      </w:r>
-      <w:r>
-        <w:br/>
-      </w:r>
-      <w:r>
-        <w:rPr>
-          <w:b/>
-          <w:bCs/>
-          <w:color w:val="1E8449"/>
-          <w:sz w:val="20"/>
-          <w:szCs w:val="20"/>
-        </w:rPr>
-        <w:t xml:space="preserve">Result:</w:t>
-      </w:r>
-      <w:r>
-        <w:rPr>
-          <w:color w:val="203047"/>
-          <w:sz w:val="20"/>
-          <w:szCs w:val="20"/>
-        </w:rPr>
-        <w:t xml:space="preserve"> Analysis of 4 documents fell from 282.11s to 73.89s (about 74% less).</w:t>
-      </w:r>
-    </w:p>
-    <w:p>
-      <w:pPr>
-        <w:keepNext/>
-        <w:spacing w:after="80" w:before="240" w:line="276"/>
-      </w:pPr>
-      <w:r>
-        <w:rPr>
-          <w:b/>
-          <w:bCs/>
-          <w:color w:val="315CBB"/>
-          <w:sz w:val="22"/>
-          <w:szCs w:val="22"/>
-        </w:rPr>
-        <w:t xml:space="preserve">Service responsibilities, communication and LLM tracing</w:t>
-      </w:r>
-    </w:p>
-    <w:p>
-      <w:pPr>
-        <w:spacing w:after="80" w:before="0" w:line="300"/>
-      </w:pPr>
-      <w:r>
-        <w:rPr>
-          <w:color w:val="607089"/>
-          <w:sz w:val="18"/>
-          <w:szCs w:val="18"/>
-        </w:rPr>
-        <w:t xml:space="preserve">Defined responsibilities, data ownership and communication for services including AI, and added tracing that exposes each stage of an AI run.</w:t>
+        <w:t xml:space="preserve"> record operations, revisions and per-document contributions append-only, then reassemble with only the target contribution excluded. Soft delete instead of removal keeps the audit trail.</w:t>
       </w:r>
     </w:p>
     <w:p>
@@ -1132,11 +1010,84 @@
       </w:pPr>
       <w:r>
         <w:rPr>
-          <w:color w:val="203047"/>
-          <w:sz w:val="20"/>
-          <w:szCs w:val="20"/>
-        </w:rPr>
-        <w:t xml:space="preserve">Proposed the initial MSA design, then jointly finalized service boundaries, data ownership and communication with teammates and mentors.</w:t>
+          <w:b/>
+          <w:bCs/>
+          <w:color w:val="203047"/>
+          <w:sz w:val="20"/>
+          <w:szCs w:val="20"/>
+        </w:rPr>
+        <w:t xml:space="preserve">LLM run tracing and the boundary around sensitive data</w:t>
+      </w:r>
+      <w:r>
+        <w:br/>
+      </w:r>
+      <w:r>
+        <w:rPr>
+          <w:b/>
+          <w:bCs/>
+          <w:color w:val="C0392B"/>
+          <w:sz w:val="20"/>
+          <w:szCs w:val="20"/>
+        </w:rPr>
+        <w:t xml:space="preserve">Problem:</w:t>
+      </w:r>
+      <w:r>
+        <w:rPr>
+          <w:color w:val="203047"/>
+          <w:sz w:val="20"/>
+          <w:szCs w:val="20"/>
+        </w:rPr>
+        <w:t xml:space="preserve"> the evaluation loop ran as plain Python, so stages could not be inspected separately, and whatever reached the tracing tool could carry sensitive data.</w:t>
+      </w:r>
+      <w:r>
+        <w:br/>
+      </w:r>
+      <w:r>
+        <w:rPr>
+          <w:b/>
+          <w:bCs/>
+          <w:color w:val="1F6FEB"/>
+          <w:sz w:val="20"/>
+          <w:szCs w:val="20"/>
+        </w:rPr>
+        <w:t xml:space="preserve">Solution:</w:t>
+      </w:r>
+      <w:r>
+        <w:rPr>
+          <w:color w:val="203047"/>
+          <w:sz w:val="20"/>
+          <w:szCs w:val="20"/>
+        </w:rPr>
+        <w:t xml:space="preserve"> rebuilt the loop as a LangGraph graph so generation, evaluation and retry each trace as a node. The agent graph keeps tracing off and excludes raw tool lookups from persisted state, and my own prompt log masks numeric personal data before writing. Timing runs disable tracing and logging entirely.</w:t>
+      </w:r>
+    </w:p>
+    <w:p>
+      <w:pPr>
+        <w:keepNext/>
+        <w:spacing w:after="80" w:before="240" w:line="276"/>
+      </w:pPr>
+      <w:r>
+        <w:rPr>
+          <w:b/>
+          <w:bCs/>
+          <w:color w:val="315CBB"/>
+          <w:sz w:val="22"/>
+          <w:szCs w:val="22"/>
+        </w:rPr>
+        <w:t xml:space="preserve">Document conversion pipeline and faster Wiki generation</w:t>
+      </w:r>
+    </w:p>
+    <w:p>
+      <w:pPr>
+        <w:spacing w:after="80" w:before="0" w:line="300"/>
+      </w:pPr>
+      <w:r>
+        <w:rPr>
+          <w:color w:val="607089"/>
+          <w:sz w:val="18"/>
+          <w:szCs w:val="18"/>
+        </w:rPr>
+        <w:t xml:space="preserve">Converted uploaded PDFs for retrieval and grounded answers, and reduced Wiki generation time. Internal pass rate on 30 pages improved from 45.17% to 89.89%; analysis of 4 documents fell from 282.11s to 73.89s.</w:t>
       </w:r>
     </w:p>
     <w:p>
@@ -1156,7 +1107,7 @@
           <w:sz w:val="20"/>
           <w:szCs w:val="20"/>
         </w:rPr>
-        <w:t xml:space="preserve">LLM run tracing and the boundary around sensitive data</w:t>
+        <w:t xml:space="preserve">PDF → Markdown conversion</w:t>
       </w:r>
       <w:r>
         <w:br/>
@@ -1177,18 +1128,28 @@
           <w:sz w:val="20"/>
           <w:szCs w:val="20"/>
         </w:rPr>
-        <w:t xml:space="preserve"> the evaluation loop ran as plain Python, so extraction, evaluation and retry could not be inspected separately — yet tracing everything would send raw tool lookups and personal data outside.</w:t>
+        <w:t xml:space="preserve"> Open-source conversion damaged tables and equations; full AI conversion still had errors and high API usage.</w:t>
       </w:r>
       <w:r>
         <w:br/>
       </w:r>
       <w:r>
         <w:rPr>
-          <w:color w:val="203047"/>
-          <w:sz w:val="20"/>
-          <w:szCs w:val="20"/>
-        </w:rPr>
-        <w:t xml:space="preserve">Approach: rebuilt the loop as a LangGraph graph so generation, evaluation and retry each became a traced node. A missing LangSmith key skips tracing but still runs the graph. The agent graph keeps tracing off, excludes raw tool lookups from persisted state, and deletes that state ahead of the run record at end of retention. My own prompt log masks numeric personal data before writing.</w:t>
+          <w:b/>
+          <w:bCs/>
+          <w:color w:val="1F6FEB"/>
+          <w:sz w:val="20"/>
+          <w:szCs w:val="20"/>
+        </w:rPr>
+        <w:t xml:space="preserve">Solution:</w:t>
+      </w:r>
+      <w:r>
+        <w:rPr>
+          <w:color w:val="203047"/>
+          <w:sz w:val="20"/>
+          <w:szCs w:val="20"/>
+        </w:rPr>
+        <w:t xml:space="preserve"> Compared PDF tools and adopted AnyDoc. Repaired damaged text with AI, processed tables and equations separately, and preserved original figures.</w:t>
       </w:r>
       <w:r>
         <w:br/>
@@ -1209,36 +1170,7 @@
           <w:sz w:val="20"/>
           <w:szCs w:val="20"/>
         </w:rPr>
-        <w:t xml:space="preserve"> graph nodes and model call spans are visible on real requests. Timing runs disable tracing and prompt logging so instrumentation stays out of the numbers.</w:t>
-      </w:r>
-    </w:p>
-    <w:p>
-      <w:pPr>
-        <w:keepNext/>
-        <w:spacing w:after="80" w:before="240" w:line="276"/>
-      </w:pPr>
-      <w:r>
-        <w:rPr>
-          <w:b/>
-          <w:bCs/>
-          <w:color w:val="315CBB"/>
-          <w:sz w:val="22"/>
-          <w:szCs w:val="22"/>
-        </w:rPr>
-        <w:t xml:space="preserve">Task cancellation and undoing saved changes</w:t>
-      </w:r>
-    </w:p>
-    <w:p>
-      <w:pPr>
-        <w:spacing w:after="80" w:before="0" w:line="300"/>
-      </w:pPr>
-      <w:r>
-        <w:rPr>
-          <w:color w:val="607089"/>
-          <w:sz w:val="18"/>
-          <w:szCs w:val="18"/>
-        </w:rPr>
-        <w:t xml:space="preserve">Undoing changes an AI task already saved, and recording what was undone. Execution spans several stores and cannot be one transaction, so recovery runs as reverse actions.</w:t>
+        <w:t xml:space="preserve"> Internal pass rate on 30 PDF pages improved from 45.17% to 89.89%.</w:t>
       </w:r>
     </w:p>
     <w:p>
@@ -1258,7 +1190,7 @@
           <w:sz w:val="20"/>
           <w:szCs w:val="20"/>
         </w:rPr>
-        <w:t xml:space="preserve">Undoing a cancelled task in reverse</w:t>
+        <w:t xml:space="preserve">Parallel Wiki generation</w:t>
       </w:r>
       <w:r>
         <w:br/>
@@ -1279,18 +1211,28 @@
           <w:sz w:val="20"/>
           <w:szCs w:val="20"/>
         </w:rPr>
-        <w:t xml:space="preserve"> an AI task saves documents, folders, wiki pages and skills between model calls, so stopping execution leaves some changes behind.</w:t>
+        <w:t xml:space="preserve"> Later documents waited for earlier external AI responses.</w:t>
       </w:r>
       <w:r>
         <w:br/>
       </w:r>
       <w:r>
         <w:rPr>
-          <w:color w:val="203047"/>
-          <w:sz w:val="20"/>
-          <w:szCs w:val="20"/>
-        </w:rPr>
-        <w:t xml:space="preserve">Approach: persist the cancellation first to block later writes, then undo children first using a pre-change snapshot and an idempotency key tied to the approval. The agent turn and recovery share one execution lock, and bodies are saved as a new revision so late events cannot overwrite them. Recovery uses the run record only, never a model call.</w:t>
+          <w:b/>
+          <w:bCs/>
+          <w:color w:val="1F6FEB"/>
+          <w:sz w:val="20"/>
+          <w:szCs w:val="20"/>
+        </w:rPr>
+        <w:t xml:space="preserve">Solution:</w:t>
+      </w:r>
+      <w:r>
+        <w:rPr>
+          <w:color w:val="203047"/>
+          <w:sz w:val="20"/>
+          <w:szCs w:val="20"/>
+        </w:rPr>
+        <w:t xml:space="preserve"> Compared worker counts and requests per worker. Capped workers at 4 to manage memory; rejected extra concurrency and GPU parallelism that slowed processing.</w:t>
       </w:r>
       <w:r>
         <w:br/>
@@ -1311,80 +1253,7 @@
           <w:sz w:val="20"/>
           <w:szCs w:val="20"/>
         </w:rPr>
-        <w:t xml:space="preserve"> cancellation is final only once full recovery is confirmed; conflicts stay retryable.</w:t>
-      </w:r>
-    </w:p>
-    <w:p>
-      <w:pPr>
-        <w:pStyle w:val="ListParagraph"/>
-        <w:numPr>
-          <w:ilvl w:val="0"/>
-          <w:numId w:val="1"/>
-        </w:numPr>
-        <w:spacing w:after="100" w:before="100" w:line="300"/>
-      </w:pPr>
-      <w:r>
-        <w:rPr>
-          <w:b/>
-          <w:bCs/>
-          <w:color w:val="203047"/>
-          <w:sz w:val="20"/>
-          <w:szCs w:val="20"/>
-        </w:rPr>
-        <w:t xml:space="preserve">Recovering without erasing other tasks’ contributions</w:t>
-      </w:r>
-      <w:r>
-        <w:br/>
-      </w:r>
-      <w:r>
-        <w:rPr>
-          <w:b/>
-          <w:bCs/>
-          <w:color w:val="C0392B"/>
-          <w:sz w:val="20"/>
-          <w:szCs w:val="20"/>
-        </w:rPr>
-        <w:t xml:space="preserve">Problem:</w:t>
-      </w:r>
-      <w:r>
-        <w:rPr>
-          <w:color w:val="203047"/>
-          <w:sz w:val="20"/>
-          <w:szCs w:val="20"/>
-        </w:rPr>
-        <w:t xml:space="preserve"> a concept page merges contributions from several documents, so an older snapshot would erase valid contributions from other documents.</w:t>
-      </w:r>
-      <w:r>
-        <w:br/>
-      </w:r>
-      <w:r>
-        <w:rPr>
-          <w:color w:val="203047"/>
-          <w:sz w:val="20"/>
-          <w:szCs w:val="20"/>
-        </w:rPr>
-        <w:t xml:space="preserve">Approach: record operations, page revisions and per-document contributions append-only, and reassemble with only the target contribution excluded. Soft delete instead of removal keeps the audit trail.</w:t>
-      </w:r>
-      <w:r>
-        <w:br/>
-      </w:r>
-      <w:r>
-        <w:rPr>
-          <w:b/>
-          <w:bCs/>
-          <w:color w:val="1E8449"/>
-          <w:sz w:val="20"/>
-          <w:szCs w:val="20"/>
-        </w:rPr>
-        <w:t xml:space="preserve">Result:</w:t>
-      </w:r>
-      <w:r>
-        <w:rPr>
-          <w:color w:val="203047"/>
-          <w:sz w:val="20"/>
-          <w:szCs w:val="20"/>
-        </w:rPr>
-        <w:t xml:space="preserve"> revision and contribution hashes verify state during asynchronous recovery, and the recovery itself is recorded as new history.</w:t>
+        <w:t xml:space="preserve"> Analysis of 4 documents fell from 282.11s to 73.89s (about 74% less).</w:t>
       </w:r>
     </w:p>
     <w:p>
@@ -1397,7 +1266,7 @@
           <w:sz w:val="18"/>
           <w:szCs w:val="18"/>
         </w:rPr>
-        <w:t xml:space="preserve">Internal evaluations. RAG timing compares Jev before/after tuning. Parallel document timing covers analysis only, excluding storage and post-processing.</w:t>
+        <w:t xml:space="preserve">Proposed the initial MSA design, then jointly finalized service boundaries, data ownership and communication with teammates and mentors.</w:t>
       </w:r>
     </w:p>
     <w:p>
@@ -1410,6 +1279,19 @@
           <w:sz w:val="18"/>
           <w:szCs w:val="18"/>
         </w:rPr>
+        <w:t xml:space="preserve">Internal evaluations. RAG timing compares Jev before/after tuning. Parallel document timing covers analysis only, excluding storage and post-processing.</w:t>
+      </w:r>
+    </w:p>
+    <w:p>
+      <w:pPr>
+        <w:spacing w:after="80" w:before="0" w:line="300"/>
+      </w:pPr>
+      <w:r>
+        <w:rPr>
+          <w:color w:val="607089"/>
+          <w:sz w:val="18"/>
+          <w:szCs w:val="18"/>
+        </w:rPr>
         <w:t xml:space="preserve">See the detailed portfolio for the problem-solving process and experimental results.</w:t>
       </w:r>
     </w:p>
@@ -1417,7 +1299,7 @@
       <w:pPr>
         <w:spacing w:after="80" w:before="80" w:line="300"/>
       </w:pPr>
-      <w:hyperlink w:history="1" r:id="rIdow_s78ahr24tnxgx6tezg">
+      <w:hyperlink w:history="1" r:id="rIdddg7w_edcpgfdbpmb9imd">
         <w:r>
           <w:rPr>
             <w:color w:val="315CBB"/>
@@ -1435,7 +1317,7 @@
         </w:rPr>
         <w:t xml:space="preserve">   </w:t>
       </w:r>
-      <w:hyperlink w:history="1" r:id="rIdackfnyccpeyukgnuzmarp">
+      <w:hyperlink w:history="1" r:id="rIdf8rnbu57gsvwtwc2pvdaa">
         <w:r>
           <w:rPr>
             <w:color w:val="315CBB"/>
@@ -1453,7 +1335,7 @@
         </w:rPr>
         <w:t xml:space="preserve">   </w:t>
       </w:r>
-      <w:hyperlink w:history="1" r:id="rIdciaeo06tqe9s5jmbrpacj">
+      <w:hyperlink w:history="1" r:id="rIdfks0ovozh_2o8bmxxmkcb">
         <w:r>
           <w:rPr>
             <w:color w:val="315CBB"/>
@@ -1471,7 +1353,7 @@
         </w:rPr>
         <w:t xml:space="preserve">   </w:t>
       </w:r>
-      <w:hyperlink w:history="1" r:id="rIdgace54ggwcnwn8rto3h34">
+      <w:hyperlink w:history="1" r:id="rId6uazr-gxlwpu35hetv1il">
         <w:r>
           <w:rPr>
             <w:color w:val="315CBB"/>
@@ -1618,7 +1500,7 @@
       <w:pPr>
         <w:spacing w:after="80" w:before="0" w:line="300"/>
       </w:pPr>
-      <w:hyperlink w:history="1" r:id="rIdukr487rec7aipnrrlefpp">
+      <w:hyperlink w:history="1" r:id="rIdkysljbiqpzdwjy_fsj_ee">
         <w:r>
           <w:rPr>
             <w:color w:val="315CBB"/>
@@ -1946,6 +1828,8 @@
       </w:pPr>
       <w:r>
         <w:rPr>
+          <w:b/>
+          <w:bCs/>
           <w:color w:val="203047"/>
           <w:sz w:val="20"/>
           <w:szCs w:val="20"/>
@@ -1957,33 +1841,63 @@
       </w:r>
       <w:r>
         <w:rPr>
-          <w:color w:val="203047"/>
-          <w:sz w:val="20"/>
-          <w:szCs w:val="20"/>
-        </w:rPr>
-        <w:t xml:space="preserve">Feedback: at the first exhibition, visitors asked to check health functional foods alongside prescription drugs.</w:t>
+          <w:b/>
+          <w:bCs/>
+          <w:color w:val="C0392B"/>
+          <w:sz w:val="20"/>
+          <w:szCs w:val="20"/>
+        </w:rPr>
+        <w:t xml:space="preserve">Problem:</w:t>
+      </w:r>
+      <w:r>
+        <w:rPr>
+          <w:color w:val="203047"/>
+          <w:sz w:val="20"/>
+          <w:szCs w:val="20"/>
+        </w:rPr>
+        <w:t xml:space="preserve"> at the first exhibition visitors could only check prescription drugs and asked to see health functional foods too.</w:t>
       </w:r>
       <w:r>
         <w:br/>
       </w:r>
       <w:r>
         <w:rPr>
-          <w:color w:val="203047"/>
-          <w:sz w:val="20"/>
-          <w:szCs w:val="20"/>
-        </w:rPr>
-        <w:t xml:space="preserve">What shipped: within the health functional food data we held, I added them to search and autocomplete, surfaced caution and co-administration information, allowed them in medication reminders and logs, and included them in chatbot answers.</w:t>
+          <w:b/>
+          <w:bCs/>
+          <w:color w:val="1F6FEB"/>
+          <w:sz w:val="20"/>
+          <w:szCs w:val="20"/>
+        </w:rPr>
+        <w:t xml:space="preserve">Solution:</w:t>
+      </w:r>
+      <w:r>
+        <w:rPr>
+          <w:color w:val="203047"/>
+          <w:sz w:val="20"/>
+          <w:szCs w:val="20"/>
+        </w:rPr>
+        <w:t xml:space="preserve"> within the data we held, added them to search and autocomplete, surfaced caution and co-administration information, allowed them in reminders and logs, and included them in chatbot answers.</w:t>
       </w:r>
       <w:r>
         <w:br/>
       </w:r>
       <w:r>
         <w:rPr>
-          <w:color w:val="203047"/>
-          <w:sz w:val="20"/>
-          <w:szCs w:val="20"/>
-        </w:rPr>
-        <w:t xml:space="preserve">Scope: limited to the data we had obtained; not the exhaustive coverage we have for drugs.</w:t>
+          <w:b/>
+          <w:bCs/>
+          <w:color w:val="1E8449"/>
+          <w:sz w:val="20"/>
+          <w:szCs w:val="20"/>
+        </w:rPr>
+        <w:t xml:space="preserve">Result:</w:t>
+      </w:r>
+      <w:r>
+        <w:rPr>
+          <w:color w:val="203047"/>
+          <w:sz w:val="20"/>
+          <w:szCs w:val="20"/>
+        </w:rPr>
+        <w:t xml:space="preserve"> a request from the floor became the next slice of work. Limited to the data we had obtained, not the exhaustive coverage we have for drugs.</w:t>
       </w:r>
     </w:p>
     <w:p>
@@ -2032,7 +1946,7 @@
       <w:pPr>
         <w:spacing w:after="80" w:before="80" w:line="300"/>
       </w:pPr>
-      <w:hyperlink w:history="1" r:id="rIdqmyv-3wevfiwezemlfco0">
+      <w:hyperlink w:history="1" r:id="rIdd6z3wgaq86m3_oweiukqs">
         <w:r>
           <w:rPr>
             <w:color w:val="315CBB"/>
@@ -2050,7 +1964,7 @@
         </w:rPr>
         <w:t xml:space="preserve">   </w:t>
       </w:r>
-      <w:hyperlink w:history="1" r:id="rIddpfqddwz0q9konqh50rbe">
+      <w:hyperlink w:history="1" r:id="rIdi7rhqficizzrvq21povoq">
         <w:r>
           <w:rPr>
             <w:color w:val="315CBB"/>
@@ -2437,7 +2351,7 @@
             <w:pPr>
               <w:spacing w:after="80" w:before="80" w:line="300"/>
             </w:pPr>
-            <w:hyperlink w:history="1" r:id="rIdambt6eflvrkhazfnvdj22">
+            <w:hyperlink w:history="1" r:id="rIdgmqapbgagdr5b-bwo6klu">
               <w:r>
                 <w:rPr>
                   <w:color w:val="315CBB"/>
@@ -2455,7 +2369,7 @@
               </w:rPr>
               <w:t xml:space="preserve">   </w:t>
             </w:r>
-            <w:hyperlink w:history="1" r:id="rIda9cfa6zswretuqvf4o9hc">
+            <w:hyperlink w:history="1" r:id="rIdbu6geupxc84koylbu2a0j">
               <w:r>
                 <w:rPr>
                   <w:color w:val="315CBB"/>
@@ -2473,7 +2387,7 @@
               </w:rPr>
               <w:t xml:space="preserve">   </w:t>
             </w:r>
-            <w:hyperlink w:history="1" r:id="rIde5trpffkquqva_q2jfcpi">
+            <w:hyperlink w:history="1" r:id="rIdfooca1ruzwqxzfcnex3r6">
               <w:r>
                 <w:rPr>
                   <w:color w:val="315CBB"/>
@@ -2941,7 +2855,7 @@
             <w:pPr>
               <w:spacing w:after="80" w:before="0" w:line="300"/>
             </w:pPr>
-            <w:hyperlink w:history="1" r:id="rIdh_p5tw8wvtgjb9b3kadbh">
+            <w:hyperlink w:history="1" r:id="rIddayp--lyuo8ehwxoixzwu">
               <w:r>
                 <w:rPr>
                   <w:color w:val="315CBB"/>

</xml_diff>

<commit_message>
Match the Word résumé to the PDF typography
The two documents are built by different engines — Chrome printing CSS
versus Word paragraphs assembled by the docx library — and they shared no
values, so the same content ran to seven pages in Word against three in the
PDF: 10pt text on 15pt lines instead of 7.5pt on 10.9pt, wider margins, and
a forced page break the PDF had already dropped.

- Derive every size from the CSS: px × 1.5 for half-points, px × 15 for
  spacing in twips
- Compute each paragraph's line height from its own size, reproducing
  line-height 1.45 (1.4 in English) instead of one flat value
- Split the project title from the activity headings, which are 17px and
  12px in CSS but shared one style
- Use the PDF's page margins and footer position
- Drop the forced break before activities, whose comment still claimed
  parity with a PDF rule removed earlier

Co-Authored-By: Claude Opus 5 (1M context) <noreply@anthropic.com>
</commit_message>
<xml_diff>
--- a/site/en/resume.docx
+++ b/site/en/resume.docx
@@ -4,7 +4,7 @@
   <w:body>
     <w:tbl>
       <w:tblPr>
-        <w:tblW w:type="dxa" w:w="10092"/>
+        <w:tblW w:type="dxa" w:w="10318"/>
         <w:tblBorders>
           <w:top w:val="none" w:color="FFFFFF" w:sz="0"/>
           <w:left w:val="none" w:color="FFFFFF" w:sz="0"/>
@@ -16,7 +16,7 @@
         <w:tblLayout w:type="fixed"/>
       </w:tblPr>
       <w:tblGrid>
-        <w:gridCol w:w="10092"/>
+        <w:gridCol w:w="10318"/>
       </w:tblGrid>
       <w:tr>
         <w:trPr>
@@ -24,27 +24,27 @@
         </w:trPr>
         <w:tc>
           <w:tcPr>
-            <w:tcW w:type="dxa" w:w="10092"/>
+            <w:tcW w:type="dxa" w:w="10318"/>
             <w:shd w:fill="EFF3FC"/>
             <w:tcMar>
-              <w:top w:type="dxa" w:w="200"/>
-              <w:left w:type="dxa" w:w="260"/>
-              <w:bottom w:type="dxa" w:w="200"/>
-              <w:right w:type="dxa" w:w="260"/>
+              <w:top w:type="dxa" w:w="195"/>
+              <w:left w:type="dxa" w:w="240"/>
+              <w:bottom w:type="dxa" w:w="195"/>
+              <w:right w:type="dxa" w:w="240"/>
             </w:tcMar>
           </w:tcPr>
           <w:p>
             <w:pPr>
               <w:keepNext/>
-              <w:spacing w:after="60" w:before="0" w:line="276"/>
+              <w:spacing w:after="0" w:before="0" w:line="322"/>
             </w:pPr>
             <w:r>
               <w:rPr>
                 <w:b/>
                 <w:bCs/>
                 <w:color w:val="315CBB"/>
-                <w:sz w:val="20"/>
-                <w:szCs w:val="20"/>
+                <w:sz w:val="23"/>
+                <w:szCs w:val="23"/>
               </w:rPr>
               <w:t xml:space="preserve">Jaehyeong Kim · AI Application Developer / Backend Engineer</w:t>
             </w:r>
@@ -52,15 +52,15 @@
           <w:p>
             <w:pPr>
               <w:keepNext/>
-              <w:spacing w:after="80" w:before="60" w:line="276"/>
+              <w:spacing w:after="75" w:before="75" w:line="364"/>
             </w:pPr>
             <w:r>
               <w:rPr>
                 <w:b/>
                 <w:bCs/>
                 <w:color w:val="315CBB"/>
-                <w:sz w:val="34"/>
-                <w:szCs w:val="34"/>
+                <w:sz w:val="26"/>
+                <w:szCs w:val="26"/>
               </w:rPr>
               <w:t xml:space="preserve">A developer who digs into root causes</w:t>
             </w:r>
@@ -69,8 +69,8 @@
                 <w:b/>
                 <w:bCs/>
                 <w:color w:val="315CBB"/>
-                <w:sz w:val="34"/>
-                <w:szCs w:val="34"/>
+                <w:sz w:val="26"/>
+                <w:szCs w:val="26"/>
               </w:rPr>
               <w:t xml:space="preserve"> </w:t>
             </w:r>
@@ -79,35 +79,35 @@
                 <w:b/>
                 <w:bCs/>
                 <w:color w:val="315CBB"/>
-                <w:sz w:val="34"/>
-                <w:szCs w:val="34"/>
+                <w:sz w:val="26"/>
+                <w:szCs w:val="26"/>
               </w:rPr>
               <w:t xml:space="preserve">and enjoys solving difficult problems</w:t>
             </w:r>
           </w:p>
           <w:p>
             <w:pPr>
-              <w:spacing w:after="140" w:before="0" w:line="300"/>
+              <w:spacing w:after="90" w:before="0" w:line="210"/>
             </w:pPr>
             <w:r>
               <w:rPr>
                 <w:color w:val="607089"/>
-                <w:sz w:val="22"/>
-                <w:szCs w:val="22"/>
+                <w:sz w:val="15"/>
+                <w:szCs w:val="15"/>
               </w:rPr>
               <w:t xml:space="preserve">AI Application Developer · Backend Engineer</w:t>
             </w:r>
           </w:p>
           <w:p>
             <w:pPr>
-              <w:spacing w:after="80" w:before="80" w:line="300"/>
-            </w:pPr>
-            <w:hyperlink w:history="1" r:id="rIdfjt7yc-dshloyaw6puhst">
+              <w:spacing w:after="0" w:before="75" w:line="210"/>
+            </w:pPr>
+            <w:hyperlink w:history="1" r:id="rId78zehyaydu1jdj4dbcvby">
               <w:r>
                 <w:rPr>
                   <w:color w:val="315CBB"/>
-                  <w:sz w:val="20"/>
-                  <w:szCs w:val="20"/>
+                  <w:sz w:val="15"/>
+                  <w:szCs w:val="15"/>
                 </w:rPr>
                 <w:t xml:space="preserve">kkuldangi2@gmail.com</w:t>
               </w:r>
@@ -115,17 +115,17 @@
             <w:r>
               <w:rPr>
                 <w:color w:val="203047"/>
-                <w:sz w:val="20"/>
-                <w:szCs w:val="20"/>
+                <w:sz w:val="15"/>
+                <w:szCs w:val="15"/>
               </w:rPr>
               <w:t xml:space="preserve">   </w:t>
             </w:r>
-            <w:hyperlink w:history="1" r:id="rIdz2ell9lronya7er6gdnp7">
+            <w:hyperlink w:history="1" r:id="rIdzvyk-8amys_crp4pklhx3">
               <w:r>
                 <w:rPr>
                   <w:color w:val="315CBB"/>
-                  <w:sz w:val="20"/>
-                  <w:szCs w:val="20"/>
+                  <w:sz w:val="15"/>
+                  <w:szCs w:val="15"/>
                 </w:rPr>
                 <w:t xml:space="preserve">GitHub ↗</w:t>
               </w:r>
@@ -133,17 +133,17 @@
             <w:r>
               <w:rPr>
                 <w:color w:val="203047"/>
-                <w:sz w:val="20"/>
-                <w:szCs w:val="20"/>
+                <w:sz w:val="15"/>
+                <w:szCs w:val="15"/>
               </w:rPr>
               <w:t xml:space="preserve">   </w:t>
             </w:r>
-            <w:hyperlink w:history="1" r:id="rIdoawd7bdt3mtdot4cr_zv1">
+            <w:hyperlink w:history="1" r:id="rIdjsqff9gp93gtrqli9yvvm">
               <w:r>
                 <w:rPr>
                   <w:color w:val="315CBB"/>
-                  <w:sz w:val="20"/>
-                  <w:szCs w:val="20"/>
+                  <w:sz w:val="15"/>
+                  <w:szCs w:val="15"/>
                 </w:rPr>
                 <w:t xml:space="preserve">Blog ↗</w:t>
               </w:r>
@@ -151,17 +151,17 @@
             <w:r>
               <w:rPr>
                 <w:color w:val="203047"/>
-                <w:sz w:val="20"/>
-                <w:szCs w:val="20"/>
+                <w:sz w:val="15"/>
+                <w:szCs w:val="15"/>
               </w:rPr>
               <w:t xml:space="preserve">   </w:t>
             </w:r>
-            <w:hyperlink w:history="1" r:id="rIdqh0weztudkytdzdcdmb3_">
+            <w:hyperlink w:history="1" r:id="rIdtt0kxfd7z6chqamdx7kx7">
               <w:r>
                 <w:rPr>
                   <w:color w:val="315CBB"/>
-                  <w:sz w:val="20"/>
-                  <w:szCs w:val="20"/>
+                  <w:sz w:val="15"/>
+                  <w:szCs w:val="15"/>
                 </w:rPr>
                 <w:t xml:space="preserve">LinkedIn ↗</w:t>
               </w:r>
@@ -169,8 +169,8 @@
             <w:r>
               <w:rPr>
                 <w:color w:val="203047"/>
-                <w:sz w:val="20"/>
-                <w:szCs w:val="20"/>
+                <w:sz w:val="15"/>
+                <w:szCs w:val="15"/>
               </w:rPr>
               <w:t xml:space="preserve">   </w:t>
             </w:r>
@@ -184,15 +184,15 @@
         <w:pBdr>
           <w:bottom w:val="single" w:color="6A80BD" w:sz="12" w:space="4"/>
         </w:pBdr>
-        <w:spacing w:after="180" w:before="420" w:line="276"/>
+        <w:spacing w:after="135" w:before="240" w:line="252"/>
       </w:pPr>
       <w:r>
         <w:rPr>
           <w:b/>
           <w:bCs/>
           <w:color w:val="315CBB"/>
-          <w:sz w:val="24"/>
-          <w:szCs w:val="24"/>
+          <w:sz w:val="18"/>
+          <w:szCs w:val="18"/>
         </w:rPr>
         <w:t xml:space="preserve">SUMMARY</w:t>
       </w:r>
@@ -204,15 +204,15 @@
           <w:ilvl w:val="0"/>
           <w:numId w:val="1"/>
         </w:numPr>
-        <w:spacing w:after="100" w:before="100" w:line="300"/>
-      </w:pPr>
-      <w:r>
-        <w:rPr>
-          <w:b/>
-          <w:bCs/>
-          <w:color w:val="203047"/>
-          <w:sz w:val="20"/>
-          <w:szCs w:val="20"/>
+        <w:spacing w:after="75" w:before="0" w:line="210"/>
+      </w:pPr>
+      <w:r>
+        <w:rPr>
+          <w:b/>
+          <w:bCs/>
+          <w:color w:val="203047"/>
+          <w:sz w:val="15"/>
+          <w:szCs w:val="15"/>
         </w:rPr>
         <w:t xml:space="preserve">RAG evidence selection: coverage 66.25% → 91.25%, false evidence 20 → 0</w:t>
       </w:r>
@@ -224,15 +224,15 @@
           <w:ilvl w:val="0"/>
           <w:numId w:val="1"/>
         </w:numPr>
-        <w:spacing w:after="100" w:before="100" w:line="300"/>
-      </w:pPr>
-      <w:r>
-        <w:rPr>
-          <w:b/>
-          <w:bCs/>
-          <w:color w:val="203047"/>
-          <w:sz w:val="20"/>
-          <w:szCs w:val="20"/>
+        <w:spacing w:after="75" w:before="0" w:line="210"/>
+      </w:pPr>
+      <w:r>
+        <w:rPr>
+          <w:b/>
+          <w:bCs/>
+          <w:color w:val="203047"/>
+          <w:sz w:val="15"/>
+          <w:szCs w:val="15"/>
         </w:rPr>
         <w:t xml:space="preserve">Agent execution environment: user-defined skills behind approval, edit quality 94/114 → 104/114</w:t>
       </w:r>
@@ -244,15 +244,15 @@
           <w:ilvl w:val="0"/>
           <w:numId w:val="1"/>
         </w:numPr>
-        <w:spacing w:after="100" w:before="100" w:line="300"/>
-      </w:pPr>
-      <w:r>
-        <w:rPr>
-          <w:b/>
-          <w:bCs/>
-          <w:color w:val="203047"/>
-          <w:sz w:val="20"/>
-          <w:szCs w:val="20"/>
+        <w:spacing w:after="75" w:before="0" w:line="210"/>
+      </w:pPr>
+      <w:r>
+        <w:rPr>
+          <w:b/>
+          <w:bCs/>
+          <w:color w:val="203047"/>
+          <w:sz w:val="15"/>
+          <w:szCs w:val="15"/>
         </w:rPr>
         <w:t xml:space="preserve">Data pipelines: PDF conversion pass rate 45.17% → 89.89%, drug conversion $200 estimated → $11.18 spent</w:t>
       </w:r>
@@ -263,22 +263,22 @@
         <w:pBdr>
           <w:bottom w:val="single" w:color="6A80BD" w:sz="12" w:space="4"/>
         </w:pBdr>
-        <w:spacing w:after="180" w:before="420" w:line="276"/>
+        <w:spacing w:after="135" w:before="240" w:line="252"/>
       </w:pPr>
       <w:r>
         <w:rPr>
           <w:b/>
           <w:bCs/>
           <w:color w:val="315CBB"/>
-          <w:sz w:val="24"/>
-          <w:szCs w:val="24"/>
+          <w:sz w:val="18"/>
+          <w:szCs w:val="18"/>
         </w:rPr>
         <w:t xml:space="preserve">PROJECTS &amp; EXPERIENCE</w:t>
       </w:r>
     </w:p>
     <w:tbl>
       <w:tblPr>
-        <w:tblW w:type="dxa" w:w="10092"/>
+        <w:tblW w:type="dxa" w:w="10318"/>
         <w:tblBorders>
           <w:top w:val="none" w:color="FFFFFF" w:sz="0"/>
           <w:left w:val="none" w:color="FFFFFF" w:sz="0"/>
@@ -290,8 +290,8 @@
         <w:tblLayout w:type="fixed"/>
       </w:tblPr>
       <w:tblGrid>
-        <w:gridCol w:w="7064"/>
-        <w:gridCol w:w="3028"/>
+        <w:gridCol w:w="7223"/>
+        <w:gridCol w:w="3095"/>
       </w:tblGrid>
       <w:tr>
         <w:trPr>
@@ -299,26 +299,26 @@
         </w:trPr>
         <w:tc>
           <w:tcPr>
-            <w:tcW w:type="dxa" w:w="7064"/>
+            <w:tcW w:type="dxa" w:w="7223"/>
             <w:tcMar>
-              <w:top w:type="dxa" w:w="280"/>
+              <w:top w:type="dxa" w:w="204"/>
               <w:left w:type="dxa" w:w="0"/>
-              <w:bottom w:type="dxa" w:w="60"/>
+              <w:bottom w:type="dxa" w:w="44"/>
               <w:right w:type="dxa" w:w="0"/>
             </w:tcMar>
           </w:tcPr>
           <w:p>
             <w:pPr>
               <w:keepNext/>
-              <w:spacing w:after="0" w:before="0" w:line="276"/>
+              <w:spacing w:after="0" w:before="0" w:line="364"/>
             </w:pPr>
             <w:r>
               <w:rPr>
                 <w:b/>
                 <w:bCs/>
                 <w:color w:val="203047"/>
-                <w:sz w:val="24"/>
-                <w:szCs w:val="24"/>
+                <w:sz w:val="26"/>
+                <w:szCs w:val="26"/>
               </w:rPr>
               <w:t xml:space="preserve">Fruition</w:t>
             </w:r>
@@ -326,25 +326,25 @@
         </w:tc>
         <w:tc>
           <w:tcPr>
-            <w:tcW w:type="dxa" w:w="3028"/>
+            <w:tcW w:type="dxa" w:w="3095"/>
             <w:tcMar>
-              <w:top w:type="dxa" w:w="280"/>
+              <w:top w:type="dxa" w:w="204"/>
               <w:left w:type="dxa" w:w="0"/>
-              <w:bottom w:type="dxa" w:w="60"/>
+              <w:bottom w:type="dxa" w:w="44"/>
               <w:right w:type="dxa" w:w="0"/>
             </w:tcMar>
           </w:tcPr>
           <w:p>
             <w:pPr>
               <w:keepNext/>
-              <w:spacing w:after="80" w:before="0" w:line="300"/>
+              <w:spacing w:after="75" w:before="0" w:line="196"/>
               <w:jc w:val="right"/>
             </w:pPr>
             <w:r>
               <w:rPr>
                 <w:color w:val="607089"/>
-                <w:sz w:val="18"/>
-                <w:szCs w:val="18"/>
+                <w:sz w:val="14"/>
+                <w:szCs w:val="14"/>
               </w:rPr>
               <w:t xml:space="preserve">2026.04 — Present</w:t>
             </w:r>
@@ -354,13 +354,13 @@
     </w:tbl>
     <w:p>
       <w:pPr>
-        <w:spacing w:after="80" w:before="0" w:line="300"/>
+        <w:spacing w:after="75" w:before="0" w:line="196"/>
       </w:pPr>
       <w:r>
         <w:rPr>
           <w:color w:val="607089"/>
-          <w:sz w:val="18"/>
-          <w:szCs w:val="18"/>
+          <w:sz w:val="14"/>
+          <w:szCs w:val="14"/>
         </w:rPr>
         <w:t xml:space="preserve">LLM Wiki-based AI workspace · AI SW Maestro, 17th cohort · Deployed on AWS EKS, in QA</w:t>
       </w:r>
@@ -370,21 +370,21 @@
       <w:r>
         <w:rPr>
           <w:color w:val="607089"/>
-          <w:sz w:val="18"/>
-          <w:szCs w:val="18"/>
+          <w:sz w:val="14"/>
+          <w:szCs w:val="14"/>
         </w:rPr>
         <w:t xml:space="preserve">Team project (3 + designer) / AI lead</w:t>
       </w:r>
     </w:p>
     <w:p>
       <w:pPr>
-        <w:spacing w:after="80" w:before="0" w:line="300"/>
+        <w:spacing w:after="75" w:before="0" w:line="196"/>
       </w:pPr>
       <w:r>
         <w:rPr>
           <w:color w:val="607089"/>
-          <w:sz w:val="18"/>
-          <w:szCs w:val="18"/>
+          <w:sz w:val="14"/>
+          <w:szCs w:val="14"/>
         </w:rPr>
         <w:t xml:space="preserve">How it started: a teammate’s pain point with managing documents, refined through design thinking — saved documents could not be found when needed.</w:t>
       </w:r>
@@ -394,22 +394,22 @@
       <w:r>
         <w:rPr>
           <w:color w:val="607089"/>
-          <w:sz w:val="18"/>
-          <w:szCs w:val="18"/>
+          <w:sz w:val="14"/>
+          <w:szCs w:val="14"/>
         </w:rPr>
         <w:t xml:space="preserve">Team: me (all AI), 1 backend (Spring backend), 1 frontend &amp; DevOps (frontend, MSA deployment on AWS), external designer · 3 mentors</w:t>
       </w:r>
     </w:p>
     <w:p>
       <w:pPr>
-        <w:spacing w:after="80" w:before="0" w:line="300"/>
-      </w:pPr>
-      <w:hyperlink w:history="1" r:id="rIdvqt_3unyk6-08wwq8dpnq">
+        <w:spacing w:after="75" w:before="0" w:line="210"/>
+      </w:pPr>
+      <w:hyperlink w:history="1" r:id="rIdhyko_kxiqzzswoel_9hkp">
         <w:r>
           <w:rPr>
             <w:color w:val="315CBB"/>
-            <w:sz w:val="20"/>
-            <w:szCs w:val="20"/>
+            <w:sz w:val="15"/>
+            <w:szCs w:val="15"/>
           </w:rPr>
           <w:t xml:space="preserve">GitHub · AI repository ↗</w:t>
         </w:r>
@@ -418,28 +418,28 @@
     <w:p>
       <w:pPr>
         <w:keepNext/>
-        <w:spacing w:after="80" w:before="240" w:line="276"/>
+        <w:spacing w:after="45" w:before="105" w:line="238"/>
       </w:pPr>
       <w:r>
         <w:rPr>
           <w:b/>
           <w:bCs/>
           <w:color w:val="315CBB"/>
-          <w:sz w:val="22"/>
-          <w:szCs w:val="22"/>
+          <w:sz w:val="17"/>
+          <w:szCs w:val="17"/>
         </w:rPr>
         <w:t xml:space="preserve">Improving retrieval for grounded AI answers</w:t>
       </w:r>
     </w:p>
     <w:p>
       <w:pPr>
-        <w:spacing w:after="80" w:before="0" w:line="300"/>
+        <w:spacing w:after="75" w:before="0" w:line="196"/>
       </w:pPr>
       <w:r>
         <w:rPr>
           <w:color w:val="607089"/>
-          <w:sz w:val="18"/>
-          <w:szCs w:val="18"/>
+          <w:sz w:val="14"/>
+          <w:szCs w:val="14"/>
         </w:rPr>
         <w:t xml:space="preserve">Retrieved document evidence for AI answers. Coverage on 80 answerable questions rose from 66.25% to 91.25%, while false evidence returns on 20 unanswerable questions fell from 20 to 0.</w:t>
       </w:r>
@@ -451,15 +451,15 @@
           <w:ilvl w:val="0"/>
           <w:numId w:val="1"/>
         </w:numPr>
-        <w:spacing w:after="100" w:before="100" w:line="300"/>
-      </w:pPr>
-      <w:r>
-        <w:rPr>
-          <w:b/>
-          <w:bCs/>
-          <w:color w:val="203047"/>
-          <w:sz w:val="20"/>
-          <w:szCs w:val="20"/>
+        <w:spacing w:after="75" w:before="0" w:line="210"/>
+      </w:pPr>
+      <w:r>
+        <w:rPr>
+          <w:b/>
+          <w:bCs/>
+          <w:color w:val="203047"/>
+          <w:sz w:val="15"/>
+          <w:szCs w:val="15"/>
         </w:rPr>
         <w:t xml:space="preserve">Evidence selection for RAG</w:t>
       </w:r>
@@ -471,16 +471,16 @@
           <w:b/>
           <w:bCs/>
           <w:color w:val="C0392B"/>
-          <w:sz w:val="20"/>
-          <w:szCs w:val="20"/>
+          <w:sz w:val="15"/>
+          <w:szCs w:val="15"/>
         </w:rPr>
         <w:t xml:space="preserve">Problem:</w:t>
       </w:r>
       <w:r>
         <w:rPr>
           <w:color w:val="203047"/>
-          <w:sz w:val="20"/>
-          <w:szCs w:val="20"/>
+          <w:sz w:val="15"/>
+          <w:szCs w:val="15"/>
         </w:rPr>
         <w:t xml:space="preserve"> Retrieval missed required facts and returned evidence for unanswerable questions.</w:t>
       </w:r>
@@ -492,16 +492,16 @@
           <w:b/>
           <w:bCs/>
           <w:color w:val="1F6FEB"/>
-          <w:sz w:val="20"/>
-          <w:szCs w:val="20"/>
+          <w:sz w:val="15"/>
+          <w:szCs w:val="15"/>
         </w:rPr>
         <w:t xml:space="preserve">Solution:</w:t>
       </w:r>
       <w:r>
         <w:rPr>
           <w:color w:val="203047"/>
-          <w:sz w:val="20"/>
-          <w:szCs w:val="20"/>
+          <w:sz w:val="15"/>
+          <w:szCs w:val="15"/>
         </w:rPr>
         <w:t xml:space="preserve"> Applied Jev after routing tests, then controlled candidates and return limits after a full-corpus trial. Tuned to 300 candidates and up to 4 parallel batches.</w:t>
       </w:r>
@@ -513,16 +513,16 @@
           <w:b/>
           <w:bCs/>
           <w:color w:val="1E8449"/>
-          <w:sz w:val="20"/>
-          <w:szCs w:val="20"/>
+          <w:sz w:val="15"/>
+          <w:szCs w:val="15"/>
         </w:rPr>
         <w:t xml:space="preserve">Result:</w:t>
       </w:r>
       <w:r>
         <w:rPr>
           <w:color w:val="203047"/>
-          <w:sz w:val="20"/>
-          <w:szCs w:val="20"/>
+          <w:sz w:val="15"/>
+          <w:szCs w:val="15"/>
         </w:rPr>
         <w:t xml:space="preserve"> Across 9 papers, coverage on 80 answerable questions rose from 66.25% to 91.25%. False evidence returns on 20 unanswerable questions fell from 20 to 0. Median time before/after Jev tuning: 9.090s → 2.251s.</w:t>
       </w:r>
@@ -530,28 +530,28 @@
     <w:p>
       <w:pPr>
         <w:keepNext/>
-        <w:spacing w:after="80" w:before="240" w:line="276"/>
+        <w:spacing w:after="45" w:before="105" w:line="238"/>
       </w:pPr>
       <w:r>
         <w:rPr>
           <w:b/>
           <w:bCs/>
           <w:color w:val="315CBB"/>
-          <w:sz w:val="22"/>
-          <w:szCs w:val="22"/>
+          <w:sz w:val="17"/>
+          <w:szCs w:val="17"/>
         </w:rPr>
         <w:t xml:space="preserve">Agent execution environment - skills, approval, routing and conversation context</w:t>
       </w:r>
     </w:p>
     <w:p>
       <w:pPr>
-        <w:spacing w:after="80" w:before="0" w:line="300"/>
+        <w:spacing w:after="75" w:before="0" w:line="196"/>
       </w:pPr>
       <w:r>
         <w:rPr>
           <w:color w:val="607089"/>
-          <w:sz w:val="18"/>
-          <w:szCs w:val="18"/>
+          <w:sz w:val="14"/>
+          <w:szCs w:val="14"/>
         </w:rPr>
         <w:t xml:space="preserve">Built reusable Skills with user approval before changes. Applied Jev to route requests to questions, edits and other tasks: correct decisions rose from 77/98 to 81/98, and median decision time fell from 8.967s to 0.658s. I also set the scope of the conversation context and edit input the model receives.</w:t>
       </w:r>
@@ -563,15 +563,15 @@
           <w:ilvl w:val="0"/>
           <w:numId w:val="1"/>
         </w:numPr>
-        <w:spacing w:after="100" w:before="100" w:line="300"/>
-      </w:pPr>
-      <w:r>
-        <w:rPr>
-          <w:b/>
-          <w:bCs/>
-          <w:color w:val="203047"/>
-          <w:sz w:val="20"/>
-          <w:szCs w:val="20"/>
+        <w:spacing w:after="75" w:before="0" w:line="210"/>
+      </w:pPr>
+      <w:r>
+        <w:rPr>
+          <w:b/>
+          <w:bCs/>
+          <w:color w:val="203047"/>
+          <w:sz w:val="15"/>
+          <w:szCs w:val="15"/>
         </w:rPr>
         <w:t xml:space="preserve">User-defined task instructions (Skills)</w:t>
       </w:r>
@@ -583,16 +583,16 @@
           <w:b/>
           <w:bCs/>
           <w:color w:val="C0392B"/>
-          <w:sz w:val="20"/>
-          <w:szCs w:val="20"/>
+          <w:sz w:val="15"/>
+          <w:szCs w:val="15"/>
         </w:rPr>
         <w:t xml:space="preserve">Problem:</w:t>
       </w:r>
       <w:r>
         <w:rPr>
           <w:color w:val="203047"/>
-          <w:sz w:val="20"/>
-          <w:szCs w:val="20"/>
+          <w:sz w:val="15"/>
+          <w:szCs w:val="15"/>
         </w:rPr>
         <w:t xml:space="preserve"> Developers cannot build every recurring workflow users need.</w:t>
       </w:r>
@@ -604,16 +604,16 @@
           <w:b/>
           <w:bCs/>
           <w:color w:val="1F6FEB"/>
-          <w:sz w:val="20"/>
-          <w:szCs w:val="20"/>
+          <w:sz w:val="15"/>
+          <w:szCs w:val="15"/>
         </w:rPr>
         <w:t xml:space="preserve">Solution:</w:t>
       </w:r>
       <w:r>
         <w:rPr>
           <w:color w:val="203047"/>
-          <w:sz w:val="20"/>
-          <w:szCs w:val="20"/>
+          <w:sz w:val="15"/>
+          <w:szCs w:val="15"/>
         </w:rPr>
         <w:t xml:space="preserve"> Built drafting, review and publishing of natural-language instructions, with checks against bypassing permissions or approval. Document changes require separate preview and approval.</w:t>
       </w:r>
@@ -625,16 +625,16 @@
           <w:b/>
           <w:bCs/>
           <w:color w:val="1E8449"/>
-          <w:sz w:val="20"/>
-          <w:szCs w:val="20"/>
+          <w:sz w:val="15"/>
+          <w:szCs w:val="15"/>
         </w:rPr>
         <w:t xml:space="preserve">Result:</w:t>
       </w:r>
       <w:r>
         <w:rPr>
           <w:color w:val="203047"/>
-          <w:sz w:val="20"/>
-          <w:szCs w:val="20"/>
+          <w:sz w:val="15"/>
+          <w:szCs w:val="15"/>
         </w:rPr>
         <w:t xml:space="preserve"> Published Skills became available to the Agent. In a 6-document check, no changes occurred before approval; 3 folders were created and documents moved afterward.</w:t>
       </w:r>
@@ -646,15 +646,15 @@
           <w:ilvl w:val="0"/>
           <w:numId w:val="1"/>
         </w:numPr>
-        <w:spacing w:after="100" w:before="100" w:line="300"/>
-      </w:pPr>
-      <w:r>
-        <w:rPr>
-          <w:b/>
-          <w:bCs/>
-          <w:color w:val="203047"/>
-          <w:sz w:val="20"/>
-          <w:szCs w:val="20"/>
+        <w:spacing w:after="75" w:before="0" w:line="210"/>
+      </w:pPr>
+      <w:r>
+        <w:rPr>
+          <w:b/>
+          <w:bCs/>
+          <w:color w:val="203047"/>
+          <w:sz w:val="15"/>
+          <w:szCs w:val="15"/>
         </w:rPr>
         <w:t xml:space="preserve">Jev-based request routing</w:t>
       </w:r>
@@ -666,16 +666,16 @@
           <w:b/>
           <w:bCs/>
           <w:color w:val="C0392B"/>
-          <w:sz w:val="20"/>
-          <w:szCs w:val="20"/>
+          <w:sz w:val="15"/>
+          <w:szCs w:val="15"/>
         </w:rPr>
         <w:t xml:space="preserve">Problem:</w:t>
       </w:r>
       <w:r>
         <w:rPr>
           <w:color w:val="203047"/>
-          <w:sz w:val="20"/>
-          <w:szCs w:val="20"/>
+          <w:sz w:val="15"/>
+          <w:szCs w:val="15"/>
         </w:rPr>
         <w:t xml:space="preserve"> Misclassifying questions as edits led to the wrong action.</w:t>
       </w:r>
@@ -687,16 +687,16 @@
           <w:b/>
           <w:bCs/>
           <w:color w:val="1F6FEB"/>
-          <w:sz w:val="20"/>
-          <w:szCs w:val="20"/>
+          <w:sz w:val="15"/>
+          <w:szCs w:val="15"/>
         </w:rPr>
         <w:t xml:space="preserve">Solution:</w:t>
       </w:r>
       <w:r>
         <w:rPr>
           <w:color w:val="203047"/>
-          <w:sz w:val="20"/>
-          <w:szCs w:val="20"/>
+          <w:sz w:val="15"/>
+          <w:szCs w:val="15"/>
         </w:rPr>
         <w:t xml:space="preserve"> Applied Jev, a model that picks only from a fixed set of options, to select task types and additional conditions for questions, edits, document creation and folder organization.</w:t>
       </w:r>
@@ -708,16 +708,16 @@
           <w:b/>
           <w:bCs/>
           <w:color w:val="1E8449"/>
-          <w:sz w:val="20"/>
-          <w:szCs w:val="20"/>
+          <w:sz w:val="15"/>
+          <w:szCs w:val="15"/>
         </w:rPr>
         <w:t xml:space="preserve">Result:</w:t>
       </w:r>
       <w:r>
         <w:rPr>
           <w:color w:val="203047"/>
-          <w:sz w:val="20"/>
-          <w:szCs w:val="20"/>
+          <w:sz w:val="15"/>
+          <w:szCs w:val="15"/>
         </w:rPr>
         <w:t xml:space="preserve"> Fully correct decisions on the same 98 requests rose from 77 to 81 (63 for GPT-5-nano on the same options). Median decision time fell from 8.967s to 0.658s.</w:t>
       </w:r>
@@ -729,15 +729,15 @@
           <w:ilvl w:val="0"/>
           <w:numId w:val="1"/>
         </w:numPr>
-        <w:spacing w:after="100" w:before="100" w:line="300"/>
-      </w:pPr>
-      <w:r>
-        <w:rPr>
-          <w:b/>
-          <w:bCs/>
-          <w:color w:val="203047"/>
-          <w:sz w:val="20"/>
-          <w:szCs w:val="20"/>
+        <w:spacing w:after="75" w:before="0" w:line="210"/>
+      </w:pPr>
+      <w:r>
+        <w:rPr>
+          <w:b/>
+          <w:bCs/>
+          <w:color w:val="203047"/>
+          <w:sz w:val="15"/>
+          <w:szCs w:val="15"/>
         </w:rPr>
         <w:t xml:space="preserve">Conversation memory</w:t>
       </w:r>
@@ -749,16 +749,16 @@
           <w:b/>
           <w:bCs/>
           <w:color w:val="C0392B"/>
-          <w:sz w:val="20"/>
-          <w:szCs w:val="20"/>
+          <w:sz w:val="15"/>
+          <w:szCs w:val="15"/>
         </w:rPr>
         <w:t xml:space="preserve">Problem:</w:t>
       </w:r>
       <w:r>
         <w:rPr>
           <w:color w:val="203047"/>
-          <w:sz w:val="20"/>
-          <w:szCs w:val="20"/>
+          <w:sz w:val="15"/>
+          <w:szCs w:val="15"/>
         </w:rPr>
         <w:t xml:space="preserve"> a long conversation cannot be passed to the model in full.</w:t>
       </w:r>
@@ -770,16 +770,16 @@
           <w:b/>
           <w:bCs/>
           <w:color w:val="1F6FEB"/>
-          <w:sz w:val="20"/>
-          <w:szCs w:val="20"/>
+          <w:sz w:val="15"/>
+          <w:szCs w:val="15"/>
         </w:rPr>
         <w:t xml:space="preserve">Solution:</w:t>
       </w:r>
       <w:r>
         <w:rPr>
           <w:color w:val="203047"/>
-          <w:sz w:val="20"/>
-          <w:szCs w:val="20"/>
+          <w:sz w:val="15"/>
+          <w:szCs w:val="15"/>
         </w:rPr>
         <w:t xml:space="preserve"> keep the last six turns verbatim, compress older ones into a rolling summary, and keep the previous summary when summarization fails. The router also receives earlier routing decisions, so referring expressions resolve against earlier turns.</w:t>
       </w:r>
@@ -791,15 +791,15 @@
           <w:ilvl w:val="0"/>
           <w:numId w:val="1"/>
         </w:numPr>
-        <w:spacing w:after="100" w:before="100" w:line="300"/>
-      </w:pPr>
-      <w:r>
-        <w:rPr>
-          <w:b/>
-          <w:bCs/>
-          <w:color w:val="203047"/>
-          <w:sz w:val="20"/>
-          <w:szCs w:val="20"/>
+        <w:spacing w:after="75" w:before="0" w:line="210"/>
+      </w:pPr>
+      <w:r>
+        <w:rPr>
+          <w:b/>
+          <w:bCs/>
+          <w:color w:val="203047"/>
+          <w:sz w:val="15"/>
+          <w:szCs w:val="15"/>
         </w:rPr>
         <w:t xml:space="preserve">Bounding the edit input</w:t>
       </w:r>
@@ -811,16 +811,16 @@
           <w:b/>
           <w:bCs/>
           <w:color w:val="C0392B"/>
-          <w:sz w:val="20"/>
-          <w:szCs w:val="20"/>
+          <w:sz w:val="15"/>
+          <w:szCs w:val="15"/>
         </w:rPr>
         <w:t xml:space="preserve">Problem:</w:t>
       </w:r>
       <w:r>
         <w:rPr>
           <w:color w:val="203047"/>
-          <w:sz w:val="20"/>
-          <w:szCs w:val="20"/>
+          <w:sz w:val="15"/>
+          <w:szCs w:val="15"/>
         </w:rPr>
         <w:t xml:space="preserve"> sending a whole document to the model drives up cost and latency.</w:t>
       </w:r>
@@ -832,16 +832,16 @@
           <w:b/>
           <w:bCs/>
           <w:color w:val="1F6FEB"/>
-          <w:sz w:val="20"/>
-          <w:szCs w:val="20"/>
+          <w:sz w:val="15"/>
+          <w:szCs w:val="15"/>
         </w:rPr>
         <w:t xml:space="preserve">Solution:</w:t>
       </w:r>
       <w:r>
         <w:rPr>
           <w:color w:val="203047"/>
-          <w:sz w:val="20"/>
-          <w:szCs w:val="20"/>
+          <w:sz w:val="15"/>
+          <w:szCs w:val="15"/>
         </w:rPr>
         <w:t xml:space="preserve"> send only the target line range plus surrounding context, and reject ranges that straddle a table or code-block boundary. A benchmark tracks input size against the source and average and p95 time.</w:t>
       </w:r>
@@ -849,28 +849,28 @@
     <w:p>
       <w:pPr>
         <w:keepNext/>
-        <w:spacing w:after="80" w:before="240" w:line="276"/>
+        <w:spacing w:after="45" w:before="105" w:line="238"/>
       </w:pPr>
       <w:r>
         <w:rPr>
           <w:b/>
           <w:bCs/>
           <w:color w:val="315CBB"/>
-          <w:sz w:val="22"/>
-          <w:szCs w:val="22"/>
+          <w:sz w:val="17"/>
+          <w:szCs w:val="17"/>
         </w:rPr>
         <w:t xml:space="preserve">Execution reliability and LLM tracing</w:t>
       </w:r>
     </w:p>
     <w:p>
       <w:pPr>
-        <w:spacing w:after="80" w:before="0" w:line="300"/>
+        <w:spacing w:after="75" w:before="0" w:line="196"/>
       </w:pPr>
       <w:r>
         <w:rPr>
           <w:color w:val="607089"/>
-          <w:sz w:val="18"/>
-          <w:szCs w:val="18"/>
+          <w:sz w:val="14"/>
+          <w:szCs w:val="14"/>
         </w:rPr>
         <w:t xml:space="preserve">Undoing changes an AI task already saved, and making each stage of a run inspectable. Execution spans several stores and cannot be one transaction, so recovery runs as reverse actions.</w:t>
       </w:r>
@@ -882,15 +882,15 @@
           <w:ilvl w:val="0"/>
           <w:numId w:val="1"/>
         </w:numPr>
-        <w:spacing w:after="100" w:before="100" w:line="300"/>
-      </w:pPr>
-      <w:r>
-        <w:rPr>
-          <w:b/>
-          <w:bCs/>
-          <w:color w:val="203047"/>
-          <w:sz w:val="20"/>
-          <w:szCs w:val="20"/>
+        <w:spacing w:after="75" w:before="0" w:line="210"/>
+      </w:pPr>
+      <w:r>
+        <w:rPr>
+          <w:b/>
+          <w:bCs/>
+          <w:color w:val="203047"/>
+          <w:sz w:val="15"/>
+          <w:szCs w:val="15"/>
         </w:rPr>
         <w:t xml:space="preserve">Undoing a cancelled task in reverse</w:t>
       </w:r>
@@ -902,16 +902,16 @@
           <w:b/>
           <w:bCs/>
           <w:color w:val="C0392B"/>
-          <w:sz w:val="20"/>
-          <w:szCs w:val="20"/>
+          <w:sz w:val="15"/>
+          <w:szCs w:val="15"/>
         </w:rPr>
         <w:t xml:space="preserve">Problem:</w:t>
       </w:r>
       <w:r>
         <w:rPr>
           <w:color w:val="203047"/>
-          <w:sz w:val="20"/>
-          <w:szCs w:val="20"/>
+          <w:sz w:val="15"/>
+          <w:szCs w:val="15"/>
         </w:rPr>
         <w:t xml:space="preserve"> an AI task saves documents, folders, wiki pages and skills between model calls, so stopping execution leaves some changes behind.</w:t>
       </w:r>
@@ -923,16 +923,16 @@
           <w:b/>
           <w:bCs/>
           <w:color w:val="1F6FEB"/>
-          <w:sz w:val="20"/>
-          <w:szCs w:val="20"/>
+          <w:sz w:val="15"/>
+          <w:szCs w:val="15"/>
         </w:rPr>
         <w:t xml:space="preserve">Solution:</w:t>
       </w:r>
       <w:r>
         <w:rPr>
           <w:color w:val="203047"/>
-          <w:sz w:val="20"/>
-          <w:szCs w:val="20"/>
+          <w:sz w:val="15"/>
+          <w:szCs w:val="15"/>
         </w:rPr>
         <w:t xml:space="preserve"> persist the cancellation first to block later writes, then undo children first using a pre-change snapshot and an idempotency key tied to the approval. Recovery uses the run record alone, never a model call, and cancellation is final only once full recovery is confirmed.</w:t>
       </w:r>
@@ -944,15 +944,15 @@
           <w:ilvl w:val="0"/>
           <w:numId w:val="1"/>
         </w:numPr>
-        <w:spacing w:after="100" w:before="100" w:line="300"/>
-      </w:pPr>
-      <w:r>
-        <w:rPr>
-          <w:b/>
-          <w:bCs/>
-          <w:color w:val="203047"/>
-          <w:sz w:val="20"/>
-          <w:szCs w:val="20"/>
+        <w:spacing w:after="75" w:before="0" w:line="210"/>
+      </w:pPr>
+      <w:r>
+        <w:rPr>
+          <w:b/>
+          <w:bCs/>
+          <w:color w:val="203047"/>
+          <w:sz w:val="15"/>
+          <w:szCs w:val="15"/>
         </w:rPr>
         <w:t xml:space="preserve">Recovering without erasing other tasks’ contributions</w:t>
       </w:r>
@@ -964,16 +964,16 @@
           <w:b/>
           <w:bCs/>
           <w:color w:val="C0392B"/>
-          <w:sz w:val="20"/>
-          <w:szCs w:val="20"/>
+          <w:sz w:val="15"/>
+          <w:szCs w:val="15"/>
         </w:rPr>
         <w:t xml:space="preserve">Problem:</w:t>
       </w:r>
       <w:r>
         <w:rPr>
           <w:color w:val="203047"/>
-          <w:sz w:val="20"/>
-          <w:szCs w:val="20"/>
+          <w:sz w:val="15"/>
+          <w:szCs w:val="15"/>
         </w:rPr>
         <w:t xml:space="preserve"> a concept page merges contributions from several documents, so an older snapshot would erase valid contributions from other documents.</w:t>
       </w:r>
@@ -985,16 +985,16 @@
           <w:b/>
           <w:bCs/>
           <w:color w:val="1F6FEB"/>
-          <w:sz w:val="20"/>
-          <w:szCs w:val="20"/>
+          <w:sz w:val="15"/>
+          <w:szCs w:val="15"/>
         </w:rPr>
         <w:t xml:space="preserve">Solution:</w:t>
       </w:r>
       <w:r>
         <w:rPr>
           <w:color w:val="203047"/>
-          <w:sz w:val="20"/>
-          <w:szCs w:val="20"/>
+          <w:sz w:val="15"/>
+          <w:szCs w:val="15"/>
         </w:rPr>
         <w:t xml:space="preserve"> record operations, revisions and per-document contributions append-only, then reassemble with only the target contribution excluded. Soft delete instead of removal keeps the audit trail.</w:t>
       </w:r>
@@ -1006,15 +1006,15 @@
           <w:ilvl w:val="0"/>
           <w:numId w:val="1"/>
         </w:numPr>
-        <w:spacing w:after="100" w:before="100" w:line="300"/>
-      </w:pPr>
-      <w:r>
-        <w:rPr>
-          <w:b/>
-          <w:bCs/>
-          <w:color w:val="203047"/>
-          <w:sz w:val="20"/>
-          <w:szCs w:val="20"/>
+        <w:spacing w:after="75" w:before="0" w:line="210"/>
+      </w:pPr>
+      <w:r>
+        <w:rPr>
+          <w:b/>
+          <w:bCs/>
+          <w:color w:val="203047"/>
+          <w:sz w:val="15"/>
+          <w:szCs w:val="15"/>
         </w:rPr>
         <w:t xml:space="preserve">LLM run tracing and the boundary around sensitive data</w:t>
       </w:r>
@@ -1026,16 +1026,16 @@
           <w:b/>
           <w:bCs/>
           <w:color w:val="C0392B"/>
-          <w:sz w:val="20"/>
-          <w:szCs w:val="20"/>
+          <w:sz w:val="15"/>
+          <w:szCs w:val="15"/>
         </w:rPr>
         <w:t xml:space="preserve">Problem:</w:t>
       </w:r>
       <w:r>
         <w:rPr>
           <w:color w:val="203047"/>
-          <w:sz w:val="20"/>
-          <w:szCs w:val="20"/>
+          <w:sz w:val="15"/>
+          <w:szCs w:val="15"/>
         </w:rPr>
         <w:t xml:space="preserve"> the evaluation loop ran as plain Python, so stages could not be inspected separately, and whatever reached the tracing tool could carry sensitive data.</w:t>
       </w:r>
@@ -1047,16 +1047,16 @@
           <w:b/>
           <w:bCs/>
           <w:color w:val="1F6FEB"/>
-          <w:sz w:val="20"/>
-          <w:szCs w:val="20"/>
+          <w:sz w:val="15"/>
+          <w:szCs w:val="15"/>
         </w:rPr>
         <w:t xml:space="preserve">Solution:</w:t>
       </w:r>
       <w:r>
         <w:rPr>
           <w:color w:val="203047"/>
-          <w:sz w:val="20"/>
-          <w:szCs w:val="20"/>
+          <w:sz w:val="15"/>
+          <w:szCs w:val="15"/>
         </w:rPr>
         <w:t xml:space="preserve"> rebuilt the loop as a LangGraph graph so generation, evaluation and retry each trace as a node. The agent graph keeps tracing off and excludes raw tool lookups from persisted state, and my own prompt log masks numeric personal data before writing. Timing runs disable tracing and logging entirely.</w:t>
       </w:r>
@@ -1064,28 +1064,28 @@
     <w:p>
       <w:pPr>
         <w:keepNext/>
-        <w:spacing w:after="80" w:before="240" w:line="276"/>
+        <w:spacing w:after="45" w:before="105" w:line="238"/>
       </w:pPr>
       <w:r>
         <w:rPr>
           <w:b/>
           <w:bCs/>
           <w:color w:val="315CBB"/>
-          <w:sz w:val="22"/>
-          <w:szCs w:val="22"/>
+          <w:sz w:val="17"/>
+          <w:szCs w:val="17"/>
         </w:rPr>
         <w:t xml:space="preserve">Document conversion pipeline and faster Wiki generation</w:t>
       </w:r>
     </w:p>
     <w:p>
       <w:pPr>
-        <w:spacing w:after="80" w:before="0" w:line="300"/>
+        <w:spacing w:after="75" w:before="0" w:line="196"/>
       </w:pPr>
       <w:r>
         <w:rPr>
           <w:color w:val="607089"/>
-          <w:sz w:val="18"/>
-          <w:szCs w:val="18"/>
+          <w:sz w:val="14"/>
+          <w:szCs w:val="14"/>
         </w:rPr>
         <w:t xml:space="preserve">Converted uploaded PDFs for retrieval and grounded answers, and reduced Wiki generation time. Internal pass rate on 30 pages improved from 45.17% to 89.89%; analysis of 4 documents fell from 282.11s to 73.89s.</w:t>
       </w:r>
@@ -1097,15 +1097,15 @@
           <w:ilvl w:val="0"/>
           <w:numId w:val="1"/>
         </w:numPr>
-        <w:spacing w:after="100" w:before="100" w:line="300"/>
-      </w:pPr>
-      <w:r>
-        <w:rPr>
-          <w:b/>
-          <w:bCs/>
-          <w:color w:val="203047"/>
-          <w:sz w:val="20"/>
-          <w:szCs w:val="20"/>
+        <w:spacing w:after="75" w:before="0" w:line="210"/>
+      </w:pPr>
+      <w:r>
+        <w:rPr>
+          <w:b/>
+          <w:bCs/>
+          <w:color w:val="203047"/>
+          <w:sz w:val="15"/>
+          <w:szCs w:val="15"/>
         </w:rPr>
         <w:t xml:space="preserve">PDF → Markdown conversion</w:t>
       </w:r>
@@ -1117,16 +1117,16 @@
           <w:b/>
           <w:bCs/>
           <w:color w:val="C0392B"/>
-          <w:sz w:val="20"/>
-          <w:szCs w:val="20"/>
+          <w:sz w:val="15"/>
+          <w:szCs w:val="15"/>
         </w:rPr>
         <w:t xml:space="preserve">Problem:</w:t>
       </w:r>
       <w:r>
         <w:rPr>
           <w:color w:val="203047"/>
-          <w:sz w:val="20"/>
-          <w:szCs w:val="20"/>
+          <w:sz w:val="15"/>
+          <w:szCs w:val="15"/>
         </w:rPr>
         <w:t xml:space="preserve"> Open-source conversion damaged tables and equations; full AI conversion still had errors and high API usage.</w:t>
       </w:r>
@@ -1138,16 +1138,16 @@
           <w:b/>
           <w:bCs/>
           <w:color w:val="1F6FEB"/>
-          <w:sz w:val="20"/>
-          <w:szCs w:val="20"/>
+          <w:sz w:val="15"/>
+          <w:szCs w:val="15"/>
         </w:rPr>
         <w:t xml:space="preserve">Solution:</w:t>
       </w:r>
       <w:r>
         <w:rPr>
           <w:color w:val="203047"/>
-          <w:sz w:val="20"/>
-          <w:szCs w:val="20"/>
+          <w:sz w:val="15"/>
+          <w:szCs w:val="15"/>
         </w:rPr>
         <w:t xml:space="preserve"> Compared PDF tools and adopted AnyDoc. Repaired damaged text with AI, processed tables and equations separately, and preserved original figures.</w:t>
       </w:r>
@@ -1159,16 +1159,16 @@
           <w:b/>
           <w:bCs/>
           <w:color w:val="1E8449"/>
-          <w:sz w:val="20"/>
-          <w:szCs w:val="20"/>
+          <w:sz w:val="15"/>
+          <w:szCs w:val="15"/>
         </w:rPr>
         <w:t xml:space="preserve">Result:</w:t>
       </w:r>
       <w:r>
         <w:rPr>
           <w:color w:val="203047"/>
-          <w:sz w:val="20"/>
-          <w:szCs w:val="20"/>
+          <w:sz w:val="15"/>
+          <w:szCs w:val="15"/>
         </w:rPr>
         <w:t xml:space="preserve"> Internal pass rate on 30 PDF pages improved from 45.17% to 89.89%.</w:t>
       </w:r>
@@ -1180,15 +1180,15 @@
           <w:ilvl w:val="0"/>
           <w:numId w:val="1"/>
         </w:numPr>
-        <w:spacing w:after="100" w:before="100" w:line="300"/>
-      </w:pPr>
-      <w:r>
-        <w:rPr>
-          <w:b/>
-          <w:bCs/>
-          <w:color w:val="203047"/>
-          <w:sz w:val="20"/>
-          <w:szCs w:val="20"/>
+        <w:spacing w:after="75" w:before="0" w:line="210"/>
+      </w:pPr>
+      <w:r>
+        <w:rPr>
+          <w:b/>
+          <w:bCs/>
+          <w:color w:val="203047"/>
+          <w:sz w:val="15"/>
+          <w:szCs w:val="15"/>
         </w:rPr>
         <w:t xml:space="preserve">Parallel Wiki generation</w:t>
       </w:r>
@@ -1200,16 +1200,16 @@
           <w:b/>
           <w:bCs/>
           <w:color w:val="C0392B"/>
-          <w:sz w:val="20"/>
-          <w:szCs w:val="20"/>
+          <w:sz w:val="15"/>
+          <w:szCs w:val="15"/>
         </w:rPr>
         <w:t xml:space="preserve">Problem:</w:t>
       </w:r>
       <w:r>
         <w:rPr>
           <w:color w:val="203047"/>
-          <w:sz w:val="20"/>
-          <w:szCs w:val="20"/>
+          <w:sz w:val="15"/>
+          <w:szCs w:val="15"/>
         </w:rPr>
         <w:t xml:space="preserve"> Later documents waited for earlier external AI responses.</w:t>
       </w:r>
@@ -1221,16 +1221,16 @@
           <w:b/>
           <w:bCs/>
           <w:color w:val="1F6FEB"/>
-          <w:sz w:val="20"/>
-          <w:szCs w:val="20"/>
+          <w:sz w:val="15"/>
+          <w:szCs w:val="15"/>
         </w:rPr>
         <w:t xml:space="preserve">Solution:</w:t>
       </w:r>
       <w:r>
         <w:rPr>
           <w:color w:val="203047"/>
-          <w:sz w:val="20"/>
-          <w:szCs w:val="20"/>
+          <w:sz w:val="15"/>
+          <w:szCs w:val="15"/>
         </w:rPr>
         <w:t xml:space="preserve"> Compared worker counts and requests per worker. Capped workers at 4 to manage memory; rejected extra concurrency and GPU parallelism that slowed processing.</w:t>
       </w:r>
@@ -1242,69 +1242,69 @@
           <w:b/>
           <w:bCs/>
           <w:color w:val="1E8449"/>
-          <w:sz w:val="20"/>
-          <w:szCs w:val="20"/>
+          <w:sz w:val="15"/>
+          <w:szCs w:val="15"/>
         </w:rPr>
         <w:t xml:space="preserve">Result:</w:t>
       </w:r>
       <w:r>
         <w:rPr>
           <w:color w:val="203047"/>
-          <w:sz w:val="20"/>
-          <w:szCs w:val="20"/>
+          <w:sz w:val="15"/>
+          <w:szCs w:val="15"/>
         </w:rPr>
         <w:t xml:space="preserve"> Analysis of 4 documents fell from 282.11s to 73.89s (about 74% less).</w:t>
       </w:r>
     </w:p>
     <w:p>
       <w:pPr>
-        <w:spacing w:after="80" w:before="0" w:line="300"/>
+        <w:spacing w:after="75" w:before="0" w:line="196"/>
       </w:pPr>
       <w:r>
         <w:rPr>
           <w:color w:val="607089"/>
-          <w:sz w:val="18"/>
-          <w:szCs w:val="18"/>
+          <w:sz w:val="14"/>
+          <w:szCs w:val="14"/>
         </w:rPr>
         <w:t xml:space="preserve">Proposed the initial MSA design, then jointly finalized service boundaries, data ownership and communication with teammates and mentors.</w:t>
       </w:r>
     </w:p>
     <w:p>
       <w:pPr>
-        <w:spacing w:after="80" w:before="0" w:line="300"/>
+        <w:spacing w:after="75" w:before="0" w:line="196"/>
       </w:pPr>
       <w:r>
         <w:rPr>
           <w:color w:val="607089"/>
-          <w:sz w:val="18"/>
-          <w:szCs w:val="18"/>
+          <w:sz w:val="14"/>
+          <w:szCs w:val="14"/>
         </w:rPr>
         <w:t xml:space="preserve">Internal evaluations. RAG timing compares Jev before/after tuning. Parallel document timing covers analysis only, excluding storage and post-processing.</w:t>
       </w:r>
     </w:p>
     <w:p>
       <w:pPr>
-        <w:spacing w:after="80" w:before="0" w:line="300"/>
+        <w:spacing w:after="75" w:before="0" w:line="196"/>
       </w:pPr>
       <w:r>
         <w:rPr>
           <w:color w:val="607089"/>
-          <w:sz w:val="18"/>
-          <w:szCs w:val="18"/>
+          <w:sz w:val="14"/>
+          <w:szCs w:val="14"/>
         </w:rPr>
         <w:t xml:space="preserve">See the detailed portfolio for the problem-solving process and experimental results.</w:t>
       </w:r>
     </w:p>
     <w:p>
       <w:pPr>
-        <w:spacing w:after="80" w:before="80" w:line="300"/>
-      </w:pPr>
-      <w:hyperlink w:history="1" r:id="rIdddg7w_edcpgfdbpmb9imd">
+        <w:spacing w:after="0" w:before="75" w:line="210"/>
+      </w:pPr>
+      <w:hyperlink w:history="1" r:id="rIdk8bzhqpdqrtpwtrkzg3hm">
         <w:r>
           <w:rPr>
             <w:color w:val="315CBB"/>
-            <w:sz w:val="20"/>
-            <w:szCs w:val="20"/>
+            <w:sz w:val="15"/>
+            <w:szCs w:val="15"/>
           </w:rPr>
           <w:t xml:space="preserve">RAG evidence selection ↗</w:t>
         </w:r>
@@ -1312,17 +1312,17 @@
       <w:r>
         <w:rPr>
           <w:color w:val="203047"/>
-          <w:sz w:val="20"/>
-          <w:szCs w:val="20"/>
+          <w:sz w:val="15"/>
+          <w:szCs w:val="15"/>
         </w:rPr>
         <w:t xml:space="preserve">   </w:t>
       </w:r>
-      <w:hyperlink w:history="1" r:id="rIdf8rnbu57gsvwtwc2pvdaa">
+      <w:hyperlink w:history="1" r:id="rIddkgaqz1qtutwei0jqe-bf">
         <w:r>
           <w:rPr>
             <w:color w:val="315CBB"/>
-            <w:sz w:val="20"/>
-            <w:szCs w:val="20"/>
+            <w:sz w:val="15"/>
+            <w:szCs w:val="15"/>
           </w:rPr>
           <w:t xml:space="preserve">Agent execution environment ↗</w:t>
         </w:r>
@@ -1330,17 +1330,17 @@
       <w:r>
         <w:rPr>
           <w:color w:val="203047"/>
-          <w:sz w:val="20"/>
-          <w:szCs w:val="20"/>
+          <w:sz w:val="15"/>
+          <w:szCs w:val="15"/>
         </w:rPr>
         <w:t xml:space="preserve">   </w:t>
       </w:r>
-      <w:hyperlink w:history="1" r:id="rIdfks0ovozh_2o8bmxxmkcb">
+      <w:hyperlink w:history="1" r:id="rIdaes0ieshznkkud2sqbc9j">
         <w:r>
           <w:rPr>
             <w:color w:val="315CBB"/>
-            <w:sz w:val="20"/>
-            <w:szCs w:val="20"/>
+            <w:sz w:val="15"/>
+            <w:szCs w:val="15"/>
           </w:rPr>
           <w:t xml:space="preserve">PDF conversion ↗</w:t>
         </w:r>
@@ -1348,17 +1348,17 @@
       <w:r>
         <w:rPr>
           <w:color w:val="203047"/>
-          <w:sz w:val="20"/>
-          <w:szCs w:val="20"/>
+          <w:sz w:val="15"/>
+          <w:szCs w:val="15"/>
         </w:rPr>
         <w:t xml:space="preserve">   </w:t>
       </w:r>
-      <w:hyperlink w:history="1" r:id="rId6uazr-gxlwpu35hetv1il">
+      <w:hyperlink w:history="1" r:id="rId-fm8aynxbfo2nadpewsor">
         <w:r>
           <w:rPr>
             <w:color w:val="315CBB"/>
-            <w:sz w:val="20"/>
-            <w:szCs w:val="20"/>
+            <w:sz w:val="15"/>
+            <w:szCs w:val="15"/>
           </w:rPr>
           <w:t xml:space="preserve">Parallel document processing ↗</w:t>
         </w:r>
@@ -1366,15 +1366,15 @@
       <w:r>
         <w:rPr>
           <w:color w:val="203047"/>
-          <w:sz w:val="20"/>
-          <w:szCs w:val="20"/>
+          <w:sz w:val="15"/>
+          <w:szCs w:val="15"/>
         </w:rPr>
         <w:t xml:space="preserve">   </w:t>
       </w:r>
     </w:p>
     <w:tbl>
       <w:tblPr>
-        <w:tblW w:type="dxa" w:w="10092"/>
+        <w:tblW w:type="dxa" w:w="10318"/>
         <w:tblBorders>
           <w:top w:val="none" w:color="FFFFFF" w:sz="0"/>
           <w:left w:val="none" w:color="FFFFFF" w:sz="0"/>
@@ -1386,8 +1386,8 @@
         <w:tblLayout w:type="fixed"/>
       </w:tblPr>
       <w:tblGrid>
-        <w:gridCol w:w="7064"/>
-        <w:gridCol w:w="3028"/>
+        <w:gridCol w:w="7223"/>
+        <w:gridCol w:w="3095"/>
       </w:tblGrid>
       <w:tr>
         <w:trPr>
@@ -1395,26 +1395,26 @@
         </w:trPr>
         <w:tc>
           <w:tcPr>
-            <w:tcW w:type="dxa" w:w="7064"/>
+            <w:tcW w:type="dxa" w:w="7223"/>
             <w:tcMar>
-              <w:top w:type="dxa" w:w="280"/>
+              <w:top w:type="dxa" w:w="204"/>
               <w:left w:type="dxa" w:w="0"/>
-              <w:bottom w:type="dxa" w:w="60"/>
+              <w:bottom w:type="dxa" w:w="44"/>
               <w:right w:type="dxa" w:w="0"/>
             </w:tcMar>
           </w:tcPr>
           <w:p>
             <w:pPr>
               <w:keepNext/>
-              <w:spacing w:after="0" w:before="0" w:line="276"/>
+              <w:spacing w:after="0" w:before="0" w:line="364"/>
             </w:pPr>
             <w:r>
               <w:rPr>
                 <w:b/>
                 <w:bCs/>
                 <w:color w:val="203047"/>
-                <w:sz w:val="24"/>
-                <w:szCs w:val="24"/>
+                <w:sz w:val="26"/>
+                <w:szCs w:val="26"/>
               </w:rPr>
               <w:t xml:space="preserve">Pilltip</w:t>
             </w:r>
@@ -1422,25 +1422,25 @@
         </w:tc>
         <w:tc>
           <w:tcPr>
-            <w:tcW w:type="dxa" w:w="3028"/>
+            <w:tcW w:type="dxa" w:w="3095"/>
             <w:tcMar>
-              <w:top w:type="dxa" w:w="280"/>
+              <w:top w:type="dxa" w:w="204"/>
               <w:left w:type="dxa" w:w="0"/>
-              <w:bottom w:type="dxa" w:w="60"/>
+              <w:bottom w:type="dxa" w:w="44"/>
               <w:right w:type="dxa" w:w="0"/>
             </w:tcMar>
           </w:tcPr>
           <w:p>
             <w:pPr>
               <w:keepNext/>
-              <w:spacing w:after="80" w:before="0" w:line="300"/>
+              <w:spacing w:after="75" w:before="0" w:line="196"/>
               <w:jc w:val="right"/>
             </w:pPr>
             <w:r>
               <w:rPr>
                 <w:color w:val="607089"/>
-                <w:sz w:val="18"/>
-                <w:szCs w:val="18"/>
+                <w:sz w:val="14"/>
+                <w:szCs w:val="14"/>
               </w:rPr>
               <w:t xml:space="preserve">2025.03 — 2025.12</w:t>
             </w:r>
@@ -1450,13 +1450,13 @@
     </w:tbl>
     <w:p>
       <w:pPr>
-        <w:spacing w:after="80" w:before="0" w:line="300"/>
+        <w:spacing w:after="75" w:before="0" w:line="196"/>
       </w:pPr>
       <w:r>
         <w:rPr>
           <w:color w:val="607089"/>
-          <w:sz w:val="18"/>
-          <w:szCs w:val="18"/>
+          <w:sz w:val="14"/>
+          <w:szCs w:val="14"/>
         </w:rPr>
         <w:t xml:space="preserve">Personalized AI medication service · Pusan National University capstone</w:t>
       </w:r>
@@ -1466,21 +1466,21 @@
       <w:r>
         <w:rPr>
           <w:color w:val="607089"/>
-          <w:sz w:val="18"/>
-          <w:szCs w:val="18"/>
+          <w:sz w:val="14"/>
+          <w:szCs w:val="14"/>
         </w:rPr>
         <w:t xml:space="preserve">Team project (3 + designer) / Core backend · data preparation</w:t>
       </w:r>
     </w:p>
     <w:p>
       <w:pPr>
-        <w:spacing w:after="80" w:before="0" w:line="300"/>
+        <w:spacing w:after="75" w:before="0" w:line="196"/>
       </w:pPr>
       <w:r>
         <w:rPr>
           <w:color w:val="607089"/>
-          <w:sz w:val="18"/>
-          <w:szCs w:val="18"/>
+          <w:sz w:val="14"/>
+          <w:szCs w:val="14"/>
         </w:rPr>
         <w:t xml:space="preserve">How it started: drug information is scattered, making it hard to check whether a medicine is safe for your current health condition.</w:t>
       </w:r>
@@ -1490,22 +1490,22 @@
       <w:r>
         <w:rPr>
           <w:color w:val="607089"/>
-          <w:sz w:val="18"/>
-          <w:szCs w:val="18"/>
+          <w:sz w:val="14"/>
+          <w:szCs w:val="14"/>
         </w:rPr>
         <w:t xml:space="preserve">Team: me (backend &amp; AI), 1 Android (Kotlin app), 1 backend &amp; security (user DB, login, questionnaires, AES-GCM), designer. The features below are my work.</w:t>
       </w:r>
     </w:p>
     <w:p>
       <w:pPr>
-        <w:spacing w:after="80" w:before="0" w:line="300"/>
-      </w:pPr>
-      <w:hyperlink w:history="1" r:id="rIdkysljbiqpzdwjy_fsj_ee">
+        <w:spacing w:after="75" w:before="0" w:line="210"/>
+      </w:pPr>
+      <w:hyperlink w:history="1" r:id="rIdbwkj120b-kypvqosj694r">
         <w:r>
           <w:rPr>
             <w:color w:val="315CBB"/>
-            <w:sz w:val="20"/>
-            <w:szCs w:val="20"/>
+            <w:sz w:val="15"/>
+            <w:szCs w:val="15"/>
           </w:rPr>
           <w:t xml:space="preserve">GitHub repository ↗</w:t>
         </w:r>
@@ -1514,28 +1514,28 @@
     <w:p>
       <w:pPr>
         <w:keepNext/>
-        <w:spacing w:after="80" w:before="240" w:line="276"/>
+        <w:spacing w:after="45" w:before="105" w:line="238"/>
       </w:pPr>
       <w:r>
         <w:rPr>
           <w:b/>
           <w:bCs/>
           <w:color w:val="315CBB"/>
-          <w:sz w:val="22"/>
-          <w:szCs w:val="22"/>
+          <w:sz w:val="17"/>
+          <w:szCs w:val="17"/>
         </w:rPr>
         <w:t xml:space="preserve">Drug data preparation pipeline</w:t>
       </w:r>
     </w:p>
     <w:p>
       <w:pPr>
-        <w:spacing w:after="80" w:before="0" w:line="300"/>
+        <w:spacing w:after="75" w:before="0" w:line="196"/>
       </w:pPr>
       <w:r>
         <w:rPr>
           <w:color w:val="607089"/>
-          <w:sz w:val="18"/>
-          <w:szCs w:val="18"/>
+          <w:sz w:val="14"/>
+          <w:szCs w:val="14"/>
         </w:rPr>
         <w:t xml:space="preserve">Rewrote about 44,000 drug records in plain language. Deduplication reduced input from 1GB to 326MB; after filling missing information, conversion cost $11.18 in actual API spending versus about $200 estimated for the original text.</w:t>
       </w:r>
@@ -1547,23 +1547,23 @@
           <w:ilvl w:val="0"/>
           <w:numId w:val="1"/>
         </w:numPr>
-        <w:spacing w:after="100" w:before="100" w:line="300"/>
+        <w:spacing w:after="75" w:before="0" w:line="210"/>
       </w:pPr>
       <w:r>
         <w:rPr>
           <w:b/>
           <w:bCs/>
           <w:color w:val="C0392B"/>
-          <w:sz w:val="20"/>
-          <w:szCs w:val="20"/>
+          <w:sz w:val="15"/>
+          <w:szCs w:val="15"/>
         </w:rPr>
         <w:t xml:space="preserve">Problem:</w:t>
       </w:r>
       <w:r>
         <w:rPr>
           <w:color w:val="203047"/>
-          <w:sz w:val="20"/>
-          <w:szCs w:val="20"/>
+          <w:sz w:val="15"/>
+          <w:szCs w:val="15"/>
         </w:rPr>
         <w:t xml:space="preserve"> Converting all 44,000 drug records was estimated to cost about $200 in API calls.</w:t>
       </w:r>
@@ -1575,16 +1575,16 @@
           <w:b/>
           <w:bCs/>
           <w:color w:val="1F6FEB"/>
-          <w:sz w:val="20"/>
-          <w:szCs w:val="20"/>
+          <w:sz w:val="15"/>
+          <w:szCs w:val="15"/>
         </w:rPr>
         <w:t xml:space="preserve">Solution:</w:t>
       </w:r>
       <w:r>
         <w:rPr>
           <w:color w:val="203047"/>
-          <w:sz w:val="20"/>
-          <w:szCs w:val="20"/>
+          <w:sz w:val="15"/>
+          <w:szCs w:val="15"/>
         </w:rPr>
         <w:t xml:space="preserve"> Removed exact duplicates, then semantically equivalent sentences. Filled the missing 5% with ingredient-specific precautions, converted via GPT Batch API and mapped results back to each drug.</w:t>
       </w:r>
@@ -1596,30 +1596,30 @@
           <w:b/>
           <w:bCs/>
           <w:color w:val="1E8449"/>
-          <w:sz w:val="20"/>
-          <w:szCs w:val="20"/>
+          <w:sz w:val="15"/>
+          <w:szCs w:val="15"/>
         </w:rPr>
         <w:t xml:space="preserve">Result:</w:t>
       </w:r>
       <w:r>
         <w:rPr>
           <w:color w:val="203047"/>
-          <w:sz w:val="20"/>
-          <w:szCs w:val="20"/>
+          <w:sz w:val="15"/>
+          <w:szCs w:val="15"/>
         </w:rPr>
         <w:t xml:space="preserve"> Conversion input shrank from 1GB to 326MB. Actual API spending was $11.18 versus about $200 estimated for all original text.</w:t>
       </w:r>
     </w:p>
     <w:p>
       <w:pPr>
-        <w:spacing w:after="80" w:before="0" w:line="300"/>
+        <w:spacing w:after="75" w:before="0" w:line="196"/>
         <w:ind w:left="720"/>
       </w:pPr>
       <w:r>
         <w:rPr>
           <w:color w:val="607089"/>
-          <w:sz w:val="18"/>
-          <w:szCs w:val="18"/>
+          <w:sz w:val="14"/>
+          <w:szCs w:val="14"/>
         </w:rPr>
         <w:t xml:space="preserve">Estimated cost versus actual spending; preprocessing labor is excluded.</w:t>
       </w:r>
@@ -1627,28 +1627,28 @@
     <w:p>
       <w:pPr>
         <w:keepNext/>
-        <w:spacing w:after="80" w:before="240" w:line="276"/>
+        <w:spacing w:after="45" w:before="105" w:line="238"/>
       </w:pPr>
       <w:r>
         <w:rPr>
           <w:b/>
           <w:bCs/>
           <w:color w:val="315CBB"/>
-          <w:sz w:val="22"/>
-          <w:szCs w:val="22"/>
+          <w:sz w:val="17"/>
+          <w:szCs w:val="17"/>
         </w:rPr>
         <w:t xml:space="preserve">AI medication chatbot using health profiles</w:t>
       </w:r>
     </w:p>
     <w:p>
       <w:pPr>
-        <w:spacing w:after="80" w:before="0" w:line="300"/>
+        <w:spacing w:after="75" w:before="0" w:line="196"/>
       </w:pPr>
       <w:r>
         <w:rPr>
           <w:color w:val="607089"/>
-          <w:sz w:val="18"/>
-          <w:szCs w:val="18"/>
+          <w:sz w:val="14"/>
+          <w:szCs w:val="14"/>
         </w:rPr>
         <w:t xml:space="preserve">Found drug and medication information from natural-language symptoms. Evaluated health profiles internally, separately from information sent to external AI.</w:t>
       </w:r>
@@ -1660,23 +1660,23 @@
           <w:ilvl w:val="0"/>
           <w:numId w:val="1"/>
         </w:numPr>
-        <w:spacing w:after="100" w:before="100" w:line="300"/>
+        <w:spacing w:after="75" w:before="0" w:line="210"/>
       </w:pPr>
       <w:r>
         <w:rPr>
           <w:b/>
           <w:bCs/>
           <w:color w:val="C0392B"/>
-          <w:sz w:val="20"/>
-          <w:szCs w:val="20"/>
+          <w:sz w:val="15"/>
+          <w:szCs w:val="15"/>
         </w:rPr>
         <w:t xml:space="preserve">Problem:</w:t>
       </w:r>
       <w:r>
         <w:rPr>
           <w:color w:val="203047"/>
-          <w:sz w:val="20"/>
-          <w:szCs w:val="20"/>
+          <w:sz w:val="15"/>
+          <w:szCs w:val="15"/>
         </w:rPr>
         <w:t xml:space="preserve"> Everyday symptom language differed from drug indications, while sensitive health data needed to stay out of external AI inputs.</w:t>
       </w:r>
@@ -1688,16 +1688,16 @@
           <w:b/>
           <w:bCs/>
           <w:color w:val="1F6FEB"/>
-          <w:sz w:val="20"/>
-          <w:szCs w:val="20"/>
+          <w:sz w:val="15"/>
+          <w:szCs w:val="15"/>
         </w:rPr>
         <w:t xml:space="preserve">Solution:</w:t>
       </w:r>
       <w:r>
         <w:rPr>
           <w:color w:val="203047"/>
-          <w:sz w:val="20"/>
-          <w:szCs w:val="20"/>
+          <w:sz w:val="15"/>
+          <w:szCs w:val="15"/>
         </w:rPr>
         <w:t xml:space="preserve"> Used Weaviate semantic search and AI orchestration for drug discovery, medication risks and dosage. Evaluated pregnancy, current medications and underlying conditions in internal code.</w:t>
       </w:r>
@@ -1709,16 +1709,16 @@
           <w:b/>
           <w:bCs/>
           <w:color w:val="1E8449"/>
-          <w:sz w:val="20"/>
-          <w:szCs w:val="20"/>
+          <w:sz w:val="15"/>
+          <w:szCs w:val="15"/>
         </w:rPr>
         <w:t xml:space="preserve">Result:</w:t>
       </w:r>
       <w:r>
         <w:rPr>
           <w:color w:val="203047"/>
-          <w:sz w:val="20"/>
-          <w:szCs w:val="20"/>
+          <w:sz w:val="15"/>
+          <w:szCs w:val="15"/>
         </w:rPr>
         <w:t xml:space="preserve"> Implemented personalized symptom-based search while excluding those profile fields from external LLM inputs.</w:t>
       </w:r>
@@ -1726,28 +1726,28 @@
     <w:p>
       <w:pPr>
         <w:keepNext/>
-        <w:spacing w:after="80" w:before="240" w:line="276"/>
+        <w:spacing w:after="45" w:before="105" w:line="238"/>
       </w:pPr>
       <w:r>
         <w:rPr>
           <w:b/>
           <w:bCs/>
           <w:color w:val="315CBB"/>
-          <w:sz w:val="22"/>
-          <w:szCs w:val="22"/>
+          <w:sz w:val="17"/>
+          <w:szCs w:val="17"/>
         </w:rPr>
         <w:t xml:space="preserve">Backend feature implementation</w:t>
       </w:r>
     </w:p>
     <w:p>
       <w:pPr>
-        <w:spacing w:after="80" w:before="0" w:line="300"/>
+        <w:spacing w:after="75" w:before="0" w:line="196"/>
       </w:pPr>
       <w:r>
         <w:rPr>
           <w:color w:val="607089"/>
-          <w:sz w:val="18"/>
-          <w:szCs w:val="18"/>
+          <w:sz w:val="14"/>
+          <w:szCs w:val="14"/>
         </w:rPr>
         <w:t xml:space="preserve">Built server features for drug search, risk information, medication reminders and logs, and family profiles. Integrated with teammates responsible for the mobile app, users and security.</w:t>
       </w:r>
@@ -1759,13 +1759,13 @@
           <w:ilvl w:val="0"/>
           <w:numId w:val="1"/>
         </w:numPr>
-        <w:spacing w:after="100" w:before="100" w:line="300"/>
-      </w:pPr>
-      <w:r>
-        <w:rPr>
-          <w:color w:val="203047"/>
-          <w:sz w:val="20"/>
-          <w:szCs w:val="20"/>
+        <w:spacing w:after="75" w:before="0" w:line="210"/>
+      </w:pPr>
+      <w:r>
+        <w:rPr>
+          <w:color w:val="203047"/>
+          <w:sz w:val="15"/>
+          <w:szCs w:val="15"/>
         </w:rPr>
         <w:t xml:space="preserve">Designed the drug database on Java and Spring Boot with search, autocomplete and DUR risk display.</w:t>
       </w:r>
@@ -1777,13 +1777,13 @@
           <w:ilvl w:val="0"/>
           <w:numId w:val="1"/>
         </w:numPr>
-        <w:spacing w:after="100" w:before="100" w:line="300"/>
-      </w:pPr>
-      <w:r>
-        <w:rPr>
-          <w:color w:val="203047"/>
-          <w:sz w:val="20"/>
-          <w:szCs w:val="20"/>
+        <w:spacing w:after="75" w:before="0" w:line="210"/>
+      </w:pPr>
+      <w:r>
+        <w:rPr>
+          <w:color w:val="203047"/>
+          <w:sz w:val="15"/>
+          <w:szCs w:val="15"/>
         </w:rPr>
         <w:t xml:space="preserve">Built FCM medication reminders and logs, deep-link friend invites and family profile switching, and kept API docs, meeting notes and ADRs in Notion to share decisions.</w:t>
       </w:r>
@@ -1791,28 +1791,28 @@
     <w:p>
       <w:pPr>
         <w:keepNext/>
-        <w:spacing w:after="80" w:before="240" w:line="276"/>
+        <w:spacing w:after="45" w:before="105" w:line="238"/>
       </w:pPr>
       <w:r>
         <w:rPr>
           <w:b/>
           <w:bCs/>
           <w:color w:val="315CBB"/>
-          <w:sz w:val="22"/>
-          <w:szCs w:val="22"/>
+          <w:sz w:val="17"/>
+          <w:szCs w:val="17"/>
         </w:rPr>
         <w:t xml:space="preserve">Feature work driven by feedback from live exhibitions</w:t>
       </w:r>
     </w:p>
     <w:p>
       <w:pPr>
-        <w:spacing w:after="80" w:before="0" w:line="300"/>
+        <w:spacing w:after="75" w:before="0" w:line="196"/>
       </w:pPr>
       <w:r>
         <w:rPr>
           <w:color w:val="607089"/>
-          <w:sz w:val="18"/>
-          <w:szCs w:val="18"/>
+          <w:sz w:val="14"/>
+          <w:szCs w:val="14"/>
         </w:rPr>
         <w:t xml:space="preserve">We ran the booth as Pusan National University’s representative exhibition team, and I fed the feedback we collected into the next slice of work. A request from the first exhibition became a feature within the data we already had.</w:t>
       </w:r>
@@ -1824,15 +1824,15 @@
           <w:ilvl w:val="0"/>
           <w:numId w:val="1"/>
         </w:numPr>
-        <w:spacing w:after="100" w:before="100" w:line="300"/>
-      </w:pPr>
-      <w:r>
-        <w:rPr>
-          <w:b/>
-          <w:bCs/>
-          <w:color w:val="203047"/>
-          <w:sz w:val="20"/>
-          <w:szCs w:val="20"/>
+        <w:spacing w:after="75" w:before="0" w:line="210"/>
+      </w:pPr>
+      <w:r>
+        <w:rPr>
+          <w:b/>
+          <w:bCs/>
+          <w:color w:val="203047"/>
+          <w:sz w:val="15"/>
+          <w:szCs w:val="15"/>
         </w:rPr>
         <w:t xml:space="preserve">Extending support to health functional foods</w:t>
       </w:r>
@@ -1844,16 +1844,16 @@
           <w:b/>
           <w:bCs/>
           <w:color w:val="C0392B"/>
-          <w:sz w:val="20"/>
-          <w:szCs w:val="20"/>
+          <w:sz w:val="15"/>
+          <w:szCs w:val="15"/>
         </w:rPr>
         <w:t xml:space="preserve">Problem:</w:t>
       </w:r>
       <w:r>
         <w:rPr>
           <w:color w:val="203047"/>
-          <w:sz w:val="20"/>
-          <w:szCs w:val="20"/>
+          <w:sz w:val="15"/>
+          <w:szCs w:val="15"/>
         </w:rPr>
         <w:t xml:space="preserve"> at the first exhibition visitors could only check prescription drugs and asked to see health functional foods too.</w:t>
       </w:r>
@@ -1865,16 +1865,16 @@
           <w:b/>
           <w:bCs/>
           <w:color w:val="1F6FEB"/>
-          <w:sz w:val="20"/>
-          <w:szCs w:val="20"/>
+          <w:sz w:val="15"/>
+          <w:szCs w:val="15"/>
         </w:rPr>
         <w:t xml:space="preserve">Solution:</w:t>
       </w:r>
       <w:r>
         <w:rPr>
           <w:color w:val="203047"/>
-          <w:sz w:val="20"/>
-          <w:szCs w:val="20"/>
+          <w:sz w:val="15"/>
+          <w:szCs w:val="15"/>
         </w:rPr>
         <w:t xml:space="preserve"> within the data we held, added them to search and autocomplete, surfaced caution and co-administration information, allowed them in reminders and logs, and included them in chatbot answers.</w:t>
       </w:r>
@@ -1886,16 +1886,16 @@
           <w:b/>
           <w:bCs/>
           <w:color w:val="1E8449"/>
-          <w:sz w:val="20"/>
-          <w:szCs w:val="20"/>
+          <w:sz w:val="15"/>
+          <w:szCs w:val="15"/>
         </w:rPr>
         <w:t xml:space="preserve">Result:</w:t>
       </w:r>
       <w:r>
         <w:rPr>
           <w:color w:val="203047"/>
-          <w:sz w:val="20"/>
-          <w:szCs w:val="20"/>
+          <w:sz w:val="15"/>
+          <w:szCs w:val="15"/>
         </w:rPr>
         <w:t xml:space="preserve"> a request from the floor became the next slice of work. Limited to the data we had obtained, not the exhaustive coverage we have for drugs.</w:t>
       </w:r>
@@ -1907,13 +1907,13 @@
           <w:ilvl w:val="0"/>
           <w:numId w:val="1"/>
         </w:numPr>
-        <w:spacing w:after="100" w:before="100" w:line="300"/>
-      </w:pPr>
-      <w:r>
-        <w:rPr>
-          <w:color w:val="203047"/>
-          <w:sz w:val="20"/>
-          <w:szCs w:val="20"/>
+        <w:spacing w:after="75" w:before="0" w:line="210"/>
+      </w:pPr>
+      <w:r>
+        <w:rPr>
+          <w:color w:val="203047"/>
+          <w:sz w:val="15"/>
+          <w:szCs w:val="15"/>
         </w:rPr>
         <w:t xml:space="preserve">Feedback I could not act on</w:t>
       </w:r>
@@ -1923,35 +1923,35 @@
       <w:r>
         <w:rPr>
           <w:color w:val="203047"/>
-          <w:sz w:val="20"/>
-          <w:szCs w:val="20"/>
+          <w:sz w:val="15"/>
+          <w:szCs w:val="15"/>
         </w:rPr>
         <w:t xml:space="preserve">Someone pointed out that the service would be better off running in containers, but I could not adopt it inside the capstone timeline. On Fruition I designed the AI services around a container-based deployment from the start.</w:t>
       </w:r>
     </w:p>
     <w:p>
       <w:pPr>
-        <w:spacing w:after="80" w:before="0" w:line="300"/>
+        <w:spacing w:after="75" w:before="0" w:line="196"/>
       </w:pPr>
       <w:r>
         <w:rPr>
           <w:color w:val="607089"/>
-          <w:sz w:val="18"/>
-          <w:szCs w:val="18"/>
+          <w:sz w:val="14"/>
+          <w:szCs w:val="14"/>
         </w:rPr>
         <w:t xml:space="preserve">See the detailed portfolio for the problem-solving process and experimental results.</w:t>
       </w:r>
     </w:p>
     <w:p>
       <w:pPr>
-        <w:spacing w:after="80" w:before="80" w:line="300"/>
-      </w:pPr>
-      <w:hyperlink w:history="1" r:id="rIdd6z3wgaq86m3_oweiukqs">
+        <w:spacing w:after="0" w:before="75" w:line="210"/>
+      </w:pPr>
+      <w:hyperlink w:history="1" r:id="rIdyog5fwfaoq9cat-edbdbo">
         <w:r>
           <w:rPr>
             <w:color w:val="315CBB"/>
-            <w:sz w:val="20"/>
-            <w:szCs w:val="20"/>
+            <w:sz w:val="15"/>
+            <w:szCs w:val="15"/>
           </w:rPr>
           <w:t xml:space="preserve">Data pipeline case study ↗</w:t>
         </w:r>
@@ -1959,17 +1959,17 @@
       <w:r>
         <w:rPr>
           <w:color w:val="203047"/>
-          <w:sz w:val="20"/>
-          <w:szCs w:val="20"/>
+          <w:sz w:val="15"/>
+          <w:szCs w:val="15"/>
         </w:rPr>
         <w:t xml:space="preserve">   </w:t>
       </w:r>
-      <w:hyperlink w:history="1" r:id="rIdi7rhqficizzrvq21povoq">
+      <w:hyperlink w:history="1" r:id="rIdzxn22ieds1nskdckayakr">
         <w:r>
           <w:rPr>
             <w:color w:val="315CBB"/>
-            <w:sz w:val="20"/>
-            <w:szCs w:val="20"/>
+            <w:sz w:val="15"/>
+            <w:szCs w:val="15"/>
           </w:rPr>
           <w:t xml:space="preserve">Personalization case study ↗</w:t>
         </w:r>
@@ -1977,8 +1977,8 @@
       <w:r>
         <w:rPr>
           <w:color w:val="203047"/>
-          <w:sz w:val="20"/>
-          <w:szCs w:val="20"/>
+          <w:sz w:val="15"/>
+          <w:szCs w:val="15"/>
         </w:rPr>
         <w:t xml:space="preserve">   </w:t>
       </w:r>
@@ -1989,22 +1989,22 @@
         <w:pBdr>
           <w:bottom w:val="single" w:color="6A80BD" w:sz="12" w:space="4"/>
         </w:pBdr>
-        <w:spacing w:after="180" w:before="420" w:line="276"/>
+        <w:spacing w:after="135" w:before="240" w:line="252"/>
       </w:pPr>
       <w:r>
         <w:rPr>
           <w:b/>
           <w:bCs/>
           <w:color w:val="315CBB"/>
-          <w:sz w:val="24"/>
-          <w:szCs w:val="24"/>
+          <w:sz w:val="18"/>
+          <w:szCs w:val="18"/>
         </w:rPr>
         <w:t xml:space="preserve">Skills </w:t>
       </w:r>
     </w:p>
     <w:tbl>
       <w:tblPr>
-        <w:tblW w:type="dxa" w:w="10092"/>
+        <w:tblW w:type="dxa" w:w="10318"/>
         <w:tblBorders>
           <w:top w:val="none" w:color="FFFFFF" w:sz="0"/>
           <w:left w:val="none" w:color="FFFFFF" w:sz="0"/>
@@ -2016,8 +2016,8 @@
         <w:tblLayout w:type="fixed"/>
       </w:tblPr>
       <w:tblGrid>
-        <w:gridCol w:w="2523"/>
-        <w:gridCol w:w="7569"/>
+        <w:gridCol w:w="2580"/>
+        <w:gridCol w:w="7739"/>
       </w:tblGrid>
       <w:tr>
         <w:trPr>
@@ -2025,25 +2025,25 @@
         </w:trPr>
         <w:tc>
           <w:tcPr>
-            <w:tcW w:type="dxa" w:w="2523"/>
+            <w:tcW w:type="dxa" w:w="2580"/>
             <w:tcMar>
-              <w:top w:type="dxa" w:w="60"/>
+              <w:top w:type="dxa" w:w="44"/>
               <w:left w:type="dxa" w:w="0"/>
-              <w:bottom w:type="dxa" w:w="60"/>
-              <w:right w:type="dxa" w:w="120"/>
+              <w:bottom w:type="dxa" w:w="44"/>
+              <w:right w:type="dxa" w:w="87"/>
             </w:tcMar>
           </w:tcPr>
           <w:p>
             <w:pPr>
-              <w:spacing w:after="80" w:before="0" w:line="300"/>
+              <w:spacing w:after="75" w:before="0" w:line="210"/>
             </w:pPr>
             <w:r>
               <w:rPr>
                 <w:b/>
                 <w:bCs/>
                 <w:color w:val="203047"/>
-                <w:sz w:val="20"/>
-                <w:szCs w:val="20"/>
+                <w:sz w:val="15"/>
+                <w:szCs w:val="15"/>
               </w:rPr>
               <w:t xml:space="preserve">AI &amp; Search</w:t>
             </w:r>
@@ -2051,23 +2051,23 @@
         </w:tc>
         <w:tc>
           <w:tcPr>
-            <w:tcW w:type="dxa" w:w="7569"/>
+            <w:tcW w:type="dxa" w:w="7739"/>
             <w:tcMar>
-              <w:top w:type="dxa" w:w="60"/>
+              <w:top w:type="dxa" w:w="44"/>
               <w:left w:type="dxa" w:w="0"/>
-              <w:bottom w:type="dxa" w:w="60"/>
+              <w:bottom w:type="dxa" w:w="44"/>
               <w:right w:type="dxa" w:w="0"/>
             </w:tcMar>
           </w:tcPr>
           <w:p>
             <w:pPr>
-              <w:spacing w:after="80" w:before="0" w:line="300"/>
-            </w:pPr>
-            <w:r>
-              <w:rPr>
-                <w:color w:val="203047"/>
-                <w:sz w:val="20"/>
-                <w:szCs w:val="20"/>
+              <w:spacing w:after="75" w:before="0" w:line="210"/>
+            </w:pPr>
+            <w:r>
+              <w:rPr>
+                <w:color w:val="203047"/>
+                <w:sz w:val="15"/>
+                <w:szCs w:val="15"/>
               </w:rPr>
               <w:t xml:space="preserve">LangChain · LangGraph · Spring AI · RAG · LLM Evaluation · Prompt injection defense</w:t>
             </w:r>
@@ -2077,8 +2077,8 @@
             <w:r>
               <w:rPr>
                 <w:color w:val="203047"/>
-                <w:sz w:val="20"/>
-                <w:szCs w:val="20"/>
+                <w:sz w:val="15"/>
+                <w:szCs w:val="15"/>
               </w:rPr>
               <w:t xml:space="preserve">LangSmith · Elasticsearch · Weaviate</w:t>
             </w:r>
@@ -2088,7 +2088,7 @@
     </w:tbl>
     <w:tbl>
       <w:tblPr>
-        <w:tblW w:type="dxa" w:w="10092"/>
+        <w:tblW w:type="dxa" w:w="10318"/>
         <w:tblBorders>
           <w:top w:val="none" w:color="FFFFFF" w:sz="0"/>
           <w:left w:val="none" w:color="FFFFFF" w:sz="0"/>
@@ -2100,8 +2100,8 @@
         <w:tblLayout w:type="fixed"/>
       </w:tblPr>
       <w:tblGrid>
-        <w:gridCol w:w="2523"/>
-        <w:gridCol w:w="7569"/>
+        <w:gridCol w:w="2580"/>
+        <w:gridCol w:w="7739"/>
       </w:tblGrid>
       <w:tr>
         <w:trPr>
@@ -2109,25 +2109,25 @@
         </w:trPr>
         <w:tc>
           <w:tcPr>
-            <w:tcW w:type="dxa" w:w="2523"/>
+            <w:tcW w:type="dxa" w:w="2580"/>
             <w:tcMar>
-              <w:top w:type="dxa" w:w="60"/>
+              <w:top w:type="dxa" w:w="44"/>
               <w:left w:type="dxa" w:w="0"/>
-              <w:bottom w:type="dxa" w:w="60"/>
-              <w:right w:type="dxa" w:w="120"/>
+              <w:bottom w:type="dxa" w:w="44"/>
+              <w:right w:type="dxa" w:w="87"/>
             </w:tcMar>
           </w:tcPr>
           <w:p>
             <w:pPr>
-              <w:spacing w:after="80" w:before="0" w:line="300"/>
+              <w:spacing w:after="75" w:before="0" w:line="210"/>
             </w:pPr>
             <w:r>
               <w:rPr>
                 <w:b/>
                 <w:bCs/>
                 <w:color w:val="203047"/>
-                <w:sz w:val="20"/>
-                <w:szCs w:val="20"/>
+                <w:sz w:val="15"/>
+                <w:szCs w:val="15"/>
               </w:rPr>
               <w:t xml:space="preserve">Backend</w:t>
             </w:r>
@@ -2135,23 +2135,23 @@
         </w:tc>
         <w:tc>
           <w:tcPr>
-            <w:tcW w:type="dxa" w:w="7569"/>
+            <w:tcW w:type="dxa" w:w="7739"/>
             <w:tcMar>
-              <w:top w:type="dxa" w:w="60"/>
+              <w:top w:type="dxa" w:w="44"/>
               <w:left w:type="dxa" w:w="0"/>
-              <w:bottom w:type="dxa" w:w="60"/>
+              <w:bottom w:type="dxa" w:w="44"/>
               <w:right w:type="dxa" w:w="0"/>
             </w:tcMar>
           </w:tcPr>
           <w:p>
             <w:pPr>
-              <w:spacing w:after="80" w:before="0" w:line="300"/>
-            </w:pPr>
-            <w:r>
-              <w:rPr>
-                <w:color w:val="203047"/>
-                <w:sz w:val="20"/>
-                <w:szCs w:val="20"/>
+              <w:spacing w:after="75" w:before="0" w:line="210"/>
+            </w:pPr>
+            <w:r>
+              <w:rPr>
+                <w:color w:val="203047"/>
+                <w:sz w:val="15"/>
+                <w:szCs w:val="15"/>
               </w:rPr>
               <w:t xml:space="preserve">Java · Spring Boot · Python</w:t>
             </w:r>
@@ -2161,7 +2161,7 @@
     </w:tbl>
     <w:tbl>
       <w:tblPr>
-        <w:tblW w:type="dxa" w:w="10092"/>
+        <w:tblW w:type="dxa" w:w="10318"/>
         <w:tblBorders>
           <w:top w:val="none" w:color="FFFFFF" w:sz="0"/>
           <w:left w:val="none" w:color="FFFFFF" w:sz="0"/>
@@ -2173,8 +2173,8 @@
         <w:tblLayout w:type="fixed"/>
       </w:tblPr>
       <w:tblGrid>
-        <w:gridCol w:w="2523"/>
-        <w:gridCol w:w="7569"/>
+        <w:gridCol w:w="2580"/>
+        <w:gridCol w:w="7739"/>
       </w:tblGrid>
       <w:tr>
         <w:trPr>
@@ -2182,25 +2182,25 @@
         </w:trPr>
         <w:tc>
           <w:tcPr>
-            <w:tcW w:type="dxa" w:w="2523"/>
+            <w:tcW w:type="dxa" w:w="2580"/>
             <w:tcMar>
-              <w:top w:type="dxa" w:w="60"/>
+              <w:top w:type="dxa" w:w="44"/>
               <w:left w:type="dxa" w:w="0"/>
-              <w:bottom w:type="dxa" w:w="60"/>
-              <w:right w:type="dxa" w:w="120"/>
+              <w:bottom w:type="dxa" w:w="44"/>
+              <w:right w:type="dxa" w:w="87"/>
             </w:tcMar>
           </w:tcPr>
           <w:p>
             <w:pPr>
-              <w:spacing w:after="80" w:before="0" w:line="300"/>
+              <w:spacing w:after="75" w:before="0" w:line="210"/>
             </w:pPr>
             <w:r>
               <w:rPr>
                 <w:b/>
                 <w:bCs/>
                 <w:color w:val="203047"/>
-                <w:sz w:val="20"/>
-                <w:szCs w:val="20"/>
+                <w:sz w:val="15"/>
+                <w:szCs w:val="15"/>
               </w:rPr>
               <w:t xml:space="preserve">Data &amp; Infra</w:t>
             </w:r>
@@ -2208,23 +2208,23 @@
         </w:tc>
         <w:tc>
           <w:tcPr>
-            <w:tcW w:type="dxa" w:w="7569"/>
+            <w:tcW w:type="dxa" w:w="7739"/>
             <w:tcMar>
-              <w:top w:type="dxa" w:w="60"/>
+              <w:top w:type="dxa" w:w="44"/>
               <w:left w:type="dxa" w:w="0"/>
-              <w:bottom w:type="dxa" w:w="60"/>
+              <w:bottom w:type="dxa" w:w="44"/>
               <w:right w:type="dxa" w:w="0"/>
             </w:tcMar>
           </w:tcPr>
           <w:p>
             <w:pPr>
-              <w:spacing w:after="80" w:before="0" w:line="300"/>
-            </w:pPr>
-            <w:r>
-              <w:rPr>
-                <w:color w:val="203047"/>
-                <w:sz w:val="20"/>
-                <w:szCs w:val="20"/>
+              <w:spacing w:after="75" w:before="0" w:line="210"/>
+            </w:pPr>
+            <w:r>
+              <w:rPr>
+                <w:color w:val="203047"/>
+                <w:sz w:val="15"/>
+                <w:szCs w:val="15"/>
               </w:rPr>
               <w:t xml:space="preserve">MySQL · PostgreSQL · Redis · Kafka</w:t>
             </w:r>
@@ -2234,8 +2234,8 @@
             <w:r>
               <w:rPr>
                 <w:color w:val="203047"/>
-                <w:sz w:val="20"/>
-                <w:szCs w:val="20"/>
+                <w:sz w:val="15"/>
+                <w:szCs w:val="15"/>
               </w:rPr>
               <w:t xml:space="preserve">Docker · Docker Compose · GitHub Actions</w:t>
             </w:r>
@@ -2246,26 +2246,25 @@
     <w:p>
       <w:pPr>
         <w:keepNext/>
-        <w:pageBreakBefore/>
         <w:pBdr>
           <w:bottom w:val="single" w:color="6A80BD" w:sz="12" w:space="4"/>
         </w:pBdr>
-        <w:spacing w:after="180" w:before="420" w:line="276"/>
+        <w:spacing w:after="135" w:before="240" w:line="252"/>
       </w:pPr>
       <w:r>
         <w:rPr>
           <w:b/>
           <w:bCs/>
           <w:color w:val="315CBB"/>
-          <w:sz w:val="24"/>
-          <w:szCs w:val="24"/>
+          <w:sz w:val="18"/>
+          <w:szCs w:val="18"/>
         </w:rPr>
         <w:t xml:space="preserve">Activities &amp; contributions </w:t>
       </w:r>
     </w:p>
     <w:tbl>
       <w:tblPr>
-        <w:tblW w:type="dxa" w:w="10092"/>
+        <w:tblW w:type="dxa" w:w="10318"/>
         <w:tblBorders>
           <w:top w:val="none" w:color="FFFFFF" w:sz="0"/>
           <w:left w:val="none" w:color="FFFFFF" w:sz="0"/>
@@ -2277,8 +2276,8 @@
         <w:tblLayout w:type="fixed"/>
       </w:tblPr>
       <w:tblGrid>
-        <w:gridCol w:w="2523"/>
-        <w:gridCol w:w="7569"/>
+        <w:gridCol w:w="2580"/>
+        <w:gridCol w:w="7739"/>
       </w:tblGrid>
       <w:tr>
         <w:trPr>
@@ -2286,23 +2285,23 @@
         </w:trPr>
         <w:tc>
           <w:tcPr>
-            <w:tcW w:type="dxa" w:w="2523"/>
+            <w:tcW w:type="dxa" w:w="2580"/>
             <w:tcMar>
-              <w:top w:type="dxa" w:w="60"/>
+              <w:top w:type="dxa" w:w="44"/>
               <w:left w:type="dxa" w:w="0"/>
-              <w:bottom w:type="dxa" w:w="60"/>
-              <w:right w:type="dxa" w:w="120"/>
+              <w:bottom w:type="dxa" w:w="44"/>
+              <w:right w:type="dxa" w:w="87"/>
             </w:tcMar>
           </w:tcPr>
           <w:p>
             <w:pPr>
-              <w:spacing w:after="80" w:before="0" w:line="300"/>
-            </w:pPr>
-            <w:r>
-              <w:rPr>
-                <w:color w:val="203047"/>
-                <w:sz w:val="20"/>
-                <w:szCs w:val="20"/>
+              <w:spacing w:after="75" w:before="0" w:line="210"/>
+            </w:pPr>
+            <w:r>
+              <w:rPr>
+                <w:color w:val="203047"/>
+                <w:sz w:val="15"/>
+                <w:szCs w:val="15"/>
               </w:rPr>
               <w:t xml:space="preserve">2026.06 — 2026.06</w:t>
             </w:r>
@@ -2310,53 +2309,53 @@
         </w:tc>
         <w:tc>
           <w:tcPr>
-            <w:tcW w:type="dxa" w:w="7569"/>
+            <w:tcW w:type="dxa" w:w="7739"/>
             <w:tcMar>
-              <w:top w:type="dxa" w:w="60"/>
+              <w:top w:type="dxa" w:w="44"/>
               <w:left w:type="dxa" w:w="0"/>
-              <w:bottom w:type="dxa" w:w="60"/>
+              <w:bottom w:type="dxa" w:w="44"/>
               <w:right w:type="dxa" w:w="0"/>
             </w:tcMar>
           </w:tcPr>
           <w:p>
             <w:pPr>
               <w:keepNext/>
-              <w:spacing w:after="0" w:before="0" w:line="276"/>
+              <w:spacing w:after="0" w:before="0" w:line="252"/>
             </w:pPr>
             <w:r>
               <w:rPr>
                 <w:b/>
                 <w:bCs/>
                 <w:color w:val="203047"/>
-                <w:sz w:val="24"/>
-                <w:szCs w:val="24"/>
+                <w:sz w:val="18"/>
+                <w:szCs w:val="18"/>
               </w:rPr>
               <w:t xml:space="preserve">Rhwp open-source contributions</w:t>
             </w:r>
           </w:p>
           <w:p>
             <w:pPr>
-              <w:spacing w:after="80" w:before="0" w:line="300"/>
-            </w:pPr>
-            <w:r>
-              <w:rPr>
-                <w:color w:val="203047"/>
-                <w:sz w:val="20"/>
-                <w:szCs w:val="20"/>
+              <w:spacing w:after="75" w:before="0" w:line="210"/>
+            </w:pPr>
+            <w:r>
+              <w:rPr>
+                <w:color w:val="203047"/>
+                <w:sz w:val="15"/>
+                <w:szCs w:val="15"/>
               </w:rPr>
               <w:t xml:space="preserve">Investigated bugs, submitted fixes and addressed CI in a Rust HWP/HWPX project. Fixed textFlow attributes of images, tables and shapes being reset after saving.</w:t>
             </w:r>
           </w:p>
           <w:p>
             <w:pPr>
-              <w:spacing w:after="80" w:before="80" w:line="300"/>
-            </w:pPr>
-            <w:hyperlink w:history="1" r:id="rIdgmqapbgagdr5b-bwo6klu">
+              <w:spacing w:after="0" w:before="75" w:line="210"/>
+            </w:pPr>
+            <w:hyperlink w:history="1" r:id="rIdjqnaxtp2ybzcraatbkd-5">
               <w:r>
                 <w:rPr>
                   <w:color w:val="315CBB"/>
-                  <w:sz w:val="20"/>
-                  <w:szCs w:val="20"/>
+                  <w:sz w:val="15"/>
+                  <w:szCs w:val="15"/>
                 </w:rPr>
                 <w:t xml:space="preserve">GitHub repository ↗</w:t>
               </w:r>
@@ -2364,17 +2363,17 @@
             <w:r>
               <w:rPr>
                 <w:color w:val="203047"/>
-                <w:sz w:val="20"/>
-                <w:szCs w:val="20"/>
+                <w:sz w:val="15"/>
+                <w:szCs w:val="15"/>
               </w:rPr>
               <w:t xml:space="preserve">   </w:t>
             </w:r>
-            <w:hyperlink w:history="1" r:id="rIdbu6geupxc84koylbu2a0j">
+            <w:hyperlink w:history="1" r:id="rIdjsbcrvyo5fqreigezdkfs">
               <w:r>
                 <w:rPr>
                   <w:color w:val="315CBB"/>
-                  <w:sz w:val="20"/>
-                  <w:szCs w:val="20"/>
+                  <w:sz w:val="15"/>
+                  <w:szCs w:val="15"/>
                 </w:rPr>
                 <w:t xml:space="preserve">PR #1213 · Merged ↗</w:t>
               </w:r>
@@ -2382,17 +2381,17 @@
             <w:r>
               <w:rPr>
                 <w:color w:val="203047"/>
-                <w:sz w:val="20"/>
-                <w:szCs w:val="20"/>
+                <w:sz w:val="15"/>
+                <w:szCs w:val="15"/>
               </w:rPr>
               <w:t xml:space="preserve">   </w:t>
             </w:r>
-            <w:hyperlink w:history="1" r:id="rIdfooca1ruzwqxzfcnex3r6">
+            <w:hyperlink w:history="1" r:id="rIdlnj-rwjq47mjgsqknbmdd">
               <w:r>
                 <w:rPr>
                   <w:color w:val="315CBB"/>
-                  <w:sz w:val="20"/>
-                  <w:szCs w:val="20"/>
+                  <w:sz w:val="15"/>
+                  <w:szCs w:val="15"/>
                 </w:rPr>
                 <w:t xml:space="preserve">PR #1351 · Submitted ↗</w:t>
               </w:r>
@@ -2400,8 +2399,8 @@
             <w:r>
               <w:rPr>
                 <w:color w:val="203047"/>
-                <w:sz w:val="20"/>
-                <w:szCs w:val="20"/>
+                <w:sz w:val="15"/>
+                <w:szCs w:val="15"/>
               </w:rPr>
               <w:t xml:space="preserve">   </w:t>
             </w:r>
@@ -2411,7 +2410,7 @@
     </w:tbl>
     <w:tbl>
       <w:tblPr>
-        <w:tblW w:type="dxa" w:w="10092"/>
+        <w:tblW w:type="dxa" w:w="10318"/>
         <w:tblBorders>
           <w:top w:val="none" w:color="FFFFFF" w:sz="0"/>
           <w:left w:val="none" w:color="FFFFFF" w:sz="0"/>
@@ -2423,9 +2422,9 @@
         <w:tblLayout w:type="fixed"/>
       </w:tblPr>
       <w:tblGrid>
-        <w:gridCol w:w="2523"/>
-        <w:gridCol w:w="1110"/>
-        <w:gridCol w:w="6459"/>
+        <w:gridCol w:w="2580"/>
+        <w:gridCol w:w="1135"/>
+        <w:gridCol w:w="6604"/>
       </w:tblGrid>
       <w:tr>
         <w:trPr>
@@ -2433,23 +2432,23 @@
         </w:trPr>
         <w:tc>
           <w:tcPr>
-            <w:tcW w:type="dxa" w:w="2523"/>
+            <w:tcW w:type="dxa" w:w="2580"/>
             <w:tcMar>
-              <w:top w:type="dxa" w:w="60"/>
+              <w:top w:type="dxa" w:w="44"/>
               <w:left w:type="dxa" w:w="0"/>
-              <w:bottom w:type="dxa" w:w="60"/>
-              <w:right w:type="dxa" w:w="120"/>
+              <w:bottom w:type="dxa" w:w="44"/>
+              <w:right w:type="dxa" w:w="87"/>
             </w:tcMar>
           </w:tcPr>
           <w:p>
             <w:pPr>
-              <w:spacing w:after="80" w:before="0" w:line="300"/>
-            </w:pPr>
-            <w:r>
-              <w:rPr>
-                <w:color w:val="203047"/>
-                <w:sz w:val="20"/>
-                <w:szCs w:val="20"/>
+              <w:spacing w:after="75" w:before="0" w:line="210"/>
+            </w:pPr>
+            <w:r>
+              <w:rPr>
+                <w:color w:val="203047"/>
+                <w:sz w:val="15"/>
+                <w:szCs w:val="15"/>
               </w:rPr>
               <w:t xml:space="preserve">2025.03 — 2026.01</w:t>
             </w:r>
@@ -2457,22 +2456,22 @@
         </w:tc>
         <w:tc>
           <w:tcPr>
-            <w:tcW w:type="dxa" w:w="1110"/>
+            <w:tcW w:type="dxa" w:w="1135"/>
             <w:tcMar>
-              <w:top w:type="dxa" w:w="60"/>
+              <w:top w:type="dxa" w:w="44"/>
               <w:left w:type="dxa" w:w="0"/>
-              <w:bottom w:type="dxa" w:w="60"/>
+              <w:bottom w:type="dxa" w:w="44"/>
               <w:right w:type="dxa" w:w="0"/>
             </w:tcMar>
           </w:tcPr>
           <w:p>
             <w:pPr>
-              <w:spacing w:after="80" w:before="0" w:line="300"/>
+              <w:spacing w:after="75" w:before="0" w:line="210"/>
             </w:pPr>
             <w:r>
               <w:drawing>
                 <wp:inline distT="0" distB="0" distL="0" distR="0">
-                  <wp:extent cx="552450" cy="762000"/>
+                  <wp:extent cx="409575" cy="571500"/>
                   <wp:effectExtent t="0" r="0" b="0" l="0"/>
                   <wp:docPr id="1" name="" descr="" title=""/>
                   <wp:cNvGraphicFramePr>
@@ -2497,7 +2496,7 @@
                         <pic:spPr bwMode="auto">
                           <a:xfrm>
                             <a:off x="0" y="0"/>
-                            <a:ext cx="552450" cy="762000"/>
+                            <a:ext cx="409575" cy="571500"/>
                           </a:xfrm>
                           <a:prstGeom prst="rect">
                             <a:avLst/>
@@ -2513,52 +2512,52 @@
         </w:tc>
         <w:tc>
           <w:tcPr>
-            <w:tcW w:type="dxa" w:w="6459"/>
+            <w:tcW w:type="dxa" w:w="6604"/>
             <w:tcMar>
-              <w:top w:type="dxa" w:w="60"/>
+              <w:top w:type="dxa" w:w="44"/>
               <w:left w:type="dxa" w:w="0"/>
-              <w:bottom w:type="dxa" w:w="60"/>
+              <w:bottom w:type="dxa" w:w="44"/>
               <w:right w:type="dxa" w:w="0"/>
             </w:tcMar>
           </w:tcPr>
           <w:p>
             <w:pPr>
               <w:keepNext/>
-              <w:spacing w:after="0" w:before="0" w:line="276"/>
+              <w:spacing w:after="0" w:before="0" w:line="252"/>
             </w:pPr>
             <w:r>
               <w:rPr>
                 <w:b/>
                 <w:bCs/>
                 <w:color w:val="203047"/>
-                <w:sz w:val="24"/>
-                <w:szCs w:val="24"/>
-              </w:rPr>
-              <w:t xml:space="preserve">APPTIVE, Pusan National University</w:t>
-            </w:r>
-          </w:p>
-          <w:p>
-            <w:pPr>
-              <w:spacing w:after="80" w:before="0" w:line="300"/>
-            </w:pPr>
-            <w:r>
-              <w:rPr>
-                <w:color w:val="203047"/>
-                <w:sz w:val="20"/>
-                <w:szCs w:val="20"/>
-              </w:rPr>
-              <w:t xml:space="preserve">Backend mentee and mentor. Led 6 mentoring and code-review sessions for 12 mentees. Helped revise the curriculum to strengthen HTTP, Servlet, REST API and database foundations.</w:t>
-            </w:r>
-          </w:p>
-          <w:p>
-            <w:pPr>
-              <w:spacing w:after="80" w:before="0" w:line="300"/>
-            </w:pPr>
-            <w:r>
-              <w:rPr>
-                <w:color w:val="607089"/>
                 <w:sz w:val="18"/>
                 <w:szCs w:val="18"/>
+              </w:rPr>
+              <w:t xml:space="preserve">APPTIVE, Pusan National University</w:t>
+            </w:r>
+          </w:p>
+          <w:p>
+            <w:pPr>
+              <w:spacing w:after="75" w:before="0" w:line="210"/>
+            </w:pPr>
+            <w:r>
+              <w:rPr>
+                <w:color w:val="203047"/>
+                <w:sz w:val="15"/>
+                <w:szCs w:val="15"/>
+              </w:rPr>
+              <w:t xml:space="preserve">Backend mentee and mentor. Led 6 mentoring and code-review sessions for 12 mentees. Helped revise the curriculum to strengthen HTTP, Servlet, REST API and database foundations.</w:t>
+            </w:r>
+          </w:p>
+          <w:p>
+            <w:pPr>
+              <w:spacing w:after="75" w:before="0" w:line="196"/>
+            </w:pPr>
+            <w:r>
+              <w:rPr>
+                <w:color w:val="607089"/>
+                <w:sz w:val="14"/>
+                <w:szCs w:val="14"/>
               </w:rPr>
               <w:t xml:space="preserve">APPTIVE Backend Mentor Merit Award · 2026.01.09</w:t>
             </w:r>
@@ -2568,7 +2567,7 @@
     </w:tbl>
     <w:tbl>
       <w:tblPr>
-        <w:tblW w:type="dxa" w:w="10092"/>
+        <w:tblW w:type="dxa" w:w="10318"/>
         <w:tblBorders>
           <w:top w:val="none" w:color="FFFFFF" w:sz="0"/>
           <w:left w:val="none" w:color="FFFFFF" w:sz="0"/>
@@ -2580,9 +2579,9 @@
         <w:tblLayout w:type="fixed"/>
       </w:tblPr>
       <w:tblGrid>
-        <w:gridCol w:w="2523"/>
-        <w:gridCol w:w="1110"/>
-        <w:gridCol w:w="6459"/>
+        <w:gridCol w:w="2580"/>
+        <w:gridCol w:w="1135"/>
+        <w:gridCol w:w="6604"/>
       </w:tblGrid>
       <w:tr>
         <w:trPr>
@@ -2590,23 +2589,23 @@
         </w:trPr>
         <w:tc>
           <w:tcPr>
-            <w:tcW w:type="dxa" w:w="2523"/>
+            <w:tcW w:type="dxa" w:w="2580"/>
             <w:tcMar>
-              <w:top w:type="dxa" w:w="60"/>
+              <w:top w:type="dxa" w:w="44"/>
               <w:left w:type="dxa" w:w="0"/>
-              <w:bottom w:type="dxa" w:w="60"/>
-              <w:right w:type="dxa" w:w="120"/>
+              <w:bottom w:type="dxa" w:w="44"/>
+              <w:right w:type="dxa" w:w="87"/>
             </w:tcMar>
           </w:tcPr>
           <w:p>
             <w:pPr>
-              <w:spacing w:after="80" w:before="0" w:line="300"/>
-            </w:pPr>
-            <w:r>
-              <w:rPr>
-                <w:color w:val="203047"/>
-                <w:sz w:val="20"/>
-                <w:szCs w:val="20"/>
+              <w:spacing w:after="75" w:before="0" w:line="210"/>
+            </w:pPr>
+            <w:r>
+              <w:rPr>
+                <w:color w:val="203047"/>
+                <w:sz w:val="15"/>
+                <w:szCs w:val="15"/>
               </w:rPr>
               <w:t xml:space="preserve">2025.11 / 2025.07</w:t>
             </w:r>
@@ -2614,22 +2613,22 @@
         </w:tc>
         <w:tc>
           <w:tcPr>
-            <w:tcW w:type="dxa" w:w="1110"/>
+            <w:tcW w:type="dxa" w:w="1135"/>
             <w:tcMar>
-              <w:top w:type="dxa" w:w="60"/>
+              <w:top w:type="dxa" w:w="44"/>
               <w:left w:type="dxa" w:w="0"/>
-              <w:bottom w:type="dxa" w:w="60"/>
+              <w:bottom w:type="dxa" w:w="44"/>
               <w:right w:type="dxa" w:w="0"/>
             </w:tcMar>
           </w:tcPr>
           <w:p>
             <w:pPr>
-              <w:spacing w:after="80" w:before="0" w:line="300"/>
+              <w:spacing w:after="75" w:before="0" w:line="210"/>
             </w:pPr>
             <w:r>
               <w:drawing>
                 <wp:inline distT="0" distB="0" distL="0" distR="0">
-                  <wp:extent cx="609600" cy="457200"/>
+                  <wp:extent cx="571500" cy="428625"/>
                   <wp:effectExtent t="0" r="0" b="0" l="0"/>
                   <wp:docPr id="1" name="" descr="" title=""/>
                   <wp:cNvGraphicFramePr>
@@ -2654,7 +2653,7 @@
                         <pic:spPr bwMode="auto">
                           <a:xfrm>
                             <a:off x="0" y="0"/>
-                            <a:ext cx="609600" cy="457200"/>
+                            <a:ext cx="571500" cy="428625"/>
                           </a:xfrm>
                           <a:prstGeom prst="rect">
                             <a:avLst/>
@@ -2670,39 +2669,39 @@
         </w:tc>
         <w:tc>
           <w:tcPr>
-            <w:tcW w:type="dxa" w:w="6459"/>
+            <w:tcW w:type="dxa" w:w="6604"/>
             <w:tcMar>
-              <w:top w:type="dxa" w:w="60"/>
+              <w:top w:type="dxa" w:w="44"/>
               <w:left w:type="dxa" w:w="0"/>
-              <w:bottom w:type="dxa" w:w="60"/>
+              <w:bottom w:type="dxa" w:w="44"/>
               <w:right w:type="dxa" w:w="0"/>
             </w:tcMar>
           </w:tcPr>
           <w:p>
             <w:pPr>
               <w:keepNext/>
-              <w:spacing w:after="0" w:before="0" w:line="276"/>
+              <w:spacing w:after="0" w:before="0" w:line="252"/>
             </w:pPr>
             <w:r>
               <w:rPr>
                 <w:b/>
                 <w:bCs/>
                 <w:color w:val="203047"/>
-                <w:sz w:val="24"/>
-                <w:szCs w:val="24"/>
+                <w:sz w:val="18"/>
+                <w:szCs w:val="18"/>
               </w:rPr>
               <w:t xml:space="preserve">SK AI SUMMIT · K-ICT WEEK in Busan</w:t>
             </w:r>
           </w:p>
           <w:p>
             <w:pPr>
-              <w:spacing w:after="80" w:before="0" w:line="300"/>
-            </w:pPr>
-            <w:r>
-              <w:rPr>
-                <w:color w:val="203047"/>
-                <w:sz w:val="20"/>
-                <w:szCs w:val="20"/>
+              <w:spacing w:after="75" w:before="0" w:line="210"/>
+            </w:pPr>
+            <w:r>
+              <w:rPr>
+                <w:color w:val="203047"/>
+                <w:sz w:val="15"/>
+                <w:szCs w:val="15"/>
               </w:rPr>
               <w:t xml:space="preserve">Represented Pusan National University at the Pilltip booth, demonstrating the service and answering technical questions.</w:t>
             </w:r>
@@ -2712,7 +2711,7 @@
     </w:tbl>
     <w:tbl>
       <w:tblPr>
-        <w:tblW w:type="dxa" w:w="10092"/>
+        <w:tblW w:type="dxa" w:w="10318"/>
         <w:tblBorders>
           <w:top w:val="none" w:color="FFFFFF" w:sz="0"/>
           <w:left w:val="none" w:color="FFFFFF" w:sz="0"/>
@@ -2724,9 +2723,9 @@
         <w:tblLayout w:type="fixed"/>
       </w:tblPr>
       <w:tblGrid>
-        <w:gridCol w:w="2523"/>
-        <w:gridCol w:w="1110"/>
-        <w:gridCol w:w="6459"/>
+        <w:gridCol w:w="2580"/>
+        <w:gridCol w:w="1135"/>
+        <w:gridCol w:w="6604"/>
       </w:tblGrid>
       <w:tr>
         <w:trPr>
@@ -2734,23 +2733,23 @@
         </w:trPr>
         <w:tc>
           <w:tcPr>
-            <w:tcW w:type="dxa" w:w="2523"/>
+            <w:tcW w:type="dxa" w:w="2580"/>
             <w:tcMar>
-              <w:top w:type="dxa" w:w="60"/>
+              <w:top w:type="dxa" w:w="44"/>
               <w:left w:type="dxa" w:w="0"/>
-              <w:bottom w:type="dxa" w:w="60"/>
-              <w:right w:type="dxa" w:w="120"/>
+              <w:bottom w:type="dxa" w:w="44"/>
+              <w:right w:type="dxa" w:w="87"/>
             </w:tcMar>
           </w:tcPr>
           <w:p>
             <w:pPr>
-              <w:spacing w:after="80" w:before="0" w:line="300"/>
-            </w:pPr>
-            <w:r>
-              <w:rPr>
-                <w:color w:val="203047"/>
-                <w:sz w:val="20"/>
-                <w:szCs w:val="20"/>
+              <w:spacing w:after="75" w:before="0" w:line="210"/>
+            </w:pPr>
+            <w:r>
+              <w:rPr>
+                <w:color w:val="203047"/>
+                <w:sz w:val="15"/>
+                <w:szCs w:val="15"/>
               </w:rPr>
               <w:t xml:space="preserve">2022.02 — 2025.07</w:t>
             </w:r>
@@ -2758,22 +2757,22 @@
         </w:tc>
         <w:tc>
           <w:tcPr>
-            <w:tcW w:type="dxa" w:w="1110"/>
+            <w:tcW w:type="dxa" w:w="1135"/>
             <w:tcMar>
-              <w:top w:type="dxa" w:w="60"/>
+              <w:top w:type="dxa" w:w="44"/>
               <w:left w:type="dxa" w:w="0"/>
-              <w:bottom w:type="dxa" w:w="60"/>
+              <w:bottom w:type="dxa" w:w="44"/>
               <w:right w:type="dxa" w:w="0"/>
             </w:tcMar>
           </w:tcPr>
           <w:p>
             <w:pPr>
-              <w:spacing w:after="80" w:before="0" w:line="300"/>
+              <w:spacing w:after="75" w:before="0" w:line="210"/>
             </w:pPr>
             <w:r>
               <w:drawing>
                 <wp:inline distT="0" distB="0" distL="0" distR="0">
-                  <wp:extent cx="609600" cy="409575"/>
+                  <wp:extent cx="571500" cy="381000"/>
                   <wp:effectExtent t="0" r="0" b="0" l="0"/>
                   <wp:docPr id="1" name="" descr="" title=""/>
                   <wp:cNvGraphicFramePr>
@@ -2798,7 +2797,7 @@
                         <pic:spPr bwMode="auto">
                           <a:xfrm>
                             <a:off x="0" y="0"/>
-                            <a:ext cx="609600" cy="409575"/>
+                            <a:ext cx="571500" cy="381000"/>
                           </a:xfrm>
                           <a:prstGeom prst="rect">
                             <a:avLst/>
@@ -2814,53 +2813,53 @@
         </w:tc>
         <w:tc>
           <w:tcPr>
-            <w:tcW w:type="dxa" w:w="6459"/>
+            <w:tcW w:type="dxa" w:w="6604"/>
             <w:tcMar>
-              <w:top w:type="dxa" w:w="60"/>
+              <w:top w:type="dxa" w:w="44"/>
               <w:left w:type="dxa" w:w="0"/>
-              <w:bottom w:type="dxa" w:w="60"/>
+              <w:bottom w:type="dxa" w:w="44"/>
               <w:right w:type="dxa" w:w="0"/>
             </w:tcMar>
           </w:tcPr>
           <w:p>
             <w:pPr>
               <w:keepNext/>
-              <w:spacing w:after="0" w:before="0" w:line="276"/>
+              <w:spacing w:after="0" w:before="0" w:line="252"/>
             </w:pPr>
             <w:r>
               <w:rPr>
                 <w:b/>
                 <w:bCs/>
                 <w:color w:val="203047"/>
-                <w:sz w:val="24"/>
-                <w:szCs w:val="24"/>
+                <w:sz w:val="18"/>
+                <w:szCs w:val="18"/>
               </w:rPr>
               <w:t xml:space="preserve">945-day Baekjoon problem-solving streak</w:t>
             </w:r>
           </w:p>
           <w:p>
             <w:pPr>
-              <w:spacing w:after="80" w:before="0" w:line="300"/>
-            </w:pPr>
-            <w:r>
-              <w:rPr>
-                <w:color w:val="203047"/>
-                <w:sz w:val="20"/>
-                <w:szCs w:val="20"/>
+              <w:spacing w:after="75" w:before="0" w:line="210"/>
+            </w:pPr>
+            <w:r>
+              <w:rPr>
+                <w:color w:val="203047"/>
+                <w:sz w:val="15"/>
+                <w:szCs w:val="15"/>
               </w:rPr>
               <w:t xml:space="preserve">Aiming for one problem a day, I reached a longest streak of 945 consecutive days on solved.ac. 1,659 problems solved, solved.ac Platinum IV. Solutions are recorded in a GitHub repository.</w:t>
             </w:r>
           </w:p>
           <w:p>
             <w:pPr>
-              <w:spacing w:after="80" w:before="0" w:line="300"/>
-            </w:pPr>
-            <w:hyperlink w:history="1" r:id="rIddayp--lyuo8ehwxoixzwu">
+              <w:spacing w:after="75" w:before="0" w:line="210"/>
+            </w:pPr>
+            <w:hyperlink w:history="1" r:id="rIdhkb8ar0gobu7teqtof1ck">
               <w:r>
                 <w:rPr>
                   <w:color w:val="315CBB"/>
-                  <w:sz w:val="20"/>
-                  <w:szCs w:val="20"/>
+                  <w:sz w:val="15"/>
+                  <w:szCs w:val="15"/>
                 </w:rPr>
                 <w:t xml:space="preserve">Baekjoon solutions repository ↗</w:t>
               </w:r>
@@ -2875,22 +2874,22 @@
         <w:pBdr>
           <w:bottom w:val="single" w:color="6A80BD" w:sz="12" w:space="4"/>
         </w:pBdr>
-        <w:spacing w:after="180" w:before="420" w:line="276"/>
+        <w:spacing w:after="135" w:before="240" w:line="252"/>
       </w:pPr>
       <w:r>
         <w:rPr>
           <w:b/>
           <w:bCs/>
           <w:color w:val="315CBB"/>
-          <w:sz w:val="24"/>
-          <w:szCs w:val="24"/>
+          <w:sz w:val="18"/>
+          <w:szCs w:val="18"/>
         </w:rPr>
         <w:t xml:space="preserve">Education &amp; certification </w:t>
       </w:r>
     </w:p>
     <w:tbl>
       <w:tblPr>
-        <w:tblW w:type="dxa" w:w="10092"/>
+        <w:tblW w:type="dxa" w:w="10318"/>
         <w:tblBorders>
           <w:top w:val="none" w:color="FFFFFF" w:sz="0"/>
           <w:left w:val="none" w:color="FFFFFF" w:sz="0"/>
@@ -2902,8 +2901,8 @@
         <w:tblLayout w:type="fixed"/>
       </w:tblPr>
       <w:tblGrid>
-        <w:gridCol w:w="2523"/>
-        <w:gridCol w:w="7569"/>
+        <w:gridCol w:w="2580"/>
+        <w:gridCol w:w="7739"/>
       </w:tblGrid>
       <w:tr>
         <w:trPr>
@@ -2911,23 +2910,23 @@
         </w:trPr>
         <w:tc>
           <w:tcPr>
-            <w:tcW w:type="dxa" w:w="2523"/>
+            <w:tcW w:type="dxa" w:w="2580"/>
             <w:tcMar>
-              <w:top w:type="dxa" w:w="60"/>
+              <w:top w:type="dxa" w:w="44"/>
               <w:left w:type="dxa" w:w="0"/>
-              <w:bottom w:type="dxa" w:w="60"/>
-              <w:right w:type="dxa" w:w="120"/>
+              <w:bottom w:type="dxa" w:w="44"/>
+              <w:right w:type="dxa" w:w="87"/>
             </w:tcMar>
           </w:tcPr>
           <w:p>
             <w:pPr>
-              <w:spacing w:after="80" w:before="0" w:line="300"/>
-            </w:pPr>
-            <w:r>
-              <w:rPr>
-                <w:color w:val="203047"/>
-                <w:sz w:val="20"/>
-                <w:szCs w:val="20"/>
+              <w:spacing w:after="75" w:before="0" w:line="210"/>
+            </w:pPr>
+            <w:r>
+              <w:rPr>
+                <w:color w:val="203047"/>
+                <w:sz w:val="15"/>
+                <w:szCs w:val="15"/>
               </w:rPr>
               <w:t xml:space="preserve">2022.02 — 2026.02 (Transfer)</w:t>
             </w:r>
@@ -2935,39 +2934,39 @@
         </w:tc>
         <w:tc>
           <w:tcPr>
-            <w:tcW w:type="dxa" w:w="7569"/>
+            <w:tcW w:type="dxa" w:w="7739"/>
             <w:tcMar>
-              <w:top w:type="dxa" w:w="60"/>
+              <w:top w:type="dxa" w:w="44"/>
               <w:left w:type="dxa" w:w="0"/>
-              <w:bottom w:type="dxa" w:w="60"/>
+              <w:bottom w:type="dxa" w:w="44"/>
               <w:right w:type="dxa" w:w="0"/>
             </w:tcMar>
           </w:tcPr>
           <w:p>
             <w:pPr>
               <w:keepNext/>
-              <w:spacing w:after="0" w:before="0" w:line="276"/>
+              <w:spacing w:after="0" w:before="0" w:line="252"/>
             </w:pPr>
             <w:r>
               <w:rPr>
                 <w:b/>
                 <w:bCs/>
                 <w:color w:val="203047"/>
-                <w:sz w:val="24"/>
-                <w:szCs w:val="24"/>
+                <w:sz w:val="18"/>
+                <w:szCs w:val="18"/>
               </w:rPr>
               <w:t xml:space="preserve">Pusan National University</w:t>
             </w:r>
           </w:p>
           <w:p>
             <w:pPr>
-              <w:spacing w:after="80" w:before="0" w:line="300"/>
-            </w:pPr>
-            <w:r>
-              <w:rPr>
-                <w:color w:val="203047"/>
-                <w:sz w:val="20"/>
-                <w:szCs w:val="20"/>
+              <w:spacing w:after="75" w:before="0" w:line="210"/>
+            </w:pPr>
+            <w:r>
+              <w:rPr>
+                <w:color w:val="203047"/>
+                <w:sz w:val="15"/>
+                <w:szCs w:val="15"/>
               </w:rPr>
               <w:t xml:space="preserve">GPA 4.12 / 4.5</w:t>
             </w:r>
@@ -2977,7 +2976,7 @@
     </w:tbl>
     <w:tbl>
       <w:tblPr>
-        <w:tblW w:type="dxa" w:w="10092"/>
+        <w:tblW w:type="dxa" w:w="10318"/>
         <w:tblBorders>
           <w:top w:val="none" w:color="FFFFFF" w:sz="0"/>
           <w:left w:val="none" w:color="FFFFFF" w:sz="0"/>
@@ -2989,8 +2988,8 @@
         <w:tblLayout w:type="fixed"/>
       </w:tblPr>
       <w:tblGrid>
-        <w:gridCol w:w="2523"/>
-        <w:gridCol w:w="7569"/>
+        <w:gridCol w:w="2580"/>
+        <w:gridCol w:w="7739"/>
       </w:tblGrid>
       <w:tr>
         <w:trPr>
@@ -2998,23 +2997,23 @@
         </w:trPr>
         <w:tc>
           <w:tcPr>
-            <w:tcW w:type="dxa" w:w="2523"/>
+            <w:tcW w:type="dxa" w:w="2580"/>
             <w:tcMar>
-              <w:top w:type="dxa" w:w="60"/>
+              <w:top w:type="dxa" w:w="44"/>
               <w:left w:type="dxa" w:w="0"/>
-              <w:bottom w:type="dxa" w:w="60"/>
-              <w:right w:type="dxa" w:w="120"/>
+              <w:bottom w:type="dxa" w:w="44"/>
+              <w:right w:type="dxa" w:w="87"/>
             </w:tcMar>
           </w:tcPr>
           <w:p>
             <w:pPr>
-              <w:spacing w:after="80" w:before="0" w:line="300"/>
-            </w:pPr>
-            <w:r>
-              <w:rPr>
-                <w:color w:val="203047"/>
-                <w:sz w:val="20"/>
-                <w:szCs w:val="20"/>
+              <w:spacing w:after="75" w:before="0" w:line="210"/>
+            </w:pPr>
+            <w:r>
+              <w:rPr>
+                <w:color w:val="203047"/>
+                <w:sz w:val="15"/>
+                <w:szCs w:val="15"/>
               </w:rPr>
               <w:t xml:space="preserve">2019.03 — 2022.02 (Withdrew)</w:t>
             </w:r>
@@ -3022,39 +3021,39 @@
         </w:tc>
         <w:tc>
           <w:tcPr>
-            <w:tcW w:type="dxa" w:w="7569"/>
+            <w:tcW w:type="dxa" w:w="7739"/>
             <w:tcMar>
-              <w:top w:type="dxa" w:w="60"/>
+              <w:top w:type="dxa" w:w="44"/>
               <w:left w:type="dxa" w:w="0"/>
-              <w:bottom w:type="dxa" w:w="60"/>
+              <w:bottom w:type="dxa" w:w="44"/>
               <w:right w:type="dxa" w:w="0"/>
             </w:tcMar>
           </w:tcPr>
           <w:p>
             <w:pPr>
               <w:keepNext/>
-              <w:spacing w:after="0" w:before="0" w:line="276"/>
+              <w:spacing w:after="0" w:before="0" w:line="252"/>
             </w:pPr>
             <w:r>
               <w:rPr>
                 <w:b/>
                 <w:bCs/>
                 <w:color w:val="203047"/>
-                <w:sz w:val="24"/>
-                <w:szCs w:val="24"/>
+                <w:sz w:val="18"/>
+                <w:szCs w:val="18"/>
               </w:rPr>
               <w:t xml:space="preserve">Daegu University</w:t>
             </w:r>
           </w:p>
           <w:p>
             <w:pPr>
-              <w:spacing w:after="80" w:before="0" w:line="300"/>
-            </w:pPr>
-            <w:r>
-              <w:rPr>
-                <w:color w:val="203047"/>
-                <w:sz w:val="20"/>
-                <w:szCs w:val="20"/>
+              <w:spacing w:after="75" w:before="0" w:line="210"/>
+            </w:pPr>
+            <w:r>
+              <w:rPr>
+                <w:color w:val="203047"/>
+                <w:sz w:val="15"/>
+                <w:szCs w:val="15"/>
               </w:rPr>
               <w:t xml:space="preserve">GPA 4.2 / 4.5</w:t>
             </w:r>
@@ -3064,7 +3063,7 @@
     </w:tbl>
     <w:tbl>
       <w:tblPr>
-        <w:tblW w:type="dxa" w:w="10092"/>
+        <w:tblW w:type="dxa" w:w="10318"/>
         <w:tblBorders>
           <w:top w:val="none" w:color="FFFFFF" w:sz="0"/>
           <w:left w:val="none" w:color="FFFFFF" w:sz="0"/>
@@ -3076,8 +3075,8 @@
         <w:tblLayout w:type="fixed"/>
       </w:tblPr>
       <w:tblGrid>
-        <w:gridCol w:w="2523"/>
-        <w:gridCol w:w="7569"/>
+        <w:gridCol w:w="2580"/>
+        <w:gridCol w:w="7739"/>
       </w:tblGrid>
       <w:tr>
         <w:trPr>
@@ -3085,23 +3084,23 @@
         </w:trPr>
         <w:tc>
           <w:tcPr>
-            <w:tcW w:type="dxa" w:w="2523"/>
+            <w:tcW w:type="dxa" w:w="2580"/>
             <w:tcMar>
-              <w:top w:type="dxa" w:w="60"/>
+              <w:top w:type="dxa" w:w="44"/>
               <w:left w:type="dxa" w:w="0"/>
-              <w:bottom w:type="dxa" w:w="60"/>
-              <w:right w:type="dxa" w:w="120"/>
+              <w:bottom w:type="dxa" w:w="44"/>
+              <w:right w:type="dxa" w:w="87"/>
             </w:tcMar>
           </w:tcPr>
           <w:p>
             <w:pPr>
-              <w:spacing w:after="80" w:before="0" w:line="300"/>
-            </w:pPr>
-            <w:r>
-              <w:rPr>
-                <w:color w:val="203047"/>
-                <w:sz w:val="20"/>
-                <w:szCs w:val="20"/>
+              <w:spacing w:after="75" w:before="0" w:line="210"/>
+            </w:pPr>
+            <w:r>
+              <w:rPr>
+                <w:color w:val="203047"/>
+                <w:sz w:val="15"/>
+                <w:szCs w:val="15"/>
               </w:rPr>
               <w:t xml:space="preserve">2025.09</w:t>
             </w:r>
@@ -3109,39 +3108,39 @@
         </w:tc>
         <w:tc>
           <w:tcPr>
-            <w:tcW w:type="dxa" w:w="7569"/>
+            <w:tcW w:type="dxa" w:w="7739"/>
             <w:tcMar>
-              <w:top w:type="dxa" w:w="60"/>
+              <w:top w:type="dxa" w:w="44"/>
               <w:left w:type="dxa" w:w="0"/>
-              <w:bottom w:type="dxa" w:w="60"/>
+              <w:bottom w:type="dxa" w:w="44"/>
               <w:right w:type="dxa" w:w="0"/>
             </w:tcMar>
           </w:tcPr>
           <w:p>
             <w:pPr>
               <w:keepNext/>
-              <w:spacing w:after="0" w:before="0" w:line="276"/>
+              <w:spacing w:after="0" w:before="0" w:line="252"/>
             </w:pPr>
             <w:r>
               <w:rPr>
                 <w:b/>
                 <w:bCs/>
                 <w:color w:val="203047"/>
-                <w:sz w:val="24"/>
-                <w:szCs w:val="24"/>
+                <w:sz w:val="18"/>
+                <w:szCs w:val="18"/>
               </w:rPr>
               <w:t xml:space="preserve">Engineer Information Processing</w:t>
             </w:r>
           </w:p>
           <w:p>
             <w:pPr>
-              <w:spacing w:after="80" w:before="0" w:line="300"/>
-            </w:pPr>
-            <w:r>
-              <w:rPr>
-                <w:color w:val="203047"/>
-                <w:sz w:val="20"/>
-                <w:szCs w:val="20"/>
+              <w:spacing w:after="75" w:before="0" w:line="210"/>
+            </w:pPr>
+            <w:r>
+              <w:rPr>
+                <w:color w:val="203047"/>
+                <w:sz w:val="15"/>
+                <w:szCs w:val="15"/>
               </w:rPr>
               <w:t xml:space="preserve">Human Resources Development Service of Korea</w:t>
             </w:r>
@@ -3155,22 +3154,22 @@
         <w:pBdr>
           <w:bottom w:val="single" w:color="6A80BD" w:sz="12" w:space="4"/>
         </w:pBdr>
-        <w:spacing w:after="180" w:before="420" w:line="276"/>
+        <w:spacing w:after="135" w:before="240" w:line="252"/>
       </w:pPr>
       <w:r>
         <w:rPr>
           <w:b/>
           <w:bCs/>
           <w:color w:val="315CBB"/>
-          <w:sz w:val="24"/>
-          <w:szCs w:val="24"/>
+          <w:sz w:val="18"/>
+          <w:szCs w:val="18"/>
         </w:rPr>
         <w:t xml:space="preserve">Awards </w:t>
       </w:r>
     </w:p>
     <w:tbl>
       <w:tblPr>
-        <w:tblW w:type="dxa" w:w="10092"/>
+        <w:tblW w:type="dxa" w:w="10318"/>
         <w:tblBorders>
           <w:top w:val="none" w:color="FFFFFF" w:sz="0"/>
           <w:left w:val="none" w:color="FFFFFF" w:sz="0"/>
@@ -3182,9 +3181,9 @@
         <w:tblLayout w:type="fixed"/>
       </w:tblPr>
       <w:tblGrid>
-        <w:gridCol w:w="2523"/>
-        <w:gridCol w:w="1110"/>
-        <w:gridCol w:w="6459"/>
+        <w:gridCol w:w="2580"/>
+        <w:gridCol w:w="1135"/>
+        <w:gridCol w:w="6604"/>
       </w:tblGrid>
       <w:tr>
         <w:trPr>
@@ -3192,23 +3191,23 @@
         </w:trPr>
         <w:tc>
           <w:tcPr>
-            <w:tcW w:type="dxa" w:w="2523"/>
+            <w:tcW w:type="dxa" w:w="2580"/>
             <w:tcMar>
-              <w:top w:type="dxa" w:w="60"/>
+              <w:top w:type="dxa" w:w="44"/>
               <w:left w:type="dxa" w:w="0"/>
-              <w:bottom w:type="dxa" w:w="60"/>
-              <w:right w:type="dxa" w:w="120"/>
+              <w:bottom w:type="dxa" w:w="44"/>
+              <w:right w:type="dxa" w:w="87"/>
             </w:tcMar>
           </w:tcPr>
           <w:p>
             <w:pPr>
-              <w:spacing w:after="80" w:before="0" w:line="300"/>
-            </w:pPr>
-            <w:r>
-              <w:rPr>
-                <w:color w:val="203047"/>
-                <w:sz w:val="20"/>
-                <w:szCs w:val="20"/>
+              <w:spacing w:after="75" w:before="0" w:line="210"/>
+            </w:pPr>
+            <w:r>
+              <w:rPr>
+                <w:color w:val="203047"/>
+                <w:sz w:val="15"/>
+                <w:szCs w:val="15"/>
               </w:rPr>
               <w:t xml:space="preserve">2025.10</w:t>
             </w:r>
@@ -3216,22 +3215,22 @@
         </w:tc>
         <w:tc>
           <w:tcPr>
-            <w:tcW w:type="dxa" w:w="1110"/>
+            <w:tcW w:type="dxa" w:w="1135"/>
             <w:tcMar>
-              <w:top w:type="dxa" w:w="60"/>
+              <w:top w:type="dxa" w:w="44"/>
               <w:left w:type="dxa" w:w="0"/>
-              <w:bottom w:type="dxa" w:w="60"/>
+              <w:bottom w:type="dxa" w:w="44"/>
               <w:right w:type="dxa" w:w="0"/>
             </w:tcMar>
           </w:tcPr>
           <w:p>
             <w:pPr>
-              <w:spacing w:after="80" w:before="0" w:line="300"/>
+              <w:spacing w:after="75" w:before="0" w:line="210"/>
             </w:pPr>
             <w:r>
               <w:drawing>
                 <wp:inline distT="0" distB="0" distL="0" distR="0">
-                  <wp:extent cx="542925" cy="762000"/>
+                  <wp:extent cx="400050" cy="571500"/>
                   <wp:effectExtent t="0" r="0" b="0" l="0"/>
                   <wp:docPr id="1" name="" descr="" title=""/>
                   <wp:cNvGraphicFramePr>
@@ -3256,7 +3255,7 @@
                         <pic:spPr bwMode="auto">
                           <a:xfrm>
                             <a:off x="0" y="0"/>
-                            <a:ext cx="542925" cy="762000"/>
+                            <a:ext cx="400050" cy="571500"/>
                           </a:xfrm>
                           <a:prstGeom prst="rect">
                             <a:avLst/>
@@ -3272,25 +3271,25 @@
         </w:tc>
         <w:tc>
           <w:tcPr>
-            <w:tcW w:type="dxa" w:w="6459"/>
+            <w:tcW w:type="dxa" w:w="6604"/>
             <w:tcMar>
-              <w:top w:type="dxa" w:w="60"/>
+              <w:top w:type="dxa" w:w="44"/>
               <w:left w:type="dxa" w:w="0"/>
-              <w:bottom w:type="dxa" w:w="60"/>
+              <w:bottom w:type="dxa" w:w="44"/>
               <w:right w:type="dxa" w:w="0"/>
             </w:tcMar>
           </w:tcPr>
           <w:p>
             <w:pPr>
-              <w:spacing w:after="80" w:before="0" w:line="300"/>
+              <w:spacing w:after="75" w:before="0" w:line="210"/>
             </w:pPr>
             <w:r>
               <w:rPr>
                 <w:b/>
                 <w:bCs/>
                 <w:color w:val="203047"/>
-                <w:sz w:val="20"/>
-                <w:szCs w:val="20"/>
+                <w:sz w:val="15"/>
+                <w:szCs w:val="15"/>
               </w:rPr>
               <w:t xml:space="preserve">Capstone Design Gold Award</w:t>
             </w:r>
@@ -3300,8 +3299,8 @@
             <w:r>
               <w:rPr>
                 <w:color w:val="203047"/>
-                <w:sz w:val="20"/>
-                <w:szCs w:val="20"/>
+                <w:sz w:val="15"/>
+                <w:szCs w:val="15"/>
               </w:rPr>
               <w:t xml:space="preserve">Software &amp; AI division / College of Information and Biomedical Engineering, Pusan National University</w:t>
             </w:r>
@@ -3311,7 +3310,7 @@
     </w:tbl>
     <w:tbl>
       <w:tblPr>
-        <w:tblW w:type="dxa" w:w="10092"/>
+        <w:tblW w:type="dxa" w:w="10318"/>
         <w:tblBorders>
           <w:top w:val="none" w:color="FFFFFF" w:sz="0"/>
           <w:left w:val="none" w:color="FFFFFF" w:sz="0"/>
@@ -3323,9 +3322,9 @@
         <w:tblLayout w:type="fixed"/>
       </w:tblPr>
       <w:tblGrid>
-        <w:gridCol w:w="2523"/>
-        <w:gridCol w:w="1110"/>
-        <w:gridCol w:w="6459"/>
+        <w:gridCol w:w="2580"/>
+        <w:gridCol w:w="1135"/>
+        <w:gridCol w:w="6604"/>
       </w:tblGrid>
       <w:tr>
         <w:trPr>
@@ -3333,23 +3332,23 @@
         </w:trPr>
         <w:tc>
           <w:tcPr>
-            <w:tcW w:type="dxa" w:w="2523"/>
+            <w:tcW w:type="dxa" w:w="2580"/>
             <w:tcMar>
-              <w:top w:type="dxa" w:w="60"/>
+              <w:top w:type="dxa" w:w="44"/>
               <w:left w:type="dxa" w:w="0"/>
-              <w:bottom w:type="dxa" w:w="60"/>
-              <w:right w:type="dxa" w:w="120"/>
+              <w:bottom w:type="dxa" w:w="44"/>
+              <w:right w:type="dxa" w:w="87"/>
             </w:tcMar>
           </w:tcPr>
           <w:p>
             <w:pPr>
-              <w:spacing w:after="80" w:before="0" w:line="300"/>
-            </w:pPr>
-            <w:r>
-              <w:rPr>
-                <w:color w:val="203047"/>
-                <w:sz w:val="20"/>
-                <w:szCs w:val="20"/>
+              <w:spacing w:after="75" w:before="0" w:line="210"/>
+            </w:pPr>
+            <w:r>
+              <w:rPr>
+                <w:color w:val="203047"/>
+                <w:sz w:val="15"/>
+                <w:szCs w:val="15"/>
               </w:rPr>
               <w:t xml:space="preserve">2025.09</w:t>
             </w:r>
@@ -3357,22 +3356,22 @@
         </w:tc>
         <w:tc>
           <w:tcPr>
-            <w:tcW w:type="dxa" w:w="1110"/>
+            <w:tcW w:type="dxa" w:w="1135"/>
             <w:tcMar>
-              <w:top w:type="dxa" w:w="60"/>
+              <w:top w:type="dxa" w:w="44"/>
               <w:left w:type="dxa" w:w="0"/>
-              <w:bottom w:type="dxa" w:w="60"/>
+              <w:bottom w:type="dxa" w:w="44"/>
               <w:right w:type="dxa" w:w="0"/>
             </w:tcMar>
           </w:tcPr>
           <w:p>
             <w:pPr>
-              <w:spacing w:after="80" w:before="0" w:line="300"/>
+              <w:spacing w:after="75" w:before="0" w:line="210"/>
             </w:pPr>
             <w:r>
               <w:drawing>
                 <wp:inline distT="0" distB="0" distL="0" distR="0">
-                  <wp:extent cx="542925" cy="762000"/>
+                  <wp:extent cx="400050" cy="571500"/>
                   <wp:effectExtent t="0" r="0" b="0" l="0"/>
                   <wp:docPr id="1" name="" descr="" title=""/>
                   <wp:cNvGraphicFramePr>
@@ -3397,7 +3396,7 @@
                         <pic:spPr bwMode="auto">
                           <a:xfrm>
                             <a:off x="0" y="0"/>
-                            <a:ext cx="542925" cy="762000"/>
+                            <a:ext cx="400050" cy="571500"/>
                           </a:xfrm>
                           <a:prstGeom prst="rect">
                             <a:avLst/>
@@ -3413,25 +3412,25 @@
         </w:tc>
         <w:tc>
           <w:tcPr>
-            <w:tcW w:type="dxa" w:w="6459"/>
+            <w:tcW w:type="dxa" w:w="6604"/>
             <w:tcMar>
-              <w:top w:type="dxa" w:w="60"/>
+              <w:top w:type="dxa" w:w="44"/>
               <w:left w:type="dxa" w:w="0"/>
-              <w:bottom w:type="dxa" w:w="60"/>
+              <w:bottom w:type="dxa" w:w="44"/>
               <w:right w:type="dxa" w:w="0"/>
             </w:tcMar>
           </w:tcPr>
           <w:p>
             <w:pPr>
-              <w:spacing w:after="80" w:before="0" w:line="300"/>
+              <w:spacing w:after="75" w:before="0" w:line="210"/>
             </w:pPr>
             <w:r>
               <w:rPr>
                 <w:b/>
                 <w:bCs/>
                 <w:color w:val="203047"/>
-                <w:sz w:val="20"/>
-                <w:szCs w:val="20"/>
+                <w:sz w:val="15"/>
+                <w:szCs w:val="15"/>
               </w:rPr>
               <w:t xml:space="preserve">Busan DATA WEEK Top Excellence Award</w:t>
             </w:r>
@@ -3441,8 +3440,8 @@
             <w:r>
               <w:rPr>
                 <w:color w:val="203047"/>
-                <w:sz w:val="20"/>
-                <w:szCs w:val="20"/>
+                <w:sz w:val="15"/>
+                <w:szCs w:val="15"/>
               </w:rPr>
               <w:t xml:space="preserve">Data utilization case competition / Busan Techno Park</w:t>
             </w:r>
@@ -3452,7 +3451,7 @@
     </w:tbl>
     <w:tbl>
       <w:tblPr>
-        <w:tblW w:type="dxa" w:w="10092"/>
+        <w:tblW w:type="dxa" w:w="10318"/>
         <w:tblBorders>
           <w:top w:val="none" w:color="FFFFFF" w:sz="0"/>
           <w:left w:val="none" w:color="FFFFFF" w:sz="0"/>
@@ -3464,9 +3463,9 @@
         <w:tblLayout w:type="fixed"/>
       </w:tblPr>
       <w:tblGrid>
-        <w:gridCol w:w="2523"/>
-        <w:gridCol w:w="1110"/>
-        <w:gridCol w:w="6459"/>
+        <w:gridCol w:w="2580"/>
+        <w:gridCol w:w="1135"/>
+        <w:gridCol w:w="6604"/>
       </w:tblGrid>
       <w:tr>
         <w:trPr>
@@ -3474,23 +3473,23 @@
         </w:trPr>
         <w:tc>
           <w:tcPr>
-            <w:tcW w:type="dxa" w:w="2523"/>
+            <w:tcW w:type="dxa" w:w="2580"/>
             <w:tcMar>
-              <w:top w:type="dxa" w:w="60"/>
+              <w:top w:type="dxa" w:w="44"/>
               <w:left w:type="dxa" w:w="0"/>
-              <w:bottom w:type="dxa" w:w="60"/>
-              <w:right w:type="dxa" w:w="120"/>
+              <w:bottom w:type="dxa" w:w="44"/>
+              <w:right w:type="dxa" w:w="87"/>
             </w:tcMar>
           </w:tcPr>
           <w:p>
             <w:pPr>
-              <w:spacing w:after="80" w:before="0" w:line="300"/>
-            </w:pPr>
-            <w:r>
-              <w:rPr>
-                <w:color w:val="203047"/>
-                <w:sz w:val="20"/>
-                <w:szCs w:val="20"/>
+              <w:spacing w:after="75" w:before="0" w:line="210"/>
+            </w:pPr>
+            <w:r>
+              <w:rPr>
+                <w:color w:val="203047"/>
+                <w:sz w:val="15"/>
+                <w:szCs w:val="15"/>
               </w:rPr>
               <w:t xml:space="preserve">2025.09</w:t>
             </w:r>
@@ -3498,22 +3497,22 @@
         </w:tc>
         <w:tc>
           <w:tcPr>
-            <w:tcW w:type="dxa" w:w="1110"/>
+            <w:tcW w:type="dxa" w:w="1135"/>
             <w:tcMar>
-              <w:top w:type="dxa" w:w="60"/>
+              <w:top w:type="dxa" w:w="44"/>
               <w:left w:type="dxa" w:w="0"/>
-              <w:bottom w:type="dxa" w:w="60"/>
+              <w:bottom w:type="dxa" w:w="44"/>
               <w:right w:type="dxa" w:w="0"/>
             </w:tcMar>
           </w:tcPr>
           <w:p>
             <w:pPr>
-              <w:spacing w:after="80" w:before="0" w:line="300"/>
+              <w:spacing w:after="75" w:before="0" w:line="210"/>
             </w:pPr>
             <w:r>
               <w:drawing>
                 <wp:inline distT="0" distB="0" distL="0" distR="0">
-                  <wp:extent cx="542925" cy="762000"/>
+                  <wp:extent cx="400050" cy="571500"/>
                   <wp:effectExtent t="0" r="0" b="0" l="0"/>
                   <wp:docPr id="1" name="" descr="" title=""/>
                   <wp:cNvGraphicFramePr>
@@ -3538,7 +3537,7 @@
                         <pic:spPr bwMode="auto">
                           <a:xfrm>
                             <a:off x="0" y="0"/>
-                            <a:ext cx="542925" cy="762000"/>
+                            <a:ext cx="400050" cy="571500"/>
                           </a:xfrm>
                           <a:prstGeom prst="rect">
                             <a:avLst/>
@@ -3554,25 +3553,25 @@
         </w:tc>
         <w:tc>
           <w:tcPr>
-            <w:tcW w:type="dxa" w:w="6459"/>
+            <w:tcW w:type="dxa" w:w="6604"/>
             <w:tcMar>
-              <w:top w:type="dxa" w:w="60"/>
+              <w:top w:type="dxa" w:w="44"/>
               <w:left w:type="dxa" w:w="0"/>
-              <w:bottom w:type="dxa" w:w="60"/>
+              <w:bottom w:type="dxa" w:w="44"/>
               <w:right w:type="dxa" w:w="0"/>
             </w:tcMar>
           </w:tcPr>
           <w:p>
             <w:pPr>
-              <w:spacing w:after="80" w:before="0" w:line="300"/>
+              <w:spacing w:after="75" w:before="0" w:line="210"/>
             </w:pPr>
             <w:r>
               <w:rPr>
                 <w:b/>
                 <w:bCs/>
                 <w:color w:val="203047"/>
-                <w:sz w:val="20"/>
-                <w:szCs w:val="20"/>
+                <w:sz w:val="15"/>
+                <w:szCs w:val="15"/>
               </w:rPr>
               <w:t xml:space="preserve">AI LAUNCH Career School Startup Hackathon Encouragement Award</w:t>
             </w:r>
@@ -3582,8 +3581,8 @@
             <w:r>
               <w:rPr>
                 <w:color w:val="203047"/>
-                <w:sz w:val="20"/>
-                <w:szCs w:val="20"/>
+                <w:sz w:val="15"/>
+                <w:szCs w:val="15"/>
               </w:rPr>
               <w:t xml:space="preserve">KRYPTON X x Root Impact x Google.org</w:t>
             </w:r>
@@ -3593,7 +3592,7 @@
     </w:tbl>
     <w:tbl>
       <w:tblPr>
-        <w:tblW w:type="dxa" w:w="10092"/>
+        <w:tblW w:type="dxa" w:w="10318"/>
         <w:tblBorders>
           <w:top w:val="none" w:color="FFFFFF" w:sz="0"/>
           <w:left w:val="none" w:color="FFFFFF" w:sz="0"/>
@@ -3605,9 +3604,9 @@
         <w:tblLayout w:type="fixed"/>
       </w:tblPr>
       <w:tblGrid>
-        <w:gridCol w:w="2523"/>
-        <w:gridCol w:w="1110"/>
-        <w:gridCol w:w="6459"/>
+        <w:gridCol w:w="2580"/>
+        <w:gridCol w:w="1135"/>
+        <w:gridCol w:w="6604"/>
       </w:tblGrid>
       <w:tr>
         <w:trPr>
@@ -3615,23 +3614,23 @@
         </w:trPr>
         <w:tc>
           <w:tcPr>
-            <w:tcW w:type="dxa" w:w="2523"/>
+            <w:tcW w:type="dxa" w:w="2580"/>
             <w:tcMar>
-              <w:top w:type="dxa" w:w="60"/>
+              <w:top w:type="dxa" w:w="44"/>
               <w:left w:type="dxa" w:w="0"/>
-              <w:bottom w:type="dxa" w:w="60"/>
-              <w:right w:type="dxa" w:w="120"/>
+              <w:bottom w:type="dxa" w:w="44"/>
+              <w:right w:type="dxa" w:w="87"/>
             </w:tcMar>
           </w:tcPr>
           <w:p>
             <w:pPr>
-              <w:spacing w:after="80" w:before="0" w:line="300"/>
-            </w:pPr>
-            <w:r>
-              <w:rPr>
-                <w:color w:val="203047"/>
-                <w:sz w:val="20"/>
-                <w:szCs w:val="20"/>
+              <w:spacing w:after="75" w:before="0" w:line="210"/>
+            </w:pPr>
+            <w:r>
+              <w:rPr>
+                <w:color w:val="203047"/>
+                <w:sz w:val="15"/>
+                <w:szCs w:val="15"/>
               </w:rPr>
               <w:t xml:space="preserve">2025.08</w:t>
             </w:r>
@@ -3639,22 +3638,22 @@
         </w:tc>
         <w:tc>
           <w:tcPr>
-            <w:tcW w:type="dxa" w:w="1110"/>
+            <w:tcW w:type="dxa" w:w="1135"/>
             <w:tcMar>
-              <w:top w:type="dxa" w:w="60"/>
+              <w:top w:type="dxa" w:w="44"/>
               <w:left w:type="dxa" w:w="0"/>
-              <w:bottom w:type="dxa" w:w="60"/>
+              <w:bottom w:type="dxa" w:w="44"/>
               <w:right w:type="dxa" w:w="0"/>
             </w:tcMar>
           </w:tcPr>
           <w:p>
             <w:pPr>
-              <w:spacing w:after="80" w:before="0" w:line="300"/>
+              <w:spacing w:after="75" w:before="0" w:line="210"/>
             </w:pPr>
             <w:r>
               <w:drawing>
                 <wp:inline distT="0" distB="0" distL="0" distR="0">
-                  <wp:extent cx="542925" cy="762000"/>
+                  <wp:extent cx="400050" cy="571500"/>
                   <wp:effectExtent t="0" r="0" b="0" l="0"/>
                   <wp:docPr id="1" name="" descr="" title=""/>
                   <wp:cNvGraphicFramePr>
@@ -3679,7 +3678,7 @@
                         <pic:spPr bwMode="auto">
                           <a:xfrm>
                             <a:off x="0" y="0"/>
-                            <a:ext cx="542925" cy="762000"/>
+                            <a:ext cx="400050" cy="571500"/>
                           </a:xfrm>
                           <a:prstGeom prst="rect">
                             <a:avLst/>
@@ -3695,25 +3694,25 @@
         </w:tc>
         <w:tc>
           <w:tcPr>
-            <w:tcW w:type="dxa" w:w="6459"/>
+            <w:tcW w:type="dxa" w:w="6604"/>
             <w:tcMar>
-              <w:top w:type="dxa" w:w="60"/>
+              <w:top w:type="dxa" w:w="44"/>
               <w:left w:type="dxa" w:w="0"/>
-              <w:bottom w:type="dxa" w:w="60"/>
+              <w:bottom w:type="dxa" w:w="44"/>
               <w:right w:type="dxa" w:w="0"/>
             </w:tcMar>
           </w:tcPr>
           <w:p>
             <w:pPr>
-              <w:spacing w:after="80" w:before="0" w:line="300"/>
+              <w:spacing w:after="75" w:before="0" w:line="210"/>
             </w:pPr>
             <w:r>
               <w:rPr>
                 <w:b/>
                 <w:bCs/>
                 <w:color w:val="203047"/>
-                <w:sz w:val="20"/>
-                <w:szCs w:val="20"/>
+                <w:sz w:val="15"/>
+                <w:szCs w:val="15"/>
               </w:rPr>
               <w:t xml:space="preserve">SW University Digital Competition Sponsor Award</w:t>
             </w:r>
@@ -3723,8 +3722,8 @@
             <w:r>
               <w:rPr>
                 <w:color w:val="203047"/>
-                <w:sz w:val="20"/>
-                <w:szCs w:val="20"/>
+                <w:sz w:val="15"/>
+                <w:szCs w:val="15"/>
               </w:rPr>
               <w:t xml:space="preserve">SW University Council</w:t>
             </w:r>
@@ -3735,7 +3734,7 @@
     <w:sectPr>
       <w:footerReference w:type="default" r:id="rId7"/>
       <w:pgSz w:w="11906" w:h="16838" w:orient="portrait"/>
-      <w:pgMar w:top="1000" w:right="907" w:bottom="1000" w:left="907" w:header="708" w:footer="500" w:gutter="0"/>
+      <w:pgMar w:top="737" w:right="794" w:bottom="907" w:left="794" w:header="708" w:footer="454" w:gutter="0"/>
       <w:pgNumType/>
       <w:docGrid w:linePitch="360"/>
     </w:sectPr>
@@ -3789,14 +3788,14 @@
   <w:p>
     <w:pPr>
       <w:tabs>
-        <w:tab w:val="right" w:pos="10092"/>
+        <w:tab w:val="right" w:pos="10318"/>
       </w:tabs>
     </w:pPr>
     <w:r>
       <w:rPr>
         <w:color w:val="7D8DA3"/>
-        <w:sz w:val="16"/>
-        <w:szCs w:val="16"/>
+        <w:sz w:val="12"/>
+        <w:szCs w:val="12"/>
       </w:rPr>
       <w:t xml:space="preserve">Jaehyeong Kim · AI Application Developer / Backend Engineer</w:t>
     </w:r>
@@ -3806,8 +3805,8 @@
     <w:r>
       <w:rPr>
         <w:color w:val="7D8DA3"/>
-        <w:sz w:val="16"/>
-        <w:szCs w:val="16"/>
+        <w:sz w:val="12"/>
+        <w:szCs w:val="12"/>
       </w:rPr>
       <w:fldChar w:fldCharType="begin"/>
       <w:instrText xml:space="preserve">PAGE</w:instrText>
@@ -3962,14 +3961,14 @@
       <w:rPr>
         <w:rFonts w:ascii="Malgun Gothic" w:cs="Malgun Gothic" w:eastAsia="Malgun Gothic" w:hAnsi="Malgun Gothic"/>
         <w:color w:val="203047"/>
-        <w:sz w:val="20"/>
-        <w:szCs w:val="20"/>
+        <w:sz w:val="15"/>
+        <w:szCs w:val="15"/>
         <w:lang w:val="en-US" w:eastAsia="ko-KR"/>
       </w:rPr>
     </w:rPrDefault>
     <w:pPrDefault>
       <w:pPr>
-        <w:spacing w:after="60" w:line="300"/>
+        <w:spacing w:after="75" w:line="218"/>
       </w:pPr>
     </w:pPrDefault>
   </w:docDefaults>

</xml_diff>

<commit_message>
Close the remaining layout gaps between Word and the PDF
Matching the type alone left Word at six pages, because several fixed
measurements never scaled with it.

- Give table lead columns the CSS grid widths: the date and label columns
  took 25% where the CSS gives them 10 to 15%, so every row wrapped early
- Drop the 5px gap Word added after every paragraph; the CSS zeroes
  paragraph margins and spaces only notes, roles and list items
- Indent bullets 13px as the CSS does, instead of Word's default 48px,
  which cost width on every bullet line in the longest section
- Leave the summary list unbulleted, as list-style:none does in the CSS
- Stop repeating the job title under the name: both builders overwrite the
  name line with it, so the role line below said the same thing twice

Co-Authored-By: Claude Opus 5 (1M context) <noreply@anthropic.com>
</commit_message>
<xml_diff>
--- a/site/en/resume.docx
+++ b/site/en/resume.docx
@@ -87,22 +87,9 @@
           </w:p>
           <w:p>
             <w:pPr>
-              <w:spacing w:after="90" w:before="0" w:line="210"/>
-            </w:pPr>
-            <w:r>
-              <w:rPr>
-                <w:color w:val="607089"/>
-                <w:sz w:val="15"/>
-                <w:szCs w:val="15"/>
-              </w:rPr>
-              <w:t xml:space="preserve">AI Application Developer · Backend Engineer</w:t>
-            </w:r>
-          </w:p>
-          <w:p>
-            <w:pPr>
               <w:spacing w:after="0" w:before="75" w:line="210"/>
             </w:pPr>
-            <w:hyperlink w:history="1" r:id="rId78zehyaydu1jdj4dbcvby">
+            <w:hyperlink w:history="1" r:id="rIdksh2u5yb7duqr26spxttf">
               <w:r>
                 <w:rPr>
                   <w:color w:val="315CBB"/>
@@ -120,7 +107,7 @@
               </w:rPr>
               <w:t xml:space="preserve">   </w:t>
             </w:r>
-            <w:hyperlink w:history="1" r:id="rIdzvyk-8amys_crp4pklhx3">
+            <w:hyperlink w:history="1" r:id="rIdrhiwqdd06w4_qm8knvfdq">
               <w:r>
                 <w:rPr>
                   <w:color w:val="315CBB"/>
@@ -138,7 +125,7 @@
               </w:rPr>
               <w:t xml:space="preserve">   </w:t>
             </w:r>
-            <w:hyperlink w:history="1" r:id="rIdjsqff9gp93gtrqli9yvvm">
+            <w:hyperlink w:history="1" r:id="rId9jyv_cbmf5sjnyuihlqk8">
               <w:r>
                 <w:rPr>
                   <w:color w:val="315CBB"/>
@@ -156,7 +143,7 @@
               </w:rPr>
               <w:t xml:space="preserve">   </w:t>
             </w:r>
-            <w:hyperlink w:history="1" r:id="rIdtt0kxfd7z6chqamdx7kx7">
+            <w:hyperlink w:history="1" r:id="rIdrpjaljdzii7nxyexuqaxu">
               <w:r>
                 <w:rPr>
                   <w:color w:val="315CBB"/>
@@ -205,6 +192,7 @@
           <w:numId w:val="1"/>
         </w:numPr>
         <w:spacing w:after="75" w:before="0" w:line="210"/>
+        <w:ind w:left="195" w:hanging="195"/>
       </w:pPr>
       <w:r>
         <w:rPr>
@@ -225,6 +213,7 @@
           <w:numId w:val="1"/>
         </w:numPr>
         <w:spacing w:after="75" w:before="0" w:line="210"/>
+        <w:ind w:left="195" w:hanging="195"/>
       </w:pPr>
       <w:r>
         <w:rPr>
@@ -245,6 +234,7 @@
           <w:numId w:val="1"/>
         </w:numPr>
         <w:spacing w:after="75" w:before="0" w:line="210"/>
+        <w:ind w:left="195" w:hanging="195"/>
       </w:pPr>
       <w:r>
         <w:rPr>
@@ -290,8 +280,8 @@
         <w:tblLayout w:type="fixed"/>
       </w:tblPr>
       <w:tblGrid>
-        <w:gridCol w:w="7223"/>
-        <w:gridCol w:w="3095"/>
+        <w:gridCol w:w="8048"/>
+        <w:gridCol w:w="2270"/>
       </w:tblGrid>
       <w:tr>
         <w:trPr>
@@ -299,7 +289,7 @@
         </w:trPr>
         <w:tc>
           <w:tcPr>
-            <w:tcW w:type="dxa" w:w="7223"/>
+            <w:tcW w:type="dxa" w:w="8048"/>
             <w:tcMar>
               <w:top w:type="dxa" w:w="204"/>
               <w:left w:type="dxa" w:w="0"/>
@@ -326,7 +316,7 @@
         </w:tc>
         <w:tc>
           <w:tcPr>
-            <w:tcW w:type="dxa" w:w="3095"/>
+            <w:tcW w:type="dxa" w:w="2270"/>
             <w:tcMar>
               <w:top w:type="dxa" w:w="204"/>
               <w:left w:type="dxa" w:w="0"/>
@@ -337,7 +327,7 @@
           <w:p>
             <w:pPr>
               <w:keepNext/>
-              <w:spacing w:after="75" w:before="0" w:line="196"/>
+              <w:spacing w:after="0" w:before="0" w:line="196"/>
               <w:jc w:val="right"/>
             </w:pPr>
             <w:r>
@@ -354,7 +344,7 @@
     </w:tbl>
     <w:p>
       <w:pPr>
-        <w:spacing w:after="75" w:before="0" w:line="196"/>
+        <w:spacing w:after="60" w:before="0" w:line="196"/>
       </w:pPr>
       <w:r>
         <w:rPr>
@@ -378,7 +368,7 @@
     </w:p>
     <w:p>
       <w:pPr>
-        <w:spacing w:after="75" w:before="0" w:line="196"/>
+        <w:spacing w:after="60" w:before="0" w:line="196"/>
       </w:pPr>
       <w:r>
         <w:rPr>
@@ -402,9 +392,9 @@
     </w:p>
     <w:p>
       <w:pPr>
-        <w:spacing w:after="75" w:before="0" w:line="210"/>
-      </w:pPr>
-      <w:hyperlink w:history="1" r:id="rIdhyko_kxiqzzswoel_9hkp">
+        <w:spacing w:after="0" w:before="0" w:line="210"/>
+      </w:pPr>
+      <w:hyperlink w:history="1" r:id="rIdpplshhvholp_65ifqkrce">
         <w:r>
           <w:rPr>
             <w:color w:val="315CBB"/>
@@ -433,7 +423,7 @@
     </w:p>
     <w:p>
       <w:pPr>
-        <w:spacing w:after="75" w:before="0" w:line="196"/>
+        <w:spacing w:after="60" w:before="0" w:line="196"/>
       </w:pPr>
       <w:r>
         <w:rPr>
@@ -452,6 +442,7 @@
           <w:numId w:val="1"/>
         </w:numPr>
         <w:spacing w:after="75" w:before="0" w:line="210"/>
+        <w:ind w:left="195" w:hanging="195"/>
       </w:pPr>
       <w:r>
         <w:rPr>
@@ -545,7 +536,7 @@
     </w:p>
     <w:p>
       <w:pPr>
-        <w:spacing w:after="75" w:before="0" w:line="196"/>
+        <w:spacing w:after="60" w:before="0" w:line="196"/>
       </w:pPr>
       <w:r>
         <w:rPr>
@@ -564,6 +555,7 @@
           <w:numId w:val="1"/>
         </w:numPr>
         <w:spacing w:after="75" w:before="0" w:line="210"/>
+        <w:ind w:left="195" w:hanging="195"/>
       </w:pPr>
       <w:r>
         <w:rPr>
@@ -647,6 +639,7 @@
           <w:numId w:val="1"/>
         </w:numPr>
         <w:spacing w:after="75" w:before="0" w:line="210"/>
+        <w:ind w:left="195" w:hanging="195"/>
       </w:pPr>
       <w:r>
         <w:rPr>
@@ -730,6 +723,7 @@
           <w:numId w:val="1"/>
         </w:numPr>
         <w:spacing w:after="75" w:before="0" w:line="210"/>
+        <w:ind w:left="195" w:hanging="195"/>
       </w:pPr>
       <w:r>
         <w:rPr>
@@ -792,6 +786,7 @@
           <w:numId w:val="1"/>
         </w:numPr>
         <w:spacing w:after="75" w:before="0" w:line="210"/>
+        <w:ind w:left="195" w:hanging="195"/>
       </w:pPr>
       <w:r>
         <w:rPr>
@@ -864,7 +859,7 @@
     </w:p>
     <w:p>
       <w:pPr>
-        <w:spacing w:after="75" w:before="0" w:line="196"/>
+        <w:spacing w:after="60" w:before="0" w:line="196"/>
       </w:pPr>
       <w:r>
         <w:rPr>
@@ -883,6 +878,7 @@
           <w:numId w:val="1"/>
         </w:numPr>
         <w:spacing w:after="75" w:before="0" w:line="210"/>
+        <w:ind w:left="195" w:hanging="195"/>
       </w:pPr>
       <w:r>
         <w:rPr>
@@ -945,6 +941,7 @@
           <w:numId w:val="1"/>
         </w:numPr>
         <w:spacing w:after="75" w:before="0" w:line="210"/>
+        <w:ind w:left="195" w:hanging="195"/>
       </w:pPr>
       <w:r>
         <w:rPr>
@@ -1007,6 +1004,7 @@
           <w:numId w:val="1"/>
         </w:numPr>
         <w:spacing w:after="75" w:before="0" w:line="210"/>
+        <w:ind w:left="195" w:hanging="195"/>
       </w:pPr>
       <w:r>
         <w:rPr>
@@ -1079,7 +1077,7 @@
     </w:p>
     <w:p>
       <w:pPr>
-        <w:spacing w:after="75" w:before="0" w:line="196"/>
+        <w:spacing w:after="60" w:before="0" w:line="196"/>
       </w:pPr>
       <w:r>
         <w:rPr>
@@ -1098,6 +1096,7 @@
           <w:numId w:val="1"/>
         </w:numPr>
         <w:spacing w:after="75" w:before="0" w:line="210"/>
+        <w:ind w:left="195" w:hanging="195"/>
       </w:pPr>
       <w:r>
         <w:rPr>
@@ -1181,6 +1180,7 @@
           <w:numId w:val="1"/>
         </w:numPr>
         <w:spacing w:after="75" w:before="0" w:line="210"/>
+        <w:ind w:left="195" w:hanging="195"/>
       </w:pPr>
       <w:r>
         <w:rPr>
@@ -1258,7 +1258,7 @@
     </w:p>
     <w:p>
       <w:pPr>
-        <w:spacing w:after="75" w:before="0" w:line="196"/>
+        <w:spacing w:after="60" w:before="0" w:line="196"/>
       </w:pPr>
       <w:r>
         <w:rPr>
@@ -1271,7 +1271,7 @@
     </w:p>
     <w:p>
       <w:pPr>
-        <w:spacing w:after="75" w:before="0" w:line="196"/>
+        <w:spacing w:after="60" w:before="0" w:line="196"/>
       </w:pPr>
       <w:r>
         <w:rPr>
@@ -1284,7 +1284,7 @@
     </w:p>
     <w:p>
       <w:pPr>
-        <w:spacing w:after="75" w:before="0" w:line="196"/>
+        <w:spacing w:after="60" w:before="0" w:line="196"/>
       </w:pPr>
       <w:r>
         <w:rPr>
@@ -1299,7 +1299,7 @@
       <w:pPr>
         <w:spacing w:after="0" w:before="75" w:line="210"/>
       </w:pPr>
-      <w:hyperlink w:history="1" r:id="rIdk8bzhqpdqrtpwtrkzg3hm">
+      <w:hyperlink w:history="1" r:id="rIdscq6bpbcfdfleenckkk2o">
         <w:r>
           <w:rPr>
             <w:color w:val="315CBB"/>
@@ -1317,7 +1317,7 @@
         </w:rPr>
         <w:t xml:space="preserve">   </w:t>
       </w:r>
-      <w:hyperlink w:history="1" r:id="rIddkgaqz1qtutwei0jqe-bf">
+      <w:hyperlink w:history="1" r:id="rIdgk_9hatemmznaymchl5yw">
         <w:r>
           <w:rPr>
             <w:color w:val="315CBB"/>
@@ -1335,7 +1335,7 @@
         </w:rPr>
         <w:t xml:space="preserve">   </w:t>
       </w:r>
-      <w:hyperlink w:history="1" r:id="rIdaes0ieshznkkud2sqbc9j">
+      <w:hyperlink w:history="1" r:id="rIdacizrbo6n6mdxvzt5vutg">
         <w:r>
           <w:rPr>
             <w:color w:val="315CBB"/>
@@ -1353,7 +1353,7 @@
         </w:rPr>
         <w:t xml:space="preserve">   </w:t>
       </w:r>
-      <w:hyperlink w:history="1" r:id="rId-fm8aynxbfo2nadpewsor">
+      <w:hyperlink w:history="1" r:id="rIdzjxozf8d4tkqyqde-p-kw">
         <w:r>
           <w:rPr>
             <w:color w:val="315CBB"/>
@@ -1386,8 +1386,8 @@
         <w:tblLayout w:type="fixed"/>
       </w:tblPr>
       <w:tblGrid>
-        <w:gridCol w:w="7223"/>
-        <w:gridCol w:w="3095"/>
+        <w:gridCol w:w="8048"/>
+        <w:gridCol w:w="2270"/>
       </w:tblGrid>
       <w:tr>
         <w:trPr>
@@ -1395,7 +1395,7 @@
         </w:trPr>
         <w:tc>
           <w:tcPr>
-            <w:tcW w:type="dxa" w:w="7223"/>
+            <w:tcW w:type="dxa" w:w="8048"/>
             <w:tcMar>
               <w:top w:type="dxa" w:w="204"/>
               <w:left w:type="dxa" w:w="0"/>
@@ -1422,7 +1422,7 @@
         </w:tc>
         <w:tc>
           <w:tcPr>
-            <w:tcW w:type="dxa" w:w="3095"/>
+            <w:tcW w:type="dxa" w:w="2270"/>
             <w:tcMar>
               <w:top w:type="dxa" w:w="204"/>
               <w:left w:type="dxa" w:w="0"/>
@@ -1433,7 +1433,7 @@
           <w:p>
             <w:pPr>
               <w:keepNext/>
-              <w:spacing w:after="75" w:before="0" w:line="196"/>
+              <w:spacing w:after="0" w:before="0" w:line="196"/>
               <w:jc w:val="right"/>
             </w:pPr>
             <w:r>
@@ -1450,7 +1450,7 @@
     </w:tbl>
     <w:p>
       <w:pPr>
-        <w:spacing w:after="75" w:before="0" w:line="196"/>
+        <w:spacing w:after="60" w:before="0" w:line="196"/>
       </w:pPr>
       <w:r>
         <w:rPr>
@@ -1474,7 +1474,7 @@
     </w:p>
     <w:p>
       <w:pPr>
-        <w:spacing w:after="75" w:before="0" w:line="196"/>
+        <w:spacing w:after="60" w:before="0" w:line="196"/>
       </w:pPr>
       <w:r>
         <w:rPr>
@@ -1498,9 +1498,9 @@
     </w:p>
     <w:p>
       <w:pPr>
-        <w:spacing w:after="75" w:before="0" w:line="210"/>
-      </w:pPr>
-      <w:hyperlink w:history="1" r:id="rIdbwkj120b-kypvqosj694r">
+        <w:spacing w:after="0" w:before="0" w:line="210"/>
+      </w:pPr>
+      <w:hyperlink w:history="1" r:id="rId8qolork4ctrzupzmbdpno">
         <w:r>
           <w:rPr>
             <w:color w:val="315CBB"/>
@@ -1529,7 +1529,7 @@
     </w:p>
     <w:p>
       <w:pPr>
-        <w:spacing w:after="75" w:before="0" w:line="196"/>
+        <w:spacing w:after="60" w:before="0" w:line="196"/>
       </w:pPr>
       <w:r>
         <w:rPr>
@@ -1548,6 +1548,7 @@
           <w:numId w:val="1"/>
         </w:numPr>
         <w:spacing w:after="75" w:before="0" w:line="210"/>
+        <w:ind w:left="195" w:hanging="195"/>
       </w:pPr>
       <w:r>
         <w:rPr>
@@ -1612,8 +1613,8 @@
     </w:p>
     <w:p>
       <w:pPr>
-        <w:spacing w:after="75" w:before="0" w:line="196"/>
-        <w:ind w:left="720"/>
+        <w:spacing w:after="60" w:before="0" w:line="196"/>
+        <w:ind w:left="195"/>
       </w:pPr>
       <w:r>
         <w:rPr>
@@ -1642,7 +1643,7 @@
     </w:p>
     <w:p>
       <w:pPr>
-        <w:spacing w:after="75" w:before="0" w:line="196"/>
+        <w:spacing w:after="60" w:before="0" w:line="196"/>
       </w:pPr>
       <w:r>
         <w:rPr>
@@ -1661,6 +1662,7 @@
           <w:numId w:val="1"/>
         </w:numPr>
         <w:spacing w:after="75" w:before="0" w:line="210"/>
+        <w:ind w:left="195" w:hanging="195"/>
       </w:pPr>
       <w:r>
         <w:rPr>
@@ -1741,7 +1743,7 @@
     </w:p>
     <w:p>
       <w:pPr>
-        <w:spacing w:after="75" w:before="0" w:line="196"/>
+        <w:spacing w:after="60" w:before="0" w:line="196"/>
       </w:pPr>
       <w:r>
         <w:rPr>
@@ -1760,6 +1762,7 @@
           <w:numId w:val="1"/>
         </w:numPr>
         <w:spacing w:after="75" w:before="0" w:line="210"/>
+        <w:ind w:left="195" w:hanging="195"/>
       </w:pPr>
       <w:r>
         <w:rPr>
@@ -1778,6 +1781,7 @@
           <w:numId w:val="1"/>
         </w:numPr>
         <w:spacing w:after="75" w:before="0" w:line="210"/>
+        <w:ind w:left="195" w:hanging="195"/>
       </w:pPr>
       <w:r>
         <w:rPr>
@@ -1806,7 +1810,7 @@
     </w:p>
     <w:p>
       <w:pPr>
-        <w:spacing w:after="75" w:before="0" w:line="196"/>
+        <w:spacing w:after="60" w:before="0" w:line="196"/>
       </w:pPr>
       <w:r>
         <w:rPr>
@@ -1825,6 +1829,7 @@
           <w:numId w:val="1"/>
         </w:numPr>
         <w:spacing w:after="75" w:before="0" w:line="210"/>
+        <w:ind w:left="195" w:hanging="195"/>
       </w:pPr>
       <w:r>
         <w:rPr>
@@ -1908,6 +1913,7 @@
           <w:numId w:val="1"/>
         </w:numPr>
         <w:spacing w:after="75" w:before="0" w:line="210"/>
+        <w:ind w:left="195" w:hanging="195"/>
       </w:pPr>
       <w:r>
         <w:rPr>
@@ -1931,7 +1937,7 @@
     </w:p>
     <w:p>
       <w:pPr>
-        <w:spacing w:after="75" w:before="0" w:line="196"/>
+        <w:spacing w:after="60" w:before="0" w:line="196"/>
       </w:pPr>
       <w:r>
         <w:rPr>
@@ -1946,7 +1952,7 @@
       <w:pPr>
         <w:spacing w:after="0" w:before="75" w:line="210"/>
       </w:pPr>
-      <w:hyperlink w:history="1" r:id="rIdyog5fwfaoq9cat-edbdbo">
+      <w:hyperlink w:history="1" r:id="rIdinpce1c1talfeespoqh73">
         <w:r>
           <w:rPr>
             <w:color w:val="315CBB"/>
@@ -1964,7 +1970,7 @@
         </w:rPr>
         <w:t xml:space="preserve">   </w:t>
       </w:r>
-      <w:hyperlink w:history="1" r:id="rIdzxn22ieds1nskdckayakr">
+      <w:hyperlink w:history="1" r:id="rIdz9ltjxo04igg5gls8-ix2">
         <w:r>
           <w:rPr>
             <w:color w:val="315CBB"/>
@@ -2016,8 +2022,8 @@
         <w:tblLayout w:type="fixed"/>
       </w:tblPr>
       <w:tblGrid>
-        <w:gridCol w:w="2580"/>
-        <w:gridCol w:w="7739"/>
+        <w:gridCol w:w="1445"/>
+        <w:gridCol w:w="8873"/>
       </w:tblGrid>
       <w:tr>
         <w:trPr>
@@ -2025,7 +2031,7 @@
         </w:trPr>
         <w:tc>
           <w:tcPr>
-            <w:tcW w:type="dxa" w:w="2580"/>
+            <w:tcW w:type="dxa" w:w="1445"/>
             <w:tcMar>
               <w:top w:type="dxa" w:w="44"/>
               <w:left w:type="dxa" w:w="0"/>
@@ -2035,7 +2041,7 @@
           </w:tcPr>
           <w:p>
             <w:pPr>
-              <w:spacing w:after="75" w:before="0" w:line="210"/>
+              <w:spacing w:after="0" w:before="0" w:line="210"/>
             </w:pPr>
             <w:r>
               <w:rPr>
@@ -2051,7 +2057,7 @@
         </w:tc>
         <w:tc>
           <w:tcPr>
-            <w:tcW w:type="dxa" w:w="7739"/>
+            <w:tcW w:type="dxa" w:w="8873"/>
             <w:tcMar>
               <w:top w:type="dxa" w:w="44"/>
               <w:left w:type="dxa" w:w="0"/>
@@ -2061,7 +2067,7 @@
           </w:tcPr>
           <w:p>
             <w:pPr>
-              <w:spacing w:after="75" w:before="0" w:line="210"/>
+              <w:spacing w:after="0" w:before="0" w:line="210"/>
             </w:pPr>
             <w:r>
               <w:rPr>
@@ -2100,8 +2106,8 @@
         <w:tblLayout w:type="fixed"/>
       </w:tblPr>
       <w:tblGrid>
-        <w:gridCol w:w="2580"/>
-        <w:gridCol w:w="7739"/>
+        <w:gridCol w:w="1445"/>
+        <w:gridCol w:w="8873"/>
       </w:tblGrid>
       <w:tr>
         <w:trPr>
@@ -2109,7 +2115,7 @@
         </w:trPr>
         <w:tc>
           <w:tcPr>
-            <w:tcW w:type="dxa" w:w="2580"/>
+            <w:tcW w:type="dxa" w:w="1445"/>
             <w:tcMar>
               <w:top w:type="dxa" w:w="44"/>
               <w:left w:type="dxa" w:w="0"/>
@@ -2119,7 +2125,7 @@
           </w:tcPr>
           <w:p>
             <w:pPr>
-              <w:spacing w:after="75" w:before="0" w:line="210"/>
+              <w:spacing w:after="0" w:before="0" w:line="210"/>
             </w:pPr>
             <w:r>
               <w:rPr>
@@ -2135,7 +2141,7 @@
         </w:tc>
         <w:tc>
           <w:tcPr>
-            <w:tcW w:type="dxa" w:w="7739"/>
+            <w:tcW w:type="dxa" w:w="8873"/>
             <w:tcMar>
               <w:top w:type="dxa" w:w="44"/>
               <w:left w:type="dxa" w:w="0"/>
@@ -2145,7 +2151,7 @@
           </w:tcPr>
           <w:p>
             <w:pPr>
-              <w:spacing w:after="75" w:before="0" w:line="210"/>
+              <w:spacing w:after="0" w:before="0" w:line="210"/>
             </w:pPr>
             <w:r>
               <w:rPr>
@@ -2173,8 +2179,8 @@
         <w:tblLayout w:type="fixed"/>
       </w:tblPr>
       <w:tblGrid>
-        <w:gridCol w:w="2580"/>
-        <w:gridCol w:w="7739"/>
+        <w:gridCol w:w="1445"/>
+        <w:gridCol w:w="8873"/>
       </w:tblGrid>
       <w:tr>
         <w:trPr>
@@ -2182,7 +2188,7 @@
         </w:trPr>
         <w:tc>
           <w:tcPr>
-            <w:tcW w:type="dxa" w:w="2580"/>
+            <w:tcW w:type="dxa" w:w="1445"/>
             <w:tcMar>
               <w:top w:type="dxa" w:w="44"/>
               <w:left w:type="dxa" w:w="0"/>
@@ -2192,7 +2198,7 @@
           </w:tcPr>
           <w:p>
             <w:pPr>
-              <w:spacing w:after="75" w:before="0" w:line="210"/>
+              <w:spacing w:after="0" w:before="0" w:line="210"/>
             </w:pPr>
             <w:r>
               <w:rPr>
@@ -2208,7 +2214,7 @@
         </w:tc>
         <w:tc>
           <w:tcPr>
-            <w:tcW w:type="dxa" w:w="7739"/>
+            <w:tcW w:type="dxa" w:w="8873"/>
             <w:tcMar>
               <w:top w:type="dxa" w:w="44"/>
               <w:left w:type="dxa" w:w="0"/>
@@ -2218,7 +2224,7 @@
           </w:tcPr>
           <w:p>
             <w:pPr>
-              <w:spacing w:after="75" w:before="0" w:line="210"/>
+              <w:spacing w:after="0" w:before="0" w:line="210"/>
             </w:pPr>
             <w:r>
               <w:rPr>
@@ -2276,8 +2282,8 @@
         <w:tblLayout w:type="fixed"/>
       </w:tblPr>
       <w:tblGrid>
-        <w:gridCol w:w="2580"/>
-        <w:gridCol w:w="7739"/>
+        <w:gridCol w:w="1548"/>
+        <w:gridCol w:w="8770"/>
       </w:tblGrid>
       <w:tr>
         <w:trPr>
@@ -2285,7 +2291,7 @@
         </w:trPr>
         <w:tc>
           <w:tcPr>
-            <w:tcW w:type="dxa" w:w="2580"/>
+            <w:tcW w:type="dxa" w:w="1548"/>
             <w:tcMar>
               <w:top w:type="dxa" w:w="44"/>
               <w:left w:type="dxa" w:w="0"/>
@@ -2295,7 +2301,7 @@
           </w:tcPr>
           <w:p>
             <w:pPr>
-              <w:spacing w:after="75" w:before="0" w:line="210"/>
+              <w:spacing w:after="0" w:before="0" w:line="210"/>
             </w:pPr>
             <w:r>
               <w:rPr>
@@ -2309,7 +2315,7 @@
         </w:tc>
         <w:tc>
           <w:tcPr>
-            <w:tcW w:type="dxa" w:w="7739"/>
+            <w:tcW w:type="dxa" w:w="8770"/>
             <w:tcMar>
               <w:top w:type="dxa" w:w="44"/>
               <w:left w:type="dxa" w:w="0"/>
@@ -2335,7 +2341,7 @@
           </w:p>
           <w:p>
             <w:pPr>
-              <w:spacing w:after="75" w:before="0" w:line="210"/>
+              <w:spacing w:after="0" w:before="0" w:line="210"/>
             </w:pPr>
             <w:r>
               <w:rPr>
@@ -2350,7 +2356,7 @@
             <w:pPr>
               <w:spacing w:after="0" w:before="75" w:line="210"/>
             </w:pPr>
-            <w:hyperlink w:history="1" r:id="rIdjqnaxtp2ybzcraatbkd-5">
+            <w:hyperlink w:history="1" r:id="rIdhmyuz398hcoc7khh6lyiq">
               <w:r>
                 <w:rPr>
                   <w:color w:val="315CBB"/>
@@ -2368,7 +2374,7 @@
               </w:rPr>
               <w:t xml:space="preserve">   </w:t>
             </w:r>
-            <w:hyperlink w:history="1" r:id="rIdjsbcrvyo5fqreigezdkfs">
+            <w:hyperlink w:history="1" r:id="rIdfbnpwwpimymaqgy0opdh9">
               <w:r>
                 <w:rPr>
                   <w:color w:val="315CBB"/>
@@ -2386,7 +2392,7 @@
               </w:rPr>
               <w:t xml:space="preserve">   </w:t>
             </w:r>
-            <w:hyperlink w:history="1" r:id="rIdlnj-rwjq47mjgsqknbmdd">
+            <w:hyperlink w:history="1" r:id="rId-_bijpdcdp3syq2-ur6wi">
               <w:r>
                 <w:rPr>
                   <w:color w:val="315CBB"/>
@@ -2422,9 +2428,9 @@
         <w:tblLayout w:type="fixed"/>
       </w:tblPr>
       <w:tblGrid>
-        <w:gridCol w:w="2580"/>
-        <w:gridCol w:w="1135"/>
-        <w:gridCol w:w="6604"/>
+        <w:gridCol w:w="1548"/>
+        <w:gridCol w:w="929"/>
+        <w:gridCol w:w="7842"/>
       </w:tblGrid>
       <w:tr>
         <w:trPr>
@@ -2432,7 +2438,7 @@
         </w:trPr>
         <w:tc>
           <w:tcPr>
-            <w:tcW w:type="dxa" w:w="2580"/>
+            <w:tcW w:type="dxa" w:w="1548"/>
             <w:tcMar>
               <w:top w:type="dxa" w:w="44"/>
               <w:left w:type="dxa" w:w="0"/>
@@ -2442,7 +2448,7 @@
           </w:tcPr>
           <w:p>
             <w:pPr>
-              <w:spacing w:after="75" w:before="0" w:line="210"/>
+              <w:spacing w:after="0" w:before="0" w:line="210"/>
             </w:pPr>
             <w:r>
               <w:rPr>
@@ -2456,7 +2462,7 @@
         </w:tc>
         <w:tc>
           <w:tcPr>
-            <w:tcW w:type="dxa" w:w="1135"/>
+            <w:tcW w:type="dxa" w:w="929"/>
             <w:tcMar>
               <w:top w:type="dxa" w:w="44"/>
               <w:left w:type="dxa" w:w="0"/>
@@ -2466,7 +2472,7 @@
           </w:tcPr>
           <w:p>
             <w:pPr>
-              <w:spacing w:after="75" w:before="0" w:line="210"/>
+              <w:spacing w:after="0" w:before="0" w:line="210"/>
             </w:pPr>
             <w:r>
               <w:drawing>
@@ -2512,7 +2518,7 @@
         </w:tc>
         <w:tc>
           <w:tcPr>
-            <w:tcW w:type="dxa" w:w="6604"/>
+            <w:tcW w:type="dxa" w:w="7842"/>
             <w:tcMar>
               <w:top w:type="dxa" w:w="44"/>
               <w:left w:type="dxa" w:w="0"/>
@@ -2538,7 +2544,7 @@
           </w:p>
           <w:p>
             <w:pPr>
-              <w:spacing w:after="75" w:before="0" w:line="210"/>
+              <w:spacing w:after="0" w:before="0" w:line="210"/>
             </w:pPr>
             <w:r>
               <w:rPr>
@@ -2551,7 +2557,7 @@
           </w:p>
           <w:p>
             <w:pPr>
-              <w:spacing w:after="75" w:before="0" w:line="196"/>
+              <w:spacing w:after="60" w:before="0" w:line="196"/>
             </w:pPr>
             <w:r>
               <w:rPr>
@@ -2579,9 +2585,9 @@
         <w:tblLayout w:type="fixed"/>
       </w:tblPr>
       <w:tblGrid>
-        <w:gridCol w:w="2580"/>
-        <w:gridCol w:w="1135"/>
-        <w:gridCol w:w="6604"/>
+        <w:gridCol w:w="1548"/>
+        <w:gridCol w:w="929"/>
+        <w:gridCol w:w="7842"/>
       </w:tblGrid>
       <w:tr>
         <w:trPr>
@@ -2589,7 +2595,7 @@
         </w:trPr>
         <w:tc>
           <w:tcPr>
-            <w:tcW w:type="dxa" w:w="2580"/>
+            <w:tcW w:type="dxa" w:w="1548"/>
             <w:tcMar>
               <w:top w:type="dxa" w:w="44"/>
               <w:left w:type="dxa" w:w="0"/>
@@ -2599,7 +2605,7 @@
           </w:tcPr>
           <w:p>
             <w:pPr>
-              <w:spacing w:after="75" w:before="0" w:line="210"/>
+              <w:spacing w:after="0" w:before="0" w:line="210"/>
             </w:pPr>
             <w:r>
               <w:rPr>
@@ -2613,7 +2619,7 @@
         </w:tc>
         <w:tc>
           <w:tcPr>
-            <w:tcW w:type="dxa" w:w="1135"/>
+            <w:tcW w:type="dxa" w:w="929"/>
             <w:tcMar>
               <w:top w:type="dxa" w:w="44"/>
               <w:left w:type="dxa" w:w="0"/>
@@ -2623,7 +2629,7 @@
           </w:tcPr>
           <w:p>
             <w:pPr>
-              <w:spacing w:after="75" w:before="0" w:line="210"/>
+              <w:spacing w:after="0" w:before="0" w:line="210"/>
             </w:pPr>
             <w:r>
               <w:drawing>
@@ -2669,7 +2675,7 @@
         </w:tc>
         <w:tc>
           <w:tcPr>
-            <w:tcW w:type="dxa" w:w="6604"/>
+            <w:tcW w:type="dxa" w:w="7842"/>
             <w:tcMar>
               <w:top w:type="dxa" w:w="44"/>
               <w:left w:type="dxa" w:w="0"/>
@@ -2695,7 +2701,7 @@
           </w:p>
           <w:p>
             <w:pPr>
-              <w:spacing w:after="75" w:before="0" w:line="210"/>
+              <w:spacing w:after="0" w:before="0" w:line="210"/>
             </w:pPr>
             <w:r>
               <w:rPr>
@@ -2723,9 +2729,9 @@
         <w:tblLayout w:type="fixed"/>
       </w:tblPr>
       <w:tblGrid>
-        <w:gridCol w:w="2580"/>
-        <w:gridCol w:w="1135"/>
-        <w:gridCol w:w="6604"/>
+        <w:gridCol w:w="1548"/>
+        <w:gridCol w:w="929"/>
+        <w:gridCol w:w="7842"/>
       </w:tblGrid>
       <w:tr>
         <w:trPr>
@@ -2733,7 +2739,7 @@
         </w:trPr>
         <w:tc>
           <w:tcPr>
-            <w:tcW w:type="dxa" w:w="2580"/>
+            <w:tcW w:type="dxa" w:w="1548"/>
             <w:tcMar>
               <w:top w:type="dxa" w:w="44"/>
               <w:left w:type="dxa" w:w="0"/>
@@ -2743,7 +2749,7 @@
           </w:tcPr>
           <w:p>
             <w:pPr>
-              <w:spacing w:after="75" w:before="0" w:line="210"/>
+              <w:spacing w:after="0" w:before="0" w:line="210"/>
             </w:pPr>
             <w:r>
               <w:rPr>
@@ -2757,7 +2763,7 @@
         </w:tc>
         <w:tc>
           <w:tcPr>
-            <w:tcW w:type="dxa" w:w="1135"/>
+            <w:tcW w:type="dxa" w:w="929"/>
             <w:tcMar>
               <w:top w:type="dxa" w:w="44"/>
               <w:left w:type="dxa" w:w="0"/>
@@ -2767,7 +2773,7 @@
           </w:tcPr>
           <w:p>
             <w:pPr>
-              <w:spacing w:after="75" w:before="0" w:line="210"/>
+              <w:spacing w:after="0" w:before="0" w:line="210"/>
             </w:pPr>
             <w:r>
               <w:drawing>
@@ -2813,7 +2819,7 @@
         </w:tc>
         <w:tc>
           <w:tcPr>
-            <w:tcW w:type="dxa" w:w="6604"/>
+            <w:tcW w:type="dxa" w:w="7842"/>
             <w:tcMar>
               <w:top w:type="dxa" w:w="44"/>
               <w:left w:type="dxa" w:w="0"/>
@@ -2839,7 +2845,7 @@
           </w:p>
           <w:p>
             <w:pPr>
-              <w:spacing w:after="75" w:before="0" w:line="210"/>
+              <w:spacing w:after="0" w:before="0" w:line="210"/>
             </w:pPr>
             <w:r>
               <w:rPr>
@@ -2852,9 +2858,9 @@
           </w:p>
           <w:p>
             <w:pPr>
-              <w:spacing w:after="75" w:before="0" w:line="210"/>
-            </w:pPr>
-            <w:hyperlink w:history="1" r:id="rIdhkb8ar0gobu7teqtof1ck">
+              <w:spacing w:after="0" w:before="0" w:line="210"/>
+            </w:pPr>
+            <w:hyperlink w:history="1" r:id="rId9_3s9glsiskevntavqpkb">
               <w:r>
                 <w:rPr>
                   <w:color w:val="315CBB"/>
@@ -2901,8 +2907,8 @@
         <w:tblLayout w:type="fixed"/>
       </w:tblPr>
       <w:tblGrid>
-        <w:gridCol w:w="2580"/>
-        <w:gridCol w:w="7739"/>
+        <w:gridCol w:w="1548"/>
+        <w:gridCol w:w="8770"/>
       </w:tblGrid>
       <w:tr>
         <w:trPr>
@@ -2910,7 +2916,7 @@
         </w:trPr>
         <w:tc>
           <w:tcPr>
-            <w:tcW w:type="dxa" w:w="2580"/>
+            <w:tcW w:type="dxa" w:w="1548"/>
             <w:tcMar>
               <w:top w:type="dxa" w:w="44"/>
               <w:left w:type="dxa" w:w="0"/>
@@ -2920,7 +2926,7 @@
           </w:tcPr>
           <w:p>
             <w:pPr>
-              <w:spacing w:after="75" w:before="0" w:line="210"/>
+              <w:spacing w:after="0" w:before="0" w:line="210"/>
             </w:pPr>
             <w:r>
               <w:rPr>
@@ -2934,7 +2940,7 @@
         </w:tc>
         <w:tc>
           <w:tcPr>
-            <w:tcW w:type="dxa" w:w="7739"/>
+            <w:tcW w:type="dxa" w:w="8770"/>
             <w:tcMar>
               <w:top w:type="dxa" w:w="44"/>
               <w:left w:type="dxa" w:w="0"/>
@@ -2960,7 +2966,7 @@
           </w:p>
           <w:p>
             <w:pPr>
-              <w:spacing w:after="75" w:before="0" w:line="210"/>
+              <w:spacing w:after="0" w:before="0" w:line="210"/>
             </w:pPr>
             <w:r>
               <w:rPr>
@@ -2988,8 +2994,8 @@
         <w:tblLayout w:type="fixed"/>
       </w:tblPr>
       <w:tblGrid>
-        <w:gridCol w:w="2580"/>
-        <w:gridCol w:w="7739"/>
+        <w:gridCol w:w="1548"/>
+        <w:gridCol w:w="8770"/>
       </w:tblGrid>
       <w:tr>
         <w:trPr>
@@ -2997,7 +3003,7 @@
         </w:trPr>
         <w:tc>
           <w:tcPr>
-            <w:tcW w:type="dxa" w:w="2580"/>
+            <w:tcW w:type="dxa" w:w="1548"/>
             <w:tcMar>
               <w:top w:type="dxa" w:w="44"/>
               <w:left w:type="dxa" w:w="0"/>
@@ -3007,7 +3013,7 @@
           </w:tcPr>
           <w:p>
             <w:pPr>
-              <w:spacing w:after="75" w:before="0" w:line="210"/>
+              <w:spacing w:after="0" w:before="0" w:line="210"/>
             </w:pPr>
             <w:r>
               <w:rPr>
@@ -3021,7 +3027,7 @@
         </w:tc>
         <w:tc>
           <w:tcPr>
-            <w:tcW w:type="dxa" w:w="7739"/>
+            <w:tcW w:type="dxa" w:w="8770"/>
             <w:tcMar>
               <w:top w:type="dxa" w:w="44"/>
               <w:left w:type="dxa" w:w="0"/>
@@ -3047,7 +3053,7 @@
           </w:p>
           <w:p>
             <w:pPr>
-              <w:spacing w:after="75" w:before="0" w:line="210"/>
+              <w:spacing w:after="0" w:before="0" w:line="210"/>
             </w:pPr>
             <w:r>
               <w:rPr>
@@ -3075,8 +3081,8 @@
         <w:tblLayout w:type="fixed"/>
       </w:tblPr>
       <w:tblGrid>
-        <w:gridCol w:w="2580"/>
-        <w:gridCol w:w="7739"/>
+        <w:gridCol w:w="1548"/>
+        <w:gridCol w:w="8770"/>
       </w:tblGrid>
       <w:tr>
         <w:trPr>
@@ -3084,7 +3090,7 @@
         </w:trPr>
         <w:tc>
           <w:tcPr>
-            <w:tcW w:type="dxa" w:w="2580"/>
+            <w:tcW w:type="dxa" w:w="1548"/>
             <w:tcMar>
               <w:top w:type="dxa" w:w="44"/>
               <w:left w:type="dxa" w:w="0"/>
@@ -3094,7 +3100,7 @@
           </w:tcPr>
           <w:p>
             <w:pPr>
-              <w:spacing w:after="75" w:before="0" w:line="210"/>
+              <w:spacing w:after="0" w:before="0" w:line="210"/>
             </w:pPr>
             <w:r>
               <w:rPr>
@@ -3108,7 +3114,7 @@
         </w:tc>
         <w:tc>
           <w:tcPr>
-            <w:tcW w:type="dxa" w:w="7739"/>
+            <w:tcW w:type="dxa" w:w="8770"/>
             <w:tcMar>
               <w:top w:type="dxa" w:w="44"/>
               <w:left w:type="dxa" w:w="0"/>
@@ -3134,7 +3140,7 @@
           </w:p>
           <w:p>
             <w:pPr>
-              <w:spacing w:after="75" w:before="0" w:line="210"/>
+              <w:spacing w:after="0" w:before="0" w:line="210"/>
             </w:pPr>
             <w:r>
               <w:rPr>
@@ -3181,9 +3187,9 @@
         <w:tblLayout w:type="fixed"/>
       </w:tblPr>
       <w:tblGrid>
-        <w:gridCol w:w="2580"/>
-        <w:gridCol w:w="1135"/>
-        <w:gridCol w:w="6604"/>
+        <w:gridCol w:w="1032"/>
+        <w:gridCol w:w="929"/>
+        <w:gridCol w:w="8358"/>
       </w:tblGrid>
       <w:tr>
         <w:trPr>
@@ -3191,7 +3197,7 @@
         </w:trPr>
         <w:tc>
           <w:tcPr>
-            <w:tcW w:type="dxa" w:w="2580"/>
+            <w:tcW w:type="dxa" w:w="1032"/>
             <w:tcMar>
               <w:top w:type="dxa" w:w="44"/>
               <w:left w:type="dxa" w:w="0"/>
@@ -3201,7 +3207,7 @@
           </w:tcPr>
           <w:p>
             <w:pPr>
-              <w:spacing w:after="75" w:before="0" w:line="210"/>
+              <w:spacing w:after="0" w:before="0" w:line="210"/>
             </w:pPr>
             <w:r>
               <w:rPr>
@@ -3215,7 +3221,7 @@
         </w:tc>
         <w:tc>
           <w:tcPr>
-            <w:tcW w:type="dxa" w:w="1135"/>
+            <w:tcW w:type="dxa" w:w="929"/>
             <w:tcMar>
               <w:top w:type="dxa" w:w="44"/>
               <w:left w:type="dxa" w:w="0"/>
@@ -3225,7 +3231,7 @@
           </w:tcPr>
           <w:p>
             <w:pPr>
-              <w:spacing w:after="75" w:before="0" w:line="210"/>
+              <w:spacing w:after="0" w:before="0" w:line="210"/>
             </w:pPr>
             <w:r>
               <w:drawing>
@@ -3271,7 +3277,7 @@
         </w:tc>
         <w:tc>
           <w:tcPr>
-            <w:tcW w:type="dxa" w:w="6604"/>
+            <w:tcW w:type="dxa" w:w="8358"/>
             <w:tcMar>
               <w:top w:type="dxa" w:w="44"/>
               <w:left w:type="dxa" w:w="0"/>
@@ -3281,7 +3287,7 @@
           </w:tcPr>
           <w:p>
             <w:pPr>
-              <w:spacing w:after="75" w:before="0" w:line="210"/>
+              <w:spacing w:after="0" w:before="0" w:line="210"/>
             </w:pPr>
             <w:r>
               <w:rPr>
@@ -3322,9 +3328,9 @@
         <w:tblLayout w:type="fixed"/>
       </w:tblPr>
       <w:tblGrid>
-        <w:gridCol w:w="2580"/>
-        <w:gridCol w:w="1135"/>
-        <w:gridCol w:w="6604"/>
+        <w:gridCol w:w="1032"/>
+        <w:gridCol w:w="929"/>
+        <w:gridCol w:w="8358"/>
       </w:tblGrid>
       <w:tr>
         <w:trPr>
@@ -3332,7 +3338,7 @@
         </w:trPr>
         <w:tc>
           <w:tcPr>
-            <w:tcW w:type="dxa" w:w="2580"/>
+            <w:tcW w:type="dxa" w:w="1032"/>
             <w:tcMar>
               <w:top w:type="dxa" w:w="44"/>
               <w:left w:type="dxa" w:w="0"/>
@@ -3342,7 +3348,7 @@
           </w:tcPr>
           <w:p>
             <w:pPr>
-              <w:spacing w:after="75" w:before="0" w:line="210"/>
+              <w:spacing w:after="0" w:before="0" w:line="210"/>
             </w:pPr>
             <w:r>
               <w:rPr>
@@ -3356,7 +3362,7 @@
         </w:tc>
         <w:tc>
           <w:tcPr>
-            <w:tcW w:type="dxa" w:w="1135"/>
+            <w:tcW w:type="dxa" w:w="929"/>
             <w:tcMar>
               <w:top w:type="dxa" w:w="44"/>
               <w:left w:type="dxa" w:w="0"/>
@@ -3366,7 +3372,7 @@
           </w:tcPr>
           <w:p>
             <w:pPr>
-              <w:spacing w:after="75" w:before="0" w:line="210"/>
+              <w:spacing w:after="0" w:before="0" w:line="210"/>
             </w:pPr>
             <w:r>
               <w:drawing>
@@ -3412,7 +3418,7 @@
         </w:tc>
         <w:tc>
           <w:tcPr>
-            <w:tcW w:type="dxa" w:w="6604"/>
+            <w:tcW w:type="dxa" w:w="8358"/>
             <w:tcMar>
               <w:top w:type="dxa" w:w="44"/>
               <w:left w:type="dxa" w:w="0"/>
@@ -3422,7 +3428,7 @@
           </w:tcPr>
           <w:p>
             <w:pPr>
-              <w:spacing w:after="75" w:before="0" w:line="210"/>
+              <w:spacing w:after="0" w:before="0" w:line="210"/>
             </w:pPr>
             <w:r>
               <w:rPr>
@@ -3463,9 +3469,9 @@
         <w:tblLayout w:type="fixed"/>
       </w:tblPr>
       <w:tblGrid>
-        <w:gridCol w:w="2580"/>
-        <w:gridCol w:w="1135"/>
-        <w:gridCol w:w="6604"/>
+        <w:gridCol w:w="1032"/>
+        <w:gridCol w:w="929"/>
+        <w:gridCol w:w="8358"/>
       </w:tblGrid>
       <w:tr>
         <w:trPr>
@@ -3473,7 +3479,7 @@
         </w:trPr>
         <w:tc>
           <w:tcPr>
-            <w:tcW w:type="dxa" w:w="2580"/>
+            <w:tcW w:type="dxa" w:w="1032"/>
             <w:tcMar>
               <w:top w:type="dxa" w:w="44"/>
               <w:left w:type="dxa" w:w="0"/>
@@ -3483,7 +3489,7 @@
           </w:tcPr>
           <w:p>
             <w:pPr>
-              <w:spacing w:after="75" w:before="0" w:line="210"/>
+              <w:spacing w:after="0" w:before="0" w:line="210"/>
             </w:pPr>
             <w:r>
               <w:rPr>
@@ -3497,7 +3503,7 @@
         </w:tc>
         <w:tc>
           <w:tcPr>
-            <w:tcW w:type="dxa" w:w="1135"/>
+            <w:tcW w:type="dxa" w:w="929"/>
             <w:tcMar>
               <w:top w:type="dxa" w:w="44"/>
               <w:left w:type="dxa" w:w="0"/>
@@ -3507,7 +3513,7 @@
           </w:tcPr>
           <w:p>
             <w:pPr>
-              <w:spacing w:after="75" w:before="0" w:line="210"/>
+              <w:spacing w:after="0" w:before="0" w:line="210"/>
             </w:pPr>
             <w:r>
               <w:drawing>
@@ -3553,7 +3559,7 @@
         </w:tc>
         <w:tc>
           <w:tcPr>
-            <w:tcW w:type="dxa" w:w="6604"/>
+            <w:tcW w:type="dxa" w:w="8358"/>
             <w:tcMar>
               <w:top w:type="dxa" w:w="44"/>
               <w:left w:type="dxa" w:w="0"/>
@@ -3563,7 +3569,7 @@
           </w:tcPr>
           <w:p>
             <w:pPr>
-              <w:spacing w:after="75" w:before="0" w:line="210"/>
+              <w:spacing w:after="0" w:before="0" w:line="210"/>
             </w:pPr>
             <w:r>
               <w:rPr>
@@ -3604,9 +3610,9 @@
         <w:tblLayout w:type="fixed"/>
       </w:tblPr>
       <w:tblGrid>
-        <w:gridCol w:w="2580"/>
-        <w:gridCol w:w="1135"/>
-        <w:gridCol w:w="6604"/>
+        <w:gridCol w:w="1032"/>
+        <w:gridCol w:w="929"/>
+        <w:gridCol w:w="8358"/>
       </w:tblGrid>
       <w:tr>
         <w:trPr>
@@ -3614,7 +3620,7 @@
         </w:trPr>
         <w:tc>
           <w:tcPr>
-            <w:tcW w:type="dxa" w:w="2580"/>
+            <w:tcW w:type="dxa" w:w="1032"/>
             <w:tcMar>
               <w:top w:type="dxa" w:w="44"/>
               <w:left w:type="dxa" w:w="0"/>
@@ -3624,7 +3630,7 @@
           </w:tcPr>
           <w:p>
             <w:pPr>
-              <w:spacing w:after="75" w:before="0" w:line="210"/>
+              <w:spacing w:after="0" w:before="0" w:line="210"/>
             </w:pPr>
             <w:r>
               <w:rPr>
@@ -3638,7 +3644,7 @@
         </w:tc>
         <w:tc>
           <w:tcPr>
-            <w:tcW w:type="dxa" w:w="1135"/>
+            <w:tcW w:type="dxa" w:w="929"/>
             <w:tcMar>
               <w:top w:type="dxa" w:w="44"/>
               <w:left w:type="dxa" w:w="0"/>
@@ -3648,7 +3654,7 @@
           </w:tcPr>
           <w:p>
             <w:pPr>
-              <w:spacing w:after="75" w:before="0" w:line="210"/>
+              <w:spacing w:after="0" w:before="0" w:line="210"/>
             </w:pPr>
             <w:r>
               <w:drawing>
@@ -3694,7 +3700,7 @@
         </w:tc>
         <w:tc>
           <w:tcPr>
-            <w:tcW w:type="dxa" w:w="6604"/>
+            <w:tcW w:type="dxa" w:w="8358"/>
             <w:tcMar>
               <w:top w:type="dxa" w:w="44"/>
               <w:left w:type="dxa" w:w="0"/>
@@ -3704,7 +3710,7 @@
           </w:tcPr>
           <w:p>
             <w:pPr>
-              <w:spacing w:after="75" w:before="0" w:line="210"/>
+              <w:spacing w:after="0" w:before="0" w:line="210"/>
             </w:pPr>
             <w:r>
               <w:rPr>
@@ -3968,7 +3974,7 @@
     </w:rPrDefault>
     <w:pPrDefault>
       <w:pPr>
-        <w:spacing w:after="75" w:line="218"/>
+        <w:spacing w:after="0" w:line="218"/>
       </w:pPr>
     </w:pPrDefault>
   </w:docDefaults>

</xml_diff>

<commit_message>
Build a local résumé that carries a 지원동기 section
The application form has no field for it, so it has to travel as a document,
and it is company-specific text that must never reach the public site.

- Add scripts/build-cover-letter.mjs: it appends the letter as the last
  section of the résumé and writes the PDF and DOCX into local/
- Keep the source as editable markdown with a watch mode, so saving the file
  rebuilds both documents
- Strip <!-- --> notes so editing guidance stays with the file it describes
  without reaching the document
- Let the résumé builders take a target directory and carry any section past
  the fixed indices, which previously dropped anything added
- Ignore local/, since both the text and the built files are per-company

Co-Authored-By: Claude Opus 5 (1M context) <noreply@anthropic.com>
</commit_message>
<xml_diff>
--- a/site/en/resume.docx
+++ b/site/en/resume.docx
@@ -89,7 +89,7 @@
             <w:pPr>
               <w:spacing w:after="0" w:before="75" w:line="210"/>
             </w:pPr>
-            <w:hyperlink w:history="1" r:id="rIdksh2u5yb7duqr26spxttf">
+            <w:hyperlink w:history="1" r:id="rIdmulvtrrx8jsyeyfs12hnd">
               <w:r>
                 <w:rPr>
                   <w:color w:val="315CBB"/>
@@ -107,7 +107,7 @@
               </w:rPr>
               <w:t xml:space="preserve">   </w:t>
             </w:r>
-            <w:hyperlink w:history="1" r:id="rIdrhiwqdd06w4_qm8knvfdq">
+            <w:hyperlink w:history="1" r:id="rId_peobe5lj9skhg0jpkn-g">
               <w:r>
                 <w:rPr>
                   <w:color w:val="315CBB"/>
@@ -125,7 +125,7 @@
               </w:rPr>
               <w:t xml:space="preserve">   </w:t>
             </w:r>
-            <w:hyperlink w:history="1" r:id="rId9jyv_cbmf5sjnyuihlqk8">
+            <w:hyperlink w:history="1" r:id="rIdxgwqziixpnx0evvgietj-">
               <w:r>
                 <w:rPr>
                   <w:color w:val="315CBB"/>
@@ -143,7 +143,7 @@
               </w:rPr>
               <w:t xml:space="preserve">   </w:t>
             </w:r>
-            <w:hyperlink w:history="1" r:id="rIdrpjaljdzii7nxyexuqaxu">
+            <w:hyperlink w:history="1" r:id="rIdger1inkfpjohbspkg78fi">
               <w:r>
                 <w:rPr>
                   <w:color w:val="315CBB"/>
@@ -394,7 +394,7 @@
       <w:pPr>
         <w:spacing w:after="0" w:before="0" w:line="210"/>
       </w:pPr>
-      <w:hyperlink w:history="1" r:id="rIdpplshhvholp_65ifqkrce">
+      <w:hyperlink w:history="1" r:id="rId5tkjnvofra2yoxuvylfag">
         <w:r>
           <w:rPr>
             <w:color w:val="315CBB"/>
@@ -1299,7 +1299,7 @@
       <w:pPr>
         <w:spacing w:after="0" w:before="75" w:line="210"/>
       </w:pPr>
-      <w:hyperlink w:history="1" r:id="rIdscq6bpbcfdfleenckkk2o">
+      <w:hyperlink w:history="1" r:id="rId2nkyrwsqvrzanngk3bhft">
         <w:r>
           <w:rPr>
             <w:color w:val="315CBB"/>
@@ -1317,7 +1317,7 @@
         </w:rPr>
         <w:t xml:space="preserve">   </w:t>
       </w:r>
-      <w:hyperlink w:history="1" r:id="rIdgk_9hatemmznaymchl5yw">
+      <w:hyperlink w:history="1" r:id="rIdcvu64ykzxhwsdiga596rk">
         <w:r>
           <w:rPr>
             <w:color w:val="315CBB"/>
@@ -1335,7 +1335,7 @@
         </w:rPr>
         <w:t xml:space="preserve">   </w:t>
       </w:r>
-      <w:hyperlink w:history="1" r:id="rIdacizrbo6n6mdxvzt5vutg">
+      <w:hyperlink w:history="1" r:id="rId7s3uo4ao9fbfxhfcknl3s">
         <w:r>
           <w:rPr>
             <w:color w:val="315CBB"/>
@@ -1353,7 +1353,7 @@
         </w:rPr>
         <w:t xml:space="preserve">   </w:t>
       </w:r>
-      <w:hyperlink w:history="1" r:id="rIdzjxozf8d4tkqyqde-p-kw">
+      <w:hyperlink w:history="1" r:id="rIdyrlooc_3mbewef9zz1l4m">
         <w:r>
           <w:rPr>
             <w:color w:val="315CBB"/>
@@ -1500,7 +1500,7 @@
       <w:pPr>
         <w:spacing w:after="0" w:before="0" w:line="210"/>
       </w:pPr>
-      <w:hyperlink w:history="1" r:id="rId8qolork4ctrzupzmbdpno">
+      <w:hyperlink w:history="1" r:id="rIdkele5poho5y5dctfbfbpm">
         <w:r>
           <w:rPr>
             <w:color w:val="315CBB"/>
@@ -1952,7 +1952,7 @@
       <w:pPr>
         <w:spacing w:after="0" w:before="75" w:line="210"/>
       </w:pPr>
-      <w:hyperlink w:history="1" r:id="rIdinpce1c1talfeespoqh73">
+      <w:hyperlink w:history="1" r:id="rIdxyhyzprrnoc17-0zkt9rz">
         <w:r>
           <w:rPr>
             <w:color w:val="315CBB"/>
@@ -1970,7 +1970,7 @@
         </w:rPr>
         <w:t xml:space="preserve">   </w:t>
       </w:r>
-      <w:hyperlink w:history="1" r:id="rIdz9ltjxo04igg5gls8-ix2">
+      <w:hyperlink w:history="1" r:id="rIdzqdq1wtzeurl2hgyv-dox">
         <w:r>
           <w:rPr>
             <w:color w:val="315CBB"/>
@@ -2356,7 +2356,7 @@
             <w:pPr>
               <w:spacing w:after="0" w:before="75" w:line="210"/>
             </w:pPr>
-            <w:hyperlink w:history="1" r:id="rIdhmyuz398hcoc7khh6lyiq">
+            <w:hyperlink w:history="1" r:id="rIdop8hr-g7fvevsjxfjgqoa">
               <w:r>
                 <w:rPr>
                   <w:color w:val="315CBB"/>
@@ -2374,7 +2374,7 @@
               </w:rPr>
               <w:t xml:space="preserve">   </w:t>
             </w:r>
-            <w:hyperlink w:history="1" r:id="rIdfbnpwwpimymaqgy0opdh9">
+            <w:hyperlink w:history="1" r:id="rIdgw02rzc51t6hhtxdbttnb">
               <w:r>
                 <w:rPr>
                   <w:color w:val="315CBB"/>
@@ -2392,7 +2392,7 @@
               </w:rPr>
               <w:t xml:space="preserve">   </w:t>
             </w:r>
-            <w:hyperlink w:history="1" r:id="rId-_bijpdcdp3syq2-ur6wi">
+            <w:hyperlink w:history="1" r:id="rIdef-z5g3s5w_gbgmfy8puk">
               <w:r>
                 <w:rPr>
                   <w:color w:val="315CBB"/>
@@ -2860,7 +2860,7 @@
             <w:pPr>
               <w:spacing w:after="0" w:before="0" w:line="210"/>
             </w:pPr>
-            <w:hyperlink w:history="1" r:id="rId9_3s9glsiskevntavqpkb">
+            <w:hyperlink w:history="1" r:id="rIdbp1divl4mnux5_81grufz">
               <w:r>
                 <w:rPr>
                   <w:color w:val="315CBB"/>

</xml_diff>

<commit_message>
Lead the local résumé with the 지원동기 section
- Place a .resume-lead section right after the name, before the summary,
  keeping it out of the fixed section indices both builders rely on
- Keep it last in the HTML: the DOCX builder strips the paragraphs of the
  first .resume-section as summary text, so an early position would delete
  the letter's own body

Co-Authored-By: Claude Opus 5 (1M context) <noreply@anthropic.com>
</commit_message>
<xml_diff>
--- a/site/en/resume.docx
+++ b/site/en/resume.docx
@@ -89,7 +89,7 @@
             <w:pPr>
               <w:spacing w:after="0" w:before="75" w:line="210"/>
             </w:pPr>
-            <w:hyperlink w:history="1" r:id="rIdmulvtrrx8jsyeyfs12hnd">
+            <w:hyperlink w:history="1" r:id="rId1coevrzxv2z6aklfj_niu">
               <w:r>
                 <w:rPr>
                   <w:color w:val="315CBB"/>
@@ -107,7 +107,7 @@
               </w:rPr>
               <w:t xml:space="preserve">   </w:t>
             </w:r>
-            <w:hyperlink w:history="1" r:id="rId_peobe5lj9skhg0jpkn-g">
+            <w:hyperlink w:history="1" r:id="rIdh0rwvrvzbfs1w3scrj-bk">
               <w:r>
                 <w:rPr>
                   <w:color w:val="315CBB"/>
@@ -125,7 +125,7 @@
               </w:rPr>
               <w:t xml:space="preserve">   </w:t>
             </w:r>
-            <w:hyperlink w:history="1" r:id="rIdxgwqziixpnx0evvgietj-">
+            <w:hyperlink w:history="1" r:id="rId18f6tgw5jok6mlzifenfa">
               <w:r>
                 <w:rPr>
                   <w:color w:val="315CBB"/>
@@ -143,7 +143,7 @@
               </w:rPr>
               <w:t xml:space="preserve">   </w:t>
             </w:r>
-            <w:hyperlink w:history="1" r:id="rIdger1inkfpjohbspkg78fi">
+            <w:hyperlink w:history="1" r:id="rIdshelnceg-der2lcqou7_9">
               <w:r>
                 <w:rPr>
                   <w:color w:val="315CBB"/>
@@ -394,7 +394,7 @@
       <w:pPr>
         <w:spacing w:after="0" w:before="0" w:line="210"/>
       </w:pPr>
-      <w:hyperlink w:history="1" r:id="rId5tkjnvofra2yoxuvylfag">
+      <w:hyperlink w:history="1" r:id="rIdmgmehogm_istogdvtbk0j">
         <w:r>
           <w:rPr>
             <w:color w:val="315CBB"/>
@@ -1299,7 +1299,7 @@
       <w:pPr>
         <w:spacing w:after="0" w:before="75" w:line="210"/>
       </w:pPr>
-      <w:hyperlink w:history="1" r:id="rId2nkyrwsqvrzanngk3bhft">
+      <w:hyperlink w:history="1" r:id="rId3xfvdkbxwq_rcdsffjpmn">
         <w:r>
           <w:rPr>
             <w:color w:val="315CBB"/>
@@ -1317,7 +1317,7 @@
         </w:rPr>
         <w:t xml:space="preserve">   </w:t>
       </w:r>
-      <w:hyperlink w:history="1" r:id="rIdcvu64ykzxhwsdiga596rk">
+      <w:hyperlink w:history="1" r:id="rIdqmavy9bjt-z4oc22dzgqs">
         <w:r>
           <w:rPr>
             <w:color w:val="315CBB"/>
@@ -1335,7 +1335,7 @@
         </w:rPr>
         <w:t xml:space="preserve">   </w:t>
       </w:r>
-      <w:hyperlink w:history="1" r:id="rId7s3uo4ao9fbfxhfcknl3s">
+      <w:hyperlink w:history="1" r:id="rIdzwppvysr_qmqxrv2u-6se">
         <w:r>
           <w:rPr>
             <w:color w:val="315CBB"/>
@@ -1353,7 +1353,7 @@
         </w:rPr>
         <w:t xml:space="preserve">   </w:t>
       </w:r>
-      <w:hyperlink w:history="1" r:id="rIdyrlooc_3mbewef9zz1l4m">
+      <w:hyperlink w:history="1" r:id="rIdyggrmmzrhycn57qcofabn">
         <w:r>
           <w:rPr>
             <w:color w:val="315CBB"/>
@@ -1500,7 +1500,7 @@
       <w:pPr>
         <w:spacing w:after="0" w:before="0" w:line="210"/>
       </w:pPr>
-      <w:hyperlink w:history="1" r:id="rIdkele5poho5y5dctfbfbpm">
+      <w:hyperlink w:history="1" r:id="rId2b_oefmw0b7zqvo6uemvm">
         <w:r>
           <w:rPr>
             <w:color w:val="315CBB"/>
@@ -1952,7 +1952,7 @@
       <w:pPr>
         <w:spacing w:after="0" w:before="75" w:line="210"/>
       </w:pPr>
-      <w:hyperlink w:history="1" r:id="rIdxyhyzprrnoc17-0zkt9rz">
+      <w:hyperlink w:history="1" r:id="rIdhu1izbv5e9kescjmju7gb">
         <w:r>
           <w:rPr>
             <w:color w:val="315CBB"/>
@@ -1970,7 +1970,7 @@
         </w:rPr>
         <w:t xml:space="preserve">   </w:t>
       </w:r>
-      <w:hyperlink w:history="1" r:id="rIdzqdq1wtzeurl2hgyv-dox">
+      <w:hyperlink w:history="1" r:id="rIdmkrj4myixuhqp84e2mko3">
         <w:r>
           <w:rPr>
             <w:color w:val="315CBB"/>
@@ -2356,7 +2356,7 @@
             <w:pPr>
               <w:spacing w:after="0" w:before="75" w:line="210"/>
             </w:pPr>
-            <w:hyperlink w:history="1" r:id="rIdop8hr-g7fvevsjxfjgqoa">
+            <w:hyperlink w:history="1" r:id="rIdbgzmr2f9eu1zwuhihflgv">
               <w:r>
                 <w:rPr>
                   <w:color w:val="315CBB"/>
@@ -2374,7 +2374,7 @@
               </w:rPr>
               <w:t xml:space="preserve">   </w:t>
             </w:r>
-            <w:hyperlink w:history="1" r:id="rIdgw02rzc51t6hhtxdbttnb">
+            <w:hyperlink w:history="1" r:id="rIdhgkbctcvbjqdhhbvts7ll">
               <w:r>
                 <w:rPr>
                   <w:color w:val="315CBB"/>
@@ -2392,7 +2392,7 @@
               </w:rPr>
               <w:t xml:space="preserve">   </w:t>
             </w:r>
-            <w:hyperlink w:history="1" r:id="rIdef-z5g3s5w_gbgmfy8puk">
+            <w:hyperlink w:history="1" r:id="rIdy0kmryszl9tzqzlpvwulh">
               <w:r>
                 <w:rPr>
                   <w:color w:val="315CBB"/>
@@ -2860,7 +2860,7 @@
             <w:pPr>
               <w:spacing w:after="0" w:before="0" w:line="210"/>
             </w:pPr>
-            <w:hyperlink w:history="1" r:id="rIdbp1divl4mnux5_81grufz">
+            <w:hyperlink w:history="1" r:id="rIdvag23wy3rfnzrzdav_laf">
               <w:r>
                 <w:rPr>
                   <w:color w:val="315CBB"/>

</xml_diff>

<commit_message>
Open the 지원동기 with a three-line summary
- Render a block of "- " lines as a list, so the letter can lead with a
  summary before its paragraphs
- Keep the summary to three rendered lines
- Reword the Pilltip paragraph, which repeated the summary's first line
  almost verbatim right beneath it

Co-Authored-By: Claude Opus 5 (1M context) <noreply@anthropic.com>
</commit_message>
<xml_diff>
--- a/site/en/resume.docx
+++ b/site/en/resume.docx
@@ -89,7 +89,7 @@
             <w:pPr>
               <w:spacing w:after="0" w:before="75" w:line="210"/>
             </w:pPr>
-            <w:hyperlink w:history="1" r:id="rId1coevrzxv2z6aklfj_niu">
+            <w:hyperlink w:history="1" r:id="rIdtt9p90kkywwgkcsddugan">
               <w:r>
                 <w:rPr>
                   <w:color w:val="315CBB"/>
@@ -107,7 +107,7 @@
               </w:rPr>
               <w:t xml:space="preserve">   </w:t>
             </w:r>
-            <w:hyperlink w:history="1" r:id="rIdh0rwvrvzbfs1w3scrj-bk">
+            <w:hyperlink w:history="1" r:id="rIdmnlpsrzgezblscicykgs_">
               <w:r>
                 <w:rPr>
                   <w:color w:val="315CBB"/>
@@ -125,7 +125,7 @@
               </w:rPr>
               <w:t xml:space="preserve">   </w:t>
             </w:r>
-            <w:hyperlink w:history="1" r:id="rId18f6tgw5jok6mlzifenfa">
+            <w:hyperlink w:history="1" r:id="rIdyepmx2muikrxd8elxtulh">
               <w:r>
                 <w:rPr>
                   <w:color w:val="315CBB"/>
@@ -143,7 +143,7 @@
               </w:rPr>
               <w:t xml:space="preserve">   </w:t>
             </w:r>
-            <w:hyperlink w:history="1" r:id="rIdshelnceg-der2lcqou7_9">
+            <w:hyperlink w:history="1" r:id="rIdb8c8c4pfoo8coltb_eezs">
               <w:r>
                 <w:rPr>
                   <w:color w:val="315CBB"/>
@@ -394,7 +394,7 @@
       <w:pPr>
         <w:spacing w:after="0" w:before="0" w:line="210"/>
       </w:pPr>
-      <w:hyperlink w:history="1" r:id="rIdmgmehogm_istogdvtbk0j">
+      <w:hyperlink w:history="1" r:id="rId7svjwuckyxnrxlnnvsk_h">
         <w:r>
           <w:rPr>
             <w:color w:val="315CBB"/>
@@ -1299,7 +1299,7 @@
       <w:pPr>
         <w:spacing w:after="0" w:before="75" w:line="210"/>
       </w:pPr>
-      <w:hyperlink w:history="1" r:id="rId3xfvdkbxwq_rcdsffjpmn">
+      <w:hyperlink w:history="1" r:id="rIdmcbld7rqfceb12zydlg-m">
         <w:r>
           <w:rPr>
             <w:color w:val="315CBB"/>
@@ -1317,7 +1317,7 @@
         </w:rPr>
         <w:t xml:space="preserve">   </w:t>
       </w:r>
-      <w:hyperlink w:history="1" r:id="rIdqmavy9bjt-z4oc22dzgqs">
+      <w:hyperlink w:history="1" r:id="rIdo6pvg32lxie2fi0ab4wyk">
         <w:r>
           <w:rPr>
             <w:color w:val="315CBB"/>
@@ -1335,7 +1335,7 @@
         </w:rPr>
         <w:t xml:space="preserve">   </w:t>
       </w:r>
-      <w:hyperlink w:history="1" r:id="rIdzwppvysr_qmqxrv2u-6se">
+      <w:hyperlink w:history="1" r:id="rIdun1m8zhtx9s_ez0jhcv9z">
         <w:r>
           <w:rPr>
             <w:color w:val="315CBB"/>
@@ -1353,7 +1353,7 @@
         </w:rPr>
         <w:t xml:space="preserve">   </w:t>
       </w:r>
-      <w:hyperlink w:history="1" r:id="rIdyggrmmzrhycn57qcofabn">
+      <w:hyperlink w:history="1" r:id="rId4ov_kk-sdf2pmq5twsljd">
         <w:r>
           <w:rPr>
             <w:color w:val="315CBB"/>
@@ -1500,7 +1500,7 @@
       <w:pPr>
         <w:spacing w:after="0" w:before="0" w:line="210"/>
       </w:pPr>
-      <w:hyperlink w:history="1" r:id="rId2b_oefmw0b7zqvo6uemvm">
+      <w:hyperlink w:history="1" r:id="rIdbu0lcakq2sbfmlb4nazcl">
         <w:r>
           <w:rPr>
             <w:color w:val="315CBB"/>
@@ -1952,7 +1952,7 @@
       <w:pPr>
         <w:spacing w:after="0" w:before="75" w:line="210"/>
       </w:pPr>
-      <w:hyperlink w:history="1" r:id="rIdhu1izbv5e9kescjmju7gb">
+      <w:hyperlink w:history="1" r:id="rIdjy5sbasmjscitmexpl7zi">
         <w:r>
           <w:rPr>
             <w:color w:val="315CBB"/>
@@ -1970,7 +1970,7 @@
         </w:rPr>
         <w:t xml:space="preserve">   </w:t>
       </w:r>
-      <w:hyperlink w:history="1" r:id="rIdmkrj4myixuhqp84e2mko3">
+      <w:hyperlink w:history="1" r:id="rIdc5l1gmkpjdxacni42prbo">
         <w:r>
           <w:rPr>
             <w:color w:val="315CBB"/>
@@ -2356,7 +2356,7 @@
             <w:pPr>
               <w:spacing w:after="0" w:before="75" w:line="210"/>
             </w:pPr>
-            <w:hyperlink w:history="1" r:id="rIdbgzmr2f9eu1zwuhihflgv">
+            <w:hyperlink w:history="1" r:id="rIdjmh9e1wq9ykkcrg0lsslo">
               <w:r>
                 <w:rPr>
                   <w:color w:val="315CBB"/>
@@ -2374,7 +2374,7 @@
               </w:rPr>
               <w:t xml:space="preserve">   </w:t>
             </w:r>
-            <w:hyperlink w:history="1" r:id="rIdhgkbctcvbjqdhhbvts7ll">
+            <w:hyperlink w:history="1" r:id="rIdgdaglwskwqmqkryztitd8">
               <w:r>
                 <w:rPr>
                   <w:color w:val="315CBB"/>
@@ -2392,7 +2392,7 @@
               </w:rPr>
               <w:t xml:space="preserve">   </w:t>
             </w:r>
-            <w:hyperlink w:history="1" r:id="rIdy0kmryszl9tzqzlpvwulh">
+            <w:hyperlink w:history="1" r:id="rIdy0cf_ikwen5iwzm_lktde">
               <w:r>
                 <w:rPr>
                   <w:color w:val="315CBB"/>
@@ -2860,7 +2860,7 @@
             <w:pPr>
               <w:spacing w:after="0" w:before="0" w:line="210"/>
             </w:pPr>
-            <w:hyperlink w:history="1" r:id="rIdvag23wy3rfnzrzdav_laf">
+            <w:hyperlink w:history="1" r:id="rId1tmxjliqgxrkx6j72t9u2">
               <w:r>
                 <w:rPr>
                   <w:color w:val="315CBB"/>

</xml_diff>

<commit_message>
Keep the 지원동기 résumé to three pages
The letter is now just its three-line summary, but the résumé already filled
three pages, so any added section spilled onto a fourth.

- Cut the letter to the summary alone
- Add RESUME_EXTRA_CSS so a local build can tighten print spacing; the
  cover-letter build shrinks evidence thumbnails and section gaps to absorb
  the letter without cutting any content
- Leave the public résumé untouched: it stays three pages with no letter

Co-Authored-By: Claude Opus 5 (1M context) <noreply@anthropic.com>
</commit_message>
<xml_diff>
--- a/site/en/resume.docx
+++ b/site/en/resume.docx
@@ -89,7 +89,7 @@
             <w:pPr>
               <w:spacing w:after="0" w:before="75" w:line="210"/>
             </w:pPr>
-            <w:hyperlink w:history="1" r:id="rIdtt9p90kkywwgkcsddugan">
+            <w:hyperlink w:history="1" r:id="rIdz8obvd50vfgzcxqhxfvgj">
               <w:r>
                 <w:rPr>
                   <w:color w:val="315CBB"/>
@@ -107,7 +107,7 @@
               </w:rPr>
               <w:t xml:space="preserve">   </w:t>
             </w:r>
-            <w:hyperlink w:history="1" r:id="rIdmnlpsrzgezblscicykgs_">
+            <w:hyperlink w:history="1" r:id="rIdet_zj8jo1pkgprgoh-mg-">
               <w:r>
                 <w:rPr>
                   <w:color w:val="315CBB"/>
@@ -125,7 +125,7 @@
               </w:rPr>
               <w:t xml:space="preserve">   </w:t>
             </w:r>
-            <w:hyperlink w:history="1" r:id="rIdyepmx2muikrxd8elxtulh">
+            <w:hyperlink w:history="1" r:id="rIdp_qycncsrkmckkisvfnoy">
               <w:r>
                 <w:rPr>
                   <w:color w:val="315CBB"/>
@@ -143,7 +143,7 @@
               </w:rPr>
               <w:t xml:space="preserve">   </w:t>
             </w:r>
-            <w:hyperlink w:history="1" r:id="rIdb8c8c4pfoo8coltb_eezs">
+            <w:hyperlink w:history="1" r:id="rIdqjcmcipu2ocge9ugg8r2u">
               <w:r>
                 <w:rPr>
                   <w:color w:val="315CBB"/>
@@ -394,7 +394,7 @@
       <w:pPr>
         <w:spacing w:after="0" w:before="0" w:line="210"/>
       </w:pPr>
-      <w:hyperlink w:history="1" r:id="rId7svjwuckyxnrxlnnvsk_h">
+      <w:hyperlink w:history="1" r:id="rIdffnkgk8ussghjzlskvdyv">
         <w:r>
           <w:rPr>
             <w:color w:val="315CBB"/>
@@ -1299,7 +1299,7 @@
       <w:pPr>
         <w:spacing w:after="0" w:before="75" w:line="210"/>
       </w:pPr>
-      <w:hyperlink w:history="1" r:id="rIdmcbld7rqfceb12zydlg-m">
+      <w:hyperlink w:history="1" r:id="rIdusgmgauzn25gkcrzuaz-5">
         <w:r>
           <w:rPr>
             <w:color w:val="315CBB"/>
@@ -1317,7 +1317,7 @@
         </w:rPr>
         <w:t xml:space="preserve">   </w:t>
       </w:r>
-      <w:hyperlink w:history="1" r:id="rIdo6pvg32lxie2fi0ab4wyk">
+      <w:hyperlink w:history="1" r:id="rIdgah9ynkivldiafor6f4xp">
         <w:r>
           <w:rPr>
             <w:color w:val="315CBB"/>
@@ -1335,7 +1335,7 @@
         </w:rPr>
         <w:t xml:space="preserve">   </w:t>
       </w:r>
-      <w:hyperlink w:history="1" r:id="rIdun1m8zhtx9s_ez0jhcv9z">
+      <w:hyperlink w:history="1" r:id="rIdze2ntnkicrzattmm5n_j_">
         <w:r>
           <w:rPr>
             <w:color w:val="315CBB"/>
@@ -1353,7 +1353,7 @@
         </w:rPr>
         <w:t xml:space="preserve">   </w:t>
       </w:r>
-      <w:hyperlink w:history="1" r:id="rId4ov_kk-sdf2pmq5twsljd">
+      <w:hyperlink w:history="1" r:id="rIdgkxodqvqwm6iy_pcc1yjq">
         <w:r>
           <w:rPr>
             <w:color w:val="315CBB"/>
@@ -1500,7 +1500,7 @@
       <w:pPr>
         <w:spacing w:after="0" w:before="0" w:line="210"/>
       </w:pPr>
-      <w:hyperlink w:history="1" r:id="rIdbu0lcakq2sbfmlb4nazcl">
+      <w:hyperlink w:history="1" r:id="rId544egnx-qjnml5tlzdtpl">
         <w:r>
           <w:rPr>
             <w:color w:val="315CBB"/>
@@ -1952,7 +1952,7 @@
       <w:pPr>
         <w:spacing w:after="0" w:before="75" w:line="210"/>
       </w:pPr>
-      <w:hyperlink w:history="1" r:id="rIdjy5sbasmjscitmexpl7zi">
+      <w:hyperlink w:history="1" r:id="rIdgcnlb2xyhhjbl4nipzwtx">
         <w:r>
           <w:rPr>
             <w:color w:val="315CBB"/>
@@ -1970,7 +1970,7 @@
         </w:rPr>
         <w:t xml:space="preserve">   </w:t>
       </w:r>
-      <w:hyperlink w:history="1" r:id="rIdc5l1gmkpjdxacni42prbo">
+      <w:hyperlink w:history="1" r:id="rIdnyfjukrwjh9c-lnpuabt7">
         <w:r>
           <w:rPr>
             <w:color w:val="315CBB"/>
@@ -2356,7 +2356,7 @@
             <w:pPr>
               <w:spacing w:after="0" w:before="75" w:line="210"/>
             </w:pPr>
-            <w:hyperlink w:history="1" r:id="rIdjmh9e1wq9ykkcrg0lsslo">
+            <w:hyperlink w:history="1" r:id="rId5wj2dcclqybpvewvgcs40">
               <w:r>
                 <w:rPr>
                   <w:color w:val="315CBB"/>
@@ -2374,7 +2374,7 @@
               </w:rPr>
               <w:t xml:space="preserve">   </w:t>
             </w:r>
-            <w:hyperlink w:history="1" r:id="rIdgdaglwskwqmqkryztitd8">
+            <w:hyperlink w:history="1" r:id="rIdit7w3hnjjekon9821pz1v">
               <w:r>
                 <w:rPr>
                   <w:color w:val="315CBB"/>
@@ -2392,7 +2392,7 @@
               </w:rPr>
               <w:t xml:space="preserve">   </w:t>
             </w:r>
-            <w:hyperlink w:history="1" r:id="rIdy0cf_ikwen5iwzm_lktde">
+            <w:hyperlink w:history="1" r:id="rId2iqbklxpbfabw4xyr6co9">
               <w:r>
                 <w:rPr>
                   <w:color w:val="315CBB"/>
@@ -2860,7 +2860,7 @@
             <w:pPr>
               <w:spacing w:after="0" w:before="0" w:line="210"/>
             </w:pPr>
-            <w:hyperlink w:history="1" r:id="rId1tmxjliqgxrkx6j72t9u2">
+            <w:hyperlink w:history="1" r:id="rIdwmvqaqv5b7dq6braq8n5f">
               <w:r>
                 <w:rPr>
                   <w:color w:val="315CBB"/>

</xml_diff>

<commit_message>
Write the 지원동기 as prose rather than bullets
</commit_message>
<xml_diff>
--- a/site/en/resume.docx
+++ b/site/en/resume.docx
@@ -89,7 +89,7 @@
             <w:pPr>
               <w:spacing w:after="0" w:before="75" w:line="210"/>
             </w:pPr>
-            <w:hyperlink w:history="1" r:id="rIdz8obvd50vfgzcxqhxfvgj">
+            <w:hyperlink w:history="1" r:id="rIdbaeswzof66qtgq4tevtzb">
               <w:r>
                 <w:rPr>
                   <w:color w:val="315CBB"/>
@@ -107,7 +107,7 @@
               </w:rPr>
               <w:t xml:space="preserve">   </w:t>
             </w:r>
-            <w:hyperlink w:history="1" r:id="rIdet_zj8jo1pkgprgoh-mg-">
+            <w:hyperlink w:history="1" r:id="rIdys7mpn9fl3qrpyjkewsjb">
               <w:r>
                 <w:rPr>
                   <w:color w:val="315CBB"/>
@@ -125,7 +125,7 @@
               </w:rPr>
               <w:t xml:space="preserve">   </w:t>
             </w:r>
-            <w:hyperlink w:history="1" r:id="rIdp_qycncsrkmckkisvfnoy">
+            <w:hyperlink w:history="1" r:id="rIdxdvuijhhpodemhr0rss2d">
               <w:r>
                 <w:rPr>
                   <w:color w:val="315CBB"/>
@@ -143,7 +143,7 @@
               </w:rPr>
               <w:t xml:space="preserve">   </w:t>
             </w:r>
-            <w:hyperlink w:history="1" r:id="rIdqjcmcipu2ocge9ugg8r2u">
+            <w:hyperlink w:history="1" r:id="rIdzf4jk-owinyvkllgi4-xz">
               <w:r>
                 <w:rPr>
                   <w:color w:val="315CBB"/>
@@ -394,7 +394,7 @@
       <w:pPr>
         <w:spacing w:after="0" w:before="0" w:line="210"/>
       </w:pPr>
-      <w:hyperlink w:history="1" r:id="rIdffnkgk8ussghjzlskvdyv">
+      <w:hyperlink w:history="1" r:id="rIdw8qd71ukhil6mcbtpmw6d">
         <w:r>
           <w:rPr>
             <w:color w:val="315CBB"/>
@@ -1299,7 +1299,7 @@
       <w:pPr>
         <w:spacing w:after="0" w:before="75" w:line="210"/>
       </w:pPr>
-      <w:hyperlink w:history="1" r:id="rIdusgmgauzn25gkcrzuaz-5">
+      <w:hyperlink w:history="1" r:id="rIdaztlcuadf2qdisacbc50m">
         <w:r>
           <w:rPr>
             <w:color w:val="315CBB"/>
@@ -1317,7 +1317,7 @@
         </w:rPr>
         <w:t xml:space="preserve">   </w:t>
       </w:r>
-      <w:hyperlink w:history="1" r:id="rIdgah9ynkivldiafor6f4xp">
+      <w:hyperlink w:history="1" r:id="rIdki_h7dsvnjlkh5-m3axw8">
         <w:r>
           <w:rPr>
             <w:color w:val="315CBB"/>
@@ -1335,7 +1335,7 @@
         </w:rPr>
         <w:t xml:space="preserve">   </w:t>
       </w:r>
-      <w:hyperlink w:history="1" r:id="rIdze2ntnkicrzattmm5n_j_">
+      <w:hyperlink w:history="1" r:id="rIdlzmajwip50e2jl_fbfy88">
         <w:r>
           <w:rPr>
             <w:color w:val="315CBB"/>
@@ -1353,7 +1353,7 @@
         </w:rPr>
         <w:t xml:space="preserve">   </w:t>
       </w:r>
-      <w:hyperlink w:history="1" r:id="rIdgkxodqvqwm6iy_pcc1yjq">
+      <w:hyperlink w:history="1" r:id="rId1_nxqosjbvro7devlu3ov">
         <w:r>
           <w:rPr>
             <w:color w:val="315CBB"/>
@@ -1500,7 +1500,7 @@
       <w:pPr>
         <w:spacing w:after="0" w:before="0" w:line="210"/>
       </w:pPr>
-      <w:hyperlink w:history="1" r:id="rId544egnx-qjnml5tlzdtpl">
+      <w:hyperlink w:history="1" r:id="rIdmuyukwgjwwni4mywzgwac">
         <w:r>
           <w:rPr>
             <w:color w:val="315CBB"/>
@@ -1952,7 +1952,7 @@
       <w:pPr>
         <w:spacing w:after="0" w:before="75" w:line="210"/>
       </w:pPr>
-      <w:hyperlink w:history="1" r:id="rIdgcnlb2xyhhjbl4nipzwtx">
+      <w:hyperlink w:history="1" r:id="rIdrgocu37knytcgbxgfdu4-">
         <w:r>
           <w:rPr>
             <w:color w:val="315CBB"/>
@@ -1970,7 +1970,7 @@
         </w:rPr>
         <w:t xml:space="preserve">   </w:t>
       </w:r>
-      <w:hyperlink w:history="1" r:id="rIdnyfjukrwjh9c-lnpuabt7">
+      <w:hyperlink w:history="1" r:id="rIde0o13kdtvwzrzgx0wgjeo">
         <w:r>
           <w:rPr>
             <w:color w:val="315CBB"/>
@@ -2356,7 +2356,7 @@
             <w:pPr>
               <w:spacing w:after="0" w:before="75" w:line="210"/>
             </w:pPr>
-            <w:hyperlink w:history="1" r:id="rId5wj2dcclqybpvewvgcs40">
+            <w:hyperlink w:history="1" r:id="rId4ltmpqiilzb5uqjw486ji">
               <w:r>
                 <w:rPr>
                   <w:color w:val="315CBB"/>
@@ -2374,7 +2374,7 @@
               </w:rPr>
               <w:t xml:space="preserve">   </w:t>
             </w:r>
-            <w:hyperlink w:history="1" r:id="rIdit7w3hnjjekon9821pz1v">
+            <w:hyperlink w:history="1" r:id="rId2c49mnvpo2fgeu61-jkqr">
               <w:r>
                 <w:rPr>
                   <w:color w:val="315CBB"/>
@@ -2392,7 +2392,7 @@
               </w:rPr>
               <w:t xml:space="preserve">   </w:t>
             </w:r>
-            <w:hyperlink w:history="1" r:id="rId2iqbklxpbfabw4xyr6co9">
+            <w:hyperlink w:history="1" r:id="rId0cc35t8gjb8iqnmgqhbu5">
               <w:r>
                 <w:rPr>
                   <w:color w:val="315CBB"/>
@@ -2860,7 +2860,7 @@
             <w:pPr>
               <w:spacing w:after="0" w:before="0" w:line="210"/>
             </w:pPr>
-            <w:hyperlink w:history="1" r:id="rIdwmvqaqv5b7dq6braq8n5f">
+            <w:hyperlink w:history="1" r:id="rIdqx1evasruhnotfucwkbko">
               <w:r>
                 <w:rPr>
                   <w:color w:val="315CBB"/>

</xml_diff>

<commit_message>
Fill the 지원동기 to two even lines and report how it wrapped
The letter ran to a third line holding a few characters, then to a second
line only 43% full, because nothing measured the wrapping.

- Report rendered line count and trailing-line fill after each build, read
  from the print HTML the PDF builder leaves behind
- Size the letter to fill two lines at 93%

Co-Authored-By: Claude Opus 5 (1M context) <noreply@anthropic.com>
</commit_message>
<xml_diff>
--- a/site/en/resume.docx
+++ b/site/en/resume.docx
@@ -89,7 +89,7 @@
             <w:pPr>
               <w:spacing w:after="0" w:before="75" w:line="210"/>
             </w:pPr>
-            <w:hyperlink w:history="1" r:id="rIdbaeswzof66qtgq4tevtzb">
+            <w:hyperlink w:history="1" r:id="rIdpswe2x7jzuukorokizpfo">
               <w:r>
                 <w:rPr>
                   <w:color w:val="315CBB"/>
@@ -107,7 +107,7 @@
               </w:rPr>
               <w:t xml:space="preserve">   </w:t>
             </w:r>
-            <w:hyperlink w:history="1" r:id="rIdys7mpn9fl3qrpyjkewsjb">
+            <w:hyperlink w:history="1" r:id="rId0sqn4sgss2huc1iip8bah">
               <w:r>
                 <w:rPr>
                   <w:color w:val="315CBB"/>
@@ -125,7 +125,7 @@
               </w:rPr>
               <w:t xml:space="preserve">   </w:t>
             </w:r>
-            <w:hyperlink w:history="1" r:id="rIdxdvuijhhpodemhr0rss2d">
+            <w:hyperlink w:history="1" r:id="rIduycbxyqif3dr06gqcmdmp">
               <w:r>
                 <w:rPr>
                   <w:color w:val="315CBB"/>
@@ -143,7 +143,7 @@
               </w:rPr>
               <w:t xml:space="preserve">   </w:t>
             </w:r>
-            <w:hyperlink w:history="1" r:id="rIdzf4jk-owinyvkllgi4-xz">
+            <w:hyperlink w:history="1" r:id="rId4coaq9q5k479vkc8cn3iy">
               <w:r>
                 <w:rPr>
                   <w:color w:val="315CBB"/>
@@ -394,7 +394,7 @@
       <w:pPr>
         <w:spacing w:after="0" w:before="0" w:line="210"/>
       </w:pPr>
-      <w:hyperlink w:history="1" r:id="rIdw8qd71ukhil6mcbtpmw6d">
+      <w:hyperlink w:history="1" r:id="rIdfyr0cdb4k3zulcb2sjeiu">
         <w:r>
           <w:rPr>
             <w:color w:val="315CBB"/>
@@ -1299,7 +1299,7 @@
       <w:pPr>
         <w:spacing w:after="0" w:before="75" w:line="210"/>
       </w:pPr>
-      <w:hyperlink w:history="1" r:id="rIdaztlcuadf2qdisacbc50m">
+      <w:hyperlink w:history="1" r:id="rId8ff1dbbv9esgn0psbiwow">
         <w:r>
           <w:rPr>
             <w:color w:val="315CBB"/>
@@ -1317,7 +1317,7 @@
         </w:rPr>
         <w:t xml:space="preserve">   </w:t>
       </w:r>
-      <w:hyperlink w:history="1" r:id="rIdki_h7dsvnjlkh5-m3axw8">
+      <w:hyperlink w:history="1" r:id="rIdleiiafnwuqbpquamjuemg">
         <w:r>
           <w:rPr>
             <w:color w:val="315CBB"/>
@@ -1335,7 +1335,7 @@
         </w:rPr>
         <w:t xml:space="preserve">   </w:t>
       </w:r>
-      <w:hyperlink w:history="1" r:id="rIdlzmajwip50e2jl_fbfy88">
+      <w:hyperlink w:history="1" r:id="rId88pbdnpb-xl9zefaapkik">
         <w:r>
           <w:rPr>
             <w:color w:val="315CBB"/>
@@ -1353,7 +1353,7 @@
         </w:rPr>
         <w:t xml:space="preserve">   </w:t>
       </w:r>
-      <w:hyperlink w:history="1" r:id="rId1_nxqosjbvro7devlu3ov">
+      <w:hyperlink w:history="1" r:id="rIdlogd2rzgg4btv7utzqqyg">
         <w:r>
           <w:rPr>
             <w:color w:val="315CBB"/>
@@ -1500,7 +1500,7 @@
       <w:pPr>
         <w:spacing w:after="0" w:before="0" w:line="210"/>
       </w:pPr>
-      <w:hyperlink w:history="1" r:id="rIdmuyukwgjwwni4mywzgwac">
+      <w:hyperlink w:history="1" r:id="rId_tovpvxevtpmqy34ae7nu">
         <w:r>
           <w:rPr>
             <w:color w:val="315CBB"/>
@@ -1952,7 +1952,7 @@
       <w:pPr>
         <w:spacing w:after="0" w:before="75" w:line="210"/>
       </w:pPr>
-      <w:hyperlink w:history="1" r:id="rIdrgocu37knytcgbxgfdu4-">
+      <w:hyperlink w:history="1" r:id="rIdsxiloxkycve2yq3e4jlau">
         <w:r>
           <w:rPr>
             <w:color w:val="315CBB"/>
@@ -1970,7 +1970,7 @@
         </w:rPr>
         <w:t xml:space="preserve">   </w:t>
       </w:r>
-      <w:hyperlink w:history="1" r:id="rIde0o13kdtvwzrzgx0wgjeo">
+      <w:hyperlink w:history="1" r:id="rIdmlwdq7vka7otwmtiysx6f">
         <w:r>
           <w:rPr>
             <w:color w:val="315CBB"/>
@@ -2356,7 +2356,7 @@
             <w:pPr>
               <w:spacing w:after="0" w:before="75" w:line="210"/>
             </w:pPr>
-            <w:hyperlink w:history="1" r:id="rId4ltmpqiilzb5uqjw486ji">
+            <w:hyperlink w:history="1" r:id="rIdhufc8k7wilsdm5qpcb8l6">
               <w:r>
                 <w:rPr>
                   <w:color w:val="315CBB"/>
@@ -2374,7 +2374,7 @@
               </w:rPr>
               <w:t xml:space="preserve">   </w:t>
             </w:r>
-            <w:hyperlink w:history="1" r:id="rId2c49mnvpo2fgeu61-jkqr">
+            <w:hyperlink w:history="1" r:id="rId4ln836kbecaehgcwubpna">
               <w:r>
                 <w:rPr>
                   <w:color w:val="315CBB"/>
@@ -2392,7 +2392,7 @@
               </w:rPr>
               <w:t xml:space="preserve">   </w:t>
             </w:r>
-            <w:hyperlink w:history="1" r:id="rId0cc35t8gjb8iqnmgqhbu5">
+            <w:hyperlink w:history="1" r:id="rIdeyjkfhzkzitkeldqsg24b">
               <w:r>
                 <w:rPr>
                   <w:color w:val="315CBB"/>
@@ -2860,7 +2860,7 @@
             <w:pPr>
               <w:spacing w:after="0" w:before="0" w:line="210"/>
             </w:pPr>
-            <w:hyperlink w:history="1" r:id="rIdqx1evasruhnotfucwkbko">
+            <w:hyperlink w:history="1" r:id="rId8nridraykc7oflqodcmit">
               <w:r>
                 <w:rPr>
                   <w:color w:val="315CBB"/>

</xml_diff>

<commit_message>
Point readers at the three cases that matter first
Seven cases over 39 pages are not read front to back; the question is
whether a reader finds the one case they came for.

- Add a reading-order line to the contents, in the sidebar and on the PDF
  contents page, sourced from one value
- Record which cases are core and which overlap, so a later trim starts
  with the data-pipeline pair rather than the lead cases

Co-Authored-By: Claude Opus 5 (1M context) <noreply@anthropic.com>
</commit_message>
<xml_diff>
--- a/site/en/resume.docx
+++ b/site/en/resume.docx
@@ -89,7 +89,7 @@
             <w:pPr>
               <w:spacing w:after="0" w:before="75" w:line="210"/>
             </w:pPr>
-            <w:hyperlink w:history="1" r:id="rIdpswe2x7jzuukorokizpfo">
+            <w:hyperlink w:history="1" r:id="rId8ubbqzjk8_nloesloisdm">
               <w:r>
                 <w:rPr>
                   <w:color w:val="315CBB"/>
@@ -107,7 +107,7 @@
               </w:rPr>
               <w:t xml:space="preserve">   </w:t>
             </w:r>
-            <w:hyperlink w:history="1" r:id="rId0sqn4sgss2huc1iip8bah">
+            <w:hyperlink w:history="1" r:id="rIdbgou0ny2huqitxv3murfn">
               <w:r>
                 <w:rPr>
                   <w:color w:val="315CBB"/>
@@ -125,7 +125,7 @@
               </w:rPr>
               <w:t xml:space="preserve">   </w:t>
             </w:r>
-            <w:hyperlink w:history="1" r:id="rIduycbxyqif3dr06gqcmdmp">
+            <w:hyperlink w:history="1" r:id="rIdlyi_wxjl2uhdovibjrgpb">
               <w:r>
                 <w:rPr>
                   <w:color w:val="315CBB"/>
@@ -143,7 +143,7 @@
               </w:rPr>
               <w:t xml:space="preserve">   </w:t>
             </w:r>
-            <w:hyperlink w:history="1" r:id="rId4coaq9q5k479vkc8cn3iy">
+            <w:hyperlink w:history="1" r:id="rIdymrcoqweprg8ngrg341q6">
               <w:r>
                 <w:rPr>
                   <w:color w:val="315CBB"/>
@@ -394,7 +394,7 @@
       <w:pPr>
         <w:spacing w:after="0" w:before="0" w:line="210"/>
       </w:pPr>
-      <w:hyperlink w:history="1" r:id="rIdfyr0cdb4k3zulcb2sjeiu">
+      <w:hyperlink w:history="1" r:id="rIdclzwj3jow8xovpewpfuti">
         <w:r>
           <w:rPr>
             <w:color w:val="315CBB"/>
@@ -1299,7 +1299,7 @@
       <w:pPr>
         <w:spacing w:after="0" w:before="75" w:line="210"/>
       </w:pPr>
-      <w:hyperlink w:history="1" r:id="rId8ff1dbbv9esgn0psbiwow">
+      <w:hyperlink w:history="1" r:id="rIdqrbbdiroztd2xm29hpo4k">
         <w:r>
           <w:rPr>
             <w:color w:val="315CBB"/>
@@ -1317,7 +1317,7 @@
         </w:rPr>
         <w:t xml:space="preserve">   </w:t>
       </w:r>
-      <w:hyperlink w:history="1" r:id="rIdleiiafnwuqbpquamjuemg">
+      <w:hyperlink w:history="1" r:id="rIdutxsrg_w2ygm5zjbun57q">
         <w:r>
           <w:rPr>
             <w:color w:val="315CBB"/>
@@ -1335,7 +1335,7 @@
         </w:rPr>
         <w:t xml:space="preserve">   </w:t>
       </w:r>
-      <w:hyperlink w:history="1" r:id="rId88pbdnpb-xl9zefaapkik">
+      <w:hyperlink w:history="1" r:id="rIdbxdxxrqivjilktfjruwhg">
         <w:r>
           <w:rPr>
             <w:color w:val="315CBB"/>
@@ -1353,7 +1353,7 @@
         </w:rPr>
         <w:t xml:space="preserve">   </w:t>
       </w:r>
-      <w:hyperlink w:history="1" r:id="rIdlogd2rzgg4btv7utzqqyg">
+      <w:hyperlink w:history="1" r:id="rIdfxzikf5cy2qv3z3wos5-l">
         <w:r>
           <w:rPr>
             <w:color w:val="315CBB"/>
@@ -1500,7 +1500,7 @@
       <w:pPr>
         <w:spacing w:after="0" w:before="0" w:line="210"/>
       </w:pPr>
-      <w:hyperlink w:history="1" r:id="rId_tovpvxevtpmqy34ae7nu">
+      <w:hyperlink w:history="1" r:id="rIdbmzweod6wysmhckpv1kyw">
         <w:r>
           <w:rPr>
             <w:color w:val="315CBB"/>
@@ -1952,7 +1952,7 @@
       <w:pPr>
         <w:spacing w:after="0" w:before="75" w:line="210"/>
       </w:pPr>
-      <w:hyperlink w:history="1" r:id="rIdsxiloxkycve2yq3e4jlau">
+      <w:hyperlink w:history="1" r:id="rIdli-6yupuzzyblnqtppeb9">
         <w:r>
           <w:rPr>
             <w:color w:val="315CBB"/>
@@ -1970,7 +1970,7 @@
         </w:rPr>
         <w:t xml:space="preserve">   </w:t>
       </w:r>
-      <w:hyperlink w:history="1" r:id="rIdmlwdq7vka7otwmtiysx6f">
+      <w:hyperlink w:history="1" r:id="rIdubbp0rjv_wfjmmaq1zphx">
         <w:r>
           <w:rPr>
             <w:color w:val="315CBB"/>
@@ -2356,7 +2356,7 @@
             <w:pPr>
               <w:spacing w:after="0" w:before="75" w:line="210"/>
             </w:pPr>
-            <w:hyperlink w:history="1" r:id="rIdhufc8k7wilsdm5qpcb8l6">
+            <w:hyperlink w:history="1" r:id="rId3e6ajb57su6hr3n4eedk1">
               <w:r>
                 <w:rPr>
                   <w:color w:val="315CBB"/>
@@ -2374,7 +2374,7 @@
               </w:rPr>
               <w:t xml:space="preserve">   </w:t>
             </w:r>
-            <w:hyperlink w:history="1" r:id="rId4ln836kbecaehgcwubpna">
+            <w:hyperlink w:history="1" r:id="rIdh2btrq2wgabwzy0vh2ro9">
               <w:r>
                 <w:rPr>
                   <w:color w:val="315CBB"/>
@@ -2392,7 +2392,7 @@
               </w:rPr>
               <w:t xml:space="preserve">   </w:t>
             </w:r>
-            <w:hyperlink w:history="1" r:id="rIdeyjkfhzkzitkeldqsg24b">
+            <w:hyperlink w:history="1" r:id="rIdsdasdufmeiti5lqk8re_t">
               <w:r>
                 <w:rPr>
                   <w:color w:val="315CBB"/>
@@ -2860,7 +2860,7 @@
             <w:pPr>
               <w:spacing w:after="0" w:before="0" w:line="210"/>
             </w:pPr>
-            <w:hyperlink w:history="1" r:id="rId8nridraykc7oflqodcmit">
+            <w:hyperlink w:history="1" r:id="rId7aszo2ftjlatrqir04kbj">
               <w:r>
                 <w:rPr>
                   <w:color w:val="315CBB"/>

</xml_diff>

<commit_message>
Make the portfolio cover name the cases the contents recommends
The cover led with data pipelines while the contents pointed at case 03, so
the two surfaces recommended different reading.

- Put task cancellation and recovery third on the cover, matching 01·02·03
- Keep data pipelines third in the résumé summary, where the conversion and
  cost figures do more work, and record why the two differ

Co-Authored-By: Claude Opus 5 (1M context) <noreply@anthropic.com>
</commit_message>
<xml_diff>
--- a/site/en/resume.docx
+++ b/site/en/resume.docx
@@ -89,7 +89,7 @@
             <w:pPr>
               <w:spacing w:after="0" w:before="75" w:line="210"/>
             </w:pPr>
-            <w:hyperlink w:history="1" r:id="rId8ubbqzjk8_nloesloisdm">
+            <w:hyperlink w:history="1" r:id="rIdf0talyanbdkvpw17yn-33">
               <w:r>
                 <w:rPr>
                   <w:color w:val="315CBB"/>
@@ -107,7 +107,7 @@
               </w:rPr>
               <w:t xml:space="preserve">   </w:t>
             </w:r>
-            <w:hyperlink w:history="1" r:id="rIdbgou0ny2huqitxv3murfn">
+            <w:hyperlink w:history="1" r:id="rIdz8o-mddtde0pyerqiqsux">
               <w:r>
                 <w:rPr>
                   <w:color w:val="315CBB"/>
@@ -125,7 +125,7 @@
               </w:rPr>
               <w:t xml:space="preserve">   </w:t>
             </w:r>
-            <w:hyperlink w:history="1" r:id="rIdlyi_wxjl2uhdovibjrgpb">
+            <w:hyperlink w:history="1" r:id="rId1cbtdixzv6fijxu-cb4m3">
               <w:r>
                 <w:rPr>
                   <w:color w:val="315CBB"/>
@@ -143,7 +143,7 @@
               </w:rPr>
               <w:t xml:space="preserve">   </w:t>
             </w:r>
-            <w:hyperlink w:history="1" r:id="rIdymrcoqweprg8ngrg341q6">
+            <w:hyperlink w:history="1" r:id="rIdcuko-d3psazix0gy5kbvz">
               <w:r>
                 <w:rPr>
                   <w:color w:val="315CBB"/>
@@ -394,7 +394,7 @@
       <w:pPr>
         <w:spacing w:after="0" w:before="0" w:line="210"/>
       </w:pPr>
-      <w:hyperlink w:history="1" r:id="rIdclzwj3jow8xovpewpfuti">
+      <w:hyperlink w:history="1" r:id="rIdezzdm3lyxlstiihpokks2">
         <w:r>
           <w:rPr>
             <w:color w:val="315CBB"/>
@@ -1299,7 +1299,7 @@
       <w:pPr>
         <w:spacing w:after="0" w:before="75" w:line="210"/>
       </w:pPr>
-      <w:hyperlink w:history="1" r:id="rIdqrbbdiroztd2xm29hpo4k">
+      <w:hyperlink w:history="1" r:id="rIdqze5spz3cyutpdnvr-khk">
         <w:r>
           <w:rPr>
             <w:color w:val="315CBB"/>
@@ -1317,7 +1317,7 @@
         </w:rPr>
         <w:t xml:space="preserve">   </w:t>
       </w:r>
-      <w:hyperlink w:history="1" r:id="rIdutxsrg_w2ygm5zjbun57q">
+      <w:hyperlink w:history="1" r:id="rIdf6mgurcdn2a5sai8ks9gm">
         <w:r>
           <w:rPr>
             <w:color w:val="315CBB"/>
@@ -1335,7 +1335,7 @@
         </w:rPr>
         <w:t xml:space="preserve">   </w:t>
       </w:r>
-      <w:hyperlink w:history="1" r:id="rIdbxdxxrqivjilktfjruwhg">
+      <w:hyperlink w:history="1" r:id="rIdskaekbwup-7cdwt01xijq">
         <w:r>
           <w:rPr>
             <w:color w:val="315CBB"/>
@@ -1353,7 +1353,7 @@
         </w:rPr>
         <w:t xml:space="preserve">   </w:t>
       </w:r>
-      <w:hyperlink w:history="1" r:id="rIdfxzikf5cy2qv3z3wos5-l">
+      <w:hyperlink w:history="1" r:id="rId4p9wf-py1rvdfn6opktkr">
         <w:r>
           <w:rPr>
             <w:color w:val="315CBB"/>
@@ -1500,7 +1500,7 @@
       <w:pPr>
         <w:spacing w:after="0" w:before="0" w:line="210"/>
       </w:pPr>
-      <w:hyperlink w:history="1" r:id="rIdbmzweod6wysmhckpv1kyw">
+      <w:hyperlink w:history="1" r:id="rIdxd6n7hgwxrbaukvvxa3dz">
         <w:r>
           <w:rPr>
             <w:color w:val="315CBB"/>
@@ -1952,7 +1952,7 @@
       <w:pPr>
         <w:spacing w:after="0" w:before="75" w:line="210"/>
       </w:pPr>
-      <w:hyperlink w:history="1" r:id="rIdli-6yupuzzyblnqtppeb9">
+      <w:hyperlink w:history="1" r:id="rId0ktliifs8dz44x07feet2">
         <w:r>
           <w:rPr>
             <w:color w:val="315CBB"/>
@@ -1970,7 +1970,7 @@
         </w:rPr>
         <w:t xml:space="preserve">   </w:t>
       </w:r>
-      <w:hyperlink w:history="1" r:id="rIdubbp0rjv_wfjmmaq1zphx">
+      <w:hyperlink w:history="1" r:id="rIdntvvwuhkvfppr0ghfr926">
         <w:r>
           <w:rPr>
             <w:color w:val="315CBB"/>
@@ -2356,7 +2356,7 @@
             <w:pPr>
               <w:spacing w:after="0" w:before="75" w:line="210"/>
             </w:pPr>
-            <w:hyperlink w:history="1" r:id="rId3e6ajb57su6hr3n4eedk1">
+            <w:hyperlink w:history="1" r:id="rIdfc8hfd35-uhvb44c_43zv">
               <w:r>
                 <w:rPr>
                   <w:color w:val="315CBB"/>
@@ -2374,7 +2374,7 @@
               </w:rPr>
               <w:t xml:space="preserve">   </w:t>
             </w:r>
-            <w:hyperlink w:history="1" r:id="rIdh2btrq2wgabwzy0vh2ro9">
+            <w:hyperlink w:history="1" r:id="rIdrxijwtc7injm3ox8fu1dm">
               <w:r>
                 <w:rPr>
                   <w:color w:val="315CBB"/>
@@ -2392,7 +2392,7 @@
               </w:rPr>
               <w:t xml:space="preserve">   </w:t>
             </w:r>
-            <w:hyperlink w:history="1" r:id="rIdsdasdufmeiti5lqk8re_t">
+            <w:hyperlink w:history="1" r:id="rIdqderqq6xsiagzdy-2y4vy">
               <w:r>
                 <w:rPr>
                   <w:color w:val="315CBB"/>
@@ -2860,7 +2860,7 @@
             <w:pPr>
               <w:spacing w:after="0" w:before="0" w:line="210"/>
             </w:pPr>
-            <w:hyperlink w:history="1" r:id="rId7aszo2ftjlatrqir04kbj">
+            <w:hyperlink w:history="1" r:id="rIdzi7-z4w-z8pryw89euzu1">
               <w:r>
                 <w:rPr>
                   <w:color w:val="315CBB"/>

</xml_diff>

<commit_message>
Keep the measured figures on the cover and point the contents at them
Reverting the previous change: the cover leads with data pipelines again,
because its conversion pass rate and cost figures carry more weight than a
design-scope case with no numbers, and the contents now names 01·02·04 to
match.

An earlier note argued from how common data pipelines are among applicants.
There is no data behind that, so it is gone; what a case is worth here is
judged on the figures it can show.

Co-Authored-By: Claude Opus 5 (1M context) <noreply@anthropic.com>
</commit_message>
<xml_diff>
--- a/site/en/resume.docx
+++ b/site/en/resume.docx
@@ -89,7 +89,7 @@
             <w:pPr>
               <w:spacing w:after="0" w:before="75" w:line="210"/>
             </w:pPr>
-            <w:hyperlink w:history="1" r:id="rIdf0talyanbdkvpw17yn-33">
+            <w:hyperlink w:history="1" r:id="rIds-pjzug8-tgn7g5zhpn9-">
               <w:r>
                 <w:rPr>
                   <w:color w:val="315CBB"/>
@@ -107,7 +107,7 @@
               </w:rPr>
               <w:t xml:space="preserve">   </w:t>
             </w:r>
-            <w:hyperlink w:history="1" r:id="rIdz8o-mddtde0pyerqiqsux">
+            <w:hyperlink w:history="1" r:id="rIdqdrauys9jse54pz4anvc3">
               <w:r>
                 <w:rPr>
                   <w:color w:val="315CBB"/>
@@ -125,7 +125,7 @@
               </w:rPr>
               <w:t xml:space="preserve">   </w:t>
             </w:r>
-            <w:hyperlink w:history="1" r:id="rId1cbtdixzv6fijxu-cb4m3">
+            <w:hyperlink w:history="1" r:id="rIdih5gee9xjjqrzdtjrdsif">
               <w:r>
                 <w:rPr>
                   <w:color w:val="315CBB"/>
@@ -143,7 +143,7 @@
               </w:rPr>
               <w:t xml:space="preserve">   </w:t>
             </w:r>
-            <w:hyperlink w:history="1" r:id="rIdcuko-d3psazix0gy5kbvz">
+            <w:hyperlink w:history="1" r:id="rIdookomftthn1fhjliichrk">
               <w:r>
                 <w:rPr>
                   <w:color w:val="315CBB"/>
@@ -394,7 +394,7 @@
       <w:pPr>
         <w:spacing w:after="0" w:before="0" w:line="210"/>
       </w:pPr>
-      <w:hyperlink w:history="1" r:id="rIdezzdm3lyxlstiihpokks2">
+      <w:hyperlink w:history="1" r:id="rIddy9qy6zmxiumi_vxsca04">
         <w:r>
           <w:rPr>
             <w:color w:val="315CBB"/>
@@ -1299,7 +1299,7 @@
       <w:pPr>
         <w:spacing w:after="0" w:before="75" w:line="210"/>
       </w:pPr>
-      <w:hyperlink w:history="1" r:id="rIdqze5spz3cyutpdnvr-khk">
+      <w:hyperlink w:history="1" r:id="rIdxqczi33rrq0tyw4oay38p">
         <w:r>
           <w:rPr>
             <w:color w:val="315CBB"/>
@@ -1317,7 +1317,7 @@
         </w:rPr>
         <w:t xml:space="preserve">   </w:t>
       </w:r>
-      <w:hyperlink w:history="1" r:id="rIdf6mgurcdn2a5sai8ks9gm">
+      <w:hyperlink w:history="1" r:id="rIdnan6hzgxfllsr0-jyin5f">
         <w:r>
           <w:rPr>
             <w:color w:val="315CBB"/>
@@ -1335,7 +1335,7 @@
         </w:rPr>
         <w:t xml:space="preserve">   </w:t>
       </w:r>
-      <w:hyperlink w:history="1" r:id="rIdskaekbwup-7cdwt01xijq">
+      <w:hyperlink w:history="1" r:id="rIdzturpbzc1itkrjxj49ux4">
         <w:r>
           <w:rPr>
             <w:color w:val="315CBB"/>
@@ -1353,7 +1353,7 @@
         </w:rPr>
         <w:t xml:space="preserve">   </w:t>
       </w:r>
-      <w:hyperlink w:history="1" r:id="rId4p9wf-py1rvdfn6opktkr">
+      <w:hyperlink w:history="1" r:id="rIdyndqafskjqpjjvru7fj5t">
         <w:r>
           <w:rPr>
             <w:color w:val="315CBB"/>
@@ -1500,7 +1500,7 @@
       <w:pPr>
         <w:spacing w:after="0" w:before="0" w:line="210"/>
       </w:pPr>
-      <w:hyperlink w:history="1" r:id="rIdxd6n7hgwxrbaukvvxa3dz">
+      <w:hyperlink w:history="1" r:id="rIdbyxjy8zgwloyau5-emwlc">
         <w:r>
           <w:rPr>
             <w:color w:val="315CBB"/>
@@ -1952,7 +1952,7 @@
       <w:pPr>
         <w:spacing w:after="0" w:before="75" w:line="210"/>
       </w:pPr>
-      <w:hyperlink w:history="1" r:id="rId0ktliifs8dz44x07feet2">
+      <w:hyperlink w:history="1" r:id="rIdhy7rmpfsm4mgnwlneq_hy">
         <w:r>
           <w:rPr>
             <w:color w:val="315CBB"/>
@@ -1970,7 +1970,7 @@
         </w:rPr>
         <w:t xml:space="preserve">   </w:t>
       </w:r>
-      <w:hyperlink w:history="1" r:id="rIdntvvwuhkvfppr0ghfr926">
+      <w:hyperlink w:history="1" r:id="rId_gogche-czysrhmj3tuux">
         <w:r>
           <w:rPr>
             <w:color w:val="315CBB"/>
@@ -2356,7 +2356,7 @@
             <w:pPr>
               <w:spacing w:after="0" w:before="75" w:line="210"/>
             </w:pPr>
-            <w:hyperlink w:history="1" r:id="rIdfc8hfd35-uhvb44c_43zv">
+            <w:hyperlink w:history="1" r:id="rIdxwbnl-sitxi-83iqodj79">
               <w:r>
                 <w:rPr>
                   <w:color w:val="315CBB"/>
@@ -2374,7 +2374,7 @@
               </w:rPr>
               <w:t xml:space="preserve">   </w:t>
             </w:r>
-            <w:hyperlink w:history="1" r:id="rIdrxijwtc7injm3ox8fu1dm">
+            <w:hyperlink w:history="1" r:id="rIdkl6dr-ao5qdvtzlbywbuc">
               <w:r>
                 <w:rPr>
                   <w:color w:val="315CBB"/>
@@ -2392,7 +2392,7 @@
               </w:rPr>
               <w:t xml:space="preserve">   </w:t>
             </w:r>
-            <w:hyperlink w:history="1" r:id="rIdqderqq6xsiagzdy-2y4vy">
+            <w:hyperlink w:history="1" r:id="rId1kvpjycisc0unyghfleu_">
               <w:r>
                 <w:rPr>
                   <w:color w:val="315CBB"/>
@@ -2860,7 +2860,7 @@
             <w:pPr>
               <w:spacing w:after="0" w:before="0" w:line="210"/>
             </w:pPr>
-            <w:hyperlink w:history="1" r:id="rIdzi7-z4w-z8pryw89euzu1">
+            <w:hyperlink w:history="1" r:id="rIdx6lnnzjoqolb2zzxyue67">
               <w:r>
                 <w:rPr>
                   <w:color w:val="315CBB"/>

</xml_diff>

<commit_message>
Keep source paths and commit attribution out of the public repo
The README stated that local paths do not belong in the repo, then listed
them: experiment directories, module paths of a private repo, an internal
constant, and per-file commit counts.

- Leave in the README what a reader needs: what each figure means and what
  is deliberately not claimed
- Move the paths, line numbers and authorship counts to local/근거기록.md,
  which .gitignore keeps out

Co-Authored-By: Claude Opus 5 (1M context) <noreply@anthropic.com>
</commit_message>
<xml_diff>
--- a/site/en/resume.docx
+++ b/site/en/resume.docx
@@ -89,7 +89,7 @@
             <w:pPr>
               <w:spacing w:after="0" w:before="75" w:line="210"/>
             </w:pPr>
-            <w:hyperlink w:history="1" r:id="rIds-pjzug8-tgn7g5zhpn9-">
+            <w:hyperlink w:history="1" r:id="rIduqrohafu4pf2621o590_z">
               <w:r>
                 <w:rPr>
                   <w:color w:val="315CBB"/>
@@ -107,7 +107,7 @@
               </w:rPr>
               <w:t xml:space="preserve">   </w:t>
             </w:r>
-            <w:hyperlink w:history="1" r:id="rIdqdrauys9jse54pz4anvc3">
+            <w:hyperlink w:history="1" r:id="rIdl4tni6oks1qlzcv21eq1t">
               <w:r>
                 <w:rPr>
                   <w:color w:val="315CBB"/>
@@ -125,7 +125,7 @@
               </w:rPr>
               <w:t xml:space="preserve">   </w:t>
             </w:r>
-            <w:hyperlink w:history="1" r:id="rIdih5gee9xjjqrzdtjrdsif">
+            <w:hyperlink w:history="1" r:id="rIda1yijspwvq6en1oydug7g">
               <w:r>
                 <w:rPr>
                   <w:color w:val="315CBB"/>
@@ -143,7 +143,7 @@
               </w:rPr>
               <w:t xml:space="preserve">   </w:t>
             </w:r>
-            <w:hyperlink w:history="1" r:id="rIdookomftthn1fhjliichrk">
+            <w:hyperlink w:history="1" r:id="rIddgcokhfsj3l92h465vyl1">
               <w:r>
                 <w:rPr>
                   <w:color w:val="315CBB"/>
@@ -394,7 +394,7 @@
       <w:pPr>
         <w:spacing w:after="0" w:before="0" w:line="210"/>
       </w:pPr>
-      <w:hyperlink w:history="1" r:id="rIddy9qy6zmxiumi_vxsca04">
+      <w:hyperlink w:history="1" r:id="rIdmcq-mniargfmva7ltow8f">
         <w:r>
           <w:rPr>
             <w:color w:val="315CBB"/>
@@ -1299,7 +1299,7 @@
       <w:pPr>
         <w:spacing w:after="0" w:before="75" w:line="210"/>
       </w:pPr>
-      <w:hyperlink w:history="1" r:id="rIdxqczi33rrq0tyw4oay38p">
+      <w:hyperlink w:history="1" r:id="rId_99ahcjnzeaikkh8nw2qa">
         <w:r>
           <w:rPr>
             <w:color w:val="315CBB"/>
@@ -1317,7 +1317,7 @@
         </w:rPr>
         <w:t xml:space="preserve">   </w:t>
       </w:r>
-      <w:hyperlink w:history="1" r:id="rIdnan6hzgxfllsr0-jyin5f">
+      <w:hyperlink w:history="1" r:id="rIdw9wiirgbsr7tt_icpd04l">
         <w:r>
           <w:rPr>
             <w:color w:val="315CBB"/>
@@ -1335,7 +1335,7 @@
         </w:rPr>
         <w:t xml:space="preserve">   </w:t>
       </w:r>
-      <w:hyperlink w:history="1" r:id="rIdzturpbzc1itkrjxj49ux4">
+      <w:hyperlink w:history="1" r:id="rIdluwvljxukfjkmyz1ifvpa">
         <w:r>
           <w:rPr>
             <w:color w:val="315CBB"/>
@@ -1353,7 +1353,7 @@
         </w:rPr>
         <w:t xml:space="preserve">   </w:t>
       </w:r>
-      <w:hyperlink w:history="1" r:id="rIdyndqafskjqpjjvru7fj5t">
+      <w:hyperlink w:history="1" r:id="rIdyot4wtx6-_z9djurtn9vp">
         <w:r>
           <w:rPr>
             <w:color w:val="315CBB"/>
@@ -1500,7 +1500,7 @@
       <w:pPr>
         <w:spacing w:after="0" w:before="0" w:line="210"/>
       </w:pPr>
-      <w:hyperlink w:history="1" r:id="rIdbyxjy8zgwloyau5-emwlc">
+      <w:hyperlink w:history="1" r:id="rId3_5cjyvifcreo7m9pkjif">
         <w:r>
           <w:rPr>
             <w:color w:val="315CBB"/>
@@ -1952,7 +1952,7 @@
       <w:pPr>
         <w:spacing w:after="0" w:before="75" w:line="210"/>
       </w:pPr>
-      <w:hyperlink w:history="1" r:id="rIdhy7rmpfsm4mgnwlneq_hy">
+      <w:hyperlink w:history="1" r:id="rIdrd5a0is5gfqy-omg4cods">
         <w:r>
           <w:rPr>
             <w:color w:val="315CBB"/>
@@ -1970,7 +1970,7 @@
         </w:rPr>
         <w:t xml:space="preserve">   </w:t>
       </w:r>
-      <w:hyperlink w:history="1" r:id="rId_gogche-czysrhmj3tuux">
+      <w:hyperlink w:history="1" r:id="rIdaekmvevrql-bmczrh4c-g">
         <w:r>
           <w:rPr>
             <w:color w:val="315CBB"/>
@@ -2356,7 +2356,7 @@
             <w:pPr>
               <w:spacing w:after="0" w:before="75" w:line="210"/>
             </w:pPr>
-            <w:hyperlink w:history="1" r:id="rIdxwbnl-sitxi-83iqodj79">
+            <w:hyperlink w:history="1" r:id="rId0jn-r7ea6mqrs3iemnbbw">
               <w:r>
                 <w:rPr>
                   <w:color w:val="315CBB"/>
@@ -2374,7 +2374,7 @@
               </w:rPr>
               <w:t xml:space="preserve">   </w:t>
             </w:r>
-            <w:hyperlink w:history="1" r:id="rIdkl6dr-ao5qdvtzlbywbuc">
+            <w:hyperlink w:history="1" r:id="rIdetltjvrtstnufbcmiejhg">
               <w:r>
                 <w:rPr>
                   <w:color w:val="315CBB"/>
@@ -2392,7 +2392,7 @@
               </w:rPr>
               <w:t xml:space="preserve">   </w:t>
             </w:r>
-            <w:hyperlink w:history="1" r:id="rId1kvpjycisc0unyghfleu_">
+            <w:hyperlink w:history="1" r:id="rIdis0zpkhccgsjpsk5aqsla">
               <w:r>
                 <w:rPr>
                   <w:color w:val="315CBB"/>
@@ -2860,7 +2860,7 @@
             <w:pPr>
               <w:spacing w:after="0" w:before="0" w:line="210"/>
             </w:pPr>
-            <w:hyperlink w:history="1" r:id="rIdx6lnnzjoqolb2zzxyue67">
+            <w:hyperlink w:history="1" r:id="rIdcm_ebnoonaexmworibpk5">
               <w:r>
                 <w:rPr>
                   <w:color w:val="315CBB"/>

</xml_diff>

<commit_message>
Rebuild the site, PDFs and Word résumés
Co-Authored-By: Claude Opus 5 (1M context) <noreply@anthropic.com>
</commit_message>
<xml_diff>
--- a/site/en/resume.docx
+++ b/site/en/resume.docx
@@ -89,7 +89,7 @@
             <w:pPr>
               <w:spacing w:after="0" w:before="75" w:line="210"/>
             </w:pPr>
-            <w:hyperlink w:history="1" r:id="rIduqrohafu4pf2621o590_z">
+            <w:hyperlink w:history="1" r:id="rIdq_n0s52urcz5phr3zuig_">
               <w:r>
                 <w:rPr>
                   <w:color w:val="315CBB"/>
@@ -107,7 +107,7 @@
               </w:rPr>
               <w:t xml:space="preserve">   </w:t>
             </w:r>
-            <w:hyperlink w:history="1" r:id="rIdl4tni6oks1qlzcv21eq1t">
+            <w:hyperlink w:history="1" r:id="rIdyuqromsrl1mmnvpqjkv_d">
               <w:r>
                 <w:rPr>
                   <w:color w:val="315CBB"/>
@@ -125,7 +125,7 @@
               </w:rPr>
               <w:t xml:space="preserve">   </w:t>
             </w:r>
-            <w:hyperlink w:history="1" r:id="rIda1yijspwvq6en1oydug7g">
+            <w:hyperlink w:history="1" r:id="rIdhhlbnvhs2sxno-h2mus3a">
               <w:r>
                 <w:rPr>
                   <w:color w:val="315CBB"/>
@@ -143,7 +143,7 @@
               </w:rPr>
               <w:t xml:space="preserve">   </w:t>
             </w:r>
-            <w:hyperlink w:history="1" r:id="rIddgcokhfsj3l92h465vyl1">
+            <w:hyperlink w:history="1" r:id="rIdeb12ahzvtevd-njaw1tzo">
               <w:r>
                 <w:rPr>
                   <w:color w:val="315CBB"/>
@@ -223,7 +223,7 @@
           <w:sz w:val="15"/>
           <w:szCs w:val="15"/>
         </w:rPr>
-        <w:t xml:space="preserve">Agent execution environment: user-defined skills behind approval, edit quality 94/114 → 104/114</w:t>
+        <w:t xml:space="preserve">Agent execution environment: user-defined skills behind approval, edit quality 82.5% → 91.2% (114 drafts)</w:t>
       </w:r>
     </w:p>
     <w:p>
@@ -394,7 +394,7 @@
       <w:pPr>
         <w:spacing w:after="0" w:before="0" w:line="210"/>
       </w:pPr>
-      <w:hyperlink w:history="1" r:id="rIdmcq-mniargfmva7ltow8f">
+      <w:hyperlink w:history="1" r:id="rIdmvmndip4yr2rsljj38nuz">
         <w:r>
           <w:rPr>
             <w:color w:val="315CBB"/>
@@ -494,7 +494,7 @@
           <w:sz w:val="15"/>
           <w:szCs w:val="15"/>
         </w:rPr>
-        <w:t xml:space="preserve"> Applied Jev after routing tests, then controlled candidates and return limits after a full-corpus trial. Tuned to 300 candidates and up to 4 parallel batches.</w:t>
+        <w:t xml:space="preserve"> Applied Jev, a model that picks only from a fixed set of options, after routing tests, then controlled candidates and return limits after a full-corpus trial. Tuned to 300 candidates and up to 4 parallel batches.</w:t>
       </w:r>
       <w:r>
         <w:br/>
@@ -691,7 +691,7 @@
           <w:sz w:val="15"/>
           <w:szCs w:val="15"/>
         </w:rPr>
-        <w:t xml:space="preserve"> Applied Jev, a model that picks only from a fixed set of options, to select task types and additional conditions for questions, edits, document creation and folder organization.</w:t>
+        <w:t xml:space="preserve"> Applied Jev to select task types and additional conditions for questions, edits, document creation and folder organization.</w:t>
       </w:r>
       <w:r>
         <w:br/>
@@ -1299,7 +1299,7 @@
       <w:pPr>
         <w:spacing w:after="0" w:before="75" w:line="210"/>
       </w:pPr>
-      <w:hyperlink w:history="1" r:id="rId_99ahcjnzeaikkh8nw2qa">
+      <w:hyperlink w:history="1" r:id="rIdqkl5ngy4ydx4zdjxnysic">
         <w:r>
           <w:rPr>
             <w:color w:val="315CBB"/>
@@ -1317,7 +1317,7 @@
         </w:rPr>
         <w:t xml:space="preserve">   </w:t>
       </w:r>
-      <w:hyperlink w:history="1" r:id="rIdw9wiirgbsr7tt_icpd04l">
+      <w:hyperlink w:history="1" r:id="rIdermi-xscqlkuj_zbjxbhd">
         <w:r>
           <w:rPr>
             <w:color w:val="315CBB"/>
@@ -1335,7 +1335,7 @@
         </w:rPr>
         <w:t xml:space="preserve">   </w:t>
       </w:r>
-      <w:hyperlink w:history="1" r:id="rIdluwvljxukfjkmyz1ifvpa">
+      <w:hyperlink w:history="1" r:id="rIdo3zogpldxcag-f7-ezqwk">
         <w:r>
           <w:rPr>
             <w:color w:val="315CBB"/>
@@ -1353,7 +1353,7 @@
         </w:rPr>
         <w:t xml:space="preserve">   </w:t>
       </w:r>
-      <w:hyperlink w:history="1" r:id="rIdyot4wtx6-_z9djurtn9vp">
+      <w:hyperlink w:history="1" r:id="rIdqqxu8e0db1mavkmtyvczk">
         <w:r>
           <w:rPr>
             <w:color w:val="315CBB"/>
@@ -1458,7 +1458,7 @@
           <w:sz w:val="14"/>
           <w:szCs w:val="14"/>
         </w:rPr>
-        <w:t xml:space="preserve">Personalized AI medication service · Pusan National University capstone</w:t>
+        <w:t xml:space="preserve">Personalized AI medication service · Pusan National University capstone · 6 users on internal APK builds</w:t>
       </w:r>
       <w:r>
         <w:br/>
@@ -1500,7 +1500,7 @@
       <w:pPr>
         <w:spacing w:after="0" w:before="0" w:line="210"/>
       </w:pPr>
-      <w:hyperlink w:history="1" r:id="rId3_5cjyvifcreo7m9pkjif">
+      <w:hyperlink w:history="1" r:id="rIdvngspd_o944mwyqacy_rx">
         <w:r>
           <w:rPr>
             <w:color w:val="315CBB"/>
@@ -1818,7 +1818,7 @@
           <w:sz w:val="14"/>
           <w:szCs w:val="14"/>
         </w:rPr>
-        <w:t xml:space="preserve">We ran the booth as Pusan National University’s representative exhibition team, and I fed the feedback we collected into the next slice of work. A request from the first exhibition became a feature within the data we already had.</w:t>
+        <w:t xml:space="preserve">We ran the booth twice as Pusan National University’s representative exhibition team, demonstrating to more than 100 visitors and collecting 10 pieces of feedback. Most asked for health supplements, so I built that within the data we already had.</w:t>
       </w:r>
     </w:p>
     <w:p>
@@ -1952,7 +1952,7 @@
       <w:pPr>
         <w:spacing w:after="0" w:before="75" w:line="210"/>
       </w:pPr>
-      <w:hyperlink w:history="1" r:id="rIdrd5a0is5gfqy-omg4cods">
+      <w:hyperlink w:history="1" r:id="rId1rtvnoamuiyhk2-qvdcon">
         <w:r>
           <w:rPr>
             <w:color w:val="315CBB"/>
@@ -1970,7 +1970,7 @@
         </w:rPr>
         <w:t xml:space="preserve">   </w:t>
       </w:r>
-      <w:hyperlink w:history="1" r:id="rIdaekmvevrql-bmczrh4c-g">
+      <w:hyperlink w:history="1" r:id="rIdidse5_ojvav6sawcyqsz2">
         <w:r>
           <w:rPr>
             <w:color w:val="315CBB"/>
@@ -2309,7 +2309,7 @@
                 <w:sz w:val="15"/>
                 <w:szCs w:val="15"/>
               </w:rPr>
-              <w:t xml:space="preserve">2026.06 — 2026.06</w:t>
+              <w:t xml:space="preserve">2026.07 — 2026.09</w:t>
             </w:r>
           </w:p>
         </w:tc>
@@ -2336,7 +2336,7 @@
                 <w:sz w:val="18"/>
                 <w:szCs w:val="18"/>
               </w:rPr>
-              <w:t xml:space="preserve">Rhwp open-source contributions</w:t>
+              <w:t xml:space="preserve">200 SIGNAL · TQQQ 200-day moving average signal app (personal project)</w:t>
             </w:r>
           </w:p>
           <w:p>
@@ -2349,14 +2349,27 @@
                 <w:sz w:val="15"/>
                 <w:szCs w:val="15"/>
               </w:rPr>
-              <w:t xml:space="preserve">Investigated bugs, submitted fixes and addressed CI in a Rust HWP/HWPX project. Fixed textFlow attributes of images, tables and shapes being reset after saving.</w:t>
-            </w:r>
-          </w:p>
-          <w:p>
-            <w:pPr>
-              <w:spacing w:after="0" w:before="75" w:line="210"/>
-            </w:pPr>
-            <w:hyperlink w:history="1" r:id="rId0jn-r7ea6mqrs3iemnbbw">
+              <w:t xml:space="preserve">I turned a publicly posted TQQQ 200-day moving average strategy into a written spec and an Android app on live quotes, used by 2 family members. I marked the source post’s claimed returns as unverified and reproduced 45 cycles, measuring a 40.00% win rate rather than the claimed 19%. Counting partial exits as trades lifts that to 72.73%, showing the post’s two win rates count different units. I backtested 5 strategy variants under the same assumptions, comparing CAGR and MDD across sub-periods. At the users’ request I added a second QQQ-based strategy and SGOV/SPYM handling for cash waiting on an entry.</w:t>
+            </w:r>
+          </w:p>
+          <w:p>
+            <w:pPr>
+              <w:spacing w:after="60" w:before="0" w:line="196"/>
+            </w:pPr>
+            <w:r>
+              <w:rPr>
+                <w:color w:val="607089"/>
+                <w:sz w:val="14"/>
+                <w:szCs w:val="14"/>
+              </w:rPr>
+              <w:t xml:space="preserve">The app was never released, and account data stays on the device.</w:t>
+            </w:r>
+          </w:p>
+          <w:p>
+            <w:pPr>
+              <w:spacing w:after="0" w:before="0" w:line="210"/>
+            </w:pPr>
+            <w:hyperlink w:history="1" r:id="rIdd3xtkomvs2495rzbzdtlh">
               <w:r>
                 <w:rPr>
                   <w:color w:val="315CBB"/>
@@ -2366,15 +2379,117 @@
                 <w:t xml:space="preserve">GitHub repository ↗</w:t>
               </w:r>
             </w:hyperlink>
+          </w:p>
+        </w:tc>
+      </w:tr>
+    </w:tbl>
+    <w:tbl>
+      <w:tblPr>
+        <w:tblW w:type="dxa" w:w="10318"/>
+        <w:tblBorders>
+          <w:top w:val="none" w:color="FFFFFF" w:sz="0"/>
+          <w:left w:val="none" w:color="FFFFFF" w:sz="0"/>
+          <w:bottom w:val="single" w:color="E3E8F0" w:sz="4"/>
+          <w:right w:val="none" w:color="FFFFFF" w:sz="0"/>
+          <w:insideH w:val="none" w:color="FFFFFF" w:sz="0"/>
+          <w:insideV w:val="none" w:color="FFFFFF" w:sz="0"/>
+        </w:tblBorders>
+        <w:tblLayout w:type="fixed"/>
+      </w:tblPr>
+      <w:tblGrid>
+        <w:gridCol w:w="1548"/>
+        <w:gridCol w:w="8770"/>
+      </w:tblGrid>
+      <w:tr>
+        <w:trPr>
+          <w:cantSplit/>
+        </w:trPr>
+        <w:tc>
+          <w:tcPr>
+            <w:tcW w:type="dxa" w:w="1548"/>
+            <w:tcMar>
+              <w:top w:type="dxa" w:w="44"/>
+              <w:left w:type="dxa" w:w="0"/>
+              <w:bottom w:type="dxa" w:w="44"/>
+              <w:right w:type="dxa" w:w="87"/>
+            </w:tcMar>
+          </w:tcPr>
+          <w:p>
+            <w:pPr>
+              <w:spacing w:after="0" w:before="0" w:line="210"/>
+            </w:pPr>
             <w:r>
               <w:rPr>
                 <w:color w:val="203047"/>
                 <w:sz w:val="15"/>
                 <w:szCs w:val="15"/>
               </w:rPr>
+              <w:t xml:space="preserve">2026.06 — 2026.06</w:t>
+            </w:r>
+          </w:p>
+        </w:tc>
+        <w:tc>
+          <w:tcPr>
+            <w:tcW w:type="dxa" w:w="8770"/>
+            <w:tcMar>
+              <w:top w:type="dxa" w:w="44"/>
+              <w:left w:type="dxa" w:w="0"/>
+              <w:bottom w:type="dxa" w:w="44"/>
+              <w:right w:type="dxa" w:w="0"/>
+            </w:tcMar>
+          </w:tcPr>
+          <w:p>
+            <w:pPr>
+              <w:keepNext/>
+              <w:spacing w:after="0" w:before="0" w:line="252"/>
+            </w:pPr>
+            <w:r>
+              <w:rPr>
+                <w:b/>
+                <w:bCs/>
+                <w:color w:val="203047"/>
+                <w:sz w:val="18"/>
+                <w:szCs w:val="18"/>
+              </w:rPr>
+              <w:t xml:space="preserve">Rhwp open-source contributions</w:t>
+            </w:r>
+          </w:p>
+          <w:p>
+            <w:pPr>
+              <w:spacing w:after="0" w:before="0" w:line="210"/>
+            </w:pPr>
+            <w:r>
+              <w:rPr>
+                <w:color w:val="203047"/>
+                <w:sz w:val="15"/>
+                <w:szCs w:val="15"/>
+              </w:rPr>
+              <w:t xml:space="preserve">Investigated and fixed textFlow attributes of images, tables and shapes being reset after saving in a Rust HWP/HWPX project, and addressed CI.</w:t>
+            </w:r>
+          </w:p>
+          <w:p>
+            <w:pPr>
+              <w:spacing w:after="0" w:before="75" w:line="210"/>
+            </w:pPr>
+            <w:hyperlink w:history="1" r:id="rIdvnbc1bqpdira_ol9zu-x7">
+              <w:r>
+                <w:rPr>
+                  <w:color w:val="315CBB"/>
+                  <w:sz w:val="15"/>
+                  <w:szCs w:val="15"/>
+                </w:rPr>
+                <w:t xml:space="preserve">GitHub repository ↗</w:t>
+              </w:r>
+            </w:hyperlink>
+            <w:r>
+              <w:rPr>
+                <w:color w:val="203047"/>
+                <w:sz w:val="15"/>
+                <w:szCs w:val="15"/>
+              </w:rPr>
               <w:t xml:space="preserve">   </w:t>
             </w:r>
-            <w:hyperlink w:history="1" r:id="rIdetltjvrtstnufbcmiejhg">
+            <w:hyperlink w:history="1" r:id="rIdnir617qxxzmiexh7k4uae">
               <w:r>
                 <w:rPr>
                   <w:color w:val="315CBB"/>
@@ -2392,7 +2507,7 @@
               </w:rPr>
               <w:t xml:space="preserve">   </w:t>
             </w:r>
-            <w:hyperlink w:history="1" r:id="rIdis0zpkhccgsjpsk5aqsla">
+            <w:hyperlink w:history="1" r:id="rId6nh_3mzueqpkfnsnbg9q6">
               <w:r>
                 <w:rPr>
                   <w:color w:val="315CBB"/>
@@ -2709,272 +2824,7 @@
                 <w:sz w:val="15"/>
                 <w:szCs w:val="15"/>
               </w:rPr>
-              <w:t xml:space="preserve">Represented Pusan National University at the Pilltip booth, demonstrating the service and answering technical questions.</w:t>
-            </w:r>
-          </w:p>
-        </w:tc>
-      </w:tr>
-    </w:tbl>
-    <w:tbl>
-      <w:tblPr>
-        <w:tblW w:type="dxa" w:w="10318"/>
-        <w:tblBorders>
-          <w:top w:val="none" w:color="FFFFFF" w:sz="0"/>
-          <w:left w:val="none" w:color="FFFFFF" w:sz="0"/>
-          <w:bottom w:val="single" w:color="E3E8F0" w:sz="4"/>
-          <w:right w:val="none" w:color="FFFFFF" w:sz="0"/>
-          <w:insideH w:val="none" w:color="FFFFFF" w:sz="0"/>
-          <w:insideV w:val="none" w:color="FFFFFF" w:sz="0"/>
-        </w:tblBorders>
-        <w:tblLayout w:type="fixed"/>
-      </w:tblPr>
-      <w:tblGrid>
-        <w:gridCol w:w="1548"/>
-        <w:gridCol w:w="929"/>
-        <w:gridCol w:w="7842"/>
-      </w:tblGrid>
-      <w:tr>
-        <w:trPr>
-          <w:cantSplit/>
-        </w:trPr>
-        <w:tc>
-          <w:tcPr>
-            <w:tcW w:type="dxa" w:w="1548"/>
-            <w:tcMar>
-              <w:top w:type="dxa" w:w="44"/>
-              <w:left w:type="dxa" w:w="0"/>
-              <w:bottom w:type="dxa" w:w="44"/>
-              <w:right w:type="dxa" w:w="87"/>
-            </w:tcMar>
-          </w:tcPr>
-          <w:p>
-            <w:pPr>
-              <w:spacing w:after="0" w:before="0" w:line="210"/>
-            </w:pPr>
-            <w:r>
-              <w:rPr>
-                <w:color w:val="203047"/>
-                <w:sz w:val="15"/>
-                <w:szCs w:val="15"/>
-              </w:rPr>
-              <w:t xml:space="preserve">2022.02 — 2025.07</w:t>
-            </w:r>
-          </w:p>
-        </w:tc>
-        <w:tc>
-          <w:tcPr>
-            <w:tcW w:type="dxa" w:w="929"/>
-            <w:tcMar>
-              <w:top w:type="dxa" w:w="44"/>
-              <w:left w:type="dxa" w:w="0"/>
-              <w:bottom w:type="dxa" w:w="44"/>
-              <w:right w:type="dxa" w:w="0"/>
-            </w:tcMar>
-          </w:tcPr>
-          <w:p>
-            <w:pPr>
-              <w:spacing w:after="0" w:before="0" w:line="210"/>
-            </w:pPr>
-            <w:r>
-              <w:drawing>
-                <wp:inline distT="0" distB="0" distL="0" distR="0">
-                  <wp:extent cx="571500" cy="381000"/>
-                  <wp:effectExtent t="0" r="0" b="0" l="0"/>
-                  <wp:docPr id="1" name="" descr="" title=""/>
-                  <wp:cNvGraphicFramePr>
-                    <a:graphicFrameLocks xmlns:a="http://schemas.openxmlformats.org/drawingml/2006/main" noChangeAspect="1"/>
-                  </wp:cNvGraphicFramePr>
-                  <a:graphic xmlns:a="http://schemas.openxmlformats.org/drawingml/2006/main">
-                    <a:graphicData uri="http://schemas.openxmlformats.org/drawingml/2006/picture">
-                      <pic:pic xmlns:pic="http://schemas.openxmlformats.org/drawingml/2006/picture">
-                        <pic:nvPicPr>
-                          <pic:cNvPr id="0" name="" descr=""/>
-                          <pic:cNvPicPr>
-                            <a:picLocks noChangeAspect="1" noChangeArrowheads="1"/>
-                          </pic:cNvPicPr>
-                        </pic:nvPicPr>
-                        <pic:blipFill>
-                          <a:blip r:embed="rId10" cstate="none"/>
-                          <a:srcRect/>
-                          <a:stretch>
-                            <a:fillRect/>
-                          </a:stretch>
-                        </pic:blipFill>
-                        <pic:spPr bwMode="auto">
-                          <a:xfrm>
-                            <a:off x="0" y="0"/>
-                            <a:ext cx="571500" cy="381000"/>
-                          </a:xfrm>
-                          <a:prstGeom prst="rect">
-                            <a:avLst/>
-                          </a:prstGeom>
-                        </pic:spPr>
-                      </pic:pic>
-                    </a:graphicData>
-                  </a:graphic>
-                </wp:inline>
-              </w:drawing>
-            </w:r>
-          </w:p>
-        </w:tc>
-        <w:tc>
-          <w:tcPr>
-            <w:tcW w:type="dxa" w:w="7842"/>
-            <w:tcMar>
-              <w:top w:type="dxa" w:w="44"/>
-              <w:left w:type="dxa" w:w="0"/>
-              <w:bottom w:type="dxa" w:w="44"/>
-              <w:right w:type="dxa" w:w="0"/>
-            </w:tcMar>
-          </w:tcPr>
-          <w:p>
-            <w:pPr>
-              <w:keepNext/>
-              <w:spacing w:after="0" w:before="0" w:line="252"/>
-            </w:pPr>
-            <w:r>
-              <w:rPr>
-                <w:b/>
-                <w:bCs/>
-                <w:color w:val="203047"/>
-                <w:sz w:val="18"/>
-                <w:szCs w:val="18"/>
-              </w:rPr>
-              <w:t xml:space="preserve">945-day Baekjoon problem-solving streak</w:t>
-            </w:r>
-          </w:p>
-          <w:p>
-            <w:pPr>
-              <w:spacing w:after="0" w:before="0" w:line="210"/>
-            </w:pPr>
-            <w:r>
-              <w:rPr>
-                <w:color w:val="203047"/>
-                <w:sz w:val="15"/>
-                <w:szCs w:val="15"/>
-              </w:rPr>
-              <w:t xml:space="preserve">Aiming for one problem a day, I reached a longest streak of 945 consecutive days on solved.ac. 1,659 problems solved, solved.ac Platinum IV. Solutions are recorded in a GitHub repository.</w:t>
-            </w:r>
-          </w:p>
-          <w:p>
-            <w:pPr>
-              <w:spacing w:after="0" w:before="0" w:line="210"/>
-            </w:pPr>
-            <w:hyperlink w:history="1" r:id="rIdcm_ebnoonaexmworibpk5">
-              <w:r>
-                <w:rPr>
-                  <w:color w:val="315CBB"/>
-                  <w:sz w:val="15"/>
-                  <w:szCs w:val="15"/>
-                </w:rPr>
-                <w:t xml:space="preserve">Baekjoon solutions repository ↗</w:t>
-              </w:r>
-            </w:hyperlink>
-          </w:p>
-        </w:tc>
-      </w:tr>
-    </w:tbl>
-    <w:p>
-      <w:pPr>
-        <w:keepNext/>
-        <w:pBdr>
-          <w:bottom w:val="single" w:color="6A80BD" w:sz="12" w:space="4"/>
-        </w:pBdr>
-        <w:spacing w:after="135" w:before="240" w:line="252"/>
-      </w:pPr>
-      <w:r>
-        <w:rPr>
-          <w:b/>
-          <w:bCs/>
-          <w:color w:val="315CBB"/>
-          <w:sz w:val="18"/>
-          <w:szCs w:val="18"/>
-        </w:rPr>
-        <w:t xml:space="preserve">Education &amp; certification </w:t>
-      </w:r>
-    </w:p>
-    <w:tbl>
-      <w:tblPr>
-        <w:tblW w:type="dxa" w:w="10318"/>
-        <w:tblBorders>
-          <w:top w:val="none" w:color="FFFFFF" w:sz="0"/>
-          <w:left w:val="none" w:color="FFFFFF" w:sz="0"/>
-          <w:bottom w:val="single" w:color="E3E8F0" w:sz="4"/>
-          <w:right w:val="none" w:color="FFFFFF" w:sz="0"/>
-          <w:insideH w:val="none" w:color="FFFFFF" w:sz="0"/>
-          <w:insideV w:val="none" w:color="FFFFFF" w:sz="0"/>
-        </w:tblBorders>
-        <w:tblLayout w:type="fixed"/>
-      </w:tblPr>
-      <w:tblGrid>
-        <w:gridCol w:w="1548"/>
-        <w:gridCol w:w="8770"/>
-      </w:tblGrid>
-      <w:tr>
-        <w:trPr>
-          <w:cantSplit/>
-        </w:trPr>
-        <w:tc>
-          <w:tcPr>
-            <w:tcW w:type="dxa" w:w="1548"/>
-            <w:tcMar>
-              <w:top w:type="dxa" w:w="44"/>
-              <w:left w:type="dxa" w:w="0"/>
-              <w:bottom w:type="dxa" w:w="44"/>
-              <w:right w:type="dxa" w:w="87"/>
-            </w:tcMar>
-          </w:tcPr>
-          <w:p>
-            <w:pPr>
-              <w:spacing w:after="0" w:before="0" w:line="210"/>
-            </w:pPr>
-            <w:r>
-              <w:rPr>
-                <w:color w:val="203047"/>
-                <w:sz w:val="15"/>
-                <w:szCs w:val="15"/>
-              </w:rPr>
-              <w:t xml:space="preserve">2022.02 — 2026.02 (Transfer)</w:t>
-            </w:r>
-          </w:p>
-        </w:tc>
-        <w:tc>
-          <w:tcPr>
-            <w:tcW w:type="dxa" w:w="8770"/>
-            <w:tcMar>
-              <w:top w:type="dxa" w:w="44"/>
-              <w:left w:type="dxa" w:w="0"/>
-              <w:bottom w:type="dxa" w:w="44"/>
-              <w:right w:type="dxa" w:w="0"/>
-            </w:tcMar>
-          </w:tcPr>
-          <w:p>
-            <w:pPr>
-              <w:keepNext/>
-              <w:spacing w:after="0" w:before="0" w:line="252"/>
-            </w:pPr>
-            <w:r>
-              <w:rPr>
-                <w:b/>
-                <w:bCs/>
-                <w:color w:val="203047"/>
-                <w:sz w:val="18"/>
-                <w:szCs w:val="18"/>
-              </w:rPr>
-              <w:t xml:space="preserve">Pusan National University</w:t>
-            </w:r>
-          </w:p>
-          <w:p>
-            <w:pPr>
-              <w:spacing w:after="0" w:before="0" w:line="210"/>
-            </w:pPr>
-            <w:r>
-              <w:rPr>
-                <w:color w:val="203047"/>
-                <w:sz w:val="15"/>
-                <w:szCs w:val="15"/>
-              </w:rPr>
-              <w:t xml:space="preserve">GPA 4.12 / 4.5</w:t>
+              <w:t xml:space="preserve">Represented Pusan National University at the Pilltip booth, demonstrating the service to more than 100 visitors and answering technical questions. Most of the 10 pieces of feedback asked for health supplement coverage.</w:t>
             </w:r>
           </w:p>
         </w:tc>
@@ -3021,7 +2871,7 @@
                 <w:sz w:val="15"/>
                 <w:szCs w:val="15"/>
               </w:rPr>
-              <w:t xml:space="preserve">2019.03 — 2022.02 (Withdrew)</w:t>
+              <w:t xml:space="preserve">2022.02 — 2025.07</w:t>
             </w:r>
           </w:p>
         </w:tc>
@@ -3048,7 +2898,7 @@
                 <w:sz w:val="18"/>
                 <w:szCs w:val="18"/>
               </w:rPr>
-              <w:t xml:space="preserve">Daegu University</w:t>
+              <w:t xml:space="preserve">945-day Baekjoon problem-solving streak</w:t>
             </w:r>
           </w:p>
           <w:p>
@@ -3061,7 +2911,128 @@
                 <w:sz w:val="15"/>
                 <w:szCs w:val="15"/>
               </w:rPr>
-              <w:t xml:space="preserve">GPA 4.2 / 4.5</w:t>
+              <w:t xml:space="preserve">Longest streak of 945 consecutive days on solved.ac. 1,659 problems solved, Platinum IV.</w:t>
+            </w:r>
+          </w:p>
+          <w:p>
+            <w:pPr>
+              <w:spacing w:after="0" w:before="0" w:line="210"/>
+            </w:pPr>
+            <w:hyperlink w:history="1" r:id="rIdzuxyms5d1g3ko-otj5w0p">
+              <w:r>
+                <w:rPr>
+                  <w:color w:val="315CBB"/>
+                  <w:sz w:val="15"/>
+                  <w:szCs w:val="15"/>
+                </w:rPr>
+                <w:t xml:space="preserve">Baekjoon solutions repository ↗</w:t>
+              </w:r>
+            </w:hyperlink>
+          </w:p>
+        </w:tc>
+      </w:tr>
+    </w:tbl>
+    <w:p>
+      <w:pPr>
+        <w:keepNext/>
+        <w:pBdr>
+          <w:bottom w:val="single" w:color="6A80BD" w:sz="12" w:space="4"/>
+        </w:pBdr>
+        <w:spacing w:after="135" w:before="240" w:line="252"/>
+      </w:pPr>
+      <w:r>
+        <w:rPr>
+          <w:b/>
+          <w:bCs/>
+          <w:color w:val="315CBB"/>
+          <w:sz w:val="18"/>
+          <w:szCs w:val="18"/>
+        </w:rPr>
+        <w:t xml:space="preserve">Education &amp; certification </w:t>
+      </w:r>
+    </w:p>
+    <w:tbl>
+      <w:tblPr>
+        <w:tblW w:type="dxa" w:w="10318"/>
+        <w:tblBorders>
+          <w:top w:val="none" w:color="FFFFFF" w:sz="0"/>
+          <w:left w:val="none" w:color="FFFFFF" w:sz="0"/>
+          <w:bottom w:val="single" w:color="E3E8F0" w:sz="4"/>
+          <w:right w:val="none" w:color="FFFFFF" w:sz="0"/>
+          <w:insideH w:val="none" w:color="FFFFFF" w:sz="0"/>
+          <w:insideV w:val="none" w:color="FFFFFF" w:sz="0"/>
+        </w:tblBorders>
+        <w:tblLayout w:type="fixed"/>
+      </w:tblPr>
+      <w:tblGrid>
+        <w:gridCol w:w="1548"/>
+        <w:gridCol w:w="8770"/>
+      </w:tblGrid>
+      <w:tr>
+        <w:trPr>
+          <w:cantSplit/>
+        </w:trPr>
+        <w:tc>
+          <w:tcPr>
+            <w:tcW w:type="dxa" w:w="1548"/>
+            <w:tcMar>
+              <w:top w:type="dxa" w:w="44"/>
+              <w:left w:type="dxa" w:w="0"/>
+              <w:bottom w:type="dxa" w:w="44"/>
+              <w:right w:type="dxa" w:w="87"/>
+            </w:tcMar>
+          </w:tcPr>
+          <w:p>
+            <w:pPr>
+              <w:spacing w:after="0" w:before="0" w:line="210"/>
+            </w:pPr>
+            <w:r>
+              <w:rPr>
+                <w:color w:val="203047"/>
+                <w:sz w:val="15"/>
+                <w:szCs w:val="15"/>
+              </w:rPr>
+              <w:t xml:space="preserve">2022.02 — 2026.02 (Transfer)</w:t>
+            </w:r>
+          </w:p>
+        </w:tc>
+        <w:tc>
+          <w:tcPr>
+            <w:tcW w:type="dxa" w:w="8770"/>
+            <w:tcMar>
+              <w:top w:type="dxa" w:w="44"/>
+              <w:left w:type="dxa" w:w="0"/>
+              <w:bottom w:type="dxa" w:w="44"/>
+              <w:right w:type="dxa" w:w="0"/>
+            </w:tcMar>
+          </w:tcPr>
+          <w:p>
+            <w:pPr>
+              <w:keepNext/>
+              <w:spacing w:after="0" w:before="0" w:line="252"/>
+            </w:pPr>
+            <w:r>
+              <w:rPr>
+                <w:b/>
+                <w:bCs/>
+                <w:color w:val="203047"/>
+                <w:sz w:val="18"/>
+                <w:szCs w:val="18"/>
+              </w:rPr>
+              <w:t xml:space="preserve">Pusan National University</w:t>
+            </w:r>
+          </w:p>
+          <w:p>
+            <w:pPr>
+              <w:spacing w:after="0" w:before="0" w:line="210"/>
+            </w:pPr>
+            <w:r>
+              <w:rPr>
+                <w:color w:val="203047"/>
+                <w:sz w:val="15"/>
+                <w:szCs w:val="15"/>
+              </w:rPr>
+              <w:t xml:space="preserve">GPA 4.12 / 4.5</w:t>
             </w:r>
           </w:p>
         </w:tc>
@@ -3108,6 +3079,93 @@
                 <w:sz w:val="15"/>
                 <w:szCs w:val="15"/>
               </w:rPr>
+              <w:t xml:space="preserve">2019.03 — 2022.02 (Withdrew)</w:t>
+            </w:r>
+          </w:p>
+        </w:tc>
+        <w:tc>
+          <w:tcPr>
+            <w:tcW w:type="dxa" w:w="8770"/>
+            <w:tcMar>
+              <w:top w:type="dxa" w:w="44"/>
+              <w:left w:type="dxa" w:w="0"/>
+              <w:bottom w:type="dxa" w:w="44"/>
+              <w:right w:type="dxa" w:w="0"/>
+            </w:tcMar>
+          </w:tcPr>
+          <w:p>
+            <w:pPr>
+              <w:keepNext/>
+              <w:spacing w:after="0" w:before="0" w:line="252"/>
+            </w:pPr>
+            <w:r>
+              <w:rPr>
+                <w:b/>
+                <w:bCs/>
+                <w:color w:val="203047"/>
+                <w:sz w:val="18"/>
+                <w:szCs w:val="18"/>
+              </w:rPr>
+              <w:t xml:space="preserve">Daegu University</w:t>
+            </w:r>
+          </w:p>
+          <w:p>
+            <w:pPr>
+              <w:spacing w:after="0" w:before="0" w:line="210"/>
+            </w:pPr>
+            <w:r>
+              <w:rPr>
+                <w:color w:val="203047"/>
+                <w:sz w:val="15"/>
+                <w:szCs w:val="15"/>
+              </w:rPr>
+              <w:t xml:space="preserve">GPA 4.2 / 4.5</w:t>
+            </w:r>
+          </w:p>
+        </w:tc>
+      </w:tr>
+    </w:tbl>
+    <w:tbl>
+      <w:tblPr>
+        <w:tblW w:type="dxa" w:w="10318"/>
+        <w:tblBorders>
+          <w:top w:val="none" w:color="FFFFFF" w:sz="0"/>
+          <w:left w:val="none" w:color="FFFFFF" w:sz="0"/>
+          <w:bottom w:val="single" w:color="E3E8F0" w:sz="4"/>
+          <w:right w:val="none" w:color="FFFFFF" w:sz="0"/>
+          <w:insideH w:val="none" w:color="FFFFFF" w:sz="0"/>
+          <w:insideV w:val="none" w:color="FFFFFF" w:sz="0"/>
+        </w:tblBorders>
+        <w:tblLayout w:type="fixed"/>
+      </w:tblPr>
+      <w:tblGrid>
+        <w:gridCol w:w="1548"/>
+        <w:gridCol w:w="8770"/>
+      </w:tblGrid>
+      <w:tr>
+        <w:trPr>
+          <w:cantSplit/>
+        </w:trPr>
+        <w:tc>
+          <w:tcPr>
+            <w:tcW w:type="dxa" w:w="1548"/>
+            <w:tcMar>
+              <w:top w:type="dxa" w:w="44"/>
+              <w:left w:type="dxa" w:w="0"/>
+              <w:bottom w:type="dxa" w:w="44"/>
+              <w:right w:type="dxa" w:w="87"/>
+            </w:tcMar>
+          </w:tcPr>
+          <w:p>
+            <w:pPr>
+              <w:spacing w:after="0" w:before="0" w:line="210"/>
+            </w:pPr>
+            <w:r>
+              <w:rPr>
+                <w:color w:val="203047"/>
+                <w:sz w:val="15"/>
+                <w:szCs w:val="15"/>
+              </w:rPr>
               <w:t xml:space="preserve">2025.09</w:t>
             </w:r>
           </w:p>
@@ -3216,6 +3274,147 @@
                 <w:szCs w:val="15"/>
               </w:rPr>
               <w:t xml:space="preserve">2025.10</w:t>
+            </w:r>
+          </w:p>
+        </w:tc>
+        <w:tc>
+          <w:tcPr>
+            <w:tcW w:type="dxa" w:w="929"/>
+            <w:tcMar>
+              <w:top w:type="dxa" w:w="44"/>
+              <w:left w:type="dxa" w:w="0"/>
+              <w:bottom w:type="dxa" w:w="44"/>
+              <w:right w:type="dxa" w:w="0"/>
+            </w:tcMar>
+          </w:tcPr>
+          <w:p>
+            <w:pPr>
+              <w:spacing w:after="0" w:before="0" w:line="210"/>
+            </w:pPr>
+            <w:r>
+              <w:drawing>
+                <wp:inline distT="0" distB="0" distL="0" distR="0">
+                  <wp:extent cx="400050" cy="571500"/>
+                  <wp:effectExtent t="0" r="0" b="0" l="0"/>
+                  <wp:docPr id="1" name="" descr="" title=""/>
+                  <wp:cNvGraphicFramePr>
+                    <a:graphicFrameLocks xmlns:a="http://schemas.openxmlformats.org/drawingml/2006/main" noChangeAspect="1"/>
+                  </wp:cNvGraphicFramePr>
+                  <a:graphic xmlns:a="http://schemas.openxmlformats.org/drawingml/2006/main">
+                    <a:graphicData uri="http://schemas.openxmlformats.org/drawingml/2006/picture">
+                      <pic:pic xmlns:pic="http://schemas.openxmlformats.org/drawingml/2006/picture">
+                        <pic:nvPicPr>
+                          <pic:cNvPr id="0" name="" descr=""/>
+                          <pic:cNvPicPr>
+                            <a:picLocks noChangeAspect="1" noChangeArrowheads="1"/>
+                          </pic:cNvPicPr>
+                        </pic:nvPicPr>
+                        <pic:blipFill>
+                          <a:blip r:embed="rId10" cstate="none"/>
+                          <a:srcRect/>
+                          <a:stretch>
+                            <a:fillRect/>
+                          </a:stretch>
+                        </pic:blipFill>
+                        <pic:spPr bwMode="auto">
+                          <a:xfrm>
+                            <a:off x="0" y="0"/>
+                            <a:ext cx="400050" cy="571500"/>
+                          </a:xfrm>
+                          <a:prstGeom prst="rect">
+                            <a:avLst/>
+                          </a:prstGeom>
+                        </pic:spPr>
+                      </pic:pic>
+                    </a:graphicData>
+                  </a:graphic>
+                </wp:inline>
+              </w:drawing>
+            </w:r>
+          </w:p>
+        </w:tc>
+        <w:tc>
+          <w:tcPr>
+            <w:tcW w:type="dxa" w:w="8358"/>
+            <w:tcMar>
+              <w:top w:type="dxa" w:w="44"/>
+              <w:left w:type="dxa" w:w="0"/>
+              <w:bottom w:type="dxa" w:w="44"/>
+              <w:right w:type="dxa" w:w="0"/>
+            </w:tcMar>
+          </w:tcPr>
+          <w:p>
+            <w:pPr>
+              <w:spacing w:after="0" w:before="0" w:line="210"/>
+            </w:pPr>
+            <w:r>
+              <w:rPr>
+                <w:b/>
+                <w:bCs/>
+                <w:color w:val="203047"/>
+                <w:sz w:val="15"/>
+                <w:szCs w:val="15"/>
+              </w:rPr>
+              <w:t xml:space="preserve">Capstone Design Gold Award</w:t>
+            </w:r>
+            <w:r>
+              <w:br/>
+            </w:r>
+            <w:r>
+              <w:rPr>
+                <w:color w:val="203047"/>
+                <w:sz w:val="15"/>
+                <w:szCs w:val="15"/>
+              </w:rPr>
+              <w:t xml:space="preserve">Software &amp; AI division / College of Information and Biomedical Engineering, Pusan National University</w:t>
+            </w:r>
+          </w:p>
+        </w:tc>
+      </w:tr>
+    </w:tbl>
+    <w:tbl>
+      <w:tblPr>
+        <w:tblW w:type="dxa" w:w="10318"/>
+        <w:tblBorders>
+          <w:top w:val="none" w:color="FFFFFF" w:sz="0"/>
+          <w:left w:val="none" w:color="FFFFFF" w:sz="0"/>
+          <w:bottom w:val="single" w:color="E3E8F0" w:sz="4"/>
+          <w:right w:val="none" w:color="FFFFFF" w:sz="0"/>
+          <w:insideH w:val="none" w:color="FFFFFF" w:sz="0"/>
+          <w:insideV w:val="none" w:color="FFFFFF" w:sz="0"/>
+        </w:tblBorders>
+        <w:tblLayout w:type="fixed"/>
+      </w:tblPr>
+      <w:tblGrid>
+        <w:gridCol w:w="1032"/>
+        <w:gridCol w:w="929"/>
+        <w:gridCol w:w="8358"/>
+      </w:tblGrid>
+      <w:tr>
+        <w:trPr>
+          <w:cantSplit/>
+        </w:trPr>
+        <w:tc>
+          <w:tcPr>
+            <w:tcW w:type="dxa" w:w="1032"/>
+            <w:tcMar>
+              <w:top w:type="dxa" w:w="44"/>
+              <w:left w:type="dxa" w:w="0"/>
+              <w:bottom w:type="dxa" w:w="44"/>
+              <w:right w:type="dxa" w:w="87"/>
+            </w:tcMar>
+          </w:tcPr>
+          <w:p>
+            <w:pPr>
+              <w:spacing w:after="0" w:before="0" w:line="210"/>
+            </w:pPr>
+            <w:r>
+              <w:rPr>
+                <w:color w:val="203047"/>
+                <w:sz w:val="15"/>
+                <w:szCs w:val="15"/>
+              </w:rPr>
+              <w:t xml:space="preserve">2025.09</w:t>
             </w:r>
           </w:p>
         </w:tc>
@@ -3297,7 +3496,7 @@
                 <w:sz w:val="15"/>
                 <w:szCs w:val="15"/>
               </w:rPr>
-              <w:t xml:space="preserve">Capstone Design Gold Award</w:t>
+              <w:t xml:space="preserve">Busan DATA WEEK Top Excellence Award</w:t>
             </w:r>
             <w:r>
               <w:br/>
@@ -3308,7 +3507,7 @@
                 <w:sz w:val="15"/>
                 <w:szCs w:val="15"/>
               </w:rPr>
-              <w:t xml:space="preserve">Software &amp; AI division / College of Information and Biomedical Engineering, Pusan National University</w:t>
+              <w:t xml:space="preserve">Data utilization case competition / Busan Techno Park</w:t>
             </w:r>
           </w:p>
         </w:tc>
@@ -3438,7 +3637,7 @@
                 <w:sz w:val="15"/>
                 <w:szCs w:val="15"/>
               </w:rPr>
-              <w:t xml:space="preserve">Busan DATA WEEK Top Excellence Award</w:t>
+              <w:t xml:space="preserve">AI LAUNCH Career School Startup Hackathon Encouragement Award</w:t>
             </w:r>
             <w:r>
               <w:br/>
@@ -3449,7 +3648,7 @@
                 <w:sz w:val="15"/>
                 <w:szCs w:val="15"/>
               </w:rPr>
-              <w:t xml:space="preserve">Data utilization case competition / Busan Techno Park</w:t>
+              <w:t xml:space="preserve">KRYPTON X x Root Impact x Google.org</w:t>
             </w:r>
           </w:p>
         </w:tc>
@@ -3497,7 +3696,7 @@
                 <w:sz w:val="15"/>
                 <w:szCs w:val="15"/>
               </w:rPr>
-              <w:t xml:space="preserve">2025.09</w:t>
+              <w:t xml:space="preserve">2025.08</w:t>
             </w:r>
           </w:p>
         </w:tc>
@@ -3535,147 +3734,6 @@
                         </pic:nvPicPr>
                         <pic:blipFill>
                           <a:blip r:embed="rId13" cstate="none"/>
-                          <a:srcRect/>
-                          <a:stretch>
-                            <a:fillRect/>
-                          </a:stretch>
-                        </pic:blipFill>
-                        <pic:spPr bwMode="auto">
-                          <a:xfrm>
-                            <a:off x="0" y="0"/>
-                            <a:ext cx="400050" cy="571500"/>
-                          </a:xfrm>
-                          <a:prstGeom prst="rect">
-                            <a:avLst/>
-                          </a:prstGeom>
-                        </pic:spPr>
-                      </pic:pic>
-                    </a:graphicData>
-                  </a:graphic>
-                </wp:inline>
-              </w:drawing>
-            </w:r>
-          </w:p>
-        </w:tc>
-        <w:tc>
-          <w:tcPr>
-            <w:tcW w:type="dxa" w:w="8358"/>
-            <w:tcMar>
-              <w:top w:type="dxa" w:w="44"/>
-              <w:left w:type="dxa" w:w="0"/>
-              <w:bottom w:type="dxa" w:w="44"/>
-              <w:right w:type="dxa" w:w="0"/>
-            </w:tcMar>
-          </w:tcPr>
-          <w:p>
-            <w:pPr>
-              <w:spacing w:after="0" w:before="0" w:line="210"/>
-            </w:pPr>
-            <w:r>
-              <w:rPr>
-                <w:b/>
-                <w:bCs/>
-                <w:color w:val="203047"/>
-                <w:sz w:val="15"/>
-                <w:szCs w:val="15"/>
-              </w:rPr>
-              <w:t xml:space="preserve">AI LAUNCH Career School Startup Hackathon Encouragement Award</w:t>
-            </w:r>
-            <w:r>
-              <w:br/>
-            </w:r>
-            <w:r>
-              <w:rPr>
-                <w:color w:val="203047"/>
-                <w:sz w:val="15"/>
-                <w:szCs w:val="15"/>
-              </w:rPr>
-              <w:t xml:space="preserve">KRYPTON X x Root Impact x Google.org</w:t>
-            </w:r>
-          </w:p>
-        </w:tc>
-      </w:tr>
-    </w:tbl>
-    <w:tbl>
-      <w:tblPr>
-        <w:tblW w:type="dxa" w:w="10318"/>
-        <w:tblBorders>
-          <w:top w:val="none" w:color="FFFFFF" w:sz="0"/>
-          <w:left w:val="none" w:color="FFFFFF" w:sz="0"/>
-          <w:bottom w:val="single" w:color="E3E8F0" w:sz="4"/>
-          <w:right w:val="none" w:color="FFFFFF" w:sz="0"/>
-          <w:insideH w:val="none" w:color="FFFFFF" w:sz="0"/>
-          <w:insideV w:val="none" w:color="FFFFFF" w:sz="0"/>
-        </w:tblBorders>
-        <w:tblLayout w:type="fixed"/>
-      </w:tblPr>
-      <w:tblGrid>
-        <w:gridCol w:w="1032"/>
-        <w:gridCol w:w="929"/>
-        <w:gridCol w:w="8358"/>
-      </w:tblGrid>
-      <w:tr>
-        <w:trPr>
-          <w:cantSplit/>
-        </w:trPr>
-        <w:tc>
-          <w:tcPr>
-            <w:tcW w:type="dxa" w:w="1032"/>
-            <w:tcMar>
-              <w:top w:type="dxa" w:w="44"/>
-              <w:left w:type="dxa" w:w="0"/>
-              <w:bottom w:type="dxa" w:w="44"/>
-              <w:right w:type="dxa" w:w="87"/>
-            </w:tcMar>
-          </w:tcPr>
-          <w:p>
-            <w:pPr>
-              <w:spacing w:after="0" w:before="0" w:line="210"/>
-            </w:pPr>
-            <w:r>
-              <w:rPr>
-                <w:color w:val="203047"/>
-                <w:sz w:val="15"/>
-                <w:szCs w:val="15"/>
-              </w:rPr>
-              <w:t xml:space="preserve">2025.08</w:t>
-            </w:r>
-          </w:p>
-        </w:tc>
-        <w:tc>
-          <w:tcPr>
-            <w:tcW w:type="dxa" w:w="929"/>
-            <w:tcMar>
-              <w:top w:type="dxa" w:w="44"/>
-              <w:left w:type="dxa" w:w="0"/>
-              <w:bottom w:type="dxa" w:w="44"/>
-              <w:right w:type="dxa" w:w="0"/>
-            </w:tcMar>
-          </w:tcPr>
-          <w:p>
-            <w:pPr>
-              <w:spacing w:after="0" w:before="0" w:line="210"/>
-            </w:pPr>
-            <w:r>
-              <w:drawing>
-                <wp:inline distT="0" distB="0" distL="0" distR="0">
-                  <wp:extent cx="400050" cy="571500"/>
-                  <wp:effectExtent t="0" r="0" b="0" l="0"/>
-                  <wp:docPr id="1" name="" descr="" title=""/>
-                  <wp:cNvGraphicFramePr>
-                    <a:graphicFrameLocks xmlns:a="http://schemas.openxmlformats.org/drawingml/2006/main" noChangeAspect="1"/>
-                  </wp:cNvGraphicFramePr>
-                  <a:graphic xmlns:a="http://schemas.openxmlformats.org/drawingml/2006/main">
-                    <a:graphicData uri="http://schemas.openxmlformats.org/drawingml/2006/picture">
-                      <pic:pic xmlns:pic="http://schemas.openxmlformats.org/drawingml/2006/picture">
-                        <pic:nvPicPr>
-                          <pic:cNvPr id="0" name="" descr=""/>
-                          <pic:cNvPicPr>
-                            <a:picLocks noChangeAspect="1" noChangeArrowheads="1"/>
-                          </pic:cNvPicPr>
-                        </pic:nvPicPr>
-                        <pic:blipFill>
-                          <a:blip r:embed="rId14" cstate="none"/>
                           <a:srcRect/>
                           <a:stretch>
                             <a:fillRect/>

</xml_diff>

<commit_message>
feat: 직함을 AI 엔지니어(AI Engineer)로 변경
- 한국어 'AI 애플리케이션 개발자'와 영문 'AI Application Developer'를 각각 'AI 엔지니어', 'AI Engineer'로 통일
- 인사말, 소개 문장, 이력서 머리글(PDF, Word), 페이지 설명 문구까지 함께 변경

Co-Authored-By: Claude Opus 5.5 <noreply@anthropic.com>
</commit_message>
<xml_diff>
--- a/site/en/resume.docx
+++ b/site/en/resume.docx
@@ -46,7 +46,7 @@
                 <w:sz w:val="23"/>
                 <w:szCs w:val="23"/>
               </w:rPr>
-              <w:t xml:space="preserve">Jaehyeong Kim | AI Application Developer / Backend Engineer</w:t>
+              <w:t xml:space="preserve">Jaehyeong Kim | AI Engineer / Backend Engineer</w:t>
             </w:r>
           </w:p>
           <w:p>
@@ -89,7 +89,7 @@
             <w:pPr>
               <w:spacing w:after="0" w:before="75" w:line="210"/>
             </w:pPr>
-            <w:hyperlink w:history="1" r:id="rIdv1fcnaifzp3vguujsvr7l">
+            <w:hyperlink w:history="1" r:id="rId8frlby9wcm6g994fizrxq">
               <w:r>
                 <w:rPr>
                   <w:color w:val="315CBB"/>
@@ -107,7 +107,7 @@
               </w:rPr>
               <w:t xml:space="preserve">   </w:t>
             </w:r>
-            <w:hyperlink w:history="1" r:id="rId9h_3r4m-wgfsgwsvkpv0t">
+            <w:hyperlink w:history="1" r:id="rId9g67sfcx3zgcda0xbswok">
               <w:r>
                 <w:rPr>
                   <w:color w:val="315CBB"/>
@@ -125,7 +125,7 @@
               </w:rPr>
               <w:t xml:space="preserve">   </w:t>
             </w:r>
-            <w:hyperlink w:history="1" r:id="rId2w58cwwb_quhxpfa9iina">
+            <w:hyperlink w:history="1" r:id="rIdcwxsghgxwjlsjslovnnni">
               <w:r>
                 <w:rPr>
                   <w:color w:val="315CBB"/>
@@ -143,7 +143,7 @@
               </w:rPr>
               <w:t xml:space="preserve">   </w:t>
             </w:r>
-            <w:hyperlink w:history="1" r:id="rIdkvocahq6ntqveeogfm8mi">
+            <w:hyperlink w:history="1" r:id="rIdyuh6_9zpy5u7vt7fz7ljf">
               <w:r>
                 <w:rPr>
                   <w:color w:val="315CBB"/>
@@ -394,7 +394,7 @@
       <w:pPr>
         <w:spacing w:after="0" w:before="0" w:line="210"/>
       </w:pPr>
-      <w:hyperlink w:history="1" r:id="rIdk9fdco6jzzfuffcpvefz3">
+      <w:hyperlink w:history="1" r:id="rId3xypokd2es4_qege7alxr">
         <w:r>
           <w:rPr>
             <w:color w:val="315CBB"/>
@@ -850,7 +850,7 @@
       <w:pPr>
         <w:spacing w:after="0" w:before="75" w:line="210"/>
       </w:pPr>
-      <w:hyperlink w:history="1" r:id="rIdlyxprbgkrz-o9teexxi4j">
+      <w:hyperlink w:history="1" r:id="rIdfdqambnxvqvesm1qafnav">
         <w:r>
           <w:rPr>
             <w:color w:val="315CBB"/>
@@ -868,7 +868,7 @@
         </w:rPr>
         <w:t xml:space="preserve">   </w:t>
       </w:r>
-      <w:hyperlink w:history="1" r:id="rIdo5j0z7y57p5ivibpjcmjf">
+      <w:hyperlink w:history="1" r:id="rIdowlw7hiuwbnckpuxdrsye">
         <w:r>
           <w:rPr>
             <w:color w:val="315CBB"/>
@@ -886,7 +886,7 @@
         </w:rPr>
         <w:t xml:space="preserve">   </w:t>
       </w:r>
-      <w:hyperlink w:history="1" r:id="rId-cuf7cr3qha3d5mbhk3z7">
+      <w:hyperlink w:history="1" r:id="rIdqu0khwohfqcy7lkj0edqu">
         <w:r>
           <w:rPr>
             <w:color w:val="315CBB"/>
@@ -1033,7 +1033,7 @@
       <w:pPr>
         <w:spacing w:after="0" w:before="0" w:line="210"/>
       </w:pPr>
-      <w:hyperlink w:history="1" r:id="rId0z7ouomj27whukk_uqmg4">
+      <w:hyperlink w:history="1" r:id="rIdevgpvpzkhwhqsxh-c3xuf">
         <w:r>
           <w:rPr>
             <w:color w:val="315CBB"/>
@@ -1317,7 +1317,7 @@
       <w:pPr>
         <w:spacing w:after="0" w:before="75" w:line="210"/>
       </w:pPr>
-      <w:hyperlink w:history="1" r:id="rIdcy_tlqfdf1b-c2cdbj5zw">
+      <w:hyperlink w:history="1" r:id="rId_9lerijgr5gnxxsaswgwu">
         <w:r>
           <w:rPr>
             <w:color w:val="315CBB"/>
@@ -1335,7 +1335,7 @@
         </w:rPr>
         <w:t xml:space="preserve">   </w:t>
       </w:r>
-      <w:hyperlink w:history="1" r:id="rIdiumkvrz0cdljffpqetnf-">
+      <w:hyperlink w:history="1" r:id="rIdvoytwea9leasqvjaqpuhg">
         <w:r>
           <w:rPr>
             <w:color w:val="315CBB"/>
@@ -1721,7 +1721,7 @@
             <w:pPr>
               <w:spacing w:after="0" w:before="75" w:line="210"/>
             </w:pPr>
-            <w:hyperlink w:history="1" r:id="rIdqomg9grmjedlxfkxwyzos">
+            <w:hyperlink w:history="1" r:id="rIdbhrtfgq9kgzq22mxso2cs">
               <w:r>
                 <w:rPr>
                   <w:color w:val="315CBB"/>
@@ -1739,7 +1739,7 @@
               </w:rPr>
               <w:t xml:space="preserve">   </w:t>
             </w:r>
-            <w:hyperlink w:history="1" r:id="rIdci1leouu2minmkcaf9oz1">
+            <w:hyperlink w:history="1" r:id="rIdx6vsvw7nwu3p9qh_aim66">
               <w:r>
                 <w:rPr>
                   <w:color w:val="315CBB"/>
@@ -1757,7 +1757,7 @@
               </w:rPr>
               <w:t xml:space="preserve">   </w:t>
             </w:r>
-            <w:hyperlink w:history="1" r:id="rIdfmitadavaya-teeij-mii">
+            <w:hyperlink w:history="1" r:id="rIddmi2lbo6urjqi2jh1ylu1">
               <w:r>
                 <w:rPr>
                   <w:color w:val="315CBB"/>
@@ -2225,7 +2225,7 @@
             <w:pPr>
               <w:spacing w:after="0" w:before="0" w:line="210"/>
             </w:pPr>
-            <w:hyperlink w:history="1" r:id="rIdjbfqjpgy13xw3-45xl68r">
+            <w:hyperlink w:history="1" r:id="rIdaivcsyilt4wz_o8ycwv_b">
               <w:r>
                 <w:rPr>
                   <w:color w:val="315CBB"/>
@@ -3168,7 +3168,7 @@
         <w:sz w:val="12"/>
         <w:szCs w:val="12"/>
       </w:rPr>
-      <w:t xml:space="preserve">Jaehyeong Kim | AI Application Developer / Backend Engineer</w:t>
+      <w:t xml:space="preserve">Jaehyeong Kim | AI Engineer / Backend Engineer</w:t>
     </w:r>
     <w:r>
       <w:tab/>

</xml_diff>